<commit_message>
fix: complete versioned learning release checks
</commit_message>
<xml_diff>
--- a/docs/Bao-cao-ban-giao-May-VSTEP.docx
+++ b/docs/Bao-cao-ban-giao-May-VSTEP.docx
@@ -113,7 +113,7 @@
                 <w:color w:val="C93B72"/>
                 <w:sz w:val="18"/>
               </w:rPr>
-              <w:t>Ngày chốt</w:t>
+              <w:t>Ngày cập nhật</w:t>
             </w:r>
           </w:p>
         </w:tc>
@@ -139,7 +139,7 @@
                 <w:color w:val="211D20"/>
                 <w:sz w:val="18"/>
               </w:rPr>
-              <w:t>12/09/2026</w:t>
+              <w:t>13/09/2026</w:t>
             </w:r>
           </w:p>
         </w:tc>
@@ -193,7 +193,7 @@
                 <w:color w:val="211D20"/>
                 <w:sz w:val="18"/>
               </w:rPr>
-              <w:t>Kiểm định production Reading và Listening 12/09/2026</w:t>
+              <w:t>Release candidate Reading và Listening 13/09/2026</w:t>
             </w:r>
           </w:p>
         </w:tc>
@@ -443,7 +443,7 @@
           <w:color w:val="211D20"/>
           <w:sz w:val="22"/>
         </w:rPr>
-        <w:t>Bản code hiện đủ để Gùa pilot hằng ngày trên URL HTTPS hoặc local, Supabase thật đã kết nối và toàn bộ pipeline kiểm tra đang đạt. Reading và Listening có phản hồi theo dạng câu cùng độ chắc chắn; transcript chỉ mở sau khi nộp. Lịch sử và đề đang làm được khóa theo đúng phiên bản học liệu. Bộ kiểm thử production gồm 53 unit test và 40 E2E trên Chromium, Firefox và WebKit. Migration gia cố quyền ghi cloud đã qua preflight nhưng còn chờ áp dụng trên production. Các điều kiện còn thiếu để nghiệm thu vận hành là đăng nhập và đồng bộ trên bản host, micro và thiết bị thật, thử đồng bộ hai thiết bị cùng thẩm định học liệu bởi giáo viên VSTEP.</w:t>
+        <w:t>Bản code hiện đủ để Gùa pilot hằng ngày trên URL HTTPS hoặc local. Reading và Listening có phản hồi theo dạng câu cùng độ chắc chắn; transcript chỉ mở sau khi nộp. Lịch sử tương thích được nâng cấp sang snapshot; lịch ôn tách theo phiên bản; đề đang làm khóa cả học liệu và cấu trúc phần thi. Bộ kiểm thử production gồm 57 unit test và 40 E2E trên Chromium, Firefox và WebKit. Migration gia cố quyền ghi cloud đã áp dụng và hậu kiểm thành công trên Supabase production. Các điều kiện còn thiếu để nghiệm thu vận hành là đăng nhập và đồng bộ trên bản host, micro và thiết bị thật, thử đồng bộ hai thiết bị, cổng phát hành chờ CI cùng thẩm định học liệu bởi giáo viên VSTEP.</w:t>
       </w:r>
     </w:p>
     <w:p>
@@ -630,17 +630,23 @@
           <w:color w:val="211D20"/>
           <w:sz w:val="20"/>
         </w:rPr>
-        <w:t>Mây hiện là một ứng dụng luyện VSTEP cá nhân có kế hoạch học theo ngày, thư viện luyện bốn kỹ năng, hai chế độ thi có giờ, từ vựng, ôn lỗi sai, lịch sử tiến bộ, ghi âm, sao lưu và đồng bộ Supabase thủ công. Reading và Listening đã có phản hồi theo dạng câu và độ chắc chắn; phần thi có giờ cảnh báo câu bỏ trống và chỉ mở transcript Listening sau khi hoàn thành. Mỗi lượt học và đề đang làm lưu bản chụp học liệu có phiên bản, nên kết quả cũ không đổi khi ngân hàng câu hỏi được chỉnh sửa. Giao diện đã được kiểm thử tự động ở viewport máy tính và điện thoại, dùng tone hồng pastel, tối ưu cho tiếng Việt và cá nhân hóa cho Gùa. Bản build, GitHub Actions và smoke test trên URL HTTPS pilot đã đạt; luồng Reading và Listening trọng yếu cũng đạt trên Chromium, Firefox và WebKit. Chưa có nghiệm thu trên iOS hoặc Android thật.</w:t>
-      </w:r>
-    </w:p>
-    <w:p>
+        <w:t xml:space="preserve">Mây hiện là một ứng dụng luyện VSTEP cá nhân có kế hoạch học theo ngày, thư viện luyện bốn kỹ năng, hai chế độ thi có giờ, từ vựng, ôn lỗi sai, lịch sử tiến bộ, ghi âm, sao lưu và đồng bộ Supabase thủ công. Reading và Listening đã có phản hồi theo dạng câu và độ chắc chắn; phần thi có giờ cảnh báo câu bỏ trống và chỉ mở transcript Listening sau khi hoàn thành. Mỗi lượt học và đề đang làm lưu bản chụp học liệu có phiên bản, nên kết quả cũ không đổi khi ngân hàng câu hỏi được chỉnh sửa. Giao diện đã được kiểm thử tự động ở viewport máy tính và điện thoại, dùng tone hồng pastel, tối ưu cho tiếng Việt và cá nhân hóa cho Gùa. Baseline bàn giao </w:t>
+      </w:r>
+      <w:r>
+        <w:rPr>
+          <w:rFonts w:ascii="Consolas" w:hAnsi="Consolas" w:eastAsia="Consolas"/>
+          <w:color w:val="4A3B42"/>
+          <w:sz w:val="19"/>
+        </w:rPr>
+        <w:t>2ccbea8</w:t>
+      </w:r>
       <w:r>
         <w:rPr>
           <w:rFonts w:ascii="Arial" w:hAnsi="Arial" w:eastAsia="Arial"/>
           <w:color w:val="211D20"/>
           <w:sz w:val="20"/>
         </w:rPr>
-        <w:t>Sản phẩm đủ để Gùa pilot hằng ngày trên bản HTTPS hoặc local nhằm thu thập phản hồi thực tế. Chưa nên mô tả đây là hệ luyện thi VSTEP toàn diện đã được kiểm định hoặc đã nghiệm thu vận hành. Nội dung đang là nội dung tự biên soạn, mới có một đề đủ cấu trúc, bài Nghe dùng giọng tổng hợp và bài Viết hoặc Nói chưa có chấm điểm từ giáo viên hoặc AI. Bản host chưa được kiểm thử đăng nhập và đồng bộ bằng tài khoản thật, micro hoặc thiết bị thật của người học.</w:t>
+        <w:t xml:space="preserve"> đã qua GitHub Actions và smoke HTTPS; release candidate mới đã đạt toàn bộ cổng local với 57 unit và 40 E2E trên Chromium, Firefox và WebKit. Chưa có nghiệm thu trên iOS hoặc Android thật.</w:t>
       </w:r>
     </w:p>
     <w:p>
@@ -650,7 +656,17 @@
           <w:color w:val="211D20"/>
           <w:sz w:val="20"/>
         </w:rPr>
-        <w:t>Các hạng mục kỹ thuật P0 về lịch sử học liệu, kiểm tra payload cloud, timeout mạng, backup khi lỗi và smoke test sau triển khai đã hoàn thành trong mã nguồn. Migration gia cố quyền ghi Supabase đã qua kiểm thử và preflight dữ liệu thật nhưng còn chờ chạy trên production. Nghiệm thu thiết bị thật, thẩm định học liệu, đánh giá đầu vào và phản hồi Viết hoặc Nói vẫn đang mở và được liệt kê tại Mục 12.</w:t>
+        <w:t>Sản phẩm đủ để Gùa pilot hằng ngày trên bản HTTPS hoặc local nhằm thu thập phản hồi thực tế. Chưa nên mô tả đây là hệ luyện thi VSTEP toàn diện đã được kiểm định hoặc đã nghiệm thu vận hành. Nội dung đang là nội dung tự biên soạn, mới có một đề đủ cấu trúc, bài Nghe dùng giọng tổng hợp và bài Viết hoặc Nói chưa có chấm điểm từ giáo viên hoặc AI. Bản host chưa được kiểm thử đăng nhập và đồng bộ bằng tài khoản thật, micro hoặc thiết bị thật của người học.</w:t>
+      </w:r>
+    </w:p>
+    <w:p>
+      <w:r>
+        <w:rPr>
+          <w:rFonts w:ascii="Arial" w:hAnsi="Arial" w:eastAsia="Arial"/>
+          <w:color w:val="211D20"/>
+          <w:sz w:val="20"/>
+        </w:rPr>
+        <w:t>Các hạng mục kỹ thuật P0 về lịch sử học liệu, kiểm tra payload cloud, timeout mạng, backup khi lỗi và smoke test sau triển khai đã hoàn thành trong mã nguồn. Migration gia cố quyền ghi Supabase đã áp dụng và hậu kiểm thành công trên production ngày 13/09/2026. Nghiệm thu thiết bị thật, cổng bắt buộc chờ CI trước deploy, thẩm định học liệu, đánh giá đầu vào và phản hồi Viết hoặc Nói vẫn đang mở và được liệt kê tại Mục 12.</w:t>
       </w:r>
     </w:p>
     <w:p>
@@ -3614,7 +3630,7 @@
           <w:color w:val="211D20"/>
           <w:sz w:val="20"/>
         </w:rPr>
-        <w:t xml:space="preserve">; dữ liệu cũ không có snapshot vẫn đọc được bằng nội dung phiên bản 1 để giữ tương thích. </w:t>
+        <w:t xml:space="preserve">; dữ liệu cũ tương thích được nâng cấp sang snapshot phiên bản 1 khi đọc hoặc nhập. Phiên thi mới giữ cả snapshot bài lẫn cấu trúc từng phần; lịch ôn lỗi dùng khóa theo bài và version. </w:t>
       </w:r>
       <w:r>
         <w:rPr>
@@ -3882,7 +3898,71 @@
           <w:color w:val="211D20"/>
           <w:sz w:val="20"/>
         </w:rPr>
-        <w:t xml:space="preserve"> cùng rollback đã sẵn sàng và đạt kiểm thử PGlite; chưa chạy trên dự án production tại thời điểm chốt báo cáo.</w:t>
+        <w:t xml:space="preserve"> đã chạy trong transaction trên production ngày 13/09/2026. Hậu kiểm trả </w:t>
+      </w:r>
+      <w:r>
+        <w:rPr>
+          <w:rFonts w:ascii="Consolas" w:hAnsi="Consolas" w:eastAsia="Consolas"/>
+          <w:color w:val="4A3B42"/>
+          <w:sz w:val="19"/>
+        </w:rPr>
+        <w:t>migration_applied=true</w:t>
+      </w:r>
+      <w:r>
+        <w:rPr>
+          <w:rFonts w:ascii="Arial" w:hAnsi="Arial" w:eastAsia="Arial"/>
+          <w:color w:val="211D20"/>
+          <w:sz w:val="20"/>
+        </w:rPr>
+        <w:t xml:space="preserve">, </w:t>
+      </w:r>
+      <w:r>
+        <w:rPr>
+          <w:rFonts w:ascii="Consolas" w:hAnsi="Consolas" w:eastAsia="Consolas"/>
+          <w:color w:val="4A3B42"/>
+          <w:sz w:val="19"/>
+        </w:rPr>
+        <w:t>direct_update_allowed=false</w:t>
+      </w:r>
+      <w:r>
+        <w:rPr>
+          <w:rFonts w:ascii="Arial" w:hAnsi="Arial" w:eastAsia="Arial"/>
+          <w:color w:val="211D20"/>
+          <w:sz w:val="20"/>
+        </w:rPr>
+        <w:t xml:space="preserve">, </w:t>
+      </w:r>
+      <w:r>
+        <w:rPr>
+          <w:rFonts w:ascii="Consolas" w:hAnsi="Consolas" w:eastAsia="Consolas"/>
+          <w:color w:val="4A3B42"/>
+          <w:sz w:val="19"/>
+        </w:rPr>
+        <w:t>write_policies=0</w:t>
+      </w:r>
+      <w:r>
+        <w:rPr>
+          <w:rFonts w:ascii="Arial" w:hAnsi="Arial" w:eastAsia="Arial"/>
+          <w:color w:val="211D20"/>
+          <w:sz w:val="20"/>
+        </w:rPr>
+        <w:t xml:space="preserve">, </w:t>
+      </w:r>
+      <w:r>
+        <w:rPr>
+          <w:rFonts w:ascii="Consolas" w:hAnsi="Consolas" w:eastAsia="Consolas"/>
+          <w:color w:val="4A3B42"/>
+          <w:sz w:val="19"/>
+        </w:rPr>
+        <w:t>rpc_security_definer=true</w:t>
+      </w:r>
+      <w:r>
+        <w:rPr>
+          <w:rFonts w:ascii="Arial" w:hAnsi="Arial" w:eastAsia="Arial"/>
+          <w:color w:val="211D20"/>
+          <w:sz w:val="20"/>
+        </w:rPr>
+        <w:t xml:space="preserve"> và giữ nguyên một snapshot.</w:t>
       </w:r>
     </w:p>
     <w:p>
@@ -4516,7 +4596,7 @@
                 <w:color w:val="211D20"/>
                 <w:sz w:val="16"/>
               </w:rPr>
-              <w:t>53/53 đạt</w:t>
+              <w:t>57/57 đạt</w:t>
             </w:r>
           </w:p>
         </w:tc>
@@ -4932,7 +5012,7 @@
                 <w:color w:val="211D20"/>
                 <w:sz w:val="16"/>
               </w:rPr>
-              <w:t>Đạt</w:t>
+              <w:t>Đạt ở baseline</w:t>
             </w:r>
           </w:p>
         </w:tc>
@@ -4966,7 +5046,7 @@
                 <w:color w:val="4A3B42"/>
                 <w:sz w:val="15"/>
               </w:rPr>
-              <w:t>34687798626</w:t>
+              <w:t>34688471036</w:t>
             </w:r>
             <w:r>
               <w:rPr>
@@ -4982,7 +5062,7 @@
                 <w:color w:val="4A3B42"/>
                 <w:sz w:val="15"/>
               </w:rPr>
-              <w:t>f43fc23</w:t>
+              <w:t>2ccbea8</w:t>
             </w:r>
             <w:r>
               <w:rPr>
@@ -4990,7 +5070,7 @@
                 <w:color w:val="211D20"/>
                 <w:sz w:val="16"/>
               </w:rPr>
-              <w:t>; đã chạy Chromium, Firefox và WebKit</w:t>
+              <w:t>; release candidate chờ CI sau khi push</w:t>
             </w:r>
           </w:p>
         </w:tc>
@@ -7422,7 +7502,7 @@
           <w:color w:val="211D20"/>
           <w:sz w:val="20"/>
         </w:rPr>
-        <w:t>Áp dụng migration gia cố Supabase.</w:t>
+        <w:t>Hoàn tất nghiệm thu bản HTTPS.</w:t>
       </w:r>
       <w:r>
         <w:rPr>
@@ -7430,7 +7510,7 @@
           <w:color w:val="211D20"/>
           <w:sz w:val="20"/>
         </w:rPr>
-        <w:t xml:space="preserve"> Chạy migration 002 đã preflight, sau đó kiểm tra đọc snapshot, lưu revision mới và từ chối ghi trực tiếp.</w:t>
+        <w:t xml:space="preserve"> Vercel pilot, biến môi trường, headers, 404, font và smoke tự động đã kiểm tra. Còn đăng nhập và đồng bộ bằng tài khoản thật, micro và kiểm tra bundle không chứa secret ngoài publishable key.</w:t>
       </w:r>
     </w:p>
     <w:p>
@@ -7453,7 +7533,7 @@
           <w:color w:val="211D20"/>
           <w:sz w:val="20"/>
         </w:rPr>
-        <w:t>Hoàn tất nghiệm thu bản HTTPS.</w:t>
+        <w:t>Nghiệm thu trên thiết bị của Gùa.</w:t>
       </w:r>
       <w:r>
         <w:rPr>
@@ -7461,7 +7541,7 @@
           <w:color w:val="211D20"/>
           <w:sz w:val="20"/>
         </w:rPr>
-        <w:t xml:space="preserve"> Vercel pilot, biến môi trường, headers, 404, font và smoke tự động đã kiểm tra. Còn đăng nhập và đồng bộ bằng tài khoản thật, micro và kiểm tra bundle không chứa secret ngoài publishable key.</w:t>
+        <w:t xml:space="preserve"> Thử iPhone hoặc Safari hay Android hoặc Chrome thực tế, máy tính chính, tai nghe, micro, speech synthesis, reload giữa bài và màn hình tắt. Tiêu chí đạt là hoàn thành một bài Nói, một bài Nghe, một mini exam và tải lại không mất dữ liệu.</w:t>
       </w:r>
     </w:p>
     <w:p>
@@ -7484,7 +7564,7 @@
           <w:color w:val="211D20"/>
           <w:sz w:val="20"/>
         </w:rPr>
-        <w:t>Nghiệm thu trên thiết bị của Gùa.</w:t>
+        <w:t>Kiểm thử đồng bộ hai thiết bị.</w:t>
       </w:r>
       <w:r>
         <w:rPr>
@@ -7492,7 +7572,7 @@
           <w:color w:val="211D20"/>
           <w:sz w:val="20"/>
         </w:rPr>
-        <w:t xml:space="preserve"> Thử iPhone hoặc Safari hay Android hoặc Chrome thực tế, máy tính chính, tai nghe, micro, speech synthesis, reload giữa bài và màn hình tắt. Tiêu chí đạt là hoàn thành một bài Nói, một bài Nghe, một mini exam và tải lại không mất dữ liệu.</w:t>
+        <w:t xml:space="preserve"> Lưu từ thiết bị A, tải ở B, học thêm ở B, lưu lại và tải về A. Cố tình tạo conflict để xác nhận thông báo và quy trình backup dễ hiểu.</w:t>
       </w:r>
     </w:p>
     <w:p>
@@ -7507,37 +7587,6 @@
           <w:sz w:val="20"/>
         </w:rPr>
         <w:t xml:space="preserve">4. </w:t>
-      </w:r>
-      <w:r>
-        <w:rPr>
-          <w:rFonts w:ascii="Arial" w:hAnsi="Arial" w:eastAsia="Arial"/>
-          <w:b/>
-          <w:color w:val="211D20"/>
-          <w:sz w:val="20"/>
-        </w:rPr>
-        <w:t>Kiểm thử đồng bộ hai thiết bị.</w:t>
-      </w:r>
-      <w:r>
-        <w:rPr>
-          <w:rFonts w:ascii="Arial" w:hAnsi="Arial" w:eastAsia="Arial"/>
-          <w:color w:val="211D20"/>
-          <w:sz w:val="20"/>
-        </w:rPr>
-        <w:t xml:space="preserve"> Lưu từ thiết bị A, tải ở B, học thêm ở B, lưu lại và tải về A. Cố tình tạo conflict để xác nhận thông báo và quy trình backup dễ hiểu.</w:t>
-      </w:r>
-    </w:p>
-    <w:p>
-      <w:pPr>
-        <w:spacing w:after="80"/>
-        <w:ind w:left="351" w:hanging="238"/>
-      </w:pPr>
-      <w:r>
-        <w:rPr>
-          <w:rFonts w:ascii="Arial" w:hAnsi="Arial" w:eastAsia="Arial"/>
-          <w:color w:val="211D20"/>
-          <w:sz w:val="20"/>
-        </w:rPr>
-        <w:t xml:space="preserve">5. </w:t>
       </w:r>
       <w:r>
         <w:rPr>
@@ -9165,7 +9214,7 @@
           <w:color w:val="211D20"/>
           <w:sz w:val="20"/>
         </w:rPr>
-        <w:t>[ ] Migration gia cố 002 đã preflight nhưng chưa áp dụng trên production.</w:t>
+        <w:t>[x] Migration gia cố 002 đã áp dụng và hậu kiểm trên production.</w:t>
       </w:r>
     </w:p>
     <w:p>

</xml_diff>

<commit_message>
docs: record verified production release
</commit_message>
<xml_diff>
--- a/docs/Bao-cao-ban-giao-May-VSTEP.docx
+++ b/docs/Bao-cao-ban-giao-May-VSTEP.docx
@@ -193,7 +193,7 @@
                 <w:color w:val="211D20"/>
                 <w:sz w:val="18"/>
               </w:rPr>
-              <w:t>Release candidate Reading và Listening 13/09/2026</w:t>
+              <w:t>Release Reading và Listening 6cdbbfe</w:t>
             </w:r>
           </w:p>
         </w:tc>
@@ -630,7 +630,7 @@
           <w:color w:val="211D20"/>
           <w:sz w:val="20"/>
         </w:rPr>
-        <w:t xml:space="preserve">Mây hiện là một ứng dụng luyện VSTEP cá nhân có kế hoạch học theo ngày, thư viện luyện bốn kỹ năng, hai chế độ thi có giờ, từ vựng, ôn lỗi sai, lịch sử tiến bộ, ghi âm, sao lưu và đồng bộ Supabase thủ công. Reading và Listening đã có phản hồi theo dạng câu và độ chắc chắn; phần thi có giờ cảnh báo câu bỏ trống và chỉ mở transcript Listening sau khi hoàn thành. Mỗi lượt học và đề đang làm lưu bản chụp học liệu có phiên bản, nên kết quả cũ không đổi khi ngân hàng câu hỏi được chỉnh sửa. Giao diện đã được kiểm thử tự động ở viewport máy tính và điện thoại, dùng tone hồng pastel, tối ưu cho tiếng Việt và cá nhân hóa cho Gùa. Baseline bàn giao </w:t>
+        <w:t xml:space="preserve">Mây hiện là một ứng dụng luyện VSTEP cá nhân có kế hoạch học theo ngày, thư viện luyện bốn kỹ năng, hai chế độ thi có giờ, từ vựng, ôn lỗi sai, lịch sử tiến bộ, ghi âm, sao lưu và đồng bộ Supabase thủ công. Reading và Listening đã có phản hồi theo dạng câu và độ chắc chắn; phần thi có giờ cảnh báo câu bỏ trống và chỉ mở transcript Listening sau khi hoàn thành. Mỗi lượt học và đề đang làm lưu bản chụp học liệu có phiên bản, nên kết quả cũ không đổi khi ngân hàng câu hỏi được chỉnh sửa. Giao diện đã được kiểm thử tự động ở viewport máy tính và điện thoại, dùng tone hồng pastel, tối ưu cho tiếng Việt và cá nhân hóa cho Gùa. Release </w:t>
       </w:r>
       <w:r>
         <w:rPr>
@@ -638,7 +638,7 @@
           <w:color w:val="4A3B42"/>
           <w:sz w:val="19"/>
         </w:rPr>
-        <w:t>2ccbea8</w:t>
+        <w:t>6cdbbfe</w:t>
       </w:r>
       <w:r>
         <w:rPr>
@@ -646,7 +646,7 @@
           <w:color w:val="211D20"/>
           <w:sz w:val="20"/>
         </w:rPr>
-        <w:t xml:space="preserve"> đã qua GitHub Actions và smoke HTTPS; release candidate mới đã đạt toàn bộ cổng local với 57 unit và 40 E2E trên Chromium, Firefox và WebKit. Chưa có nghiệm thu trên iOS hoặc Android thật.</w:t>
+        <w:t xml:space="preserve"> đã qua GitHub Actions và smoke HTTPS với 57 unit và 40 E2E trên Chromium, Firefox và WebKit. Chưa có nghiệm thu trên iOS hoặc Android thật.</w:t>
       </w:r>
     </w:p>
     <w:p>
@@ -4955,7 +4955,7 @@
                 <w:color w:val="211D20"/>
                 <w:sz w:val="16"/>
               </w:rPr>
-              <w:t xml:space="preserve"> ngày 12/09/2026</w:t>
+              <w:t xml:space="preserve"> ngày 13/09/2026</w:t>
             </w:r>
           </w:p>
         </w:tc>
@@ -5012,7 +5012,7 @@
                 <w:color w:val="211D20"/>
                 <w:sz w:val="16"/>
               </w:rPr>
-              <w:t>Đạt ở baseline</w:t>
+              <w:t>Đạt</w:t>
             </w:r>
           </w:p>
         </w:tc>
@@ -5046,7 +5046,7 @@
                 <w:color w:val="4A3B42"/>
                 <w:sz w:val="15"/>
               </w:rPr>
-              <w:t>34688471036</w:t>
+              <w:t>34733331145</w:t>
             </w:r>
             <w:r>
               <w:rPr>
@@ -5054,7 +5054,7 @@
                 <w:color w:val="211D20"/>
                 <w:sz w:val="16"/>
               </w:rPr>
-              <w:t xml:space="preserve"> cho commit </w:t>
+              <w:t xml:space="preserve"> cho release </w:t>
             </w:r>
             <w:r>
               <w:rPr>
@@ -5062,7 +5062,7 @@
                 <w:color w:val="4A3B42"/>
                 <w:sz w:val="15"/>
               </w:rPr>
-              <w:t>2ccbea8</w:t>
+              <w:t>6cdbbfe</w:t>
             </w:r>
             <w:r>
               <w:rPr>
@@ -5070,7 +5070,23 @@
                 <w:color w:val="211D20"/>
                 <w:sz w:val="16"/>
               </w:rPr>
-              <w:t>; release candidate chờ CI sau khi push</w:t>
+              <w:t xml:space="preserve">; smoke production run </w:t>
+            </w:r>
+            <w:r>
+              <w:rPr>
+                <w:rFonts w:ascii="Consolas" w:hAnsi="Consolas" w:eastAsia="Consolas"/>
+                <w:color w:val="4A3B42"/>
+                <w:sz w:val="15"/>
+              </w:rPr>
+              <w:t>34733348658</w:t>
+            </w:r>
+            <w:r>
+              <w:rPr>
+                <w:rFonts w:ascii="Arial" w:hAnsi="Arial" w:eastAsia="Arial"/>
+                <w:color w:val="211D20"/>
+                <w:sz w:val="16"/>
+              </w:rPr>
+              <w:t xml:space="preserve"> cũng đạt</w:t>
             </w:r>
           </w:p>
         </w:tc>
@@ -10184,6 +10200,61 @@
           </w:p>
         </w:tc>
       </w:tr>
+      <w:tr>
+        <w:trPr>
+          <w:cantSplit/>
+        </w:trPr>
+        <w:tc>
+          <w:tcPr>
+            <w:tcW w:type="dxa" w:w="3013"/>
+            <w:vAlign w:val="center"/>
+            <w:tcMar>
+              <w:top w:w="85" w:type="dxa"/>
+              <w:start w:w="120" w:type="dxa"/>
+              <w:bottom w:w="85" w:type="dxa"/>
+              <w:end w:w="120" w:type="dxa"/>
+            </w:tcMar>
+          </w:tcPr>
+          <w:p>
+            <w:pPr>
+              <w:spacing w:after="0" w:line="264" w:lineRule="auto"/>
+            </w:pPr>
+            <w:r>
+              <w:rPr>
+                <w:rFonts w:ascii="Consolas" w:hAnsi="Consolas" w:eastAsia="Consolas"/>
+                <w:color w:val="4A3B42"/>
+                <w:sz w:val="15"/>
+              </w:rPr>
+              <w:t>6cdbbfe</w:t>
+            </w:r>
+          </w:p>
+        </w:tc>
+        <w:tc>
+          <w:tcPr>
+            <w:tcW w:type="dxa" w:w="6707"/>
+            <w:vAlign w:val="center"/>
+            <w:tcMar>
+              <w:top w:w="85" w:type="dxa"/>
+              <w:start w:w="120" w:type="dxa"/>
+              <w:bottom w:w="85" w:type="dxa"/>
+              <w:end w:w="120" w:type="dxa"/>
+            </w:tcMar>
+          </w:tcPr>
+          <w:p>
+            <w:pPr>
+              <w:spacing w:after="0" w:line="264" w:lineRule="auto"/>
+            </w:pPr>
+            <w:r>
+              <w:rPr>
+                <w:rFonts w:ascii="Arial" w:hAnsi="Arial" w:eastAsia="Arial"/>
+                <w:color w:val="211D20"/>
+                <w:sz w:val="16"/>
+              </w:rPr>
+              <w:t>Khép versioning legacy, cấu trúc đề, validation snapshot và smoke đối chiếu SHA</w:t>
+            </w:r>
+          </w:p>
+        </w:tc>
+      </w:tr>
     </w:tbl>
     <w:p>
       <w:pPr>

</xml_diff>

<commit_message>
docs: rebuild the Word report, and stop its cover from drifting
The handover DOCX still said "57 unit test và 40 E2E" three releases after
that stopped being true, because the figures were typed into the generator as
well as into the document.

The cover now reads them out of HANDOVER.md - tests, end-to-end tests, routes,
accessibility screens and the update date - and the script exits with an error
if that line is missing rather than printing an old number confidently. The
rebuilt report is 219 paragraphs and 9 tables, carries the current figures, and
no longer calls 32422fa the current milestone.

HANDOVER.md itself is brought up to date: three sittings rather than two, the
second paper, the self-check criteria and the teacher pack, offline support,
the fault report, and the line saying no lesson has been validated by a teacher.

Co-Authored-By: Claude Opus 5 <noreply@anthropic.com>
Claude-Session: https://claude.ai/code/session_01W75mjctkB2SZty7ogWDMjM
</commit_message>
<xml_diff>
--- a/docs/Bao-cao-ban-giao-May-VSTEP.docx
+++ b/docs/Bao-cao-ban-giao-May-VSTEP.docx
@@ -139,7 +139,7 @@
                 <w:color w:val="211D20"/>
                 <w:sz w:val="18"/>
               </w:rPr>
-              <w:t>13/09/2026</w:t>
+              <w:t>14/09/2026</w:t>
             </w:r>
           </w:p>
         </w:tc>
@@ -443,7 +443,7 @@
           <w:color w:val="211D20"/>
           <w:sz w:val="22"/>
         </w:rPr>
-        <w:t>Bản code hiện đủ để Gùa pilot hằng ngày trên URL HTTPS hoặc local. Reading và Listening có phản hồi theo dạng câu cùng độ chắc chắn; transcript chỉ mở sau khi nộp. Lịch sử tương thích được nâng cấp sang snapshot; lịch ôn tách theo phiên bản; đề đang làm khóa cả học liệu và cấu trúc phần thi. Bộ kiểm thử production gồm 57 unit test và 40 E2E trên Chromium, Firefox và WebKit. Migration gia cố quyền ghi cloud đã áp dụng và hậu kiểm thành công trên Supabase production. Các điều kiện còn thiếu để nghiệm thu vận hành là đăng nhập và đồng bộ trên bản host, micro và thiết bị thật, thử đồng bộ hai thiết bị, cổng phát hành chờ CI cùng thẩm định học liệu bởi giáo viên VSTEP.</w:t>
+        <w:t>Bản code hiện đủ để Gùa pilot hằng ngày trên URL HTTPS hoặc local. Reading và Listening có phản hồi theo dạng câu cùng độ chắc chắn; transcript chỉ mở sau khi nộp. Viết và Nói có bộ tiêu chí tự kiểm tra của Mây kèm gói in được để gửi người chấm; đây không phải thang chấm của hội đồng thi. Phòng thi có hai đề đủ cấu trúc độc lập nên đo lại được sau một giai đoạn học. App mở lại được khi mất mạng, và mỗi bài học hiện rõ chưa qua thẩm định của giáo viên. Bộ kiểm thử production gồm 127 unit test và 52 E2E trên Chromium, Firefox và WebKit, build 86 route và axe trên 14 màn. Migration gia cố quyền ghi cloud đã áp dụng và hậu kiểm thành công trên Supabase production. Các điều kiện còn thiếu để nghiệm thu vận hành là đăng nhập và đồng bộ trên bản host, micro và thiết bị thật, thử đồng bộ hai thiết bị, cổng phát hành chờ CI cùng thẩm định học liệu bởi giáo viên VSTEP.</w:t>
       </w:r>
     </w:p>
     <w:p>
@@ -630,7 +630,7 @@
           <w:color w:val="211D20"/>
           <w:sz w:val="20"/>
         </w:rPr>
-        <w:t xml:space="preserve">Mây hiện là một ứng dụng luyện VSTEP cá nhân có kế hoạch học theo ngày, thư viện luyện bốn kỹ năng, hai chế độ thi có giờ, từ vựng, ôn lỗi sai, lịch sử tiến bộ, ghi âm, sao lưu và đồng bộ Supabase thủ công. Reading và Listening đã có phản hồi theo dạng câu và độ chắc chắn; phần thi có giờ cảnh báo câu bỏ trống và chỉ mở transcript Listening sau khi hoàn thành. Mỗi lượt học và đề đang làm lưu bản chụp học liệu có phiên bản, nên kết quả cũ không đổi khi ngân hàng câu hỏi được chỉnh sửa. Giao diện đã được kiểm thử tự động ở viewport máy tính và điện thoại, dùng tone hồng pastel, tối ưu cho tiếng Việt và cá nhân hóa cho Gùa. Release </w:t>
+        <w:t xml:space="preserve">Mây hiện là một ứng dụng luyện VSTEP cá nhân có kế hoạch học theo ngày, thư viện luyện bốn kỹ năng, một buổi thi rút gọn và hai đề đủ cấu trúc độc lập, từ vựng, ôn lỗi sai, lịch sử tiến bộ, ghi âm, sao lưu và đồng bộ Supabase thủ công. Reading và Listening đã có phản hồi theo dạng câu và độ chắc chắn; phần thi có giờ cảnh báo câu bỏ trống và chỉ mở transcript Listening sau khi hoàn thành. Mỗi lượt học và đề đang làm lưu bản chụp học liệu có phiên bản, nên kết quả cũ không đổi khi ngân hàng câu hỏi được chỉnh sửa. Giao diện đã được kiểm thử tự động ở viewport máy tính và điện thoại, dùng tone hồng pastel, tối ưu cho tiếng Việt và cá nhân hóa cho Gùa. Release </w:t>
       </w:r>
       <w:r>
         <w:rPr>
@@ -646,7 +646,23 @@
           <w:color w:val="211D20"/>
           <w:sz w:val="20"/>
         </w:rPr>
-        <w:t xml:space="preserve"> đã qua GitHub Actions và smoke HTTPS với 57 unit và 40 E2E trên Chromium, Firefox và WebKit. Chưa có nghiệm thu trên iOS hoặc Android thật.</w:t>
+        <w:t xml:space="preserve"> đã qua GitHub Actions và smoke HTTPS với 57 unit và 40 E2E trên Chromium, Firefox và WebKit; release </w:t>
+      </w:r>
+      <w:r>
+        <w:rPr>
+          <w:rFonts w:ascii="Consolas" w:hAnsi="Consolas" w:eastAsia="Consolas"/>
+          <w:color w:val="4A3B42"/>
+          <w:sz w:val="19"/>
+        </w:rPr>
+        <w:t>32422fa</w:t>
+      </w:r>
+      <w:r>
+        <w:rPr>
+          <w:rFonts w:ascii="Arial" w:hAnsi="Arial" w:eastAsia="Arial"/>
+          <w:color w:val="211D20"/>
+          <w:sz w:val="20"/>
+        </w:rPr>
+        <w:t xml:space="preserve"> đạt 81 unit và 44 E2E. Nhánh chính sau sáu đợt của kế hoạch 14/09 đạt 127 unit và 52 E2E trên cùng ba engine. Chưa có nghiệm thu trên iOS hoặc Android thật.</w:t>
       </w:r>
     </w:p>
     <w:p>
@@ -1894,7 +1910,7 @@
           <w:color w:val="211D20"/>
           <w:sz w:val="20"/>
         </w:rPr>
-        <w:t>14 bài luyện ngắn gồm 4 bài Đọc, 4 bài Nghe, 3 bài Viết và 3 bài Nói.</w:t>
+        <w:t>30 bài luyện ngắn gồm 12 bài Đọc, 12 bài Nghe, 3 bài Viết và 3 bài Nói.</w:t>
       </w:r>
     </w:p>
     <w:p>
@@ -1920,7 +1936,7 @@
           <w:color w:val="211D20"/>
           <w:sz w:val="20"/>
         </w:rPr>
-        <w:t>Bài Viết có đề, giới hạn thời gian gợi ý, đếm từ, nháp tự lưu, checklist tự đánh giá và bài mẫu.</w:t>
+        <w:t>Bài Viết có đề, giới hạn thời gian gợi ý, đếm từ, nháp tự lưu, bộ tiêu chí tự kiểm tra ba mức (của Mây, không phải thang chấm hội đồng thi), bài mẫu để đối chiếu và gói in được để gửi người chấm.</w:t>
       </w:r>
     </w:p>
     <w:p>
@@ -1995,7 +2011,7 @@
           <w:color w:val="211D20"/>
           <w:sz w:val="20"/>
         </w:rPr>
-        <w:t>Chế độ đủ cấu trúc 172 phút:</w:t>
+        <w:t>Chế độ đủ cấu trúc 172 phút, hai đề độc lập:</w:t>
       </w:r>
       <w:r>
         <w:rPr>
@@ -2003,7 +2019,24 @@
           <w:color w:val="211D20"/>
           <w:sz w:val="20"/>
         </w:rPr>
-        <w:t xml:space="preserve"> Nghe 40 phút với 35 câu, Đọc 60 phút với 40 câu, Viết 60 phút với email và essay, Nói 12 phút với ba phần.</w:t>
+        <w:t xml:space="preserve"> Nghe 40 phút với 35 câu, Đọc 60 phút với 40 câu, Viết 60 phút với hai bài, Nói 12 phút với ba phần. Đề 01 mở rộng bốn bài Đọc của thư viện (câu hỏi là của riêng đề) và dùng lại phần Viết/Nói của thư viện; </w:t>
+      </w:r>
+      <w:r>
+        <w:rPr>
+          <w:rFonts w:ascii="Arial" w:hAnsi="Arial" w:eastAsia="Arial"/>
+          <w:b/>
+          <w:color w:val="211D20"/>
+          <w:sz w:val="20"/>
+        </w:rPr>
+        <w:t>đề 02 không dùng chung mã bài, mã câu, ngữ liệu hay đề bài nào</w:t>
+      </w:r>
+      <w:r>
+        <w:rPr>
+          <w:rFonts w:ascii="Arial" w:hAnsi="Arial" w:eastAsia="Arial"/>
+          <w:color w:val="211D20"/>
+          <w:sz w:val="20"/>
+        </w:rPr>
+        <w:t xml:space="preserve"> với đề 01 và thư viện, nên dùng được để đo lại sau một giai đoạn học.</w:t>
       </w:r>
     </w:p>
     <w:p>
@@ -2094,7 +2127,7 @@
           <w:color w:val="211D20"/>
           <w:sz w:val="20"/>
         </w:rPr>
-        <w:t>20 từ có IPA, nghĩa tiếng Việt, ví dụ và chủ đề.</w:t>
+        <w:t>20 từ có IPA, nghĩa tiếng Việt, ví dụ và chủ đề, cộng các thẻ người học tự thêm từ chính câu "từ vựng trong ngữ cảnh" đã làm sai (10 thẻ đã viết sẵn nghĩa tiếng Việt và IPA).</w:t>
       </w:r>
     </w:p>
     <w:p>
@@ -2147,6 +2180,75 @@
           <w:sz w:val="20"/>
         </w:rPr>
         <w:t>Người học phải chọn lại đáp án trước khi xem kết quả và giải thích.</w:t>
+      </w:r>
+    </w:p>
+    <w:p>
+      <w:pPr>
+        <w:pStyle w:val="Heading2"/>
+      </w:pPr>
+      <w:r>
+        <w:rPr>
+          <w:rFonts w:ascii="Arial" w:hAnsi="Arial" w:eastAsia="Arial"/>
+          <w:color w:val="000000"/>
+          <w:sz w:val="25"/>
+        </w:rPr>
+        <w:t>4.6b Hoạt động ngoại tuyến, nguồn gốc học liệu và báo lỗi</w:t>
+      </w:r>
+    </w:p>
+    <w:p>
+      <w:pPr>
+        <w:pStyle w:val="ListBullet"/>
+      </w:pPr>
+      <w:r>
+        <w:rPr>
+          <w:rFonts w:ascii="Arial" w:hAnsi="Arial" w:eastAsia="Arial"/>
+          <w:color w:val="211D20"/>
+          <w:sz w:val="20"/>
+        </w:rPr>
+        <w:t>Service worker viết tay cho phép mở lại app khi mất mạng; không lời gọi Supabase nào bị cache, và chỉ đăng ký ở bản production.</w:t>
+      </w:r>
+    </w:p>
+    <w:p>
+      <w:pPr>
+        <w:pStyle w:val="ListBullet"/>
+      </w:pPr>
+      <w:r>
+        <w:rPr>
+          <w:rFonts w:ascii="Arial" w:hAnsi="Arial" w:eastAsia="Arial"/>
+          <w:color w:val="211D20"/>
+          <w:sz w:val="20"/>
+        </w:rPr>
+        <w:t xml:space="preserve">Mỗi bài học hiện người soạn và trạng thái thẩm định. Hiện tại </w:t>
+      </w:r>
+      <w:r>
+        <w:rPr>
+          <w:rFonts w:ascii="Arial" w:hAnsi="Arial" w:eastAsia="Arial"/>
+          <w:b/>
+          <w:color w:val="211D20"/>
+          <w:sz w:val="20"/>
+        </w:rPr>
+        <w:t>chưa bài nào qua thẩm định của giáo viên</w:t>
+      </w:r>
+      <w:r>
+        <w:rPr>
+          <w:rFonts w:ascii="Arial" w:hAnsi="Arial" w:eastAsia="Arial"/>
+          <w:color w:val="211D20"/>
+          <w:sz w:val="20"/>
+        </w:rPr>
+        <w:t>; nhãn B1/B2 là định hướng biên soạn.</w:t>
+      </w:r>
+    </w:p>
+    <w:p>
+      <w:pPr>
+        <w:pStyle w:val="ListBullet"/>
+      </w:pPr>
+      <w:r>
+        <w:rPr>
+          <w:rFonts w:ascii="Arial" w:hAnsi="Arial" w:eastAsia="Arial"/>
+          <w:color w:val="211D20"/>
+          <w:sz w:val="20"/>
+        </w:rPr>
+        <w:t>Cài đặt có nút tải file báo lỗi gồm thông tin máy, số lượng dữ liệu và tối đa 10 lỗi gần nhất; file không chứa bài viết, bản nháp hay bản ghi âm.</w:t>
       </w:r>
     </w:p>
     <w:p>
@@ -4759,7 +4861,7 @@
                 <w:color w:val="211D20"/>
                 <w:sz w:val="16"/>
               </w:rPr>
-              <w:t>Đạt trên 13 màn</w:t>
+              <w:t>Đạt trên 14 màn</w:t>
             </w:r>
           </w:p>
         </w:tc>
@@ -4867,7 +4969,7 @@
                 <w:color w:val="211D20"/>
                 <w:sz w:val="16"/>
               </w:rPr>
-              <w:t>45 route tĩnh/SSG được sinh thành công, gồm web app manifest</w:t>
+              <w:t>86 route tĩnh/SSG được sinh thành công, gồm web app manifest</w:t>
             </w:r>
           </w:p>
         </w:tc>
@@ -10255,6 +10357,175 @@
           </w:p>
         </w:tc>
       </w:tr>
+      <w:tr>
+        <w:trPr>
+          <w:cantSplit/>
+        </w:trPr>
+        <w:tc>
+          <w:tcPr>
+            <w:tcW w:type="dxa" w:w="3013"/>
+            <w:vAlign w:val="center"/>
+            <w:tcMar>
+              <w:top w:w="85" w:type="dxa"/>
+              <w:start w:w="120" w:type="dxa"/>
+              <w:bottom w:w="85" w:type="dxa"/>
+              <w:end w:w="120" w:type="dxa"/>
+            </w:tcMar>
+            <w:shd w:fill="FAF7F8"/>
+          </w:tcPr>
+          <w:p>
+            <w:pPr>
+              <w:spacing w:after="0" w:line="264" w:lineRule="auto"/>
+            </w:pPr>
+            <w:r>
+              <w:rPr>
+                <w:rFonts w:ascii="Consolas" w:hAnsi="Consolas" w:eastAsia="Consolas"/>
+                <w:color w:val="4A3B42"/>
+                <w:sz w:val="15"/>
+              </w:rPr>
+              <w:t>cf12c02</w:t>
+            </w:r>
+          </w:p>
+        </w:tc>
+        <w:tc>
+          <w:tcPr>
+            <w:tcW w:type="dxa" w:w="6707"/>
+            <w:vAlign w:val="center"/>
+            <w:tcMar>
+              <w:top w:w="85" w:type="dxa"/>
+              <w:start w:w="120" w:type="dxa"/>
+              <w:bottom w:w="85" w:type="dxa"/>
+              <w:end w:w="120" w:type="dxa"/>
+            </w:tcMar>
+            <w:shd w:fill="FAF7F8"/>
+          </w:tcPr>
+          <w:p>
+            <w:pPr>
+              <w:spacing w:after="0" w:line="264" w:lineRule="auto"/>
+            </w:pPr>
+            <w:r>
+              <w:rPr>
+                <w:rFonts w:ascii="Arial" w:hAnsi="Arial" w:eastAsia="Arial"/>
+                <w:color w:val="211D20"/>
+                <w:sz w:val="16"/>
+              </w:rPr>
+              <w:t>Bỏ chu kỳ đoán được khỏi đáp án phần Đọc (F20)</w:t>
+            </w:r>
+          </w:p>
+        </w:tc>
+      </w:tr>
+      <w:tr>
+        <w:trPr>
+          <w:cantSplit/>
+        </w:trPr>
+        <w:tc>
+          <w:tcPr>
+            <w:tcW w:type="dxa" w:w="3013"/>
+            <w:vAlign w:val="center"/>
+            <w:tcMar>
+              <w:top w:w="85" w:type="dxa"/>
+              <w:start w:w="120" w:type="dxa"/>
+              <w:bottom w:w="85" w:type="dxa"/>
+              <w:end w:w="120" w:type="dxa"/>
+            </w:tcMar>
+          </w:tcPr>
+          <w:p>
+            <w:pPr>
+              <w:spacing w:after="0" w:line="264" w:lineRule="auto"/>
+            </w:pPr>
+            <w:r>
+              <w:rPr>
+                <w:rFonts w:ascii="Consolas" w:hAnsi="Consolas" w:eastAsia="Consolas"/>
+                <w:color w:val="4A3B42"/>
+                <w:sz w:val="15"/>
+              </w:rPr>
+              <w:t>4c3554a</w:t>
+            </w:r>
+          </w:p>
+        </w:tc>
+        <w:tc>
+          <w:tcPr>
+            <w:tcW w:type="dxa" w:w="6707"/>
+            <w:vAlign w:val="center"/>
+            <w:tcMar>
+              <w:top w:w="85" w:type="dxa"/>
+              <w:start w:w="120" w:type="dxa"/>
+              <w:bottom w:w="85" w:type="dxa"/>
+              <w:end w:w="120" w:type="dxa"/>
+            </w:tcMar>
+          </w:tcPr>
+          <w:p>
+            <w:pPr>
+              <w:spacing w:after="0" w:line="264" w:lineRule="auto"/>
+            </w:pPr>
+            <w:r>
+              <w:rPr>
+                <w:rFonts w:ascii="Arial" w:hAnsi="Arial" w:eastAsia="Arial"/>
+                <w:color w:val="211D20"/>
+                <w:sz w:val="16"/>
+              </w:rPr>
+              <w:t>Đóng F14–F19: đề có câu hỏi riêng, số liệu kỹ năng, hiệu năng, phần Nói không micro</w:t>
+            </w:r>
+          </w:p>
+        </w:tc>
+      </w:tr>
+      <w:tr>
+        <w:trPr>
+          <w:cantSplit/>
+        </w:trPr>
+        <w:tc>
+          <w:tcPr>
+            <w:tcW w:type="dxa" w:w="3013"/>
+            <w:vAlign w:val="center"/>
+            <w:tcMar>
+              <w:top w:w="85" w:type="dxa"/>
+              <w:start w:w="120" w:type="dxa"/>
+              <w:bottom w:w="85" w:type="dxa"/>
+              <w:end w:w="120" w:type="dxa"/>
+            </w:tcMar>
+            <w:shd w:fill="FAF7F8"/>
+          </w:tcPr>
+          <w:p>
+            <w:pPr>
+              <w:spacing w:after="0" w:line="264" w:lineRule="auto"/>
+            </w:pPr>
+            <w:r>
+              <w:rPr>
+                <w:rFonts w:ascii="Consolas" w:hAnsi="Consolas" w:eastAsia="Consolas"/>
+                <w:color w:val="4A3B42"/>
+                <w:sz w:val="15"/>
+              </w:rPr>
+              <w:t>32422fa</w:t>
+            </w:r>
+          </w:p>
+        </w:tc>
+        <w:tc>
+          <w:tcPr>
+            <w:tcW w:type="dxa" w:w="6707"/>
+            <w:vAlign w:val="center"/>
+            <w:tcMar>
+              <w:top w:w="85" w:type="dxa"/>
+              <w:start w:w="120" w:type="dxa"/>
+              <w:bottom w:w="85" w:type="dxa"/>
+              <w:end w:w="120" w:type="dxa"/>
+            </w:tcMar>
+            <w:shd w:fill="FAF7F8"/>
+          </w:tcPr>
+          <w:p>
+            <w:pPr>
+              <w:spacing w:after="0" w:line="264" w:lineRule="auto"/>
+            </w:pPr>
+            <w:r>
+              <w:rPr>
+                <w:rFonts w:ascii="Arial" w:hAnsi="Arial" w:eastAsia="Arial"/>
+                <w:color w:val="211D20"/>
+                <w:sz w:val="16"/>
+              </w:rPr>
+              <w:t>Ma trận dạng câu cho ngân hàng câu hỏi (F13)</w:t>
+            </w:r>
+          </w:p>
+        </w:tc>
+      </w:tr>
     </w:tbl>
     <w:p>
       <w:pPr>

</xml_diff>

<commit_message>
Bỏ file thử nghiệm lọt vào đợt 3
tests/unit/tmp-audit.test.ts là script tạm dùng để rút câu ví dụ cho
thẻ từ; nó ghi ra /tmp nên CI đỏ ngay ở bước unit test. Xoá file và
sửa lại số liệu tài liệu cho khớp: 145 unit.

Co-Authored-By: Claude Opus 5 <noreply@anthropic.com>
Claude-Session: https://claude.ai/code/session_01W75mjctkB2SZty7ogWDMjM
</commit_message>
<xml_diff>
--- a/docs/Bao-cao-ban-giao-May-VSTEP.docx
+++ b/docs/Bao-cao-ban-giao-May-VSTEP.docx
@@ -443,7 +443,7 @@
           <w:color w:val="211D20"/>
           <w:sz w:val="22"/>
         </w:rPr>
-        <w:t>Bản code hiện đủ để Gùa pilot hằng ngày trên URL HTTPS hoặc local. Reading và Listening có phản hồi theo dạng câu cùng độ chắc chắn; transcript chỉ mở sau khi nộp. Viết và Nói có bộ tiêu chí tự kiểm tra của Mây kèm gói in được để gửi người chấm; đây không phải thang chấm của hội đồng thi. Phòng thi có hai đề đủ cấu trúc độc lập nên đo lại được sau một giai đoạn học. App mở lại được khi mất mạng, và mỗi bài học hiện rõ chưa qua thẩm định của giáo viên. Bộ kiểm thử production gồm 146 unit test và 54 E2E trên Chromium, Firefox và WebKit, build 98 route và axe trên 14 màn. Migration gia cố quyền ghi cloud đã áp dụng và hậu kiểm thành công trên Supabase production. Các điều kiện còn thiếu để nghiệm thu vận hành là đăng nhập và đồng bộ trên bản host, micro và thiết bị thật, thử đồng bộ hai thiết bị, cổng phát hành chờ CI cùng thẩm định học liệu bởi giáo viên VSTEP.</w:t>
+        <w:t>Bản code hiện đủ để Gùa pilot hằng ngày trên URL HTTPS hoặc local. Reading và Listening có phản hồi theo dạng câu cùng độ chắc chắn; transcript chỉ mở sau khi nộp. Viết và Nói có bộ tiêu chí tự kiểm tra của Mây kèm gói in được để gửi người chấm; đây không phải thang chấm của hội đồng thi. Phòng thi có hai đề đủ cấu trúc độc lập nên đo lại được sau một giai đoạn học. App mở lại được khi mất mạng, và mỗi bài học hiện rõ chưa qua thẩm định của giáo viên. Bộ kiểm thử production gồm 145 unit test và 54 E2E trên Chromium, Firefox và WebKit, build 98 route và axe trên 14 màn. Migration gia cố quyền ghi cloud đã áp dụng và hậu kiểm thành công trên Supabase production. Các điều kiện còn thiếu để nghiệm thu vận hành là đăng nhập và đồng bộ trên bản host, micro và thiết bị thật, thử đồng bộ hai thiết bị, cổng phát hành chờ CI cùng thẩm định học liệu bởi giáo viên VSTEP.</w:t>
       </w:r>
     </w:p>
     <w:p>
@@ -662,7 +662,7 @@
           <w:color w:val="211D20"/>
           <w:sz w:val="20"/>
         </w:rPr>
-        <w:t xml:space="preserve"> đạt 81 unit và 44 E2E. Nhánh chính sau sáu đợt của kế hoạch 14/09 và hai đợt đầu của kế hoạch tiếp theo đạt 146 unit và 54 E2E trên cùng ba engine. Chưa có nghiệm thu trên iOS hoặc Android thật.</w:t>
+        <w:t xml:space="preserve"> đạt 81 unit và 44 E2E. Nhánh chính sau sáu đợt của kế hoạch 14/09 và hai đợt đầu của kế hoạch tiếp theo đạt 145 unit và 54 E2E trên cùng ba engine. Chưa có nghiệm thu trên iOS hoặc Android thật.</w:t>
       </w:r>
     </w:p>
     <w:p>

</xml_diff>

<commit_message>
Chú giải cho 12 câu Đọc cuối của đề 01: phủ 258/258 câu (đợt 4, lô 3)
Ngân hàng câu hỏi nay có bằng chứng nguyên văn và ghi chú bốn phương
án cho toàn bộ 258 câu Đọc/Nghe, nên vòng chữa bài chạy được ở mọi
câu, kể cả khi sai trong phòng thi. Thêm một ca unit chặn câu hỏi mới
thiếu bằng chứng hoặc thiếu đủ bốn ghi chú, để mức phủ không tụt lại.

E2E "a finished full exam exposes accessible reading feedback" chọn
summary theo locator chung nên bị nhập nhằng khi chú giải thêm phần
"Phân tích các phương án còn lại" vào trong: nay chọn đúng summary của
bài. Đó là ca kiểm thử đã bắt được thay đổi thật, không phải lỗi.

Kiểm thử: 146 unit, 54 E2E, lint, tsc, build 98 route đều đạt; tài
liệu và báo cáo Word cập nhật theo mức phủ mới.

Co-Authored-By: Claude Opus 5 <noreply@anthropic.com>
Claude-Session: https://claude.ai/code/session_01W75mjctkB2SZty7ogWDMjM
</commit_message>
<xml_diff>
--- a/docs/Bao-cao-ban-giao-May-VSTEP.docx
+++ b/docs/Bao-cao-ban-giao-May-VSTEP.docx
@@ -443,7 +443,7 @@
           <w:color w:val="211D20"/>
           <w:sz w:val="22"/>
         </w:rPr>
-        <w:t>Bản code hiện đủ để Gùa pilot hằng ngày trên URL HTTPS hoặc local. Reading và Listening có phản hồi theo dạng câu cùng độ chắc chắn; transcript chỉ mở sau khi nộp. Viết và Nói có bộ tiêu chí tự kiểm tra của Mây kèm gói in được để gửi người chấm; đây không phải thang chấm của hội đồng thi. Phòng thi có hai đề đủ cấu trúc độc lập nên đo lại được sau một giai đoạn học. App mở lại được khi mất mạng, và mỗi bài học hiện rõ chưa qua thẩm định của giáo viên. Bộ kiểm thử production gồm 145 unit test và 54 E2E trên Chromium, Firefox và WebKit, build 98 route và axe trên 14 màn. Migration gia cố quyền ghi cloud đã áp dụng và hậu kiểm thành công trên Supabase production. Các điều kiện còn thiếu để nghiệm thu vận hành là đăng nhập và đồng bộ trên bản host, micro và thiết bị thật, thử đồng bộ hai thiết bị, cổng phát hành chờ CI cùng thẩm định học liệu bởi giáo viên VSTEP.</w:t>
+        <w:t>Bản code hiện đủ để Gùa pilot hằng ngày trên URL HTTPS hoặc local. Reading và Listening có phản hồi theo dạng câu cùng độ chắc chắn; transcript chỉ mở sau khi nộp. Viết và Nói có bộ tiêu chí tự kiểm tra của Mây kèm gói in được để gửi người chấm; đây không phải thang chấm của hội đồng thi. Phòng thi có hai đề đủ cấu trúc độc lập nên đo lại được sau một giai đoạn học. App mở lại được khi mất mạng, và mỗi bài học hiện rõ chưa qua thẩm định của giáo viên. Bộ kiểm thử production gồm 146 unit test và 54 E2E trên Chromium, Firefox và WebKit, build 98 route và axe trên 14 màn. Migration gia cố quyền ghi cloud đã áp dụng và hậu kiểm thành công trên Supabase production. Các điều kiện còn thiếu để nghiệm thu vận hành là đăng nhập và đồng bộ trên bản host, micro và thiết bị thật, thử đồng bộ hai thiết bị, cổng phát hành chờ CI cùng thẩm định học liệu bởi giáo viên VSTEP.</w:t>
       </w:r>
     </w:p>
     <w:p>
@@ -662,7 +662,7 @@
           <w:color w:val="211D20"/>
           <w:sz w:val="20"/>
         </w:rPr>
-        <w:t xml:space="preserve"> đạt 81 unit và 44 E2E. Nhánh chính sau sáu đợt của kế hoạch 14/09 và hai đợt đầu của kế hoạch tiếp theo đạt 145 unit và 54 E2E trên cùng ba engine. Chưa có nghiệm thu trên iOS hoặc Android thật.</w:t>
+        <w:t xml:space="preserve"> đạt 81 unit và 44 E2E. Nhánh chính sau sáu đợt của kế hoạch 14/09 và hai đợt đầu của kế hoạch tiếp theo đạt 146 unit và 54 E2E trên cùng ba engine. Chưa có nghiệm thu trên iOS hoặc Android thật.</w:t>
       </w:r>
     </w:p>
     <w:p>

</xml_diff>

<commit_message>
Diễn tập khôi phục thành một ca kiểm thử chạy mỗi lần CI chạy
"Diễn tập khôi phục từ bản sao" vẫn nằm ở danh sách phải làm tay. Nay
nó là một ca E2E trên bản production: học một bài có một câu sai, thêm
thẻ từ từ chính câu sai đó, gõ dở một bài Viết, xuất bản sao thật (đọc
đúng file vừa tải về), rồi xoá sạch máy — localStorage, sessionStorage
và cả IndexedDB bản ghi — như khi mất điện thoại; nhập lại file và
kiểm ở đúng những nơi Gùa sẽ nhìn: Tiến bộ có buổi học, Sổ lỗi còn câu
sai, Vườn từ còn thẻ tự thêm, bài Viết còn nguyên bản nháp.

Ca này cũng khoá luôn trường library mới: bản sao đi qua vòng
xuất–xoá–nhập mà lịch sử vẫn đọc đúng học liệu của nó.

Kiểm thử: 154 unit, 55 E2E (thêm 1), lint, tsc, build 98 route đều
đạt; tài liệu và báo cáo Word cập nhật.

Co-Authored-By: Claude Opus 5 <noreply@anthropic.com>
Claude-Session: https://claude.ai/code/session_01W75mjctkB2SZty7ogWDMjM
</commit_message>
<xml_diff>
--- a/docs/Bao-cao-ban-giao-May-VSTEP.docx
+++ b/docs/Bao-cao-ban-giao-May-VSTEP.docx
@@ -443,7 +443,7 @@
           <w:color w:val="211D20"/>
           <w:sz w:val="22"/>
         </w:rPr>
-        <w:t>Bản code hiện đủ để Gùa pilot hằng ngày trên URL HTTPS hoặc local. Reading và Listening có phản hồi theo dạng câu cùng độ chắc chắn; transcript chỉ mở sau khi nộp. Viết và Nói có bộ tiêu chí tự kiểm tra của Mây kèm gói in được để gửi người chấm; đây không phải thang chấm của hội đồng thi. Phòng thi có hai đề đủ cấu trúc độc lập nên đo lại được sau một giai đoạn học. App mở lại được khi mất mạng, và mỗi bài học hiện rõ chưa qua thẩm định của giáo viên. Bộ kiểm thử production gồm 154 unit test và 54 E2E trên Chromium, Firefox và WebKit, build 98 route và axe trên 14 màn. Migration gia cố quyền ghi cloud đã áp dụng và hậu kiểm thành công trên Supabase production. Các điều kiện còn thiếu để nghiệm thu vận hành là đăng nhập và đồng bộ trên bản host, micro và thiết bị thật, thử đồng bộ hai thiết bị, cổng phát hành chờ CI cùng thẩm định học liệu bởi giáo viên VSTEP.</w:t>
+        <w:t>Bản code hiện đủ để Gùa pilot hằng ngày trên URL HTTPS hoặc local. Reading và Listening có phản hồi theo dạng câu cùng độ chắc chắn; transcript chỉ mở sau khi nộp. Viết và Nói có bộ tiêu chí tự kiểm tra của Mây kèm gói in được để gửi người chấm; đây không phải thang chấm của hội đồng thi. Phòng thi có hai đề đủ cấu trúc độc lập nên đo lại được sau một giai đoạn học. App mở lại được khi mất mạng, và mỗi bài học hiện rõ chưa qua thẩm định của giáo viên. Bộ kiểm thử production gồm 154 unit test và 55 E2E trên Chromium, Firefox và WebKit, build 98 route và axe trên 14 màn. Migration gia cố quyền ghi cloud đã áp dụng và hậu kiểm thành công trên Supabase production. Các điều kiện còn thiếu để nghiệm thu vận hành là đăng nhập và đồng bộ trên bản host, micro và thiết bị thật, thử đồng bộ hai thiết bị, cổng phát hành chờ CI cùng thẩm định học liệu bởi giáo viên VSTEP.</w:t>
       </w:r>
     </w:p>
     <w:p>
@@ -662,7 +662,7 @@
           <w:color w:val="211D20"/>
           <w:sz w:val="20"/>
         </w:rPr>
-        <w:t xml:space="preserve"> đạt 81 unit và 44 E2E. Nhánh chính sau sáu đợt của kế hoạch 14/09 và hai đợt đầu của kế hoạch tiếp theo đạt 154 unit và 54 E2E trên cùng ba engine. Chưa có nghiệm thu trên iOS hoặc Android thật.</w:t>
+        <w:t xml:space="preserve"> đạt 81 unit và 44 E2E. Nhánh chính sau sáu đợt của kế hoạch 14/09 và hai đợt đầu của kế hoạch tiếp theo đạt 154 unit và 55 E2E trên cùng ba engine. Chưa có nghiệm thu trên iOS hoặc Android thật.</w:t>
       </w:r>
     </w:p>
     <w:p>

</xml_diff>

<commit_message>
Sổ lỗi sau một đề làm hỏng: cuốn sổ chứ không phải bức tường
Đo được: làm một đề đủ cấu trúc và sai toàn bộ thì Sổ lỗi nhận 75 thẻ
cùng đến hạn một lúc, và trang cũ dựng ra đủ 75 khối, mỗi khối mang
theo ngữ liệu hoặc transcript của nó. Trên điện thoại đó là một bức
tường chứ không phải cuốn sổ.

Sửa ở phần trình bày, không đụng vào thuật toán: hiện 10 thẻ đầu theo
đúng thứ tự ưu tiên cũ (câu sai dù đã chọn "Rất chắc" lên trước, rồi
tới câu sai nhiều lần nhất), nói rõ đang hiện bao nhiêu trên tổng bao
nhiêu và vì sao xếp như vậy, kèm nút xem thêm từng 10 thẻ. Lịch ôn,
thứ tự và số thẻ đến hạn không đổi.

Kiểm thử: 159 unit, 56 E2E (thêm 1: 75 câu cần sửa, trang hiện 10
khối, bấm xem thêm thành 20), lint, tsc, build 98 route đều đạt.

Co-Authored-By: Claude Opus 5 <noreply@anthropic.com>
Claude-Session: https://claude.ai/code/session_01W75mjctkB2SZty7ogWDMjM
</commit_message>
<xml_diff>
--- a/docs/Bao-cao-ban-giao-May-VSTEP.docx
+++ b/docs/Bao-cao-ban-giao-May-VSTEP.docx
@@ -443,7 +443,7 @@
           <w:color w:val="211D20"/>
           <w:sz w:val="22"/>
         </w:rPr>
-        <w:t>Bản code hiện đủ để Gùa pilot hằng ngày trên URL HTTPS hoặc local. Reading và Listening có phản hồi theo dạng câu cùng độ chắc chắn; transcript chỉ mở sau khi nộp. Viết và Nói có bộ tiêu chí tự kiểm tra của Mây kèm gói in được để gửi người chấm; đây không phải thang chấm của hội đồng thi. Phòng thi có hai đề đủ cấu trúc độc lập nên đo lại được sau một giai đoạn học. App mở lại được khi mất mạng, và mỗi bài học hiện rõ chưa qua thẩm định của giáo viên. Bộ kiểm thử production gồm 159 unit test và 55 E2E trên Chromium, Firefox và WebKit, build 98 route và axe trên 14 màn. Migration gia cố quyền ghi cloud đã áp dụng và hậu kiểm thành công trên Supabase production. Các điều kiện còn thiếu để nghiệm thu vận hành là đăng nhập và đồng bộ trên bản host, micro và thiết bị thật, thử đồng bộ hai thiết bị, cổng phát hành chờ CI cùng thẩm định học liệu bởi giáo viên VSTEP.</w:t>
+        <w:t>Bản code hiện đủ để Gùa pilot hằng ngày trên URL HTTPS hoặc local. Reading và Listening có phản hồi theo dạng câu cùng độ chắc chắn; transcript chỉ mở sau khi nộp. Viết và Nói có bộ tiêu chí tự kiểm tra của Mây kèm gói in được để gửi người chấm; đây không phải thang chấm của hội đồng thi. Phòng thi có hai đề đủ cấu trúc độc lập nên đo lại được sau một giai đoạn học. App mở lại được khi mất mạng, và mỗi bài học hiện rõ chưa qua thẩm định của giáo viên. Bộ kiểm thử production gồm 159 unit test và 56 E2E trên Chromium, Firefox và WebKit, build 98 route và axe trên 14 màn. Migration gia cố quyền ghi cloud đã áp dụng và hậu kiểm thành công trên Supabase production. Các điều kiện còn thiếu để nghiệm thu vận hành là đăng nhập và đồng bộ trên bản host, micro và thiết bị thật, thử đồng bộ hai thiết bị, cổng phát hành chờ CI cùng thẩm định học liệu bởi giáo viên VSTEP.</w:t>
       </w:r>
     </w:p>
     <w:p>
@@ -662,7 +662,7 @@
           <w:color w:val="211D20"/>
           <w:sz w:val="20"/>
         </w:rPr>
-        <w:t xml:space="preserve"> đạt 81 unit và 44 E2E. Nhánh chính sau sáu đợt của kế hoạch 14/09 và hai đợt đầu của kế hoạch tiếp theo đạt 159 unit và 55 E2E trên cùng ba engine. Chưa có nghiệm thu trên iOS hoặc Android thật.</w:t>
+        <w:t xml:space="preserve"> đạt 81 unit và 44 E2E. Nhánh chính sau sáu đợt của kế hoạch 14/09 và hai đợt đầu của kế hoạch tiếp theo đạt 159 unit và 56 E2E trên cùng ba engine. Chưa có nghiệm thu trên iOS hoặc Android thật.</w:t>
       </w:r>
     </w:p>
     <w:p>

</xml_diff>

<commit_message>
Thư viện 42 bài: tìm được bài chưa học
Thư viện đã lên 42 bài, và câu hỏi thường gặp nhất — "còn bài nào mình
chưa học?" — không còn trả lời được bằng mắt trên một lưới thẻ. Thẻ có
dấu "đã khám phá" nhưng không có cách lọc.

Thêm bộ lọc Tất cả bài · Chưa học · Đã học cạnh bộ lọc mức bài, và con
số ngay đầu trang: "42 bài tự biên soạn · còn N bài chưa học" (học hết
thì ghi "đã học hết"). Số đếm lấy từ lịch sử thật.

Kiểm thử: 160 unit, 57 E2E (thêm 1: học một bài rồi kiểm cả ba trạng
thái lọc và con số đầu trang), lint, tsc, build 98 route đều đạt.

Co-Authored-By: Claude Opus 5 <noreply@anthropic.com>
Claude-Session: https://claude.ai/code/session_01W75mjctkB2SZty7ogWDMjM
</commit_message>
<xml_diff>
--- a/docs/Bao-cao-ban-giao-May-VSTEP.docx
+++ b/docs/Bao-cao-ban-giao-May-VSTEP.docx
@@ -443,7 +443,7 @@
           <w:color w:val="211D20"/>
           <w:sz w:val="22"/>
         </w:rPr>
-        <w:t>Bản code hiện đủ để Gùa pilot hằng ngày trên URL HTTPS hoặc local. Reading và Listening có phản hồi theo dạng câu cùng độ chắc chắn; transcript chỉ mở sau khi nộp. Viết và Nói có bộ tiêu chí tự kiểm tra của Mây kèm gói in được để gửi người chấm; đây không phải thang chấm của hội đồng thi. Phòng thi có hai đề đủ cấu trúc độc lập nên đo lại được sau một giai đoạn học. App mở lại được khi mất mạng, và mỗi bài học hiện rõ chưa qua thẩm định của giáo viên. Bộ kiểm thử production gồm 160 unit test và 56 E2E trên Chromium, Firefox và WebKit, build 98 route và axe trên 14 màn. Migration gia cố quyền ghi cloud đã áp dụng và hậu kiểm thành công trên Supabase production. Các điều kiện còn thiếu để nghiệm thu vận hành là đăng nhập và đồng bộ trên bản host, micro và thiết bị thật, thử đồng bộ hai thiết bị, cổng phát hành chờ CI cùng thẩm định học liệu bởi giáo viên VSTEP.</w:t>
+        <w:t>Bản code hiện đủ để Gùa pilot hằng ngày trên URL HTTPS hoặc local. Reading và Listening có phản hồi theo dạng câu cùng độ chắc chắn; transcript chỉ mở sau khi nộp. Viết và Nói có bộ tiêu chí tự kiểm tra của Mây kèm gói in được để gửi người chấm; đây không phải thang chấm của hội đồng thi. Phòng thi có hai đề đủ cấu trúc độc lập nên đo lại được sau một giai đoạn học. App mở lại được khi mất mạng, và mỗi bài học hiện rõ chưa qua thẩm định của giáo viên. Bộ kiểm thử production gồm 160 unit test và 57 E2E trên Chromium, Firefox và WebKit, build 98 route và axe trên 14 màn. Migration gia cố quyền ghi cloud đã áp dụng và hậu kiểm thành công trên Supabase production. Các điều kiện còn thiếu để nghiệm thu vận hành là đăng nhập và đồng bộ trên bản host, micro và thiết bị thật, thử đồng bộ hai thiết bị, cổng phát hành chờ CI cùng thẩm định học liệu bởi giáo viên VSTEP.</w:t>
       </w:r>
     </w:p>
     <w:p>
@@ -662,7 +662,7 @@
           <w:color w:val="211D20"/>
           <w:sz w:val="20"/>
         </w:rPr>
-        <w:t xml:space="preserve"> đạt 81 unit và 44 E2E. Nhánh chính sau sáu đợt của kế hoạch 14/09 và hai đợt đầu của kế hoạch tiếp theo đạt 160 unit và 56 E2E trên cùng ba engine. Chưa có nghiệm thu trên iOS hoặc Android thật.</w:t>
+        <w:t xml:space="preserve"> đạt 81 unit và 44 E2E. Nhánh chính sau sáu đợt của kế hoạch 14/09 và hai đợt đầu của kế hoạch tiếp theo đạt 160 unit và 57 E2E trên cùng ba engine. Chưa có nghiệm thu trên iOS hoặc Android thật.</w:t>
       </w:r>
     </w:p>
     <w:p>

</xml_diff>

<commit_message>
Sửa "Gùacó" ở trang Lộ trình, và kiểm tên người học trên mọi trang
Dùng thử như Gùa lượt hai thấy trang Lộ trình hiện "thời gian Gùacó".
Mã JSX ngắt dòng giữa {state.profile.name} và chữ "có", mà JSX bỏ khoảng
trắng ở chỗ ngắt dòng đó. Lint, typecheck, axe và các ca kiểm thử trước
đều không thấy được vì chỉ chữ đã hiển thị mới lộ ra.

Thêm {" "} tường minh. Thêm một ca E2E đi qua 13 trang (9 trang chính và
4 bài học đại diện bốn kỹ năng) và báo lỗi nếu "Gùa" dính liền với một
chữ cái ở bên nào. Đã chạy thử trên bản chưa sửa: đỏ ở /journey; trên
bản đã sửa: xanh.

62 -> 63 E2E.

Co-Authored-By: Claude Sonnet 5.5 <noreply@anthropic.com>
Claude-Session: https://claude.ai/code/session_01W75mjctkB2SZty7ogWDMjM
</commit_message>
<xml_diff>
--- a/docs/Bao-cao-ban-giao-May-VSTEP.docx
+++ b/docs/Bao-cao-ban-giao-May-VSTEP.docx
@@ -443,7 +443,7 @@
           <w:color w:val="211D20"/>
           <w:sz w:val="22"/>
         </w:rPr>
-        <w:t>Bản code hiện đủ để Gùa pilot hằng ngày trên URL HTTPS hoặc local. Reading và Listening có phản hồi theo dạng câu cùng độ chắc chắn; transcript chỉ mở sau khi nộp. Viết và Nói có bộ tiêu chí tự kiểm tra của Mây kèm gói in được để gửi người chấm; đây không phải thang chấm của hội đồng thi. Phòng thi có hai đề đủ cấu trúc độc lập nên đo lại được sau một giai đoạn học. App mở lại được khi mất mạng, và mỗi bài học hiện rõ chưa qua thẩm định của giáo viên. Bộ kiểm thử production gồm 175 unit test và 62 E2E trên Chromium, Firefox và WebKit, build 106 route và axe trên 16 màn. Migration gia cố quyền ghi cloud đã áp dụng và hậu kiểm thành công trên Supabase production. Các điều kiện còn thiếu để nghiệm thu vận hành là đăng nhập và đồng bộ trên bản host, micro và thiết bị thật, thử đồng bộ hai thiết bị, cổng phát hành chờ CI cùng thẩm định học liệu bởi giáo viên VSTEP.</w:t>
+        <w:t>Bản code hiện đủ để Gùa pilot hằng ngày trên URL HTTPS hoặc local. Reading và Listening có phản hồi theo dạng câu cùng độ chắc chắn; transcript chỉ mở sau khi nộp. Viết và Nói có bộ tiêu chí tự kiểm tra của Mây kèm gói in được để gửi người chấm; đây không phải thang chấm của hội đồng thi. Phòng thi có hai đề đủ cấu trúc độc lập nên đo lại được sau một giai đoạn học. App mở lại được khi mất mạng, và mỗi bài học hiện rõ chưa qua thẩm định của giáo viên. Bộ kiểm thử production gồm 175 unit test và 63 E2E trên Chromium, Firefox và WebKit, build 106 route và axe trên 16 màn. Migration gia cố quyền ghi cloud đã áp dụng và hậu kiểm thành công trên Supabase production. Các điều kiện còn thiếu để nghiệm thu vận hành là đăng nhập và đồng bộ trên bản host, micro và thiết bị thật, thử đồng bộ hai thiết bị, cổng phát hành chờ CI cùng thẩm định học liệu bởi giáo viên VSTEP.</w:t>
       </w:r>
     </w:p>
     <w:p>
@@ -662,7 +662,7 @@
           <w:color w:val="211D20"/>
           <w:sz w:val="20"/>
         </w:rPr>
-        <w:t xml:space="preserve"> đạt 81 unit và 44 E2E. Nhánh chính sau sáu đợt của kế hoạch 14/09 và hai đợt đầu của kế hoạch tiếp theo đạt 175 unit và 62 E2E trên cùng ba engine. Chưa có nghiệm thu trên iOS hoặc Android thật.</w:t>
+        <w:t xml:space="preserve"> đạt 81 unit và 44 E2E. Nhánh chính sau sáu đợt của kế hoạch 14/09 và hai đợt đầu của kế hoạch tiếp theo đạt 175 unit và 63 E2E trên cùng ba engine. Chưa có nghiệm thu trên iOS hoặc Android thật.</w:t>
       </w:r>
     </w:p>
     <w:p>

</xml_diff>

<commit_message>
Import six VSTEP papers and update release reports
</commit_message>
<xml_diff>
--- a/docs/Bao-cao-ban-giao-May-VSTEP.docx
+++ b/docs/Bao-cao-ban-giao-May-VSTEP.docx
@@ -139,7 +139,7 @@
                 <w:color w:val="211D20"/>
                 <w:sz w:val="18"/>
               </w:rPr>
-              <w:t>14/09/2026</w:t>
+              <w:t>07/10/2026</w:t>
             </w:r>
           </w:p>
         </w:tc>
@@ -193,7 +193,7 @@
                 <w:color w:val="211D20"/>
                 <w:sz w:val="18"/>
               </w:rPr>
-              <w:t>Release Reading và Listening 6cdbbfe</w:t>
+              <w:t>Bản sáu đề nhập 07/10/2026</w:t>
             </w:r>
           </w:p>
         </w:tc>
@@ -443,7 +443,7 @@
           <w:color w:val="211D20"/>
           <w:sz w:val="22"/>
         </w:rPr>
-        <w:t>Bản code hiện đủ để Gùa pilot hằng ngày trên URL HTTPS hoặc local. Reading và Listening có phản hồi theo dạng câu cùng độ chắc chắn; transcript chỉ mở sau khi nộp. Viết và Nói có bộ tiêu chí tự kiểm tra của Mây kèm gói in được để gửi người chấm; đây không phải thang chấm của hội đồng thi. Phòng thi có hai đề đủ cấu trúc độc lập nên đo lại được sau một giai đoạn học. App mở lại được khi mất mạng, và mỗi bài học hiện rõ chưa qua thẩm định của giáo viên. Bộ kiểm thử production gồm 183 unit test và 67 E2E trên Chromium, Firefox và WebKit, build 106 route và axe trên 16 màn. Migration gia cố quyền ghi cloud đã áp dụng và hậu kiểm thành công trên Supabase production. Các điều kiện còn thiếu để nghiệm thu vận hành là đăng nhập và đồng bộ trên bản host, micro và thiết bị thật, thử đồng bộ hai thiết bị, cổng phát hành chờ CI cùng thẩm định học liệu bởi giáo viên VSTEP.</w:t>
+        <w:t>Bản code có sáu đề nhập đủ bốn kỹ năng và hai đề tự biên soạn. Năm đề nhập có 375 khóa đáp án Nghe/Đọc; đề 131 thiếu đáp án và transcript nên chỉ luyện, không chấm. 126 MP3 được đóng gói cùng ứng dụng. Viết và Nói lưu bài nhưng chưa được chấm tự động; bản ghi micro cần tải riêng. Bộ kiểm thử local trước khi phát hành gồm 190 unit test và 71 E2E trên Chromium, Firefox và WebKit, build 112 route và axe trên 19 màn. Migration gia cố quyền ghi cloud đã áp dụng trên Supabase production. Bản HTTPS cần đối chiếu đúng SHA và smoke sau merge; đồng bộ hai thiết bị, micro thật, quyền công bố bộ đề và thẩm định học liệu vẫn cần xác nhận.</w:t>
       </w:r>
     </w:p>
     <w:p>
@@ -630,7 +630,7 @@
           <w:color w:val="211D20"/>
           <w:sz w:val="20"/>
         </w:rPr>
-        <w:t xml:space="preserve">Mây hiện là một ứng dụng luyện VSTEP cá nhân có kế hoạch học theo ngày, thư viện luyện bốn kỹ năng, một buổi thi rút gọn và hai đề đủ cấu trúc độc lập, từ vựng, ôn lỗi sai, lịch sử tiến bộ, ghi âm, sao lưu và đồng bộ Supabase thủ công. Reading và Listening đã có phản hồi theo dạng câu và độ chắc chắn; phần thi có giờ cảnh báo câu bỏ trống và chỉ mở transcript Listening sau khi hoàn thành. Mỗi lượt học và đề đang làm lưu bản chụp học liệu có phiên bản, nên kết quả cũ không đổi khi ngân hàng câu hỏi được chỉnh sửa. Giao diện đã được kiểm thử tự động ở viewport máy tính và điện thoại, dùng tone hồng pastel, tối ưu cho tiếng Việt và cá nhân hóa cho Gùa. Release </w:t>
+        <w:t xml:space="preserve">Mây hiện là một ứng dụng luyện VSTEP cá nhân có kế hoạch học theo ngày, thư viện luyện bốn kỹ năng, một buổi thi rút gọn, hai đề tự biên soạn và sáu đề nhập từ dữ liệu chủ dự án cung cấp, từ vựng, ôn lỗi sai, lịch sử tiến bộ, ghi âm, sao lưu và đồng bộ Supabase thủ công. Reading và Listening của học liệu tự biên soạn có phản hồi theo dạng câu và độ chắc chắn; kho đề nhập hiển thị đáp án có sẵn trong nguồn sau khi nộp. Năm đề 132–135 và Review 13/09 có đáp án; đề 131 thiếu khóa đáp án và transcript nên không chấm. Các đề nhập lưu đáp án, bài viết và trạng thái trong bản sao Mây; audio ghi âm vẫn lưu riêng. Giao diện đã được kiểm thử tự động ở viewport máy tính và điện thoại, dùng tone hồng pastel, tối ưu cho tiếng Việt và cá nhân hóa cho Gùa. Release </w:t>
       </w:r>
       <w:r>
         <w:rPr>
@@ -662,7 +662,7 @@
           <w:color w:val="211D20"/>
           <w:sz w:val="20"/>
         </w:rPr>
-        <w:t xml:space="preserve"> đạt 81 unit và 44 E2E. Nhánh chính sau sáu đợt của kế hoạch 14/09 và hai đợt đầu của kế hoạch tiếp theo đạt 183 unit và 67 E2E trên cùng ba engine. Chưa có nghiệm thu trên iOS hoặc Android thật.</w:t>
+        <w:t xml:space="preserve"> đạt 81 unit và 44 E2E. Bản làm việc hiện tại đạt 190 unit và 71 E2E trên cùng ba engine sau khi hoàn tất kiểm thử. Chưa có nghiệm thu trên iOS hoặc Android thật.</w:t>
       </w:r>
     </w:p>
     <w:p>
@@ -672,7 +672,7 @@
           <w:color w:val="211D20"/>
           <w:sz w:val="20"/>
         </w:rPr>
-        <w:t>Sản phẩm đủ để Gùa pilot hằng ngày trên bản HTTPS hoặc local nhằm thu thập phản hồi thực tế. Chưa nên mô tả đây là hệ luyện thi VSTEP toàn diện đã được kiểm định hoặc đã nghiệm thu vận hành. Nội dung đang là nội dung tự biên soạn, đã có hai đề đủ cấu trúc, bài Nghe dùng giọng tổng hợp và bài Viết hoặc Nói chưa có chấm điểm từ giáo viên hoặc AI. Bản host chưa được kiểm thử đăng nhập và đồng bộ bằng tài khoản thật, micro hoặc thiết bị thật của người học.</w:t>
+        <w:t>Sản phẩm đủ để Gùa pilot hằng ngày trên bản HTTPS hoặc local nhằm thu thập phản hồi thực tế. Chưa nên mô tả đây là hệ luyện thi VSTEP toàn diện đã được kiểm định hoặc đã nghiệm thu vận hành. Hai đề của Mây tự biên soạn dùng giọng tổng hợp; sáu đề nhập có MP3 gốc của bộ dữ liệu. Cả hai nguồn học liệu chưa được giáo viên của Mây thẩm định. Bài Viết hoặc Nói chưa có điểm từ giáo viên hoặc AI. Bản host chưa được kiểm thử đăng nhập và đồng bộ bằng tài khoản thật, micro hoặc thiết bị thật của người học.</w:t>
       </w:r>
     </w:p>
     <w:p>
@@ -2085,7 +2085,7 @@
           <w:color w:val="211D20"/>
           <w:sz w:val="20"/>
         </w:rPr>
-        <w:t>30 bài luyện ngắn gồm 12 bài Đọc, 12 bài Nghe, 3 bài Viết và 3 bài Nói.</w:t>
+        <w:t>42 bài luyện ngắn gồm 12 bài Đọc, 12 bài Nghe, 9 bài Viết và 9 bài Nói.</w:t>
       </w:r>
     </w:p>
     <w:p>
@@ -2289,7 +2289,7 @@
           <w:color w:val="000000"/>
           <w:sz w:val="25"/>
         </w:rPr>
-        <w:t>4.6 Từ vựng và sổ lỗi sai</w:t>
+        <w:t>4.5b Kho sáu đề nhập</w:t>
       </w:r>
     </w:p>
     <w:p>
@@ -2298,11 +2298,19 @@
       </w:pPr>
       <w:r>
         <w:rPr>
+          <w:rFonts w:ascii="Consolas" w:hAnsi="Consolas" w:eastAsia="Consolas"/>
+          <w:color w:val="4A3B42"/>
+          <w:sz w:val="19"/>
+        </w:rPr>
+        <w:t>/papers</w:t>
+      </w:r>
+      <w:r>
+        <w:rPr>
           <w:rFonts w:ascii="Arial" w:hAnsi="Arial" w:eastAsia="Arial"/>
           <w:color w:val="211D20"/>
           <w:sz w:val="20"/>
         </w:rPr>
-        <w:t>20 từ có IPA, nghĩa tiếng Việt, ví dụ và chủ đề, cộng các thẻ người học tự thêm từ chính câu "từ vựng trong ngữ cảnh" đã làm sai (10 thẻ đã viết sẵn nghĩa tiếng Việt và IPA).</w:t>
+        <w:t xml:space="preserve"> có sáu đề 131–135 và Review 13/09. Mỗi đề gồm 35 câu Nghe, 40 câu Đọc, hai bài Viết, ba phần Nói và 172 phút; 126 file MP3 đi kèm gồm 84 bài Nghe và 42 bài mẫu.</w:t>
       </w:r>
     </w:p>
     <w:p>
@@ -2315,7 +2323,7 @@
           <w:color w:val="211D20"/>
           <w:sz w:val="20"/>
         </w:rPr>
-        <w:t>Phát âm bằng giọng tổng hợp của thiết bị.</w:t>
+        <w:t>Năm đề 132–135 và Review 13/09 có đủ 375 khóa đáp án cùng lời giải. Đề 131 thiếu 75 khóa đáp án và transcript trong nguồn; giao diện cho làm bài nhưng không tạo điểm Nghe/Đọc.</w:t>
       </w:r>
     </w:p>
     <w:p>
@@ -2328,7 +2336,20 @@
           <w:color w:val="211D20"/>
           <w:sz w:val="20"/>
         </w:rPr>
-        <w:t>Lịch ôn thay đổi theo bốn mức: chưa nhớ, khó, nhớ rồi và rất chắc.</w:t>
+        <w:t>Dữ liệu lượt làm lưu cùng bản sao JSON và Supabase, theo version và dấu băm nguồn; bản ghi micro ở IndexedDB, phải tải riêng. Bản dịch chỉ mở sau khi nộp; kết quả không quy đổi sang bậc VSTEP.</w:t>
+      </w:r>
+    </w:p>
+    <w:p>
+      <w:pPr>
+        <w:pStyle w:val="Heading2"/>
+      </w:pPr>
+      <w:r>
+        <w:rPr>
+          <w:rFonts w:ascii="Arial" w:hAnsi="Arial" w:eastAsia="Arial"/>
+          <w:color w:val="000000"/>
+          <w:sz w:val="25"/>
+        </w:rPr>
+        <w:t>4.6 Từ vựng và sổ lỗi sai</w:t>
       </w:r>
     </w:p>
     <w:p>
@@ -2341,7 +2362,7 @@
           <w:color w:val="211D20"/>
           <w:sz w:val="20"/>
         </w:rPr>
-        <w:t>Câu sai từ bài luyện và đề thi được gom một lần vào sổ lỗi.</w:t>
+        <w:t>68 thẻ có IPA, nghĩa tiếng Việt, ví dụ và chủ đề, cộng các thẻ người học tự thêm từ chính câu "từ vựng trong ngữ cảnh" đã làm sai.</w:t>
       </w:r>
     </w:p>
     <w:p>
@@ -2354,6 +2375,45 @@
           <w:color w:val="211D20"/>
           <w:sz w:val="20"/>
         </w:rPr>
+        <w:t>Phát âm bằng giọng tổng hợp của thiết bị.</w:t>
+      </w:r>
+    </w:p>
+    <w:p>
+      <w:pPr>
+        <w:pStyle w:val="ListBullet"/>
+      </w:pPr>
+      <w:r>
+        <w:rPr>
+          <w:rFonts w:ascii="Arial" w:hAnsi="Arial" w:eastAsia="Arial"/>
+          <w:color w:val="211D20"/>
+          <w:sz w:val="20"/>
+        </w:rPr>
+        <w:t>Lịch ôn thay đổi theo bốn mức: chưa nhớ, khó, nhớ rồi và rất chắc.</w:t>
+      </w:r>
+    </w:p>
+    <w:p>
+      <w:pPr>
+        <w:pStyle w:val="ListBullet"/>
+      </w:pPr>
+      <w:r>
+        <w:rPr>
+          <w:rFonts w:ascii="Arial" w:hAnsi="Arial" w:eastAsia="Arial"/>
+          <w:color w:val="211D20"/>
+          <w:sz w:val="20"/>
+        </w:rPr>
+        <w:t>Câu sai từ bài luyện và đề thi được gom một lần vào sổ lỗi.</w:t>
+      </w:r>
+    </w:p>
+    <w:p>
+      <w:pPr>
+        <w:pStyle w:val="ListBullet"/>
+      </w:pPr>
+      <w:r>
+        <w:rPr>
+          <w:rFonts w:ascii="Arial" w:hAnsi="Arial" w:eastAsia="Arial"/>
+          <w:color w:val="211D20"/>
+          <w:sz w:val="20"/>
+        </w:rPr>
         <w:t>Người học phải chọn lại đáp án trước khi xem kết quả và giải thích.</w:t>
       </w:r>
     </w:p>
@@ -2488,6 +2548,19 @@
           <w:color w:val="211D20"/>
           <w:sz w:val="20"/>
         </w:rPr>
+        <w:t>Lượt làm sáu đề nhập hiện riêng trong Tiến bộ, mở lại được đáp án, bài Viết và phần Nói đã làm.</w:t>
+      </w:r>
+    </w:p>
+    <w:p>
+      <w:pPr>
+        <w:pStyle w:val="ListBullet"/>
+      </w:pPr>
+      <w:r>
+        <w:rPr>
+          <w:rFonts w:ascii="Arial" w:hAnsi="Arial" w:eastAsia="Arial"/>
+          <w:color w:val="211D20"/>
+          <w:sz w:val="20"/>
+        </w:rPr>
         <w:t>Lượt học mới lưu bản chụp tiêu đề, câu hỏi, đáp án và giải thích của đúng phiên bản học liệu đã làm; sổ lỗi và lịch sử ưu tiên bản chụp này thay vì nội dung hiện tại.</w:t>
       </w:r>
     </w:p>
@@ -2514,7 +2587,7 @@
           <w:color w:val="211D20"/>
           <w:sz w:val="20"/>
         </w:rPr>
-        <w:t>Xuất toàn bộ state học tập ra JSON.</w:t>
+        <w:t>Xuất toàn bộ state học tập, gồm lượt làm đề nhập, ra JSON.</w:t>
       </w:r>
     </w:p>
     <w:p>
@@ -2741,7 +2814,7 @@
           <w:color w:val="211D20"/>
           <w:sz w:val="20"/>
         </w:rPr>
-        <w:t>Có web app manifest, màu theme và metadata cho màn hình chính; chưa có service worker nên không cam kết offline đầy đủ.</w:t>
+        <w:t>Có web app manifest, màu theme, metadata và service worker. Trang cố định cùng bài trong kế hoạch hôm nay được lưu cho lúc mất mạng; audio của đề nhập không được tải sẵn.</w:t>
       </w:r>
     </w:p>
     <w:p>
@@ -3891,7 +3964,7 @@
           <w:color w:val="211D20"/>
           <w:sz w:val="20"/>
         </w:rPr>
-        <w:t xml:space="preserve">State phiên bản 1 gồm hồ sơ, lượt học, lịch ôn từ, lịch ôn lỗi, nháp, tâm trạng theo ngày, phiên thi đang chạy và thời điểm cập nhật. Lượt học và phiên thi mới kèm snapshot học liệu có </w:t>
+        <w:t xml:space="preserve">State phiên bản 1 gồm hồ sơ, lượt học, lịch ôn từ, lịch ôn lỗi, nháp, tâm trạng theo ngày, phiên thi đang chạy, </w:t>
       </w:r>
       <w:r>
         <w:rPr>
@@ -3899,7 +3972,7 @@
           <w:color w:val="4A3B42"/>
           <w:sz w:val="19"/>
         </w:rPr>
-        <w:t>version</w:t>
+        <w:t>paperRuns</w:t>
       </w:r>
       <w:r>
         <w:rPr>
@@ -3907,7 +3980,39 @@
           <w:color w:val="211D20"/>
           <w:sz w:val="20"/>
         </w:rPr>
-        <w:t xml:space="preserve">; dữ liệu cũ tương thích được nâng cấp sang snapshot phiên bản 1 khi đọc hoặc nhập. Phiên thi mới giữ cả snapshot bài lẫn cấu trúc từng phần; lịch ôn lỗi dùng khóa theo bài và version. </w:t>
+        <w:t xml:space="preserve"> của kho đề nhập và thời điểm cập nhật. Lượt học và phiên thi mới kèm snapshot học liệu có </w:t>
+      </w:r>
+      <w:r>
+        <w:rPr>
+          <w:rFonts w:ascii="Consolas" w:hAnsi="Consolas" w:eastAsia="Consolas"/>
+          <w:color w:val="4A3B42"/>
+          <w:sz w:val="19"/>
+        </w:rPr>
+        <w:t>version</w:t>
+      </w:r>
+      <w:r>
+        <w:rPr>
+          <w:rFonts w:ascii="Arial" w:hAnsi="Arial" w:eastAsia="Arial"/>
+          <w:color w:val="211D20"/>
+          <w:sz w:val="20"/>
+        </w:rPr>
+        <w:t xml:space="preserve">; dữ liệu cũ tương thích được nâng cấp sang snapshot phiên bản 1 khi đọc hoặc nhập. </w:t>
+      </w:r>
+      <w:r>
+        <w:rPr>
+          <w:rFonts w:ascii="Consolas" w:hAnsi="Consolas" w:eastAsia="Consolas"/>
+          <w:color w:val="4A3B42"/>
+          <w:sz w:val="19"/>
+        </w:rPr>
+        <w:t>paperRuns</w:t>
+      </w:r>
+      <w:r>
+        <w:rPr>
+          <w:rFonts w:ascii="Arial" w:hAnsi="Arial" w:eastAsia="Arial"/>
+          <w:color w:val="211D20"/>
+          <w:sz w:val="20"/>
+        </w:rPr>
+        <w:t xml:space="preserve"> là trường tùy chọn để backup cũ vẫn đọc được; mỗi lượt giữ mã đề, version, dấu băm nguồn, đáp án và bài tự luận, còn nội dung đề nằm trong JSON tĩnh. </w:t>
       </w:r>
       <w:r>
         <w:rPr>
@@ -4542,7 +4647,33 @@
           <w:color w:val="211D20"/>
           <w:sz w:val="20"/>
         </w:rPr>
-        <w:t>Trạng thái kiểm tra local sau vòng cải tiến theo báo cáo:</w:t>
+        <w:t>Bản chuẩn bị phát hành ngày 07/10/2026: ESLint, TypeScript, 190/190 Vitest, build 112 route và audit production dependency đều đạt. Playwright có 71 ca trên bản production local: 67 Chromium, 2 Firefox, 2 WebKit. Lượt đầy đủ gần nhất đạt 70/71; ca offline còn lại chỉ dùng tiêu đề cũ, đã sửa kỳ vọng và chạy lại riêng đạt. Axe kiểm tra 19 màn, gồm kho đề và Review 13/09. GitHub CI và HTTPS smoke phải được xác nhận theo đúng commit khi phát hành; kết quả local không thay thế bằng chứng đó.</w:t>
+      </w:r>
+    </w:p>
+    <w:p>
+      <w:r>
+        <w:rPr>
+          <w:rFonts w:ascii="Arial" w:hAnsi="Arial" w:eastAsia="Arial"/>
+          <w:color w:val="211D20"/>
+          <w:sz w:val="20"/>
+        </w:rPr>
+        <w:t xml:space="preserve">Bảng dưới đây ghi bằng chứng lịch sử cho release </w:t>
+      </w:r>
+      <w:r>
+        <w:rPr>
+          <w:rFonts w:ascii="Consolas" w:hAnsi="Consolas" w:eastAsia="Consolas"/>
+          <w:color w:val="4A3B42"/>
+          <w:sz w:val="19"/>
+        </w:rPr>
+        <w:t>6cdbbfe</w:t>
+      </w:r>
+      <w:r>
+        <w:rPr>
+          <w:rFonts w:ascii="Arial" w:hAnsi="Arial" w:eastAsia="Arial"/>
+          <w:color w:val="211D20"/>
+          <w:sz w:val="20"/>
+        </w:rPr>
+        <w:t xml:space="preserve"> ngày 13/09/2026; số liệu của bản làm việc hiện tại ở đầu tài liệu và QUALITY.md:</w:t>
       </w:r>
     </w:p>
     <w:tbl>
@@ -5998,7 +6129,7 @@
                 <w:color w:val="211D20"/>
                 <w:sz w:val="16"/>
               </w:rPr>
-              <w:t>Mới có một đề đủ cấu trúc</w:t>
+              <w:t>Có hai đề Mây và sáu đề nhập</w:t>
             </w:r>
           </w:p>
         </w:tc>
@@ -6023,7 +6154,7 @@
                 <w:color w:val="211D20"/>
                 <w:sz w:val="16"/>
               </w:rPr>
-              <w:t>Dùng lâu dài sẽ gặp lại ngữ liệu và đề Viết/Nói</w:t>
+              <w:t>Năm đề nhập có đáp án; nội dung và quyền sử dụng cần thẩm định</w:t>
             </w:r>
           </w:p>
         </w:tc>
@@ -6080,7 +6211,7 @@
                 <w:color w:val="211D20"/>
                 <w:sz w:val="16"/>
               </w:rPr>
-              <w:t>Chưa làm</w:t>
+              <w:t>Có MP3 ở sáu đề nhập</w:t>
             </w:r>
           </w:p>
         </w:tc>
@@ -6106,7 +6237,7 @@
                 <w:color w:val="211D20"/>
                 <w:sz w:val="16"/>
               </w:rPr>
-              <w:t>Speech synthesis khác điều kiện thi và chất lượng phụ thuộc thiết bị</w:t>
+              <w:t>Hai đề Mây vẫn dùng speech synthesis của thiết bị</w:t>
             </w:r>
           </w:p>
         </w:tc>
@@ -6487,7 +6618,7 @@
                 <w:color w:val="211D20"/>
                 <w:sz w:val="16"/>
               </w:rPr>
-              <w:t>Chưa làm</w:t>
+              <w:t>Một phần</w:t>
             </w:r>
           </w:p>
         </w:tc>
@@ -6512,7 +6643,7 @@
                 <w:color w:val="211D20"/>
                 <w:sz w:val="16"/>
               </w:rPr>
-              <w:t>Không có service worker; chỉ dữ liệu đã tải có thể còn trong cache trình duyệt</w:t>
+              <w:t>Service worker giữ trang cố định và bài hôm nay; audio đề nhập không tải sẵn</w:t>
             </w:r>
           </w:p>
         </w:tc>
@@ -8486,6 +8617,206 @@
                 <w:color w:val="4A3B42"/>
                 <w:sz w:val="15"/>
               </w:rPr>
+              <w:t>src/app/papers</w:t>
+            </w:r>
+            <w:r>
+              <w:rPr>
+                <w:rFonts w:ascii="Arial" w:hAnsi="Arial" w:eastAsia="Arial"/>
+                <w:color w:val="211D20"/>
+                <w:sz w:val="16"/>
+              </w:rPr>
+              <w:t xml:space="preserve">, </w:t>
+            </w:r>
+            <w:r>
+              <w:rPr>
+                <w:rFonts w:ascii="Consolas" w:hAnsi="Consolas" w:eastAsia="Consolas"/>
+                <w:color w:val="4A3B42"/>
+                <w:sz w:val="15"/>
+              </w:rPr>
+              <w:t>src/components/paper-runner.tsx</w:t>
+            </w:r>
+          </w:p>
+        </w:tc>
+        <w:tc>
+          <w:tcPr>
+            <w:tcW w:type="dxa" w:w="6707"/>
+            <w:vAlign w:val="center"/>
+            <w:tcMar>
+              <w:top w:w="85" w:type="dxa"/>
+              <w:start w:w="120" w:type="dxa"/>
+              <w:bottom w:w="85" w:type="dxa"/>
+              <w:end w:w="120" w:type="dxa"/>
+            </w:tcMar>
+          </w:tcPr>
+          <w:p>
+            <w:pPr>
+              <w:spacing w:after="0" w:line="264" w:lineRule="auto"/>
+            </w:pPr>
+            <w:r>
+              <w:rPr>
+                <w:rFonts w:ascii="Arial" w:hAnsi="Arial" w:eastAsia="Arial"/>
+                <w:color w:val="211D20"/>
+                <w:sz w:val="16"/>
+              </w:rPr>
+              <w:t>Kho đề nhập và luồng làm sáu đề</w:t>
+            </w:r>
+          </w:p>
+        </w:tc>
+      </w:tr>
+      <w:tr>
+        <w:trPr>
+          <w:cantSplit/>
+        </w:trPr>
+        <w:tc>
+          <w:tcPr>
+            <w:tcW w:type="dxa" w:w="3013"/>
+            <w:vAlign w:val="center"/>
+            <w:tcMar>
+              <w:top w:w="85" w:type="dxa"/>
+              <w:start w:w="120" w:type="dxa"/>
+              <w:bottom w:w="85" w:type="dxa"/>
+              <w:end w:w="120" w:type="dxa"/>
+            </w:tcMar>
+            <w:shd w:fill="FAF7F8"/>
+          </w:tcPr>
+          <w:p>
+            <w:pPr>
+              <w:spacing w:after="0" w:line="264" w:lineRule="auto"/>
+            </w:pPr>
+            <w:r>
+              <w:rPr>
+                <w:rFonts w:ascii="Consolas" w:hAnsi="Consolas" w:eastAsia="Consolas"/>
+                <w:color w:val="4A3B42"/>
+                <w:sz w:val="15"/>
+              </w:rPr>
+              <w:t>src/lib/papers.ts</w:t>
+            </w:r>
+            <w:r>
+              <w:rPr>
+                <w:rFonts w:ascii="Arial" w:hAnsi="Arial" w:eastAsia="Arial"/>
+                <w:color w:val="211D20"/>
+                <w:sz w:val="16"/>
+              </w:rPr>
+              <w:t xml:space="preserve">, </w:t>
+            </w:r>
+            <w:r>
+              <w:rPr>
+                <w:rFonts w:ascii="Consolas" w:hAnsi="Consolas" w:eastAsia="Consolas"/>
+                <w:color w:val="4A3B42"/>
+                <w:sz w:val="15"/>
+              </w:rPr>
+              <w:t>public/papers</w:t>
+            </w:r>
+          </w:p>
+        </w:tc>
+        <w:tc>
+          <w:tcPr>
+            <w:tcW w:type="dxa" w:w="6707"/>
+            <w:vAlign w:val="center"/>
+            <w:tcMar>
+              <w:top w:w="85" w:type="dxa"/>
+              <w:start w:w="120" w:type="dxa"/>
+              <w:bottom w:w="85" w:type="dxa"/>
+              <w:end w:w="120" w:type="dxa"/>
+            </w:tcMar>
+            <w:shd w:fill="FAF7F8"/>
+          </w:tcPr>
+          <w:p>
+            <w:pPr>
+              <w:spacing w:after="0" w:line="264" w:lineRule="auto"/>
+            </w:pPr>
+            <w:r>
+              <w:rPr>
+                <w:rFonts w:ascii="Arial" w:hAnsi="Arial" w:eastAsia="Arial"/>
+                <w:color w:val="211D20"/>
+                <w:sz w:val="16"/>
+              </w:rPr>
+              <w:t>Kiểu dữ liệu, JSON đề và 126 file MP3</w:t>
+            </w:r>
+          </w:p>
+        </w:tc>
+      </w:tr>
+      <w:tr>
+        <w:trPr>
+          <w:cantSplit/>
+        </w:trPr>
+        <w:tc>
+          <w:tcPr>
+            <w:tcW w:type="dxa" w:w="3013"/>
+            <w:vAlign w:val="center"/>
+            <w:tcMar>
+              <w:top w:w="85" w:type="dxa"/>
+              <w:start w:w="120" w:type="dxa"/>
+              <w:bottom w:w="85" w:type="dxa"/>
+              <w:end w:w="120" w:type="dxa"/>
+            </w:tcMar>
+          </w:tcPr>
+          <w:p>
+            <w:pPr>
+              <w:spacing w:after="0" w:line="264" w:lineRule="auto"/>
+            </w:pPr>
+            <w:r>
+              <w:rPr>
+                <w:rFonts w:ascii="Consolas" w:hAnsi="Consolas" w:eastAsia="Consolas"/>
+                <w:color w:val="4A3B42"/>
+                <w:sz w:val="15"/>
+              </w:rPr>
+              <w:t>scripts/import-papers.mjs</w:t>
+            </w:r>
+          </w:p>
+        </w:tc>
+        <w:tc>
+          <w:tcPr>
+            <w:tcW w:type="dxa" w:w="6707"/>
+            <w:vAlign w:val="center"/>
+            <w:tcMar>
+              <w:top w:w="85" w:type="dxa"/>
+              <w:start w:w="120" w:type="dxa"/>
+              <w:bottom w:w="85" w:type="dxa"/>
+              <w:end w:w="120" w:type="dxa"/>
+            </w:tcMar>
+          </w:tcPr>
+          <w:p>
+            <w:pPr>
+              <w:spacing w:after="0" w:line="264" w:lineRule="auto"/>
+            </w:pPr>
+            <w:r>
+              <w:rPr>
+                <w:rFonts w:ascii="Arial" w:hAnsi="Arial" w:eastAsia="Arial"/>
+                <w:color w:val="211D20"/>
+                <w:sz w:val="16"/>
+              </w:rPr>
+              <w:t>Nhập lại bộ đề từ dữ liệu nguồn ngoài repository</w:t>
+            </w:r>
+          </w:p>
+        </w:tc>
+      </w:tr>
+      <w:tr>
+        <w:trPr>
+          <w:cantSplit/>
+        </w:trPr>
+        <w:tc>
+          <w:tcPr>
+            <w:tcW w:type="dxa" w:w="3013"/>
+            <w:vAlign w:val="center"/>
+            <w:tcMar>
+              <w:top w:w="85" w:type="dxa"/>
+              <w:start w:w="120" w:type="dxa"/>
+              <w:bottom w:w="85" w:type="dxa"/>
+              <w:end w:w="120" w:type="dxa"/>
+            </w:tcMar>
+            <w:shd w:fill="FAF7F8"/>
+          </w:tcPr>
+          <w:p>
+            <w:pPr>
+              <w:spacing w:after="0" w:line="264" w:lineRule="auto"/>
+            </w:pPr>
+            <w:r>
+              <w:rPr>
+                <w:rFonts w:ascii="Consolas" w:hAnsi="Consolas" w:eastAsia="Consolas"/>
+                <w:color w:val="4A3B42"/>
+                <w:sz w:val="15"/>
+              </w:rPr>
               <w:t>src/components/audio-tools.tsx</w:t>
             </w:r>
           </w:p>
@@ -8500,6 +8831,7 @@
               <w:bottom w:w="85" w:type="dxa"/>
               <w:end w:w="120" w:type="dxa"/>
             </w:tcMar>
+            <w:shd w:fill="FAF7F8"/>
           </w:tcPr>
           <w:p>
             <w:pPr>
@@ -8530,7 +8862,6 @@
               <w:bottom w:w="85" w:type="dxa"/>
               <w:end w:w="120" w:type="dxa"/>
             </w:tcMar>
-            <w:shd w:fill="FAF7F8"/>
           </w:tcPr>
           <w:p>
             <w:pPr>
@@ -8556,7 +8887,6 @@
               <w:bottom w:w="85" w:type="dxa"/>
               <w:end w:w="120" w:type="dxa"/>
             </w:tcMar>
-            <w:shd w:fill="FAF7F8"/>
           </w:tcPr>
           <w:p>
             <w:pPr>
@@ -8587,6 +8917,7 @@
               <w:bottom w:w="85" w:type="dxa"/>
               <w:end w:w="120" w:type="dxa"/>
             </w:tcMar>
+            <w:shd w:fill="FAF7F8"/>
           </w:tcPr>
           <w:p>
             <w:pPr>
@@ -8612,6 +8943,7 @@
               <w:bottom w:w="85" w:type="dxa"/>
               <w:end w:w="120" w:type="dxa"/>
             </w:tcMar>
+            <w:shd w:fill="FAF7F8"/>
           </w:tcPr>
           <w:p>
             <w:pPr>
@@ -8642,7 +8974,6 @@
               <w:bottom w:w="85" w:type="dxa"/>
               <w:end w:w="120" w:type="dxa"/>
             </w:tcMar>
-            <w:shd w:fill="FAF7F8"/>
           </w:tcPr>
           <w:p>
             <w:pPr>
@@ -8668,7 +8999,6 @@
               <w:bottom w:w="85" w:type="dxa"/>
               <w:end w:w="120" w:type="dxa"/>
             </w:tcMar>
-            <w:shd w:fill="FAF7F8"/>
           </w:tcPr>
           <w:p>
             <w:pPr>
@@ -8680,7 +9010,7 @@
                 <w:color w:val="211D20"/>
                 <w:sz w:val="16"/>
               </w:rPr>
-              <w:t>14 bài ngắn, 20 từ và nguồn tham khảo</w:t>
+              <w:t>Học liệu ngắn và nguồn tham khảo</w:t>
             </w:r>
           </w:p>
         </w:tc>
@@ -8699,6 +9029,7 @@
               <w:bottom w:w="85" w:type="dxa"/>
               <w:end w:w="120" w:type="dxa"/>
             </w:tcMar>
+            <w:shd w:fill="FAF7F8"/>
           </w:tcPr>
           <w:p>
             <w:pPr>
@@ -8724,6 +9055,7 @@
               <w:bottom w:w="85" w:type="dxa"/>
               <w:end w:w="120" w:type="dxa"/>
             </w:tcMar>
+            <w:shd w:fill="FAF7F8"/>
           </w:tcPr>
           <w:p>
             <w:pPr>
@@ -8754,7 +9086,6 @@
               <w:bottom w:w="85" w:type="dxa"/>
               <w:end w:w="120" w:type="dxa"/>
             </w:tcMar>
-            <w:shd w:fill="FAF7F8"/>
           </w:tcPr>
           <w:p>
             <w:pPr>
@@ -8780,7 +9111,6 @@
               <w:bottom w:w="85" w:type="dxa"/>
               <w:end w:w="120" w:type="dxa"/>
             </w:tcMar>
-            <w:shd w:fill="FAF7F8"/>
           </w:tcPr>
           <w:p>
             <w:pPr>
@@ -8811,6 +9141,7 @@
               <w:bottom w:w="85" w:type="dxa"/>
               <w:end w:w="120" w:type="dxa"/>
             </w:tcMar>
+            <w:shd w:fill="FAF7F8"/>
           </w:tcPr>
           <w:p>
             <w:pPr>
@@ -8836,6 +9167,7 @@
               <w:bottom w:w="85" w:type="dxa"/>
               <w:end w:w="120" w:type="dxa"/>
             </w:tcMar>
+            <w:shd w:fill="FAF7F8"/>
           </w:tcPr>
           <w:p>
             <w:pPr>
@@ -8866,7 +9198,6 @@
               <w:bottom w:w="85" w:type="dxa"/>
               <w:end w:w="120" w:type="dxa"/>
             </w:tcMar>
-            <w:shd w:fill="FAF7F8"/>
           </w:tcPr>
           <w:p>
             <w:pPr>
@@ -8892,7 +9223,6 @@
               <w:bottom w:w="85" w:type="dxa"/>
               <w:end w:w="120" w:type="dxa"/>
             </w:tcMar>
-            <w:shd w:fill="FAF7F8"/>
           </w:tcPr>
           <w:p>
             <w:pPr>
@@ -8923,6 +9253,7 @@
               <w:bottom w:w="85" w:type="dxa"/>
               <w:end w:w="120" w:type="dxa"/>
             </w:tcMar>
+            <w:shd w:fill="FAF7F8"/>
           </w:tcPr>
           <w:p>
             <w:pPr>
@@ -8948,6 +9279,7 @@
               <w:bottom w:w="85" w:type="dxa"/>
               <w:end w:w="120" w:type="dxa"/>
             </w:tcMar>
+            <w:shd w:fill="FAF7F8"/>
           </w:tcPr>
           <w:p>
             <w:pPr>
@@ -8978,7 +9310,6 @@
               <w:bottom w:w="85" w:type="dxa"/>
               <w:end w:w="120" w:type="dxa"/>
             </w:tcMar>
-            <w:shd w:fill="FAF7F8"/>
           </w:tcPr>
           <w:p>
             <w:pPr>
@@ -9004,7 +9335,6 @@
               <w:bottom w:w="85" w:type="dxa"/>
               <w:end w:w="120" w:type="dxa"/>
             </w:tcMar>
-            <w:shd w:fill="FAF7F8"/>
           </w:tcPr>
           <w:p>
             <w:pPr>
@@ -9035,6 +9365,7 @@
               <w:bottom w:w="85" w:type="dxa"/>
               <w:end w:w="120" w:type="dxa"/>
             </w:tcMar>
+            <w:shd w:fill="FAF7F8"/>
           </w:tcPr>
           <w:p>
             <w:pPr>
@@ -9060,6 +9391,7 @@
               <w:bottom w:w="85" w:type="dxa"/>
               <w:end w:w="120" w:type="dxa"/>
             </w:tcMar>
+            <w:shd w:fill="FAF7F8"/>
           </w:tcPr>
           <w:p>
             <w:pPr>
@@ -9090,7 +9422,6 @@
               <w:bottom w:w="85" w:type="dxa"/>
               <w:end w:w="120" w:type="dxa"/>
             </w:tcMar>
-            <w:shd w:fill="FAF7F8"/>
           </w:tcPr>
           <w:p>
             <w:pPr>
@@ -9116,7 +9447,6 @@
               <w:bottom w:w="85" w:type="dxa"/>
               <w:end w:w="120" w:type="dxa"/>
             </w:tcMar>
-            <w:shd w:fill="FAF7F8"/>
           </w:tcPr>
           <w:p>
             <w:pPr>
@@ -9147,6 +9477,7 @@
               <w:bottom w:w="85" w:type="dxa"/>
               <w:end w:w="120" w:type="dxa"/>
             </w:tcMar>
+            <w:shd w:fill="FAF7F8"/>
           </w:tcPr>
           <w:p>
             <w:pPr>
@@ -9172,6 +9503,7 @@
               <w:bottom w:w="85" w:type="dxa"/>
               <w:end w:w="120" w:type="dxa"/>
             </w:tcMar>
+            <w:shd w:fill="FAF7F8"/>
           </w:tcPr>
           <w:p>
             <w:pPr>
@@ -9202,7 +9534,6 @@
               <w:bottom w:w="85" w:type="dxa"/>
               <w:end w:w="120" w:type="dxa"/>
             </w:tcMar>
-            <w:shd w:fill="FAF7F8"/>
           </w:tcPr>
           <w:p>
             <w:pPr>
@@ -9228,7 +9559,6 @@
               <w:bottom w:w="85" w:type="dxa"/>
               <w:end w:w="120" w:type="dxa"/>
             </w:tcMar>
-            <w:shd w:fill="FAF7F8"/>
           </w:tcPr>
           <w:p>
             <w:pPr>

</xml_diff>

<commit_message>
Record six-paper production release evidence
</commit_message>
<xml_diff>
--- a/docs/Bao-cao-ban-giao-May-VSTEP.docx
+++ b/docs/Bao-cao-ban-giao-May-VSTEP.docx
@@ -443,7 +443,7 @@
           <w:color w:val="211D20"/>
           <w:sz w:val="22"/>
         </w:rPr>
-        <w:t>Bản code có sáu đề nhập đủ bốn kỹ năng và hai đề tự biên soạn. Năm đề nhập có 375 khóa đáp án Nghe/Đọc; đề 131 thiếu đáp án và transcript nên chỉ luyện, không chấm. 126 MP3 được đóng gói cùng ứng dụng. Viết và Nói lưu bài nhưng chưa được chấm tự động; bản ghi micro cần tải riêng. Bộ kiểm thử local trước khi phát hành gồm 190 unit test và 71 E2E trên Chromium, Firefox và WebKit, build 112 route và axe trên 19 màn. Migration gia cố quyền ghi cloud đã áp dụng trên Supabase production. Bản HTTPS cần đối chiếu đúng SHA và smoke sau merge; đồng bộ hai thiết bị, micro thật, quyền công bố bộ đề và thẩm định học liệu vẫn cần xác nhận.</w:t>
+        <w:t>Bản code có sáu đề nhập đủ bốn kỹ năng và hai đề tự biên soạn. Năm đề nhập có 375 khóa đáp án Nghe/Đọc; đề 131 thiếu đáp án và transcript nên chỉ luyện, không chấm. 126 MP3 được đóng gói cùng ứng dụng. Viết và Nói lưu bài nhưng chưa được chấm tự động; bản ghi micro cần tải riêng. Bộ kiểm thử local trước khi phát hành gồm 190 unit test và 71 E2E trên Chromium, Firefox và WebKit, build 112 route và axe trên 19 màn. Migration gia cố quyền ghi cloud đã áp dụng trên Supabase production. PR #38 và smoke HTTPS đã đạt cho commit ứng dụng ff8faef; đồng bộ hai thiết bị, micro thật, quyền công bố bộ đề và thẩm định học liệu vẫn cần xác nhận.</w:t>
       </w:r>
     </w:p>
     <w:p>
@@ -731,23 +731,7 @@
           <w:color w:val="211D20"/>
           <w:sz w:val="20"/>
         </w:rPr>
-        <w:t xml:space="preserve"> đưa bản mô tả dạng chữ vào khay chia sẻ hoặc clipboard của điện thoại, mang đúng những gì bản JSON được phép mang. </w:t>
-      </w:r>
-      <w:r>
-        <w:rPr>
-          <w:rFonts w:ascii="Consolas" w:hAnsi="Consolas" w:eastAsia="Consolas"/>
-          <w:color w:val="4A3B42"/>
-          <w:sz w:val="19"/>
-        </w:rPr>
-        <w:t>scripts/vercel-ignore-build.mjs</w:t>
-      </w:r>
-      <w:r>
-        <w:rPr>
-          <w:rFonts w:ascii="Arial" w:hAnsi="Arial" w:eastAsia="Arial"/>
-          <w:color w:val="211D20"/>
-          <w:sz w:val="20"/>
-        </w:rPr>
-        <w:t xml:space="preserve"> chặn build production khi CI của đúng SHA chưa xanh và chặn cả khi không chắc, nhưng còn chờ hai ô cấu hình trên Vercel. </w:t>
+        <w:t xml:space="preserve"> đưa bản mô tả dạng chữ vào khay chia sẻ hoặc clipboard của điện thoại, mang đúng những gì bản JSON được phép mang. Chủ website đã chọn không bật cổng chờ CI của Vercel; quy trình phát hành yêu cầu CI xanh trước merge và smoke sau deploy. </w:t>
       </w:r>
       <w:hyperlink r:id="rId13">
         <w:r>
@@ -774,7 +758,7 @@
           <w:color w:val="211D20"/>
           <w:sz w:val="20"/>
         </w:rPr>
-        <w:t>Các hạng mục kỹ thuật P0 về lịch sử học liệu, kiểm tra payload cloud, timeout mạng, backup khi lỗi và smoke test sau triển khai đã hoàn thành trong mã nguồn. Migration gia cố quyền ghi Supabase đã áp dụng và hậu kiểm thành công trên production ngày 13/09/2026. Nghiệm thu thiết bị thật, cổng bắt buộc chờ CI trước deploy, thẩm định học liệu, đánh giá đầu vào và phản hồi Viết hoặc Nói vẫn đang mở và được liệt kê tại Mục 12.</w:t>
+        <w:t>Các hạng mục kỹ thuật P0 về lịch sử học liệu, kiểm tra payload cloud, timeout mạng, backup khi lỗi và smoke test sau triển khai đã hoàn thành trong mã nguồn. Migration gia cố quyền ghi Supabase đã áp dụng và hậu kiểm thành công trên production ngày 13/09/2026. Nghiệm thu thiết bị thật, thẩm định học liệu, đánh giá đầu vào và phản hồi Viết hoặc Nói vẫn đang mở và được liệt kê tại Mục 12.</w:t>
       </w:r>
     </w:p>
     <w:p>
@@ -4647,7 +4631,40 @@
           <w:color w:val="211D20"/>
           <w:sz w:val="20"/>
         </w:rPr>
-        <w:t>Bản chuẩn bị phát hành ngày 07/10/2026: ESLint, TypeScript, 190/190 Vitest, build 112 route và audit production dependency đều đạt. Playwright có 71 ca trên bản production local: 67 Chromium, 2 Firefox, 2 WebKit. Lượt đầy đủ gần nhất đạt 70/71; ca offline còn lại chỉ dùng tiêu đề cũ, đã sửa kỳ vọng và chạy lại riêng đạt. Axe kiểm tra 19 màn, gồm kho đề và Review 13/09. GitHub CI và HTTPS smoke phải được xác nhận theo đúng commit khi phát hành; kết quả local không thay thế bằng chứng đó.</w:t>
+        <w:t xml:space="preserve">Bản sáu đề ngày 07/10/2026: ESLint, TypeScript, 190/190 Vitest, build 112 route và audit production dependency đều đạt. Playwright có 71 ca trên bản production local: 67 Chromium, 2 Firefox, 2 WebKit. Lượt đầy đủ gần nhất đạt 70/71; ca offline còn lại chỉ dùng tiêu đề cũ, đã sửa kỳ vọng và chạy lại riêng đạt. Axe kiểm tra 19 màn, gồm kho đề và Review 13/09. Hai lượt CI của nhánh/PR #38 đạt; Vercel phục vụ SHA </w:t>
+      </w:r>
+      <w:r>
+        <w:rPr>
+          <w:rFonts w:ascii="Consolas" w:hAnsi="Consolas" w:eastAsia="Consolas"/>
+          <w:color w:val="4A3B42"/>
+          <w:sz w:val="19"/>
+        </w:rPr>
+        <w:t>ff8faef</w:t>
+      </w:r>
+      <w:r>
+        <w:rPr>
+          <w:rFonts w:ascii="Arial" w:hAnsi="Arial" w:eastAsia="Arial"/>
+          <w:color w:val="211D20"/>
+          <w:sz w:val="20"/>
+        </w:rPr>
+        <w:t xml:space="preserve"> và </w:t>
+      </w:r>
+      <w:hyperlink r:id="rId14">
+        <w:r>
+          <w:rPr>
+            <w:color w:val="C93B72"/>
+            <w:u w:val="single"/>
+          </w:rPr>
+          <w:t>smoke production</w:t>
+        </w:r>
+      </w:hyperlink>
+      <w:r>
+        <w:rPr>
+          <w:rFonts w:ascii="Arial" w:hAnsi="Arial" w:eastAsia="Arial"/>
+          <w:color w:val="211D20"/>
+          <w:sz w:val="20"/>
+        </w:rPr>
+        <w:t xml:space="preserve"> đạt cho chính deployment đó.</w:t>
       </w:r>
     </w:p>
     <w:p>

</xml_diff>

<commit_message>
Imported papers are the project owner's own: drop the vendor name
The owner confirmed the six imported papers are free to use and are for one learner's personal study, not shared or sold. The source label in the six paper files and the import script now reads "Bộ đề của chủ dự án, dùng cho học cá nhân"; the reports record the owner's decision, and both Word reports are rebuilt (only those lines changed).

The papers are labelled as the owner's set, not as written by Mây. History still holds the earlier name.

Co-Authored-By: Claude Sonnet 5.5 <noreply@anthropic.com>
Claude-Session: https://claude.ai/code/session_01W75mjctkB2SZty7ogWDMjM
</commit_message>
<xml_diff>
--- a/docs/Bao-cao-ban-giao-May-VSTEP.docx
+++ b/docs/Bao-cao-ban-giao-May-VSTEP.docx
@@ -443,7 +443,7 @@
           <w:color w:val="211D20"/>
           <w:sz w:val="22"/>
         </w:rPr>
-        <w:t>Bản code có sáu đề nhập đủ bốn kỹ năng và hai đề tự biên soạn. Năm đề nhập có 375 khóa đáp án Nghe/Đọc; đề 131 thiếu đáp án và transcript nên chỉ luyện, không chấm. 126 MP3 được đóng gói cùng ứng dụng. Viết và Nói lưu bài nhưng chưa được chấm tự động; bản ghi micro cần tải riêng. Bộ kiểm thử local trước khi phát hành gồm 190 unit test và 71 E2E trên Chromium, Firefox và WebKit, build 112 route và axe trên 19 màn. Migration gia cố quyền ghi cloud đã áp dụng trên Supabase production. PR #38 và smoke HTTPS đã đạt cho commit ứng dụng ff8faef; đồng bộ hai thiết bị, micro thật, quyền công bố bộ đề và thẩm định học liệu vẫn cần xác nhận.</w:t>
+        <w:t>Bản code có sáu đề nhập đủ bốn kỹ năng và hai đề tự biên soạn. Năm đề nhập có 375 khóa đáp án Nghe/Đọc; đề 131 thiếu đáp án và transcript nên chỉ luyện, không chấm. 126 MP3 được đóng gói cùng ứng dụng. Viết và Nói lưu bài nhưng chưa được chấm tự động; bản ghi micro cần tải riêng. Bộ kiểm thử local trước khi phát hành gồm 190 unit test và 71 E2E trên Chromium, Firefox và WebKit, build 112 route và axe trên 19 màn. Migration gia cố quyền ghi cloud đã áp dụng trên Supabase production. PR #38 và smoke HTTPS đã đạt cho commit ứng dụng ff8faef; đồng bộ hai thiết bị, micro thật và thẩm định học liệu vẫn cần xác nhận; sáu đề nhập chỉ dùng học cá nhân của chủ dự án.</w:t>
       </w:r>
     </w:p>
     <w:p>
@@ -6171,7 +6171,7 @@
                 <w:color w:val="211D20"/>
                 <w:sz w:val="16"/>
               </w:rPr>
-              <w:t>Năm đề nhập có đáp án; nội dung và quyền sử dụng cần thẩm định</w:t>
+              <w:t>Năm đề nhập có đáp án; nội dung cần thẩm định; dùng học cá nhân</w:t>
             </w:r>
           </w:p>
         </w:tc>

</xml_diff>

<commit_message>
Imported papers are the project owner's own: drop the vendor name (#40)
The owner confirmed the six imported papers are free to use and are for one learner's personal study, not shared or sold. The source label in the six paper files and the import script now reads "Bộ đề của chủ dự án, dùng cho học cá nhân"; the reports record the owner's decision, and both Word reports are rebuilt (only those lines changed).

The papers are labelled as the owner's set, not as written by Mây. History still holds the earlier name.


Claude-Session: https://claude.ai/code/session_01W75mjctkB2SZty7ogWDMjM

Co-authored-by: Claude <noreply@anthropic.com>
</commit_message>
<xml_diff>
--- a/docs/Bao-cao-ban-giao-May-VSTEP.docx
+++ b/docs/Bao-cao-ban-giao-May-VSTEP.docx
@@ -443,7 +443,7 @@
           <w:color w:val="211D20"/>
           <w:sz w:val="22"/>
         </w:rPr>
-        <w:t>Bản code có sáu đề nhập đủ bốn kỹ năng và hai đề tự biên soạn. Năm đề nhập có 375 khóa đáp án Nghe/Đọc; đề 131 thiếu đáp án và transcript nên chỉ luyện, không chấm. 126 MP3 được đóng gói cùng ứng dụng. Viết và Nói lưu bài nhưng chưa được chấm tự động; bản ghi micro cần tải riêng. Bộ kiểm thử local trước khi phát hành gồm 190 unit test và 71 E2E trên Chromium, Firefox và WebKit, build 112 route và axe trên 19 màn. Migration gia cố quyền ghi cloud đã áp dụng trên Supabase production. PR #38 và smoke HTTPS đã đạt cho commit ứng dụng ff8faef; đồng bộ hai thiết bị, micro thật, quyền công bố bộ đề và thẩm định học liệu vẫn cần xác nhận.</w:t>
+        <w:t>Bản code có sáu đề nhập đủ bốn kỹ năng và hai đề tự biên soạn. Năm đề nhập có 375 khóa đáp án Nghe/Đọc; đề 131 thiếu đáp án và transcript nên chỉ luyện, không chấm. 126 MP3 được đóng gói cùng ứng dụng. Viết và Nói lưu bài nhưng chưa được chấm tự động; bản ghi micro cần tải riêng. Bộ kiểm thử local trước khi phát hành gồm 190 unit test và 71 E2E trên Chromium, Firefox và WebKit, build 112 route và axe trên 19 màn. Migration gia cố quyền ghi cloud đã áp dụng trên Supabase production. PR #38 và smoke HTTPS đã đạt cho commit ứng dụng ff8faef; đồng bộ hai thiết bị, micro thật và thẩm định học liệu vẫn cần xác nhận; sáu đề nhập chỉ dùng học cá nhân của chủ dự án.</w:t>
       </w:r>
     </w:p>
     <w:p>
@@ -6171,7 +6171,7 @@
                 <w:color w:val="211D20"/>
                 <w:sz w:val="16"/>
               </w:rPr>
-              <w:t>Năm đề nhập có đáp án; nội dung và quyền sử dụng cần thẩm định</w:t>
+              <w:t>Năm đề nhập có đáp án; nội dung cần thẩm định; dùng học cá nhân</w:t>
             </w:r>
           </w:p>
         </w:tc>

</xml_diff>

<commit_message>
Document the exam-room mode and sync test counts and Word reports
Co-Authored-By: Claude Sonnet 5.5 <noreply@anthropic.com>
Claude-Session: https://claude.ai/code/session_01W75mjctkB2SZty7ogWDMjM
</commit_message>
<xml_diff>
--- a/docs/Bao-cao-ban-giao-May-VSTEP.docx
+++ b/docs/Bao-cao-ban-giao-May-VSTEP.docx
@@ -443,7 +443,7 @@
           <w:color w:val="211D20"/>
           <w:sz w:val="22"/>
         </w:rPr>
-        <w:t>Bản code có sáu đề nhập đủ bốn kỹ năng và hai đề tự biên soạn. Năm đề nhập có 375 khóa đáp án Nghe/Đọc; đề 131 thiếu đáp án và transcript nên chỉ luyện, không chấm. 126 MP3 được đóng gói cùng ứng dụng. Viết và Nói lưu bài nhưng chưa được chấm tự động; bản ghi micro cần tải riêng. Bộ kiểm thử local trước khi phát hành gồm 190 unit test và 71 E2E trên Chromium, Firefox và WebKit, build 112 route và axe trên 19 màn. Migration gia cố quyền ghi cloud đã áp dụng trên Supabase production. PR #38 và smoke HTTPS đã đạt cho commit ứng dụng ff8faef; đồng bộ hai thiết bị, micro thật và thẩm định học liệu vẫn cần xác nhận; sáu đề nhập chỉ dùng học cá nhân của chủ dự án.</w:t>
+        <w:t>Bản code có sáu đề nhập đủ bốn kỹ năng và hai đề tự biên soạn. Năm đề nhập có 375 khóa đáp án Nghe/Đọc; đề 131 thiếu đáp án và transcript nên chỉ luyện, không chấm. 126 MP3 được đóng gói cùng ứng dụng. Viết và Nói lưu bài nhưng chưa được chấm tự động; bản ghi micro cần tải riêng. Bộ kiểm thử local trước khi phát hành gồm 192 unit test và 75 E2E trên Chromium, Firefox và WebKit, build 112 route và axe trên 19 màn. Migration gia cố quyền ghi cloud đã áp dụng trên Supabase production. PR #38 và smoke HTTPS đã đạt cho commit ứng dụng ff8faef; đồng bộ hai thiết bị, micro thật và thẩm định học liệu vẫn cần xác nhận; sáu đề nhập chỉ dùng học cá nhân của chủ dự án.</w:t>
       </w:r>
     </w:p>
     <w:p>
@@ -662,7 +662,7 @@
           <w:color w:val="211D20"/>
           <w:sz w:val="20"/>
         </w:rPr>
-        <w:t xml:space="preserve"> đạt 81 unit và 44 E2E. Bản làm việc hiện tại đạt 190 unit và 71 E2E trên cùng ba engine sau khi hoàn tất kiểm thử. Chưa có nghiệm thu trên iOS hoặc Android thật.</w:t>
+        <w:t xml:space="preserve"> đạt 81 unit và 44 E2E. Bản làm việc hiện tại đạt 192 unit và 75 E2E trên cùng ba engine sau khi hoàn tất kiểm thử. Chưa có nghiệm thu trên iOS hoặc Android thật.</w:t>
       </w:r>
     </w:p>
     <w:p>
@@ -4631,7 +4631,7 @@
           <w:color w:val="211D20"/>
           <w:sz w:val="20"/>
         </w:rPr>
-        <w:t xml:space="preserve">Bản sáu đề ngày 07/10/2026: ESLint, TypeScript, 190/190 Vitest, build 112 route và audit production dependency đều đạt. Playwright có 71 ca trên bản production local: 67 Chromium, 2 Firefox, 2 WebKit. Lượt đầy đủ gần nhất đạt 70/71; ca offline còn lại chỉ dùng tiêu đề cũ, đã sửa kỳ vọng và chạy lại riêng đạt. Axe kiểm tra 19 màn, gồm kho đề và Review 13/09. Hai lượt CI của nhánh/PR #38 đạt; Vercel phục vụ SHA </w:t>
+        <w:t xml:space="preserve">Bản sáu đề ngày 07/10/2026: ESLint, TypeScript, 192/192 Vitest, build 112 route và audit production dependency đều đạt. Playwright có 75 ca trên bản production local: 71 Chromium, 2 Firefox, 2 WebKit. Sau khi thêm phòng thi mô phỏng, lượt Chromium đầy đủ đạt 71/71; Firefox và WebKit chưa chạy lại cho thay đổi này. Axe kiểm tra 19 màn, gồm kho đề và Review 13/09. Hai lượt CI của nhánh/PR #38 đạt; Vercel phục vụ SHA </w:t>
       </w:r>
       <w:r>
         <w:rPr>

</xml_diff>

<commit_message>
Exam-room mode for the imported papers (#41)
* Add exam-room mode for imported papers

Full-screen sitting with once-only Listening, split Reading with a question
palette, Writing word count and timed Speaking parts. Modelled on public
descriptions of the exam and labelled as unofficial on the check-in screen.

Co-Authored-By: Claude Sonnet 5.5 <noreply@anthropic.com>
Claude-Session: https://claude.ai/code/session_01W75mjctkB2SZty7ogWDMjM

* Document the exam-room mode and sync test counts and Word reports

Co-Authored-By: Claude Sonnet 5.5 <noreply@anthropic.com>
Claude-Session: https://claude.ai/code/session_01W75mjctkB2SZty7ogWDMjM

---------

Co-authored-by: Claude <noreply@anthropic.com>
</commit_message>
<xml_diff>
--- a/docs/Bao-cao-ban-giao-May-VSTEP.docx
+++ b/docs/Bao-cao-ban-giao-May-VSTEP.docx
@@ -443,7 +443,7 @@
           <w:color w:val="211D20"/>
           <w:sz w:val="22"/>
         </w:rPr>
-        <w:t>Bản code có sáu đề nhập đủ bốn kỹ năng và hai đề tự biên soạn. Năm đề nhập có 375 khóa đáp án Nghe/Đọc; đề 131 thiếu đáp án và transcript nên chỉ luyện, không chấm. 126 MP3 được đóng gói cùng ứng dụng. Viết và Nói lưu bài nhưng chưa được chấm tự động; bản ghi micro cần tải riêng. Bộ kiểm thử local trước khi phát hành gồm 190 unit test và 71 E2E trên Chromium, Firefox và WebKit, build 112 route và axe trên 19 màn. Migration gia cố quyền ghi cloud đã áp dụng trên Supabase production. PR #38 và smoke HTTPS đã đạt cho commit ứng dụng ff8faef; đồng bộ hai thiết bị, micro thật và thẩm định học liệu vẫn cần xác nhận; sáu đề nhập chỉ dùng học cá nhân của chủ dự án.</w:t>
+        <w:t>Bản code có sáu đề nhập đủ bốn kỹ năng và hai đề tự biên soạn. Năm đề nhập có 375 khóa đáp án Nghe/Đọc; đề 131 thiếu đáp án và transcript nên chỉ luyện, không chấm. 126 MP3 được đóng gói cùng ứng dụng. Viết và Nói lưu bài nhưng chưa được chấm tự động; bản ghi micro cần tải riêng. Bộ kiểm thử local trước khi phát hành gồm 192 unit test và 75 E2E trên Chromium, Firefox và WebKit, build 112 route và axe trên 19 màn. Migration gia cố quyền ghi cloud đã áp dụng trên Supabase production. PR #38 và smoke HTTPS đã đạt cho commit ứng dụng ff8faef; đồng bộ hai thiết bị, micro thật và thẩm định học liệu vẫn cần xác nhận; sáu đề nhập chỉ dùng học cá nhân của chủ dự án.</w:t>
       </w:r>
     </w:p>
     <w:p>
@@ -662,7 +662,7 @@
           <w:color w:val="211D20"/>
           <w:sz w:val="20"/>
         </w:rPr>
-        <w:t xml:space="preserve"> đạt 81 unit và 44 E2E. Bản làm việc hiện tại đạt 190 unit và 71 E2E trên cùng ba engine sau khi hoàn tất kiểm thử. Chưa có nghiệm thu trên iOS hoặc Android thật.</w:t>
+        <w:t xml:space="preserve"> đạt 81 unit và 44 E2E. Bản làm việc hiện tại đạt 192 unit và 75 E2E trên cùng ba engine sau khi hoàn tất kiểm thử. Chưa có nghiệm thu trên iOS hoặc Android thật.</w:t>
       </w:r>
     </w:p>
     <w:p>
@@ -4631,7 +4631,7 @@
           <w:color w:val="211D20"/>
           <w:sz w:val="20"/>
         </w:rPr>
-        <w:t xml:space="preserve">Bản sáu đề ngày 07/10/2026: ESLint, TypeScript, 190/190 Vitest, build 112 route và audit production dependency đều đạt. Playwright có 71 ca trên bản production local: 67 Chromium, 2 Firefox, 2 WebKit. Lượt đầy đủ gần nhất đạt 70/71; ca offline còn lại chỉ dùng tiêu đề cũ, đã sửa kỳ vọng và chạy lại riêng đạt. Axe kiểm tra 19 màn, gồm kho đề và Review 13/09. Hai lượt CI của nhánh/PR #38 đạt; Vercel phục vụ SHA </w:t>
+        <w:t xml:space="preserve">Bản sáu đề ngày 07/10/2026: ESLint, TypeScript, 192/192 Vitest, build 112 route và audit production dependency đều đạt. Playwright có 75 ca trên bản production local: 71 Chromium, 2 Firefox, 2 WebKit. Sau khi thêm phòng thi mô phỏng, lượt Chromium đầy đủ đạt 71/71; Firefox và WebKit chưa chạy lại cho thay đổi này. Axe kiểm tra 19 màn, gồm kho đề và Review 13/09. Hai lượt CI của nhánh/PR #38 đạt; Vercel phục vụ SHA </w:t>
       </w:r>
       <w:r>
         <w:rPr>

</xml_diff>

<commit_message>
Record the full Chromium run and refresh Word reports
Co-Authored-By: Claude Opus 5.5 <noreply@anthropic.com>
Claude-Session: https://claude.ai/code/session_01W75mjctkB2SZty7ogWDMjM
</commit_message>
<xml_diff>
--- a/docs/Bao-cao-ban-giao-May-VSTEP.docx
+++ b/docs/Bao-cao-ban-giao-May-VSTEP.docx
@@ -443,7 +443,7 @@
           <w:color w:val="211D20"/>
           <w:sz w:val="22"/>
         </w:rPr>
-        <w:t>Bản code có sáu đề nhập đủ bốn kỹ năng và hai đề tự biên soạn. Năm đề nhập có 375 khóa đáp án Nghe/Đọc; đề 131 thiếu đáp án và transcript nên chỉ luyện, không chấm. 126 MP3 được đóng gói cùng ứng dụng. Viết và Nói lưu bài nhưng chưa được chấm tự động; bản ghi micro cần tải riêng. Bộ kiểm thử local trước khi phát hành gồm 192 unit test và 75 E2E trên Chromium, Firefox và WebKit, build 112 route và axe trên 19 màn. Migration gia cố quyền ghi cloud đã áp dụng trên Supabase production. PR #38 và smoke HTTPS đã đạt cho commit ứng dụng ff8faef; đồng bộ hai thiết bị, micro thật và thẩm định học liệu vẫn cần xác nhận; sáu đề nhập chỉ dùng học cá nhân của chủ dự án.</w:t>
+        <w:t>Bản code có sáu đề nhập đủ bốn kỹ năng và hai đề tự biên soạn. Năm đề nhập có 375 khóa đáp án Nghe/Đọc; đề 131 thiếu đáp án và transcript nên chỉ luyện, không chấm. 126 MP3 được đóng gói cùng ứng dụng. Viết và Nói lưu bài nhưng chưa được chấm tự động; bản ghi micro cần tải riêng. Bộ kiểm thử local trước khi phát hành gồm 194 unit test và 76 E2E trên Chromium, Firefox và WebKit, build 112 route và axe trên 19 màn. Migration gia cố quyền ghi cloud đã áp dụng trên Supabase production. PR #38 và smoke HTTPS đã đạt cho commit ứng dụng ff8faef; đồng bộ hai thiết bị, micro thật và thẩm định học liệu vẫn cần xác nhận; sáu đề nhập chỉ dùng học cá nhân của chủ dự án.</w:t>
       </w:r>
     </w:p>
     <w:p>
@@ -662,7 +662,7 @@
           <w:color w:val="211D20"/>
           <w:sz w:val="20"/>
         </w:rPr>
-        <w:t xml:space="preserve"> đạt 81 unit và 44 E2E. Bản làm việc hiện tại đạt 192 unit và 75 E2E trên cùng ba engine sau khi hoàn tất kiểm thử. Chưa có nghiệm thu trên iOS hoặc Android thật.</w:t>
+        <w:t xml:space="preserve"> đạt 81 unit và 44 E2E. Bản làm việc hiện tại đạt 194 unit và 76 E2E trên cùng ba engine sau khi hoàn tất kiểm thử. Chưa có nghiệm thu trên iOS hoặc Android thật.</w:t>
       </w:r>
     </w:p>
     <w:p>
@@ -4631,7 +4631,7 @@
           <w:color w:val="211D20"/>
           <w:sz w:val="20"/>
         </w:rPr>
-        <w:t xml:space="preserve">Bản sáu đề ngày 07/10/2026: ESLint, TypeScript, 192/192 Vitest, build 112 route và audit production dependency đều đạt. Playwright có 75 ca trên bản production local: 71 Chromium, 2 Firefox, 2 WebKit. Sau khi thêm phòng thi mô phỏng, lượt Chromium đầy đủ đạt 71/71; Firefox và WebKit chưa chạy lại cho thay đổi này. Axe kiểm tra 19 màn, gồm kho đề và Review 13/09. Hai lượt CI của nhánh/PR #38 đạt; Vercel phục vụ SHA </w:t>
+        <w:t xml:space="preserve">Bản sáu đề ngày 07/10/2026: ESLint, TypeScript, 194/194 Vitest, build 112 route và audit production dependency đều đạt. Playwright có 76 ca trên bản production local: 72 Chromium, 2 Firefox, 2 WebKit. Sau khi thêm phòng thi mô phỏng và công cụ luyện đề, lượt Chromium đầy đủ đạt 72/72; Firefox và WebKit chưa chạy lại cho thay đổi này. Axe kiểm tra 19 màn, gồm kho đề và Review 13/09. Hai lượt CI của nhánh/PR #38 đạt; Vercel phục vụ SHA </w:t>
       </w:r>
       <w:r>
         <w:rPr>

</xml_diff>

<commit_message>
Practice tools for imported papers: single-skill sittings, part-by-part review, retry wrong answers (#42)
* Practice tools for imported papers: single-skill sittings, part-by-part review, retry wrong answers

Co-Authored-By: Claude Opus 5.5 <noreply@anthropic.com>
Claude-Session: https://claude.ai/code/session_01W75mjctkB2SZty7ogWDMjM

* Record the full Chromium run and refresh Word reports

Co-Authored-By: Claude Opus 5.5 <noreply@anthropic.com>
Claude-Session: https://claude.ai/code/session_01W75mjctkB2SZty7ogWDMjM

---------

Co-authored-by: Claude <noreply@anthropic.com>
</commit_message>
<xml_diff>
--- a/docs/Bao-cao-ban-giao-May-VSTEP.docx
+++ b/docs/Bao-cao-ban-giao-May-VSTEP.docx
@@ -443,7 +443,7 @@
           <w:color w:val="211D20"/>
           <w:sz w:val="22"/>
         </w:rPr>
-        <w:t>Bản code có sáu đề nhập đủ bốn kỹ năng và hai đề tự biên soạn. Năm đề nhập có 375 khóa đáp án Nghe/Đọc; đề 131 thiếu đáp án và transcript nên chỉ luyện, không chấm. 126 MP3 được đóng gói cùng ứng dụng. Viết và Nói lưu bài nhưng chưa được chấm tự động; bản ghi micro cần tải riêng. Bộ kiểm thử local trước khi phát hành gồm 192 unit test và 75 E2E trên Chromium, Firefox và WebKit, build 112 route và axe trên 19 màn. Migration gia cố quyền ghi cloud đã áp dụng trên Supabase production. PR #38 và smoke HTTPS đã đạt cho commit ứng dụng ff8faef; đồng bộ hai thiết bị, micro thật và thẩm định học liệu vẫn cần xác nhận; sáu đề nhập chỉ dùng học cá nhân của chủ dự án.</w:t>
+        <w:t>Bản code có sáu đề nhập đủ bốn kỹ năng và hai đề tự biên soạn. Năm đề nhập có 375 khóa đáp án Nghe/Đọc; đề 131 thiếu đáp án và transcript nên chỉ luyện, không chấm. 126 MP3 được đóng gói cùng ứng dụng. Viết và Nói lưu bài nhưng chưa được chấm tự động; bản ghi micro cần tải riêng. Bộ kiểm thử local trước khi phát hành gồm 194 unit test và 76 E2E trên Chromium, Firefox và WebKit, build 112 route và axe trên 19 màn. Migration gia cố quyền ghi cloud đã áp dụng trên Supabase production. PR #38 và smoke HTTPS đã đạt cho commit ứng dụng ff8faef; đồng bộ hai thiết bị, micro thật và thẩm định học liệu vẫn cần xác nhận; sáu đề nhập chỉ dùng học cá nhân của chủ dự án.</w:t>
       </w:r>
     </w:p>
     <w:p>
@@ -662,7 +662,7 @@
           <w:color w:val="211D20"/>
           <w:sz w:val="20"/>
         </w:rPr>
-        <w:t xml:space="preserve"> đạt 81 unit và 44 E2E. Bản làm việc hiện tại đạt 192 unit và 75 E2E trên cùng ba engine sau khi hoàn tất kiểm thử. Chưa có nghiệm thu trên iOS hoặc Android thật.</w:t>
+        <w:t xml:space="preserve"> đạt 81 unit và 44 E2E. Bản làm việc hiện tại đạt 194 unit và 76 E2E trên cùng ba engine sau khi hoàn tất kiểm thử. Chưa có nghiệm thu trên iOS hoặc Android thật.</w:t>
       </w:r>
     </w:p>
     <w:p>
@@ -4631,7 +4631,7 @@
           <w:color w:val="211D20"/>
           <w:sz w:val="20"/>
         </w:rPr>
-        <w:t xml:space="preserve">Bản sáu đề ngày 07/10/2026: ESLint, TypeScript, 192/192 Vitest, build 112 route và audit production dependency đều đạt. Playwright có 75 ca trên bản production local: 71 Chromium, 2 Firefox, 2 WebKit. Sau khi thêm phòng thi mô phỏng, lượt Chromium đầy đủ đạt 71/71; Firefox và WebKit chưa chạy lại cho thay đổi này. Axe kiểm tra 19 màn, gồm kho đề và Review 13/09. Hai lượt CI của nhánh/PR #38 đạt; Vercel phục vụ SHA </w:t>
+        <w:t xml:space="preserve">Bản sáu đề ngày 07/10/2026: ESLint, TypeScript, 194/194 Vitest, build 112 route và audit production dependency đều đạt. Playwright có 76 ca trên bản production local: 72 Chromium, 2 Firefox, 2 WebKit. Sau khi thêm phòng thi mô phỏng và công cụ luyện đề, lượt Chromium đầy đủ đạt 72/72; Firefox và WebKit chưa chạy lại cho thay đổi này. Axe kiểm tra 19 màn, gồm kho đề và Review 13/09. Hai lượt CI của nhánh/PR #38 đạt; Vercel phục vụ SHA </w:t>
       </w:r>
       <w:r>
         <w:rPr>

</xml_diff>

<commit_message>
Rare-path fixes for the paper practice tools (#43)
* Fix the practice tools' rare paths: misaligned time log, contradictory single-skill backups, check-in wording

Co-Authored-By: Claude Sonnet 5.5 <noreply@anthropic.com>
Claude-Session: https://claude.ai/code/session_01W75mjctkB2SZty7ogWDMjM

* Record the full Chromium run and refresh Word reports

Co-Authored-By: Claude Sonnet 5.5 <noreply@anthropic.com>
Claude-Session: https://claude.ai/code/session_01W75mjctkB2SZty7ogWDMjM

---------

Co-authored-by: Claude <noreply@anthropic.com>
</commit_message>
<xml_diff>
--- a/docs/Bao-cao-ban-giao-May-VSTEP.docx
+++ b/docs/Bao-cao-ban-giao-May-VSTEP.docx
@@ -443,7 +443,7 @@
           <w:color w:val="211D20"/>
           <w:sz w:val="22"/>
         </w:rPr>
-        <w:t>Bản code có sáu đề nhập đủ bốn kỹ năng và hai đề tự biên soạn. Năm đề nhập có 375 khóa đáp án Nghe/Đọc; đề 131 thiếu đáp án và transcript nên chỉ luyện, không chấm. 126 MP3 được đóng gói cùng ứng dụng. Viết và Nói lưu bài nhưng chưa được chấm tự động; bản ghi micro cần tải riêng. Bộ kiểm thử local trước khi phát hành gồm 194 unit test và 76 E2E trên Chromium, Firefox và WebKit, build 112 route và axe trên 19 màn. Migration gia cố quyền ghi cloud đã áp dụng trên Supabase production. PR #38 và smoke HTTPS đã đạt cho commit ứng dụng ff8faef; đồng bộ hai thiết bị, micro thật và thẩm định học liệu vẫn cần xác nhận; sáu đề nhập chỉ dùng học cá nhân của chủ dự án.</w:t>
+        <w:t>Bản code có sáu đề nhập đủ bốn kỹ năng và hai đề tự biên soạn. Năm đề nhập có 375 khóa đáp án Nghe/Đọc; đề 131 thiếu đáp án và transcript nên chỉ luyện, không chấm. 126 MP3 được đóng gói cùng ứng dụng. Viết và Nói lưu bài nhưng chưa được chấm tự động; bản ghi micro cần tải riêng. Bộ kiểm thử local trước khi phát hành gồm 196 unit test và 79 E2E trên Chromium, Firefox và WebKit, build 112 route và axe trên 19 màn. Migration gia cố quyền ghi cloud đã áp dụng trên Supabase production. PR #38 và smoke HTTPS đã đạt cho commit ứng dụng ff8faef; đồng bộ hai thiết bị, micro thật và thẩm định học liệu vẫn cần xác nhận; sáu đề nhập chỉ dùng học cá nhân của chủ dự án.</w:t>
       </w:r>
     </w:p>
     <w:p>
@@ -662,7 +662,7 @@
           <w:color w:val="211D20"/>
           <w:sz w:val="20"/>
         </w:rPr>
-        <w:t xml:space="preserve"> đạt 81 unit và 44 E2E. Bản làm việc hiện tại đạt 194 unit và 76 E2E trên cùng ba engine sau khi hoàn tất kiểm thử. Chưa có nghiệm thu trên iOS hoặc Android thật.</w:t>
+        <w:t xml:space="preserve"> đạt 81 unit và 44 E2E. Bản làm việc hiện tại đạt 196 unit và 79 E2E trên cùng ba engine sau khi hoàn tất kiểm thử. Chưa có nghiệm thu trên iOS hoặc Android thật.</w:t>
       </w:r>
     </w:p>
     <w:p>
@@ -4631,7 +4631,7 @@
           <w:color w:val="211D20"/>
           <w:sz w:val="20"/>
         </w:rPr>
-        <w:t xml:space="preserve">Bản sáu đề ngày 07/10/2026: ESLint, TypeScript, 194/194 Vitest, build 112 route và audit production dependency đều đạt. Playwright có 76 ca trên bản production local: 72 Chromium, 2 Firefox, 2 WebKit. Sau khi thêm phòng thi mô phỏng và công cụ luyện đề, lượt Chromium đầy đủ đạt 72/72; Firefox và WebKit chưa chạy lại cho thay đổi này. Axe kiểm tra 19 màn, gồm kho đề và Review 13/09. Hai lượt CI của nhánh/PR #38 đạt; Vercel phục vụ SHA </w:t>
+        <w:t xml:space="preserve">Bản sáu đề ngày 07/10/2026: ESLint, TypeScript, 196/196 Vitest, build 112 route và audit production dependency đều đạt. Playwright có 79 ca trên bản production local: 75 Chromium, 2 Firefox, 2 WebKit. Sau khi thêm phòng thi mô phỏng và công cụ luyện đề, lượt Chromium đầy đủ đạt 75/75; Firefox và WebKit chưa chạy lại cho thay đổi này. Axe kiểm tra 19 màn, gồm kho đề và Review 13/09. Hai lượt CI của nhánh/PR #38 đạt; Vercel phục vụ SHA </w:t>
       </w:r>
       <w:r>
         <w:rPr>

</xml_diff>

<commit_message>
Rare-path fixes for the exam-room mode (#44)
* Fix the exam room's rare paths: blocked autoplay skip, dropped recordings, dropped microphone, duplicate storage alert

Co-Authored-By: Claude Sonnet 5.5 <noreply@anthropic.com>
Claude-Session: https://claude.ai/code/session_01W75mjctkB2SZty7ogWDMjM

* Record the full Chromium run and refresh Word reports

Co-Authored-By: Claude Sonnet 5.5 <noreply@anthropic.com>
Claude-Session: https://claude.ai/code/session_01W75mjctkB2SZty7ogWDMjM

---------

Co-authored-by: Claude <noreply@anthropic.com>
</commit_message>
<xml_diff>
--- a/docs/Bao-cao-ban-giao-May-VSTEP.docx
+++ b/docs/Bao-cao-ban-giao-May-VSTEP.docx
@@ -443,7 +443,7 @@
           <w:color w:val="211D20"/>
           <w:sz w:val="22"/>
         </w:rPr>
-        <w:t>Bản code có sáu đề nhập đủ bốn kỹ năng và hai đề tự biên soạn. Năm đề nhập có 375 khóa đáp án Nghe/Đọc; đề 131 thiếu đáp án và transcript nên chỉ luyện, không chấm. 126 MP3 được đóng gói cùng ứng dụng. Viết và Nói lưu bài nhưng chưa được chấm tự động; bản ghi micro cần tải riêng. Bộ kiểm thử local trước khi phát hành gồm 196 unit test và 79 E2E trên Chromium, Firefox và WebKit, build 112 route và axe trên 19 màn. Migration gia cố quyền ghi cloud đã áp dụng trên Supabase production. PR #38 và smoke HTTPS đã đạt cho commit ứng dụng ff8faef; đồng bộ hai thiết bị, micro thật và thẩm định học liệu vẫn cần xác nhận; sáu đề nhập chỉ dùng học cá nhân của chủ dự án.</w:t>
+        <w:t>Bản code có sáu đề nhập đủ bốn kỹ năng và hai đề tự biên soạn. Năm đề nhập có 375 khóa đáp án Nghe/Đọc; đề 131 thiếu đáp án và transcript nên chỉ luyện, không chấm. 126 MP3 được đóng gói cùng ứng dụng. Viết và Nói lưu bài nhưng chưa được chấm tự động; bản ghi micro cần tải riêng. Bộ kiểm thử local trước khi phát hành gồm 196 unit test và 83 E2E trên Chromium, Firefox và WebKit, build 112 route và axe trên 19 màn. Migration gia cố quyền ghi cloud đã áp dụng trên Supabase production. PR #38 và smoke HTTPS đã đạt cho commit ứng dụng ff8faef; đồng bộ hai thiết bị, micro thật và thẩm định học liệu vẫn cần xác nhận; sáu đề nhập chỉ dùng học cá nhân của chủ dự án.</w:t>
       </w:r>
     </w:p>
     <w:p>
@@ -662,7 +662,7 @@
           <w:color w:val="211D20"/>
           <w:sz w:val="20"/>
         </w:rPr>
-        <w:t xml:space="preserve"> đạt 81 unit và 44 E2E. Bản làm việc hiện tại đạt 196 unit và 79 E2E trên cùng ba engine sau khi hoàn tất kiểm thử. Chưa có nghiệm thu trên iOS hoặc Android thật.</w:t>
+        <w:t xml:space="preserve"> đạt 81 unit và 44 E2E. Bản làm việc hiện tại đạt 196 unit và 83 E2E trên cùng ba engine sau khi hoàn tất kiểm thử. Chưa có nghiệm thu trên iOS hoặc Android thật.</w:t>
       </w:r>
     </w:p>
     <w:p>
@@ -4631,7 +4631,7 @@
           <w:color w:val="211D20"/>
           <w:sz w:val="20"/>
         </w:rPr>
-        <w:t xml:space="preserve">Bản sáu đề ngày 07/10/2026: ESLint, TypeScript, 196/196 Vitest, build 112 route và audit production dependency đều đạt. Playwright có 79 ca trên bản production local: 75 Chromium, 2 Firefox, 2 WebKit. Sau khi thêm phòng thi mô phỏng và công cụ luyện đề, lượt Chromium đầy đủ đạt 75/75; Firefox và WebKit chưa chạy lại cho thay đổi này. Axe kiểm tra 19 màn, gồm kho đề và Review 13/09. Hai lượt CI của nhánh/PR #38 đạt; Vercel phục vụ SHA </w:t>
+        <w:t xml:space="preserve">Bản sáu đề ngày 07/10/2026: ESLint, TypeScript, 196/196 Vitest, build 112 route và audit production dependency đều đạt. Playwright có 83 ca trên bản production local: 79 Chromium, 2 Firefox, 2 WebKit. Sau khi thêm phòng thi mô phỏng và công cụ luyện đề, lượt Chromium đầy đủ đạt 79/79; Firefox và WebKit chưa chạy lại cho thay đổi này. Axe kiểm tra 19 màn, gồm kho đề và Review 13/09. Hai lượt CI của nhánh/PR #38 đạt; Vercel phục vụ SHA </w:t>
       </w:r>
       <w:r>
         <w:rPr>

</xml_diff>

<commit_message>
Withdraw paper 131 from the bank
It has no answer key or transcript, so it could only be practised, never marked.
Its data, exclusive audio, import and smoke entries and wording are gone; the id
stays valid in the schema so an older backup holding a sitting of it still restores.

Co-Authored-By: Claude Sonnet 5.5 <noreply@anthropic.com>
Claude-Session: https://claude.ai/code/session_01W75mjctkB2SZty7ogWDMjM
</commit_message>
<xml_diff>
--- a/docs/Bao-cao-ban-giao-May-VSTEP.docx
+++ b/docs/Bao-cao-ban-giao-May-VSTEP.docx
@@ -193,7 +193,7 @@
                 <w:color w:val="211D20"/>
                 <w:sz w:val="18"/>
               </w:rPr>
-              <w:t>Bản sáu đề nhập 07/10/2026</w:t>
+              <w:t>Bản năm đề nhập 07/10/2026</w:t>
             </w:r>
           </w:p>
         </w:tc>
@@ -443,7 +443,7 @@
           <w:color w:val="211D20"/>
           <w:sz w:val="22"/>
         </w:rPr>
-        <w:t>Bản code có sáu đề nhập đủ bốn kỹ năng và hai đề tự biên soạn. Năm đề nhập có 375 khóa đáp án Nghe/Đọc; đề 131 thiếu đáp án và transcript nên chỉ luyện, không chấm. 126 MP3 được đóng gói cùng ứng dụng. Viết và Nói lưu bài nhưng chưa được chấm tự động; bản ghi micro cần tải riêng. Bộ kiểm thử local trước khi phát hành gồm 196 unit test và 83 E2E trên Chromium, Firefox và WebKit, build 112 route và axe trên 19 màn. Migration gia cố quyền ghi cloud đã áp dụng trên Supabase production. PR #38 và smoke HTTPS đã đạt cho commit ứng dụng ff8faef; đồng bộ hai thiết bị, micro thật và thẩm định học liệu vẫn cần xác nhận; sáu đề nhập chỉ dùng học cá nhân của chủ dự án.</w:t>
+        <w:t>Bản code có năm đề nhập đủ bốn kỹ năng và hai đề tự biên soạn. Cả năm đề nhập có 375 khóa đáp án Nghe/Đọc; đề 131 thiếu đáp án và transcript nên đã được gỡ. 105 MP3 được đóng gói cùng ứng dụng. Viết và Nói lưu bài nhưng chưa được chấm tự động; bản ghi micro cần tải riêng. Bộ kiểm thử local trước khi phát hành gồm 197 unit test và 82 E2E trên Chromium, Firefox và WebKit, build 111 route và axe trên 19 màn. Migration gia cố quyền ghi cloud đã áp dụng trên Supabase production. PR #38 và smoke HTTPS đã đạt cho commit ứng dụng ff8faef; đồng bộ hai thiết bị, micro thật và thẩm định học liệu vẫn cần xác nhận; sáu đề nhập chỉ dùng học cá nhân của chủ dự án.</w:t>
       </w:r>
     </w:p>
     <w:p>
@@ -630,7 +630,7 @@
           <w:color w:val="211D20"/>
           <w:sz w:val="20"/>
         </w:rPr>
-        <w:t xml:space="preserve">Mây hiện là một ứng dụng luyện VSTEP cá nhân có kế hoạch học theo ngày, thư viện luyện bốn kỹ năng, một buổi thi rút gọn, hai đề tự biên soạn và sáu đề nhập từ dữ liệu chủ dự án cung cấp, từ vựng, ôn lỗi sai, lịch sử tiến bộ, ghi âm, sao lưu và đồng bộ Supabase thủ công. Reading và Listening của học liệu tự biên soạn có phản hồi theo dạng câu và độ chắc chắn; kho đề nhập hiển thị đáp án có sẵn trong nguồn sau khi nộp. Năm đề 132–135 và Review 13/09 có đáp án; đề 131 thiếu khóa đáp án và transcript nên không chấm. Các đề nhập lưu đáp án, bài viết và trạng thái trong bản sao Mây; audio ghi âm vẫn lưu riêng. Giao diện đã được kiểm thử tự động ở viewport máy tính và điện thoại, dùng tone hồng pastel, tối ưu cho tiếng Việt và cá nhân hóa cho Gùa. Release </w:t>
+        <w:t xml:space="preserve">Mây hiện là một ứng dụng luyện VSTEP cá nhân có kế hoạch học theo ngày, thư viện luyện bốn kỹ năng, một buổi thi rút gọn, hai đề tự biên soạn và năm đề nhập từ dữ liệu chủ dự án cung cấp, từ vựng, ôn lỗi sai, lịch sử tiến bộ, ghi âm, sao lưu và đồng bộ Supabase thủ công. Reading và Listening của học liệu tự biên soạn có phản hồi theo dạng câu và độ chắc chắn; kho đề nhập hiển thị đáp án có sẵn trong nguồn sau khi nộp. Cả năm đề nhập đều có đáp án; đề 131 thiếu khóa đáp án và transcript nên đã được gỡ khỏi kho. Các đề nhập lưu đáp án, bài viết và trạng thái trong bản sao Mây; audio ghi âm vẫn lưu riêng. Giao diện đã được kiểm thử tự động ở viewport máy tính và điện thoại, dùng tone hồng pastel, tối ưu cho tiếng Việt và cá nhân hóa cho Gùa. Release </w:t>
       </w:r>
       <w:r>
         <w:rPr>
@@ -662,7 +662,7 @@
           <w:color w:val="211D20"/>
           <w:sz w:val="20"/>
         </w:rPr>
-        <w:t xml:space="preserve"> đạt 81 unit và 44 E2E. Bản làm việc hiện tại đạt 196 unit và 83 E2E trên cùng ba engine sau khi hoàn tất kiểm thử. Chưa có nghiệm thu trên iOS hoặc Android thật.</w:t>
+        <w:t xml:space="preserve"> đạt 81 unit và 44 E2E. Bản làm việc hiện tại đạt 197 unit và 82 E2E trên cùng ba engine sau khi hoàn tất kiểm thử. Chưa có nghiệm thu trên iOS hoặc Android thật.</w:t>
       </w:r>
     </w:p>
     <w:p>
@@ -2273,7 +2273,7 @@
           <w:color w:val="000000"/>
           <w:sz w:val="25"/>
         </w:rPr>
-        <w:t>4.5b Kho sáu đề nhập</w:t>
+        <w:t>4.5b Kho năm đề nhập</w:t>
       </w:r>
     </w:p>
     <w:p>
@@ -2294,7 +2294,7 @@
           <w:color w:val="211D20"/>
           <w:sz w:val="20"/>
         </w:rPr>
-        <w:t xml:space="preserve"> có sáu đề 131–135 và Review 13/09. Mỗi đề gồm 35 câu Nghe, 40 câu Đọc, hai bài Viết, ba phần Nói và 172 phút; 126 file MP3 đi kèm gồm 84 bài Nghe và 42 bài mẫu.</w:t>
+        <w:t xml:space="preserve"> có năm đề 132–135 và Review 13/09. Mỗi đề gồm 35 câu Nghe, 40 câu Đọc, hai bài Viết, ba phần Nói và 172 phút; 105 file MP3 đi kèm gồm 70 bài Nghe và 35 bài mẫu.</w:t>
       </w:r>
     </w:p>
     <w:p>
@@ -2307,7 +2307,23 @@
           <w:color w:val="211D20"/>
           <w:sz w:val="20"/>
         </w:rPr>
-        <w:t>Năm đề 132–135 và Review 13/09 có đủ 375 khóa đáp án cùng lời giải. Đề 131 thiếu 75 khóa đáp án và transcript trong nguồn; giao diện cho làm bài nhưng không tạo điểm Nghe/Đọc.</w:t>
+        <w:t xml:space="preserve">Cả năm đề có đủ 375 khóa đáp án cùng lời giải. Đề 131 từng có trong kho nhưng thiếu 75 khóa đáp án và transcript nên đã được gỡ ngày 07/10/2026. Mã </w:t>
+      </w:r>
+      <w:r>
+        <w:rPr>
+          <w:rFonts w:ascii="Consolas" w:hAnsi="Consolas" w:eastAsia="Consolas"/>
+          <w:color w:val="4A3B42"/>
+          <w:sz w:val="19"/>
+        </w:rPr>
+        <w:t>131</w:t>
+      </w:r>
+      <w:r>
+        <w:rPr>
+          <w:rFonts w:ascii="Arial" w:hAnsi="Arial" w:eastAsia="Arial"/>
+          <w:color w:val="211D20"/>
+          <w:sz w:val="20"/>
+        </w:rPr>
+        <w:t xml:space="preserve"> vẫn là mã hợp lệ trong schema để bản sao lưu cũ có lượt làm đề này vẫn khôi phục được; không màn hình nào liệt kê lượt đó.</w:t>
       </w:r>
     </w:p>
     <w:p>
@@ -2532,7 +2548,7 @@
           <w:color w:val="211D20"/>
           <w:sz w:val="20"/>
         </w:rPr>
-        <w:t>Lượt làm sáu đề nhập hiện riêng trong Tiến bộ, mở lại được đáp án, bài Viết và phần Nói đã làm.</w:t>
+        <w:t>Lượt làm năm đề nhập hiện riêng trong Tiến bộ, mở lại được đáp án, bài Viết và phần Nói đã làm.</w:t>
       </w:r>
     </w:p>
     <w:p>
@@ -4631,7 +4647,7 @@
           <w:color w:val="211D20"/>
           <w:sz w:val="20"/>
         </w:rPr>
-        <w:t xml:space="preserve">Bản sáu đề ngày 07/10/2026: ESLint, TypeScript, 196/196 Vitest, build 112 route và audit production dependency đều đạt. Playwright có 83 ca trên bản production local: 79 Chromium, 2 Firefox, 2 WebKit. Sau khi thêm phòng thi mô phỏng và công cụ luyện đề, lượt Chromium đầy đủ đạt 79/79; Firefox và WebKit chưa chạy lại cho thay đổi này. Axe kiểm tra 19 màn, gồm kho đề và Review 13/09. Hai lượt CI của nhánh/PR #38 đạt; Vercel phục vụ SHA </w:t>
+        <w:t xml:space="preserve">Bản sáu đề ngày 07/10/2026: ESLint, TypeScript, 197/197 Vitest, build 111 route và audit production dependency đều đạt. Playwright có 82 ca trên bản production local: 78 Chromium, 2 Firefox, 2 WebKit. Sau khi thêm phòng thi mô phỏng và công cụ luyện đề, lượt Chromium đầy đủ đạt 78/78; Firefox và WebKit chưa chạy lại cho thay đổi này. Axe kiểm tra 19 màn, gồm kho đề và Review 13/09. Hai lượt CI của nhánh/PR #38 đạt; Vercel phục vụ SHA </w:t>
       </w:r>
       <w:r>
         <w:rPr>
@@ -6146,7 +6162,7 @@
                 <w:color w:val="211D20"/>
                 <w:sz w:val="16"/>
               </w:rPr>
-              <w:t>Có hai đề Mây và sáu đề nhập</w:t>
+              <w:t>Có hai đề Mây và năm đề nhập</w:t>
             </w:r>
           </w:p>
         </w:tc>
@@ -6228,7 +6244,7 @@
                 <w:color w:val="211D20"/>
                 <w:sz w:val="16"/>
               </w:rPr>
-              <w:t>Có MP3 ở sáu đề nhập</w:t>
+              <w:t>Có MP3 ở năm đề nhập</w:t>
             </w:r>
           </w:p>
         </w:tc>
@@ -8675,7 +8691,7 @@
                 <w:color w:val="211D20"/>
                 <w:sz w:val="16"/>
               </w:rPr>
-              <w:t>Kho đề nhập và luồng làm sáu đề</w:t>
+              <w:t>Kho đề nhập và luồng làm năm đề</w:t>
             </w:r>
           </w:p>
         </w:tc>
@@ -8748,7 +8764,7 @@
                 <w:color w:val="211D20"/>
                 <w:sz w:val="16"/>
               </w:rPr>
-              <w:t>Kiểu dữ liệu, JSON đề và 126 file MP3</w:t>
+              <w:t>Kiểu dữ liệu, JSON đề và 105 file MP3</w:t>
             </w:r>
           </w:p>
         </w:tc>

</xml_diff>

<commit_message>
Withdraw paper 131 from the bank (#45)
It has no answer key or transcript, so it could only be practised, never marked.
Its data, exclusive audio, import and smoke entries and wording are gone; the id
stays valid in the schema so an older backup holding a sitting of it still restores.


Claude-Session: https://claude.ai/code/session_01W75mjctkB2SZty7ogWDMjM

Co-authored-by: Claude <noreply@anthropic.com>
</commit_message>
<xml_diff>
--- a/docs/Bao-cao-ban-giao-May-VSTEP.docx
+++ b/docs/Bao-cao-ban-giao-May-VSTEP.docx
@@ -193,7 +193,7 @@
                 <w:color w:val="211D20"/>
                 <w:sz w:val="18"/>
               </w:rPr>
-              <w:t>Bản sáu đề nhập 07/10/2026</w:t>
+              <w:t>Bản năm đề nhập 07/10/2026</w:t>
             </w:r>
           </w:p>
         </w:tc>
@@ -443,7 +443,7 @@
           <w:color w:val="211D20"/>
           <w:sz w:val="22"/>
         </w:rPr>
-        <w:t>Bản code có sáu đề nhập đủ bốn kỹ năng và hai đề tự biên soạn. Năm đề nhập có 375 khóa đáp án Nghe/Đọc; đề 131 thiếu đáp án và transcript nên chỉ luyện, không chấm. 126 MP3 được đóng gói cùng ứng dụng. Viết và Nói lưu bài nhưng chưa được chấm tự động; bản ghi micro cần tải riêng. Bộ kiểm thử local trước khi phát hành gồm 196 unit test và 83 E2E trên Chromium, Firefox và WebKit, build 112 route và axe trên 19 màn. Migration gia cố quyền ghi cloud đã áp dụng trên Supabase production. PR #38 và smoke HTTPS đã đạt cho commit ứng dụng ff8faef; đồng bộ hai thiết bị, micro thật và thẩm định học liệu vẫn cần xác nhận; sáu đề nhập chỉ dùng học cá nhân của chủ dự án.</w:t>
+        <w:t>Bản code có năm đề nhập đủ bốn kỹ năng và hai đề tự biên soạn. Cả năm đề nhập có 375 khóa đáp án Nghe/Đọc; đề 131 thiếu đáp án và transcript nên đã được gỡ. 105 MP3 được đóng gói cùng ứng dụng. Viết và Nói lưu bài nhưng chưa được chấm tự động; bản ghi micro cần tải riêng. Bộ kiểm thử local trước khi phát hành gồm 197 unit test và 82 E2E trên Chromium, Firefox và WebKit, build 111 route và axe trên 19 màn. Migration gia cố quyền ghi cloud đã áp dụng trên Supabase production. PR #38 và smoke HTTPS đã đạt cho commit ứng dụng ff8faef; đồng bộ hai thiết bị, micro thật và thẩm định học liệu vẫn cần xác nhận; sáu đề nhập chỉ dùng học cá nhân của chủ dự án.</w:t>
       </w:r>
     </w:p>
     <w:p>
@@ -630,7 +630,7 @@
           <w:color w:val="211D20"/>
           <w:sz w:val="20"/>
         </w:rPr>
-        <w:t xml:space="preserve">Mây hiện là một ứng dụng luyện VSTEP cá nhân có kế hoạch học theo ngày, thư viện luyện bốn kỹ năng, một buổi thi rút gọn, hai đề tự biên soạn và sáu đề nhập từ dữ liệu chủ dự án cung cấp, từ vựng, ôn lỗi sai, lịch sử tiến bộ, ghi âm, sao lưu và đồng bộ Supabase thủ công. Reading và Listening của học liệu tự biên soạn có phản hồi theo dạng câu và độ chắc chắn; kho đề nhập hiển thị đáp án có sẵn trong nguồn sau khi nộp. Năm đề 132–135 và Review 13/09 có đáp án; đề 131 thiếu khóa đáp án và transcript nên không chấm. Các đề nhập lưu đáp án, bài viết và trạng thái trong bản sao Mây; audio ghi âm vẫn lưu riêng. Giao diện đã được kiểm thử tự động ở viewport máy tính và điện thoại, dùng tone hồng pastel, tối ưu cho tiếng Việt và cá nhân hóa cho Gùa. Release </w:t>
+        <w:t xml:space="preserve">Mây hiện là một ứng dụng luyện VSTEP cá nhân có kế hoạch học theo ngày, thư viện luyện bốn kỹ năng, một buổi thi rút gọn, hai đề tự biên soạn và năm đề nhập từ dữ liệu chủ dự án cung cấp, từ vựng, ôn lỗi sai, lịch sử tiến bộ, ghi âm, sao lưu và đồng bộ Supabase thủ công. Reading và Listening của học liệu tự biên soạn có phản hồi theo dạng câu và độ chắc chắn; kho đề nhập hiển thị đáp án có sẵn trong nguồn sau khi nộp. Cả năm đề nhập đều có đáp án; đề 131 thiếu khóa đáp án và transcript nên đã được gỡ khỏi kho. Các đề nhập lưu đáp án, bài viết và trạng thái trong bản sao Mây; audio ghi âm vẫn lưu riêng. Giao diện đã được kiểm thử tự động ở viewport máy tính và điện thoại, dùng tone hồng pastel, tối ưu cho tiếng Việt và cá nhân hóa cho Gùa. Release </w:t>
       </w:r>
       <w:r>
         <w:rPr>
@@ -662,7 +662,7 @@
           <w:color w:val="211D20"/>
           <w:sz w:val="20"/>
         </w:rPr>
-        <w:t xml:space="preserve"> đạt 81 unit và 44 E2E. Bản làm việc hiện tại đạt 196 unit và 83 E2E trên cùng ba engine sau khi hoàn tất kiểm thử. Chưa có nghiệm thu trên iOS hoặc Android thật.</w:t>
+        <w:t xml:space="preserve"> đạt 81 unit và 44 E2E. Bản làm việc hiện tại đạt 197 unit và 82 E2E trên cùng ba engine sau khi hoàn tất kiểm thử. Chưa có nghiệm thu trên iOS hoặc Android thật.</w:t>
       </w:r>
     </w:p>
     <w:p>
@@ -2273,7 +2273,7 @@
           <w:color w:val="000000"/>
           <w:sz w:val="25"/>
         </w:rPr>
-        <w:t>4.5b Kho sáu đề nhập</w:t>
+        <w:t>4.5b Kho năm đề nhập</w:t>
       </w:r>
     </w:p>
     <w:p>
@@ -2294,7 +2294,7 @@
           <w:color w:val="211D20"/>
           <w:sz w:val="20"/>
         </w:rPr>
-        <w:t xml:space="preserve"> có sáu đề 131–135 và Review 13/09. Mỗi đề gồm 35 câu Nghe, 40 câu Đọc, hai bài Viết, ba phần Nói và 172 phút; 126 file MP3 đi kèm gồm 84 bài Nghe và 42 bài mẫu.</w:t>
+        <w:t xml:space="preserve"> có năm đề 132–135 và Review 13/09. Mỗi đề gồm 35 câu Nghe, 40 câu Đọc, hai bài Viết, ba phần Nói và 172 phút; 105 file MP3 đi kèm gồm 70 bài Nghe và 35 bài mẫu.</w:t>
       </w:r>
     </w:p>
     <w:p>
@@ -2307,7 +2307,23 @@
           <w:color w:val="211D20"/>
           <w:sz w:val="20"/>
         </w:rPr>
-        <w:t>Năm đề 132–135 và Review 13/09 có đủ 375 khóa đáp án cùng lời giải. Đề 131 thiếu 75 khóa đáp án và transcript trong nguồn; giao diện cho làm bài nhưng không tạo điểm Nghe/Đọc.</w:t>
+        <w:t xml:space="preserve">Cả năm đề có đủ 375 khóa đáp án cùng lời giải. Đề 131 từng có trong kho nhưng thiếu 75 khóa đáp án và transcript nên đã được gỡ ngày 07/10/2026. Mã </w:t>
+      </w:r>
+      <w:r>
+        <w:rPr>
+          <w:rFonts w:ascii="Consolas" w:hAnsi="Consolas" w:eastAsia="Consolas"/>
+          <w:color w:val="4A3B42"/>
+          <w:sz w:val="19"/>
+        </w:rPr>
+        <w:t>131</w:t>
+      </w:r>
+      <w:r>
+        <w:rPr>
+          <w:rFonts w:ascii="Arial" w:hAnsi="Arial" w:eastAsia="Arial"/>
+          <w:color w:val="211D20"/>
+          <w:sz w:val="20"/>
+        </w:rPr>
+        <w:t xml:space="preserve"> vẫn là mã hợp lệ trong schema để bản sao lưu cũ có lượt làm đề này vẫn khôi phục được; không màn hình nào liệt kê lượt đó.</w:t>
       </w:r>
     </w:p>
     <w:p>
@@ -2532,7 +2548,7 @@
           <w:color w:val="211D20"/>
           <w:sz w:val="20"/>
         </w:rPr>
-        <w:t>Lượt làm sáu đề nhập hiện riêng trong Tiến bộ, mở lại được đáp án, bài Viết và phần Nói đã làm.</w:t>
+        <w:t>Lượt làm năm đề nhập hiện riêng trong Tiến bộ, mở lại được đáp án, bài Viết và phần Nói đã làm.</w:t>
       </w:r>
     </w:p>
     <w:p>
@@ -4631,7 +4647,7 @@
           <w:color w:val="211D20"/>
           <w:sz w:val="20"/>
         </w:rPr>
-        <w:t xml:space="preserve">Bản sáu đề ngày 07/10/2026: ESLint, TypeScript, 196/196 Vitest, build 112 route và audit production dependency đều đạt. Playwright có 83 ca trên bản production local: 79 Chromium, 2 Firefox, 2 WebKit. Sau khi thêm phòng thi mô phỏng và công cụ luyện đề, lượt Chromium đầy đủ đạt 79/79; Firefox và WebKit chưa chạy lại cho thay đổi này. Axe kiểm tra 19 màn, gồm kho đề và Review 13/09. Hai lượt CI của nhánh/PR #38 đạt; Vercel phục vụ SHA </w:t>
+        <w:t xml:space="preserve">Bản sáu đề ngày 07/10/2026: ESLint, TypeScript, 197/197 Vitest, build 111 route và audit production dependency đều đạt. Playwright có 82 ca trên bản production local: 78 Chromium, 2 Firefox, 2 WebKit. Sau khi thêm phòng thi mô phỏng và công cụ luyện đề, lượt Chromium đầy đủ đạt 78/78; Firefox và WebKit chưa chạy lại cho thay đổi này. Axe kiểm tra 19 màn, gồm kho đề và Review 13/09. Hai lượt CI của nhánh/PR #38 đạt; Vercel phục vụ SHA </w:t>
       </w:r>
       <w:r>
         <w:rPr>
@@ -6146,7 +6162,7 @@
                 <w:color w:val="211D20"/>
                 <w:sz w:val="16"/>
               </w:rPr>
-              <w:t>Có hai đề Mây và sáu đề nhập</w:t>
+              <w:t>Có hai đề Mây và năm đề nhập</w:t>
             </w:r>
           </w:p>
         </w:tc>
@@ -6228,7 +6244,7 @@
                 <w:color w:val="211D20"/>
                 <w:sz w:val="16"/>
               </w:rPr>
-              <w:t>Có MP3 ở sáu đề nhập</w:t>
+              <w:t>Có MP3 ở năm đề nhập</w:t>
             </w:r>
           </w:p>
         </w:tc>
@@ -8675,7 +8691,7 @@
                 <w:color w:val="211D20"/>
                 <w:sz w:val="16"/>
               </w:rPr>
-              <w:t>Kho đề nhập và luồng làm sáu đề</w:t>
+              <w:t>Kho đề nhập và luồng làm năm đề</w:t>
             </w:r>
           </w:p>
         </w:tc>
@@ -8748,7 +8764,7 @@
                 <w:color w:val="211D20"/>
                 <w:sz w:val="16"/>
               </w:rPr>
-              <w:t>Kiểu dữ liệu, JSON đề và 126 file MP3</w:t>
+              <w:t>Kiểu dữ liệu, JSON đề và 105 file MP3</w:t>
             </w:r>
           </w:p>
         </w:tc>

</xml_diff>

<commit_message>
Fix the paper bank's rare paths: the 101st sitting made saved data unreadable, overdue label
Co-Authored-By: Claude Sonnet 5.5 <noreply@anthropic.com>
Claude-Session: https://claude.ai/code/session_01W75mjctkB2SZty7ogWDMjM
</commit_message>
<xml_diff>
--- a/docs/Bao-cao-ban-giao-May-VSTEP.docx
+++ b/docs/Bao-cao-ban-giao-May-VSTEP.docx
@@ -443,7 +443,7 @@
           <w:color w:val="211D20"/>
           <w:sz w:val="22"/>
         </w:rPr>
-        <w:t>Bản code có năm đề nhập đủ bốn kỹ năng và hai đề tự biên soạn. Cả năm đề nhập có 375 khóa đáp án Nghe/Đọc; đề 131 thiếu đáp án và transcript nên đã được gỡ. 105 MP3 được đóng gói cùng ứng dụng. Viết và Nói lưu bài nhưng chưa được chấm tự động; bản ghi micro cần tải riêng. Bộ kiểm thử local trước khi phát hành gồm 197 unit test và 82 E2E trên Chromium, Firefox và WebKit, build 111 route và axe trên 19 màn. Migration gia cố quyền ghi cloud đã áp dụng trên Supabase production. PR #38 và smoke HTTPS đã đạt cho commit ứng dụng ff8faef; đồng bộ hai thiết bị, micro thật và thẩm định học liệu vẫn cần xác nhận; sáu đề nhập chỉ dùng học cá nhân của chủ dự án.</w:t>
+        <w:t>Bản code có năm đề nhập đủ bốn kỹ năng và hai đề tự biên soạn. Cả năm đề nhập có 375 khóa đáp án Nghe/Đọc; đề 131 thiếu đáp án và transcript nên đã được gỡ. 105 MP3 được đóng gói cùng ứng dụng. Viết và Nói lưu bài nhưng chưa được chấm tự động; bản ghi micro cần tải riêng. Bộ kiểm thử local trước khi phát hành gồm 198 unit test và 86 E2E trên Chromium, Firefox và WebKit, build 111 route và axe trên 19 màn. Migration gia cố quyền ghi cloud đã áp dụng trên Supabase production. PR #38 và smoke HTTPS đã đạt cho commit ứng dụng ff8faef; đồng bộ hai thiết bị, micro thật và thẩm định học liệu vẫn cần xác nhận; sáu đề nhập chỉ dùng học cá nhân của chủ dự án.</w:t>
       </w:r>
     </w:p>
     <w:p>
@@ -662,7 +662,7 @@
           <w:color w:val="211D20"/>
           <w:sz w:val="20"/>
         </w:rPr>
-        <w:t xml:space="preserve"> đạt 81 unit và 44 E2E. Bản làm việc hiện tại đạt 197 unit và 82 E2E trên cùng ba engine sau khi hoàn tất kiểm thử. Chưa có nghiệm thu trên iOS hoặc Android thật.</w:t>
+        <w:t xml:space="preserve"> đạt 81 unit và 44 E2E. Bản làm việc hiện tại đạt 198 unit và 86 E2E trên cùng ba engine sau khi hoàn tất kiểm thử. Chưa có nghiệm thu trên iOS hoặc Android thật.</w:t>
       </w:r>
     </w:p>
     <w:p>
@@ -4647,7 +4647,7 @@
           <w:color w:val="211D20"/>
           <w:sz w:val="20"/>
         </w:rPr>
-        <w:t xml:space="preserve">Bản sáu đề ngày 07/10/2026: ESLint, TypeScript, 197/197 Vitest, build 111 route và audit production dependency đều đạt. Playwright có 82 ca trên bản production local: 78 Chromium, 2 Firefox, 2 WebKit. Sau khi thêm phòng thi mô phỏng và công cụ luyện đề, lượt Chromium đầy đủ đạt 78/78; Firefox và WebKit chưa chạy lại cho thay đổi này. Axe kiểm tra 19 màn, gồm kho đề và Review 13/09. Hai lượt CI của nhánh/PR #38 đạt; Vercel phục vụ SHA </w:t>
+        <w:t xml:space="preserve">Bản sáu đề ngày 07/10/2026: ESLint, TypeScript, 198/198 Vitest, build 111 route và audit production dependency đều đạt. Playwright có 86 ca trên bản production local: 82 Chromium, 2 Firefox, 2 WebKit. Sau khi thêm phòng thi mô phỏng và công cụ luyện đề, lượt Chromium đầy đủ đạt 82/82; Firefox và WebKit chưa chạy lại cho thay đổi này. Axe kiểm tra 19 màn, gồm kho đề và Review 13/09. Hai lượt CI của nhánh/PR #38 đạt; Vercel phục vụ SHA </w:t>
       </w:r>
       <w:r>
         <w:rPr>

</xml_diff>

<commit_message>
Fix the paper bank's rare paths: the 101st sitting made saved data unreadable, overdue label (#46)
Claude-Session: https://claude.ai/code/session_01W75mjctkB2SZty7ogWDMjM

Co-authored-by: Claude <noreply@anthropic.com>
</commit_message>
<xml_diff>
--- a/docs/Bao-cao-ban-giao-May-VSTEP.docx
+++ b/docs/Bao-cao-ban-giao-May-VSTEP.docx
@@ -443,7 +443,7 @@
           <w:color w:val="211D20"/>
           <w:sz w:val="22"/>
         </w:rPr>
-        <w:t>Bản code có năm đề nhập đủ bốn kỹ năng và hai đề tự biên soạn. Cả năm đề nhập có 375 khóa đáp án Nghe/Đọc; đề 131 thiếu đáp án và transcript nên đã được gỡ. 105 MP3 được đóng gói cùng ứng dụng. Viết và Nói lưu bài nhưng chưa được chấm tự động; bản ghi micro cần tải riêng. Bộ kiểm thử local trước khi phát hành gồm 197 unit test và 82 E2E trên Chromium, Firefox và WebKit, build 111 route và axe trên 19 màn. Migration gia cố quyền ghi cloud đã áp dụng trên Supabase production. PR #38 và smoke HTTPS đã đạt cho commit ứng dụng ff8faef; đồng bộ hai thiết bị, micro thật và thẩm định học liệu vẫn cần xác nhận; sáu đề nhập chỉ dùng học cá nhân của chủ dự án.</w:t>
+        <w:t>Bản code có năm đề nhập đủ bốn kỹ năng và hai đề tự biên soạn. Cả năm đề nhập có 375 khóa đáp án Nghe/Đọc; đề 131 thiếu đáp án và transcript nên đã được gỡ. 105 MP3 được đóng gói cùng ứng dụng. Viết và Nói lưu bài nhưng chưa được chấm tự động; bản ghi micro cần tải riêng. Bộ kiểm thử local trước khi phát hành gồm 198 unit test và 86 E2E trên Chromium, Firefox và WebKit, build 111 route và axe trên 19 màn. Migration gia cố quyền ghi cloud đã áp dụng trên Supabase production. PR #38 và smoke HTTPS đã đạt cho commit ứng dụng ff8faef; đồng bộ hai thiết bị, micro thật và thẩm định học liệu vẫn cần xác nhận; sáu đề nhập chỉ dùng học cá nhân của chủ dự án.</w:t>
       </w:r>
     </w:p>
     <w:p>
@@ -662,7 +662,7 @@
           <w:color w:val="211D20"/>
           <w:sz w:val="20"/>
         </w:rPr>
-        <w:t xml:space="preserve"> đạt 81 unit và 44 E2E. Bản làm việc hiện tại đạt 197 unit và 82 E2E trên cùng ba engine sau khi hoàn tất kiểm thử. Chưa có nghiệm thu trên iOS hoặc Android thật.</w:t>
+        <w:t xml:space="preserve"> đạt 81 unit và 44 E2E. Bản làm việc hiện tại đạt 198 unit và 86 E2E trên cùng ba engine sau khi hoàn tất kiểm thử. Chưa có nghiệm thu trên iOS hoặc Android thật.</w:t>
       </w:r>
     </w:p>
     <w:p>
@@ -4647,7 +4647,7 @@
           <w:color w:val="211D20"/>
           <w:sz w:val="20"/>
         </w:rPr>
-        <w:t xml:space="preserve">Bản sáu đề ngày 07/10/2026: ESLint, TypeScript, 197/197 Vitest, build 111 route và audit production dependency đều đạt. Playwright có 82 ca trên bản production local: 78 Chromium, 2 Firefox, 2 WebKit. Sau khi thêm phòng thi mô phỏng và công cụ luyện đề, lượt Chromium đầy đủ đạt 78/78; Firefox và WebKit chưa chạy lại cho thay đổi này. Axe kiểm tra 19 màn, gồm kho đề và Review 13/09. Hai lượt CI của nhánh/PR #38 đạt; Vercel phục vụ SHA </w:t>
+        <w:t xml:space="preserve">Bản sáu đề ngày 07/10/2026: ESLint, TypeScript, 198/198 Vitest, build 111 route và audit production dependency đều đạt. Playwright có 86 ca trên bản production local: 82 Chromium, 2 Firefox, 2 WebKit. Sau khi thêm phòng thi mô phỏng và công cụ luyện đề, lượt Chromium đầy đủ đạt 82/82; Firefox và WebKit chưa chạy lại cho thay đổi này. Axe kiểm tra 19 màn, gồm kho đề và Review 13/09. Hai lượt CI của nhánh/PR #38 đạt; Vercel phục vụ SHA </w:t>
       </w:r>
       <w:r>
         <w:rPr>

</xml_diff>

<commit_message>
Fix the vocabulary garden's rare paths: due counts, card swapped under her, duplicate word, search, removal
Co-Authored-By: Claude Sonnet 5.5 <noreply@anthropic.com>
Claude-Session: https://claude.ai/code/session_01W75mjctkB2SZty7ogWDMjM
</commit_message>
<xml_diff>
--- a/docs/Bao-cao-ban-giao-May-VSTEP.docx
+++ b/docs/Bao-cao-ban-giao-May-VSTEP.docx
@@ -443,7 +443,7 @@
           <w:color w:val="211D20"/>
           <w:sz w:val="22"/>
         </w:rPr>
-        <w:t>Bản code có năm đề nhập đủ bốn kỹ năng và hai đề tự biên soạn. Cả năm đề nhập có 375 khóa đáp án Nghe/Đọc; đề 131 thiếu đáp án và transcript nên đã được gỡ. 105 MP3 được đóng gói cùng ứng dụng. Viết và Nói lưu bài nhưng chưa được chấm tự động; bản ghi micro cần tải riêng. Bộ kiểm thử local trước khi phát hành gồm 198 unit test và 86 E2E trên Chromium, Firefox và WebKit, build 111 route và axe trên 19 màn. Migration gia cố quyền ghi cloud đã áp dụng trên Supabase production. PR #38 và smoke HTTPS đã đạt cho commit ứng dụng ff8faef; đồng bộ hai thiết bị, micro thật và thẩm định học liệu vẫn cần xác nhận; sáu đề nhập chỉ dùng học cá nhân của chủ dự án.</w:t>
+        <w:t>Bản code có năm đề nhập đủ bốn kỹ năng và hai đề tự biên soạn. Cả năm đề nhập có 375 khóa đáp án Nghe/Đọc; đề 131 thiếu đáp án và transcript nên đã được gỡ. 105 MP3 được đóng gói cùng ứng dụng. Viết và Nói lưu bài nhưng chưa được chấm tự động; bản ghi micro cần tải riêng. Bộ kiểm thử local trước khi phát hành gồm 201 unit test và 89 E2E trên Chromium, Firefox và WebKit, build 111 route và axe trên 19 màn. Migration gia cố quyền ghi cloud đã áp dụng trên Supabase production. PR #38 và smoke HTTPS đã đạt cho commit ứng dụng ff8faef; đồng bộ hai thiết bị, micro thật và thẩm định học liệu vẫn cần xác nhận; sáu đề nhập chỉ dùng học cá nhân của chủ dự án.</w:t>
       </w:r>
     </w:p>
     <w:p>
@@ -662,7 +662,7 @@
           <w:color w:val="211D20"/>
           <w:sz w:val="20"/>
         </w:rPr>
-        <w:t xml:space="preserve"> đạt 81 unit và 44 E2E. Bản làm việc hiện tại đạt 198 unit và 86 E2E trên cùng ba engine sau khi hoàn tất kiểm thử. Chưa có nghiệm thu trên iOS hoặc Android thật.</w:t>
+        <w:t xml:space="preserve"> đạt 81 unit và 44 E2E. Bản làm việc hiện tại đạt 201 unit và 89 E2E trên cùng ba engine sau khi hoàn tất kiểm thử. Chưa có nghiệm thu trên iOS hoặc Android thật.</w:t>
       </w:r>
     </w:p>
     <w:p>
@@ -4647,7 +4647,7 @@
           <w:color w:val="211D20"/>
           <w:sz w:val="20"/>
         </w:rPr>
-        <w:t xml:space="preserve">Bản sáu đề ngày 07/10/2026: ESLint, TypeScript, 198/198 Vitest, build 111 route và audit production dependency đều đạt. Playwright có 86 ca trên bản production local: 82 Chromium, 2 Firefox, 2 WebKit. Sau khi thêm phòng thi mô phỏng và công cụ luyện đề, lượt Chromium đầy đủ đạt 82/82; Firefox và WebKit chưa chạy lại cho thay đổi này. Axe kiểm tra 19 màn, gồm kho đề và Review 13/09. Hai lượt CI của nhánh/PR #38 đạt; Vercel phục vụ SHA </w:t>
+        <w:t xml:space="preserve">Bản sáu đề ngày 07/10/2026: ESLint, TypeScript, 201/201 Vitest, build 111 route và audit production dependency đều đạt. Playwright có 89 ca trên bản production local: 85 Chromium, 2 Firefox, 2 WebKit. Sau khi thêm phòng thi mô phỏng và công cụ luyện đề, lượt Chromium đầy đủ đạt 85/85; Firefox và WebKit chưa chạy lại cho thay đổi này. Axe kiểm tra 19 màn, gồm kho đề và Review 13/09. Hai lượt CI của nhánh/PR #38 đạt; Vercel phục vụ SHA </w:t>
       </w:r>
       <w:r>
         <w:rPr>

</xml_diff>

<commit_message>
Fix the vocabulary garden's rare paths: due counts, card swapped under her, duplicate word, search, removal (#47)
Claude-Session: https://claude.ai/code/session_01W75mjctkB2SZty7ogWDMjM

Co-authored-by: Claude <noreply@anthropic.com>
</commit_message>
<xml_diff>
--- a/docs/Bao-cao-ban-giao-May-VSTEP.docx
+++ b/docs/Bao-cao-ban-giao-May-VSTEP.docx
@@ -443,7 +443,7 @@
           <w:color w:val="211D20"/>
           <w:sz w:val="22"/>
         </w:rPr>
-        <w:t>Bản code có năm đề nhập đủ bốn kỹ năng và hai đề tự biên soạn. Cả năm đề nhập có 375 khóa đáp án Nghe/Đọc; đề 131 thiếu đáp án và transcript nên đã được gỡ. 105 MP3 được đóng gói cùng ứng dụng. Viết và Nói lưu bài nhưng chưa được chấm tự động; bản ghi micro cần tải riêng. Bộ kiểm thử local trước khi phát hành gồm 198 unit test và 86 E2E trên Chromium, Firefox và WebKit, build 111 route và axe trên 19 màn. Migration gia cố quyền ghi cloud đã áp dụng trên Supabase production. PR #38 và smoke HTTPS đã đạt cho commit ứng dụng ff8faef; đồng bộ hai thiết bị, micro thật và thẩm định học liệu vẫn cần xác nhận; sáu đề nhập chỉ dùng học cá nhân của chủ dự án.</w:t>
+        <w:t>Bản code có năm đề nhập đủ bốn kỹ năng và hai đề tự biên soạn. Cả năm đề nhập có 375 khóa đáp án Nghe/Đọc; đề 131 thiếu đáp án và transcript nên đã được gỡ. 105 MP3 được đóng gói cùng ứng dụng. Viết và Nói lưu bài nhưng chưa được chấm tự động; bản ghi micro cần tải riêng. Bộ kiểm thử local trước khi phát hành gồm 201 unit test và 89 E2E trên Chromium, Firefox và WebKit, build 111 route và axe trên 19 màn. Migration gia cố quyền ghi cloud đã áp dụng trên Supabase production. PR #38 và smoke HTTPS đã đạt cho commit ứng dụng ff8faef; đồng bộ hai thiết bị, micro thật và thẩm định học liệu vẫn cần xác nhận; sáu đề nhập chỉ dùng học cá nhân của chủ dự án.</w:t>
       </w:r>
     </w:p>
     <w:p>
@@ -662,7 +662,7 @@
           <w:color w:val="211D20"/>
           <w:sz w:val="20"/>
         </w:rPr>
-        <w:t xml:space="preserve"> đạt 81 unit và 44 E2E. Bản làm việc hiện tại đạt 198 unit và 86 E2E trên cùng ba engine sau khi hoàn tất kiểm thử. Chưa có nghiệm thu trên iOS hoặc Android thật.</w:t>
+        <w:t xml:space="preserve"> đạt 81 unit và 44 E2E. Bản làm việc hiện tại đạt 201 unit và 89 E2E trên cùng ba engine sau khi hoàn tất kiểm thử. Chưa có nghiệm thu trên iOS hoặc Android thật.</w:t>
       </w:r>
     </w:p>
     <w:p>
@@ -4647,7 +4647,7 @@
           <w:color w:val="211D20"/>
           <w:sz w:val="20"/>
         </w:rPr>
-        <w:t xml:space="preserve">Bản sáu đề ngày 07/10/2026: ESLint, TypeScript, 198/198 Vitest, build 111 route và audit production dependency đều đạt. Playwright có 86 ca trên bản production local: 82 Chromium, 2 Firefox, 2 WebKit. Sau khi thêm phòng thi mô phỏng và công cụ luyện đề, lượt Chromium đầy đủ đạt 82/82; Firefox và WebKit chưa chạy lại cho thay đổi này. Axe kiểm tra 19 màn, gồm kho đề và Review 13/09. Hai lượt CI của nhánh/PR #38 đạt; Vercel phục vụ SHA </w:t>
+        <w:t xml:space="preserve">Bản sáu đề ngày 07/10/2026: ESLint, TypeScript, 201/201 Vitest, build 111 route và audit production dependency đều đạt. Playwright có 89 ca trên bản production local: 85 Chromium, 2 Firefox, 2 WebKit. Sau khi thêm phòng thi mô phỏng và công cụ luyện đề, lượt Chromium đầy đủ đạt 85/85; Firefox và WebKit chưa chạy lại cho thay đổi này. Axe kiểm tra 19 màn, gồm kho đề và Review 13/09. Hai lượt CI của nhánh/PR #38 đạt; Vercel phục vụ SHA </w:t>
       </w:r>
       <w:r>
         <w:rPr>

</xml_diff>

<commit_message>
Fix the Writing and Speaking rare paths: exam take time, finishing while recording, word count
Co-Authored-By: Claude Sonnet 5.5 <noreply@anthropic.com>
Claude-Session: https://claude.ai/code/session_01W75mjctkB2SZty7ogWDMjM
</commit_message>
<xml_diff>
--- a/docs/Bao-cao-ban-giao-May-VSTEP.docx
+++ b/docs/Bao-cao-ban-giao-May-VSTEP.docx
@@ -443,7 +443,7 @@
           <w:color w:val="211D20"/>
           <w:sz w:val="22"/>
         </w:rPr>
-        <w:t>Bản code có năm đề nhập đủ bốn kỹ năng và hai đề tự biên soạn. Cả năm đề nhập có 375 khóa đáp án Nghe/Đọc; đề 131 thiếu đáp án và transcript nên đã được gỡ. 105 MP3 được đóng gói cùng ứng dụng. Viết và Nói lưu bài nhưng chưa được chấm tự động; bản ghi micro cần tải riêng. Bộ kiểm thử local trước khi phát hành gồm 201 unit test và 89 E2E trên Chromium, Firefox và WebKit, build 111 route và axe trên 19 màn. Migration gia cố quyền ghi cloud đã áp dụng trên Supabase production. PR #38 và smoke HTTPS đã đạt cho commit ứng dụng ff8faef; đồng bộ hai thiết bị, micro thật và thẩm định học liệu vẫn cần xác nhận; sáu đề nhập chỉ dùng học cá nhân của chủ dự án.</w:t>
+        <w:t>Bản code có năm đề nhập đủ bốn kỹ năng và hai đề tự biên soạn. Cả năm đề nhập có 375 khóa đáp án Nghe/Đọc; đề 131 thiếu đáp án và transcript nên đã được gỡ. 105 MP3 được đóng gói cùng ứng dụng. Viết và Nói lưu bài nhưng chưa được chấm tự động; bản ghi micro cần tải riêng. Bộ kiểm thử local trước khi phát hành gồm 201 unit test và 91 E2E trên Chromium, Firefox và WebKit, build 111 route và axe trên 19 màn. Migration gia cố quyền ghi cloud đã áp dụng trên Supabase production. PR #38 và smoke HTTPS đã đạt cho commit ứng dụng ff8faef; đồng bộ hai thiết bị, micro thật và thẩm định học liệu vẫn cần xác nhận; sáu đề nhập chỉ dùng học cá nhân của chủ dự án.</w:t>
       </w:r>
     </w:p>
     <w:p>
@@ -662,7 +662,7 @@
           <w:color w:val="211D20"/>
           <w:sz w:val="20"/>
         </w:rPr>
-        <w:t xml:space="preserve"> đạt 81 unit và 44 E2E. Bản làm việc hiện tại đạt 201 unit và 89 E2E trên cùng ba engine sau khi hoàn tất kiểm thử. Chưa có nghiệm thu trên iOS hoặc Android thật.</w:t>
+        <w:t xml:space="preserve"> đạt 81 unit và 44 E2E. Bản làm việc hiện tại đạt 201 unit và 91 E2E trên cùng ba engine sau khi hoàn tất kiểm thử. Chưa có nghiệm thu trên iOS hoặc Android thật.</w:t>
       </w:r>
     </w:p>
     <w:p>
@@ -4647,7 +4647,7 @@
           <w:color w:val="211D20"/>
           <w:sz w:val="20"/>
         </w:rPr>
-        <w:t xml:space="preserve">Bản sáu đề ngày 07/10/2026: ESLint, TypeScript, 201/201 Vitest, build 111 route và audit production dependency đều đạt. Playwright có 89 ca trên bản production local: 85 Chromium, 2 Firefox, 2 WebKit. Sau khi thêm phòng thi mô phỏng và công cụ luyện đề, lượt Chromium đầy đủ đạt 85/85; Firefox và WebKit chưa chạy lại cho thay đổi này. Axe kiểm tra 19 màn, gồm kho đề và Review 13/09. Hai lượt CI của nhánh/PR #38 đạt; Vercel phục vụ SHA </w:t>
+        <w:t xml:space="preserve">Bản sáu đề ngày 07/10/2026: ESLint, TypeScript, 201/201 Vitest, build 111 route và audit production dependency đều đạt. Playwright có 91 ca trên bản production local: 87 Chromium, 2 Firefox, 2 WebKit. Sau khi thêm phòng thi mô phỏng và công cụ luyện đề, lượt Chromium đầy đủ đạt 87/87; Firefox và WebKit chưa chạy lại cho thay đổi này. Axe kiểm tra 19 màn, gồm kho đề và Review 13/09. Hai lượt CI của nhánh/PR #38 đạt; Vercel phục vụ SHA </w:t>
       </w:r>
       <w:r>
         <w:rPr>

</xml_diff>

<commit_message>
Fix the Writing and Speaking rare paths: exam take time, finishing while recording, word count (#48)
Claude-Session: https://claude.ai/code/session_01W75mjctkB2SZty7ogWDMjM

Co-authored-by: Claude <noreply@anthropic.com>
</commit_message>
<xml_diff>
--- a/docs/Bao-cao-ban-giao-May-VSTEP.docx
+++ b/docs/Bao-cao-ban-giao-May-VSTEP.docx
@@ -443,7 +443,7 @@
           <w:color w:val="211D20"/>
           <w:sz w:val="22"/>
         </w:rPr>
-        <w:t>Bản code có năm đề nhập đủ bốn kỹ năng và hai đề tự biên soạn. Cả năm đề nhập có 375 khóa đáp án Nghe/Đọc; đề 131 thiếu đáp án và transcript nên đã được gỡ. 105 MP3 được đóng gói cùng ứng dụng. Viết và Nói lưu bài nhưng chưa được chấm tự động; bản ghi micro cần tải riêng. Bộ kiểm thử local trước khi phát hành gồm 201 unit test và 89 E2E trên Chromium, Firefox và WebKit, build 111 route và axe trên 19 màn. Migration gia cố quyền ghi cloud đã áp dụng trên Supabase production. PR #38 và smoke HTTPS đã đạt cho commit ứng dụng ff8faef; đồng bộ hai thiết bị, micro thật và thẩm định học liệu vẫn cần xác nhận; sáu đề nhập chỉ dùng học cá nhân của chủ dự án.</w:t>
+        <w:t>Bản code có năm đề nhập đủ bốn kỹ năng và hai đề tự biên soạn. Cả năm đề nhập có 375 khóa đáp án Nghe/Đọc; đề 131 thiếu đáp án và transcript nên đã được gỡ. 105 MP3 được đóng gói cùng ứng dụng. Viết và Nói lưu bài nhưng chưa được chấm tự động; bản ghi micro cần tải riêng. Bộ kiểm thử local trước khi phát hành gồm 201 unit test và 91 E2E trên Chromium, Firefox và WebKit, build 111 route và axe trên 19 màn. Migration gia cố quyền ghi cloud đã áp dụng trên Supabase production. PR #38 và smoke HTTPS đã đạt cho commit ứng dụng ff8faef; đồng bộ hai thiết bị, micro thật và thẩm định học liệu vẫn cần xác nhận; sáu đề nhập chỉ dùng học cá nhân của chủ dự án.</w:t>
       </w:r>
     </w:p>
     <w:p>
@@ -662,7 +662,7 @@
           <w:color w:val="211D20"/>
           <w:sz w:val="20"/>
         </w:rPr>
-        <w:t xml:space="preserve"> đạt 81 unit và 44 E2E. Bản làm việc hiện tại đạt 201 unit và 89 E2E trên cùng ba engine sau khi hoàn tất kiểm thử. Chưa có nghiệm thu trên iOS hoặc Android thật.</w:t>
+        <w:t xml:space="preserve"> đạt 81 unit và 44 E2E. Bản làm việc hiện tại đạt 201 unit và 91 E2E trên cùng ba engine sau khi hoàn tất kiểm thử. Chưa có nghiệm thu trên iOS hoặc Android thật.</w:t>
       </w:r>
     </w:p>
     <w:p>
@@ -4647,7 +4647,7 @@
           <w:color w:val="211D20"/>
           <w:sz w:val="20"/>
         </w:rPr>
-        <w:t xml:space="preserve">Bản sáu đề ngày 07/10/2026: ESLint, TypeScript, 201/201 Vitest, build 111 route và audit production dependency đều đạt. Playwright có 89 ca trên bản production local: 85 Chromium, 2 Firefox, 2 WebKit. Sau khi thêm phòng thi mô phỏng và công cụ luyện đề, lượt Chromium đầy đủ đạt 85/85; Firefox và WebKit chưa chạy lại cho thay đổi này. Axe kiểm tra 19 màn, gồm kho đề và Review 13/09. Hai lượt CI của nhánh/PR #38 đạt; Vercel phục vụ SHA </w:t>
+        <w:t xml:space="preserve">Bản sáu đề ngày 07/10/2026: ESLint, TypeScript, 201/201 Vitest, build 111 route và audit production dependency đều đạt. Playwright có 91 ca trên bản production local: 87 Chromium, 2 Firefox, 2 WebKit. Sau khi thêm phòng thi mô phỏng và công cụ luyện đề, lượt Chromium đầy đủ đạt 87/87; Firefox và WebKit chưa chạy lại cho thay đổi này. Axe kiểm tra 19 màn, gồm kho đề và Review 13/09. Hai lượt CI của nhánh/PR #38 đạt; Vercel phục vụ SHA </w:t>
       </w:r>
       <w:r>
         <w:rPr>

</xml_diff>

<commit_message>
Fix the Reading and Listening rare paths: stepping lesson clock, stale confidence, sentence splitting
Co-Authored-By: Claude Sonnet 5.5 <noreply@anthropic.com>
Claude-Session: https://claude.ai/code/session_01W75mjctkB2SZty7ogWDMjM
</commit_message>
<xml_diff>
--- a/docs/Bao-cao-ban-giao-May-VSTEP.docx
+++ b/docs/Bao-cao-ban-giao-May-VSTEP.docx
@@ -443,7 +443,7 @@
           <w:color w:val="211D20"/>
           <w:sz w:val="22"/>
         </w:rPr>
-        <w:t>Bản code có năm đề nhập đủ bốn kỹ năng và hai đề tự biên soạn. Cả năm đề nhập có 375 khóa đáp án Nghe/Đọc; đề 131 thiếu đáp án và transcript nên đã được gỡ. 105 MP3 được đóng gói cùng ứng dụng. Viết và Nói lưu bài nhưng chưa được chấm tự động; bản ghi micro cần tải riêng. Bộ kiểm thử local trước khi phát hành gồm 201 unit test và 91 E2E trên Chromium, Firefox và WebKit, build 111 route và axe trên 19 màn. Migration gia cố quyền ghi cloud đã áp dụng trên Supabase production. PR #38 và smoke HTTPS đã đạt cho commit ứng dụng ff8faef; đồng bộ hai thiết bị, micro thật và thẩm định học liệu vẫn cần xác nhận; sáu đề nhập chỉ dùng học cá nhân của chủ dự án.</w:t>
+        <w:t>Bản code có năm đề nhập đủ bốn kỹ năng và hai đề tự biên soạn. Cả năm đề nhập có 375 khóa đáp án Nghe/Đọc; đề 131 thiếu đáp án và transcript nên đã được gỡ. 105 MP3 được đóng gói cùng ứng dụng. Viết và Nói lưu bài nhưng chưa được chấm tự động; bản ghi micro cần tải riêng. Bộ kiểm thử local trước khi phát hành gồm 202 unit test và 93 E2E trên Chromium, Firefox và WebKit, build 111 route và axe trên 19 màn. Migration gia cố quyền ghi cloud đã áp dụng trên Supabase production. PR #38 và smoke HTTPS đã đạt cho commit ứng dụng ff8faef; đồng bộ hai thiết bị, micro thật và thẩm định học liệu vẫn cần xác nhận; sáu đề nhập chỉ dùng học cá nhân của chủ dự án.</w:t>
       </w:r>
     </w:p>
     <w:p>
@@ -662,7 +662,7 @@
           <w:color w:val="211D20"/>
           <w:sz w:val="20"/>
         </w:rPr>
-        <w:t xml:space="preserve"> đạt 81 unit và 44 E2E. Bản làm việc hiện tại đạt 201 unit và 91 E2E trên cùng ba engine sau khi hoàn tất kiểm thử. Chưa có nghiệm thu trên iOS hoặc Android thật.</w:t>
+        <w:t xml:space="preserve"> đạt 81 unit và 44 E2E. Bản làm việc hiện tại đạt 202 unit và 93 E2E trên cùng ba engine sau khi hoàn tất kiểm thử. Chưa có nghiệm thu trên iOS hoặc Android thật.</w:t>
       </w:r>
     </w:p>
     <w:p>
@@ -4647,7 +4647,7 @@
           <w:color w:val="211D20"/>
           <w:sz w:val="20"/>
         </w:rPr>
-        <w:t xml:space="preserve">Bản sáu đề ngày 07/10/2026: ESLint, TypeScript, 201/201 Vitest, build 111 route và audit production dependency đều đạt. Playwright có 91 ca trên bản production local: 87 Chromium, 2 Firefox, 2 WebKit. Sau khi thêm phòng thi mô phỏng và công cụ luyện đề, lượt Chromium đầy đủ đạt 87/87; Firefox và WebKit chưa chạy lại cho thay đổi này. Axe kiểm tra 19 màn, gồm kho đề và Review 13/09. Hai lượt CI của nhánh/PR #38 đạt; Vercel phục vụ SHA </w:t>
+        <w:t xml:space="preserve">Bản sáu đề ngày 07/10/2026: ESLint, TypeScript, 202/202 Vitest, build 111 route và audit production dependency đều đạt. Playwright có 93 ca trên bản production local: 89 Chromium, 2 Firefox, 2 WebKit. Sau khi thêm phòng thi mô phỏng và công cụ luyện đề, lượt Chromium đầy đủ đạt 89/89; Firefox và WebKit chưa chạy lại cho thay đổi này. Axe kiểm tra 19 màn, gồm kho đề và Review 13/09. Hai lượt CI của nhánh/PR #38 đạt; Vercel phục vụ SHA </w:t>
       </w:r>
       <w:r>
         <w:rPr>

</xml_diff>

<commit_message>
Fix the Reading and Listening rare paths: stepping lesson clock, stale confidence, sentence splitting (#49)
Claude-Session: https://claude.ai/code/session_01W75mjctkB2SZty7ogWDMjM

Co-authored-by: Claude <noreply@anthropic.com>
</commit_message>
<xml_diff>
--- a/docs/Bao-cao-ban-giao-May-VSTEP.docx
+++ b/docs/Bao-cao-ban-giao-May-VSTEP.docx
@@ -443,7 +443,7 @@
           <w:color w:val="211D20"/>
           <w:sz w:val="22"/>
         </w:rPr>
-        <w:t>Bản code có năm đề nhập đủ bốn kỹ năng và hai đề tự biên soạn. Cả năm đề nhập có 375 khóa đáp án Nghe/Đọc; đề 131 thiếu đáp án và transcript nên đã được gỡ. 105 MP3 được đóng gói cùng ứng dụng. Viết và Nói lưu bài nhưng chưa được chấm tự động; bản ghi micro cần tải riêng. Bộ kiểm thử local trước khi phát hành gồm 201 unit test và 91 E2E trên Chromium, Firefox và WebKit, build 111 route và axe trên 19 màn. Migration gia cố quyền ghi cloud đã áp dụng trên Supabase production. PR #38 và smoke HTTPS đã đạt cho commit ứng dụng ff8faef; đồng bộ hai thiết bị, micro thật và thẩm định học liệu vẫn cần xác nhận; sáu đề nhập chỉ dùng học cá nhân của chủ dự án.</w:t>
+        <w:t>Bản code có năm đề nhập đủ bốn kỹ năng và hai đề tự biên soạn. Cả năm đề nhập có 375 khóa đáp án Nghe/Đọc; đề 131 thiếu đáp án và transcript nên đã được gỡ. 105 MP3 được đóng gói cùng ứng dụng. Viết và Nói lưu bài nhưng chưa được chấm tự động; bản ghi micro cần tải riêng. Bộ kiểm thử local trước khi phát hành gồm 202 unit test và 93 E2E trên Chromium, Firefox và WebKit, build 111 route và axe trên 19 màn. Migration gia cố quyền ghi cloud đã áp dụng trên Supabase production. PR #38 và smoke HTTPS đã đạt cho commit ứng dụng ff8faef; đồng bộ hai thiết bị, micro thật và thẩm định học liệu vẫn cần xác nhận; sáu đề nhập chỉ dùng học cá nhân của chủ dự án.</w:t>
       </w:r>
     </w:p>
     <w:p>
@@ -662,7 +662,7 @@
           <w:color w:val="211D20"/>
           <w:sz w:val="20"/>
         </w:rPr>
-        <w:t xml:space="preserve"> đạt 81 unit và 44 E2E. Bản làm việc hiện tại đạt 201 unit và 91 E2E trên cùng ba engine sau khi hoàn tất kiểm thử. Chưa có nghiệm thu trên iOS hoặc Android thật.</w:t>
+        <w:t xml:space="preserve"> đạt 81 unit và 44 E2E. Bản làm việc hiện tại đạt 202 unit và 93 E2E trên cùng ba engine sau khi hoàn tất kiểm thử. Chưa có nghiệm thu trên iOS hoặc Android thật.</w:t>
       </w:r>
     </w:p>
     <w:p>
@@ -4647,7 +4647,7 @@
           <w:color w:val="211D20"/>
           <w:sz w:val="20"/>
         </w:rPr>
-        <w:t xml:space="preserve">Bản sáu đề ngày 07/10/2026: ESLint, TypeScript, 201/201 Vitest, build 111 route và audit production dependency đều đạt. Playwright có 91 ca trên bản production local: 87 Chromium, 2 Firefox, 2 WebKit. Sau khi thêm phòng thi mô phỏng và công cụ luyện đề, lượt Chromium đầy đủ đạt 87/87; Firefox và WebKit chưa chạy lại cho thay đổi này. Axe kiểm tra 19 màn, gồm kho đề và Review 13/09. Hai lượt CI của nhánh/PR #38 đạt; Vercel phục vụ SHA </w:t>
+        <w:t xml:space="preserve">Bản sáu đề ngày 07/10/2026: ESLint, TypeScript, 202/202 Vitest, build 111 route và audit production dependency đều đạt. Playwright có 93 ca trên bản production local: 89 Chromium, 2 Firefox, 2 WebKit. Sau khi thêm phòng thi mô phỏng và công cụ luyện đề, lượt Chromium đầy đủ đạt 89/89; Firefox và WebKit chưa chạy lại cho thay đổi này. Axe kiểm tra 19 màn, gồm kho đề và Review 13/09. Hai lượt CI của nhánh/PR #38 đạt; Vercel phục vụ SHA </w:t>
       </w:r>
       <w:r>
         <w:rPr>

</xml_diff>

<commit_message>
Keep fields this build does not know, so an older tab cannot erase a newer build's data
The state, attempt, exam and paper-run schemas used z.object, which drops
every key it was not told about. A tab still running an older build read the
profile, dropped the new fields and wrote the rest back, so whatever a newer
build had added vanished on the next save; restoring a backup or syncing with
the cloud from an older build did the same. They now use looseObject: known
fields are validated as before, unknown ones pass through, and the exported
types drop the index signature so a mistyped property still fails to compile.

This is the foundation for the note-taking plan (docs/PLAN-GHI-CHU.md), which
adds fields to these records; the interface ships in a later release.

Co-Authored-By: Claude Opus 5.5 <noreply@anthropic.com>
Claude-Session: https://claude.ai/code/session_01W75mjctkB2SZty7ogWDMjM
</commit_message>
<xml_diff>
--- a/docs/Bao-cao-ban-giao-May-VSTEP.docx
+++ b/docs/Bao-cao-ban-giao-May-VSTEP.docx
@@ -443,7 +443,7 @@
           <w:color w:val="211D20"/>
           <w:sz w:val="22"/>
         </w:rPr>
-        <w:t>Bản code có năm đề nhập đủ bốn kỹ năng và hai đề tự biên soạn. Cả năm đề nhập có 375 khóa đáp án Nghe/Đọc; đề 131 thiếu đáp án và transcript nên đã được gỡ. 105 MP3 được đóng gói cùng ứng dụng. Viết và Nói lưu bài nhưng chưa được chấm tự động; bản ghi micro cần tải riêng. Bộ kiểm thử local trước khi phát hành gồm 202 unit test và 93 E2E trên Chromium, Firefox và WebKit, build 111 route và axe trên 19 màn. Migration gia cố quyền ghi cloud đã áp dụng trên Supabase production. PR #38 và smoke HTTPS đã đạt cho commit ứng dụng ff8faef; đồng bộ hai thiết bị, micro thật và thẩm định học liệu vẫn cần xác nhận; sáu đề nhập chỉ dùng học cá nhân của chủ dự án.</w:t>
+        <w:t>Bản code có năm đề nhập đủ bốn kỹ năng và hai đề tự biên soạn. Cả năm đề nhập có 375 khóa đáp án Nghe/Đọc; đề 131 thiếu đáp án và transcript nên đã được gỡ. 105 MP3 được đóng gói cùng ứng dụng. Viết và Nói lưu bài nhưng chưa được chấm tự động; bản ghi micro cần tải riêng. Bộ kiểm thử local trước khi phát hành gồm 208 unit test và 94 E2E trên Chromium, Firefox và WebKit, build 111 route và axe trên 19 màn. Migration gia cố quyền ghi cloud đã áp dụng trên Supabase production. PR #38 và smoke HTTPS đã đạt cho commit ứng dụng ff8faef; đồng bộ hai thiết bị, micro thật và thẩm định học liệu vẫn cần xác nhận; sáu đề nhập chỉ dùng học cá nhân của chủ dự án.</w:t>
       </w:r>
     </w:p>
     <w:p>
@@ -662,7 +662,7 @@
           <w:color w:val="211D20"/>
           <w:sz w:val="20"/>
         </w:rPr>
-        <w:t xml:space="preserve"> đạt 81 unit và 44 E2E. Bản làm việc hiện tại đạt 202 unit và 93 E2E trên cùng ba engine sau khi hoàn tất kiểm thử. Chưa có nghiệm thu trên iOS hoặc Android thật.</w:t>
+        <w:t xml:space="preserve"> đạt 81 unit và 44 E2E. Bản làm việc hiện tại đạt 208 unit và 94 E2E trên cùng ba engine sau khi hoàn tất kiểm thử. Chưa có nghiệm thu trên iOS hoặc Android thật.</w:t>
       </w:r>
     </w:p>
     <w:p>
@@ -4647,7 +4647,7 @@
           <w:color w:val="211D20"/>
           <w:sz w:val="20"/>
         </w:rPr>
-        <w:t xml:space="preserve">Bản sáu đề ngày 07/10/2026: ESLint, TypeScript, 202/202 Vitest, build 111 route và audit production dependency đều đạt. Playwright có 93 ca trên bản production local: 89 Chromium, 2 Firefox, 2 WebKit. Sau khi thêm phòng thi mô phỏng và công cụ luyện đề, lượt Chromium đầy đủ đạt 89/89; Firefox và WebKit chưa chạy lại cho thay đổi này. Axe kiểm tra 19 màn, gồm kho đề và Review 13/09. Hai lượt CI của nhánh/PR #38 đạt; Vercel phục vụ SHA </w:t>
+        <w:t xml:space="preserve">Bản sáu đề ngày 07/10/2026: ESLint, TypeScript, 208/208 Vitest, build 111 route và audit production dependency đều đạt. Playwright có 94 ca trên bản production local: 90 Chromium, 2 Firefox, 2 WebKit. Sau khi thêm phòng thi mô phỏng và công cụ luyện đề, lượt Chromium đầy đủ đạt 90/90; Firefox và WebKit chưa chạy lại cho thay đổi này. Axe kiểm tra 19 màn, gồm kho đề và Review 13/09. Hai lượt CI của nhánh/PR #38 đạt; Vercel phục vụ SHA </w:t>
       </w:r>
       <w:r>
         <w:rPr>

</xml_diff>

<commit_message>
Ghi chú đợt 2 và 3: nháp, tô câu, in danh sách, nhắc sao lưu
Nháp và câu tô thuộc về lượt làm (đề kho, phòng thi, bài học, buổi thi có giờ),
tự lưu, có giới hạn riêng 0,5 MB kiểm ngay lúc ghi. Chữa bài hiện lại nháp, câu
đã tô và cho viết ghi chú từ chúng. Sổ ghi chú thêm lọc ★, in, nhắc sao lưu.

Service worker lưu tệp build trước khi lưu trang; hai ca offline chờ cache bằng
expect.poll vì waitForFunction trả Promise thoát ngay. Việc làm nóng cache hoãn
2 giây để gõ phím không phải tính lại kế hoạch mỗi lần.

Co-Authored-By: Claude Sonnet 5.5 <noreply@anthropic.com>
Claude-Session: https://claude.ai/code/session_01W75mjctkB2SZty7ogWDMjM
</commit_message>
<xml_diff>
--- a/docs/Bao-cao-ban-giao-May-VSTEP.docx
+++ b/docs/Bao-cao-ban-giao-May-VSTEP.docx
@@ -443,7 +443,7 @@
           <w:color w:val="211D20"/>
           <w:sz w:val="22"/>
         </w:rPr>
-        <w:t>Bản code có năm đề nhập đủ bốn kỹ năng và hai đề tự biên soạn. Cả năm đề nhập có 375 khóa đáp án Nghe/Đọc; đề 131 thiếu đáp án và transcript nên đã được gỡ. 105 MP3 được đóng gói cùng ứng dụng. Viết và Nói lưu bài nhưng chưa được chấm tự động; bản ghi micro cần tải riêng. Bộ kiểm thử local trước khi phát hành gồm 222 unit test và 110 E2E trên Chromium, Firefox và WebKit, build 112 route và axe trên 19 màn. Migration gia cố quyền ghi cloud đã áp dụng trên Supabase production. PR #38 và smoke HTTPS đã đạt cho commit ứng dụng ff8faef; đồng bộ hai thiết bị, micro thật và thẩm định học liệu vẫn cần xác nhận; sáu đề nhập chỉ dùng học cá nhân của chủ dự án.</w:t>
+        <w:t>Bản code có năm đề nhập đủ bốn kỹ năng và hai đề tự biên soạn. Cả năm đề nhập có 375 khóa đáp án Nghe/Đọc; đề 131 thiếu đáp án và transcript nên đã được gỡ. 105 MP3 được đóng gói cùng ứng dụng. Viết và Nói lưu bài nhưng chưa được chấm tự động; bản ghi micro cần tải riêng. Bộ kiểm thử local trước khi phát hành gồm 258 unit test và 121 E2E trên Chromium, Firefox và WebKit, build 112 route và axe trên 19 màn. Migration gia cố quyền ghi cloud đã áp dụng trên Supabase production. PR #38 và smoke HTTPS đã đạt cho commit ứng dụng ff8faef; đồng bộ hai thiết bị, micro thật và thẩm định học liệu vẫn cần xác nhận; sáu đề nhập chỉ dùng học cá nhân của chủ dự án.</w:t>
       </w:r>
     </w:p>
     <w:p>
@@ -662,7 +662,7 @@
           <w:color w:val="211D20"/>
           <w:sz w:val="20"/>
         </w:rPr>
-        <w:t xml:space="preserve"> đạt 81 unit và 44 E2E. Bản làm việc hiện tại đạt 222 unit và 110 E2E trên cùng ba engine sau khi hoàn tất kiểm thử. Chưa có nghiệm thu trên iOS hoặc Android thật.</w:t>
+        <w:t xml:space="preserve"> đạt 81 unit và 44 E2E. Bản làm việc hiện tại đạt 258 unit và 121 E2E trên cùng ba engine sau khi hoàn tất kiểm thử. Chưa có nghiệm thu trên iOS hoặc Android thật.</w:t>
       </w:r>
     </w:p>
     <w:p>
@@ -2496,108 +2496,17 @@
           <w:color w:val="000000"/>
           <w:sz w:val="25"/>
         </w:rPr>
-        <w:t>4.6c Sổ ghi chú</w:t>
+        <w:t>4.6c Nháp, tô câu và sổ ghi chú</w:t>
       </w:r>
     </w:p>
     <w:p>
-      <w:pPr>
-        <w:pStyle w:val="ListBullet"/>
-      </w:pPr>
       <w:r>
         <w:rPr>
           <w:rFonts w:ascii="Arial" w:hAnsi="Arial" w:eastAsia="Arial"/>
           <w:color w:val="211D20"/>
           <w:sz w:val="20"/>
         </w:rPr>
-        <w:t xml:space="preserve">Ghi bằng lời của mình dưới từng câu </w:t>
-      </w:r>
-      <w:r>
-        <w:rPr>
-          <w:rFonts w:ascii="Arial" w:hAnsi="Arial" w:eastAsia="Arial"/>
-          <w:b/>
-          <w:color w:val="211D20"/>
-          <w:sz w:val="20"/>
-        </w:rPr>
-        <w:t>sau khi đã biết đáp án</w:t>
-      </w:r>
-      <w:r>
-        <w:rPr>
-          <w:rFonts w:ascii="Arial" w:hAnsi="Arial" w:eastAsia="Arial"/>
-          <w:color w:val="211D20"/>
-          <w:sz w:val="20"/>
-        </w:rPr>
-        <w:t>: ở màn chữa đề kho đề (Nghe, Đọc, từng bài Viết, từng phần Nói), "Làm lại câu sai", kết quả bài học, kết quả buổi thi rút gọn và Sổ tay lỗi sai; thêm ô "Rút kinh nghiệm" cho cả đề hoặc cả bài. Ghi chú gắn với câu hỏi, nên hiện lại mỗi lần gặp lại câu đó; khi đang làm bài thì không hiện, để một ghi chú giải thích đáp án không lộ ở lần làm lại.</w:t>
-      </w:r>
-    </w:p>
-    <w:p>
-      <w:pPr>
-        <w:pStyle w:val="ListBullet"/>
-      </w:pPr>
-      <w:r>
-        <w:rPr>
-          <w:rFonts w:ascii="Arial" w:hAnsi="Arial" w:eastAsia="Arial"/>
-          <w:color w:val="211D20"/>
-          <w:sz w:val="20"/>
-        </w:rPr>
-        <w:t>Tự lưu sau 0,9 giây ngừng gõ và khi rời ô hoặc rời trang; năm gợi ý một chạm do Mây đặt; khi trình duyệt không ghi được thì ô báo đúng lỗi và hỏi trước khi bỏ chữ vừa viết.</w:t>
-      </w:r>
-    </w:p>
-    <w:p>
-      <w:pPr>
-        <w:pStyle w:val="ListBullet"/>
-      </w:pPr>
-      <w:r>
-        <w:rPr>
-          <w:rFonts w:ascii="Arial" w:hAnsi="Arial" w:eastAsia="Arial"/>
-          <w:color w:val="211D20"/>
-          <w:sz w:val="20"/>
-        </w:rPr>
-        <w:t xml:space="preserve">Trang </w:t>
-      </w:r>
-      <w:r>
-        <w:rPr>
-          <w:rFonts w:ascii="Consolas" w:hAnsi="Consolas" w:eastAsia="Consolas"/>
-          <w:color w:val="4A3B42"/>
-          <w:sz w:val="19"/>
-        </w:rPr>
-        <w:t>/notes</w:t>
-      </w:r>
-      <w:r>
-        <w:rPr>
-          <w:rFonts w:ascii="Arial" w:hAnsi="Arial" w:eastAsia="Arial"/>
-          <w:color w:val="211D20"/>
-          <w:sz w:val="20"/>
-        </w:rPr>
-        <w:t>: tìm mọi từ không cần gõ dấu, lọc theo kỹ năng, đề hoặc bài, ★ "Cần nhớ", sắp xếp, sửa tại chỗ, xóa có "Hoàn tác", mục "Đã xóa gần đây" khôi phục trong 30 ngày, mở đúng chỗ đã ghi, in danh sách đang lọc; nhận xét giáo viên đã chép ở "Gói gửi giáo viên" hiện thêm ở đó (chỉ đọc).</w:t>
-      </w:r>
-    </w:p>
-    <w:p>
-      <w:pPr>
-        <w:pStyle w:val="ListBullet"/>
-      </w:pPr>
-      <w:r>
-        <w:rPr>
-          <w:rFonts w:ascii="Arial" w:hAnsi="Arial" w:eastAsia="Arial"/>
-          <w:color w:val="211D20"/>
-          <w:sz w:val="20"/>
-        </w:rPr>
-        <w:t>Giới hạn kiểm ngay lúc ghi (</w:t>
-      </w:r>
-      <w:r>
-        <w:rPr>
-          <w:rFonts w:ascii="Consolas" w:hAnsi="Consolas" w:eastAsia="Consolas"/>
-          <w:color w:val="4A3B42"/>
-          <w:sz w:val="19"/>
-        </w:rPr>
-        <w:t>src/lib/notes.ts</w:t>
-      </w:r>
-      <w:r>
-        <w:rPr>
-          <w:rFonts w:ascii="Arial" w:hAnsi="Arial" w:eastAsia="Arial"/>
-          <w:color w:val="211D20"/>
-          <w:sz w:val="20"/>
-        </w:rPr>
-        <w:t xml:space="preserve">): 2000 ghi chú (tính cả mục đã xóa), 2000 ký tự mỗi ghi chú, 1,5 MB tổng. Ghi chú nằm trong cùng state và đi theo bản sao lưu và đồng bộ; file báo lỗi chỉ đếm số ghi chú. Kế hoạch đầy đủ và cách đo: </w:t>
+        <w:t xml:space="preserve">Ba công cụ thay giấy khi luyện; kế hoạch và cách đo nằm ở </w:t>
       </w:r>
       <w:hyperlink r:id="rId14">
         <w:r>
@@ -2615,6 +2524,193 @@
           <w:sz w:val="20"/>
         </w:rPr>
         <w:t>.</w:t>
+      </w:r>
+    </w:p>
+    <w:p>
+      <w:pPr>
+        <w:pStyle w:val="ListBullet"/>
+      </w:pPr>
+      <w:r>
+        <w:rPr>
+          <w:rFonts w:ascii="Arial" w:hAnsi="Arial" w:eastAsia="Arial"/>
+          <w:b/>
+          <w:color w:val="211D20"/>
+          <w:sz w:val="20"/>
+        </w:rPr>
+        <w:t>Nháp:</w:t>
+      </w:r>
+      <w:r>
+        <w:rPr>
+          <w:rFonts w:ascii="Arial" w:hAnsi="Arial" w:eastAsia="Arial"/>
+          <w:color w:val="211D20"/>
+          <w:sz w:val="20"/>
+        </w:rPr>
+        <w:t xml:space="preserve"> ô chữ ở từng phần của đề kho (phòng thi mô phỏng lẫn luyện thoải mái: Nghe, Đọc, dàn ý Viết, dàn ý Nói kể cả phút chuẩn bị), ở bài học và ở buổi thi rút gọn. Không tính điểm hay số từ, lưu theo từng phím như bài viết bên cạnh. Thuộc về </w:t>
+      </w:r>
+      <w:r>
+        <w:rPr>
+          <w:rFonts w:ascii="Arial" w:hAnsi="Arial" w:eastAsia="Arial"/>
+          <w:b/>
+          <w:color w:val="211D20"/>
+          <w:sz w:val="20"/>
+        </w:rPr>
+        <w:t>lượt làm</w:t>
+      </w:r>
+      <w:r>
+        <w:rPr>
+          <w:rFonts w:ascii="Arial" w:hAnsi="Arial" w:eastAsia="Arial"/>
+          <w:color w:val="211D20"/>
+          <w:sz w:val="20"/>
+        </w:rPr>
+        <w:t>: làm lại đề là trang trắng, xem lại lượt cũ thấy đúng trang của ngày đó, và một lượt bị bỏ khi vượt 100 lượt thì mang nháp đi theo.</w:t>
+      </w:r>
+    </w:p>
+    <w:p>
+      <w:pPr>
+        <w:pStyle w:val="ListBullet"/>
+      </w:pPr>
+      <w:r>
+        <w:rPr>
+          <w:rFonts w:ascii="Arial" w:hAnsi="Arial" w:eastAsia="Arial"/>
+          <w:b/>
+          <w:color w:val="211D20"/>
+          <w:sz w:val="20"/>
+        </w:rPr>
+        <w:t>Tô câu:</w:t>
+      </w:r>
+      <w:r>
+        <w:rPr>
+          <w:rFonts w:ascii="Arial" w:hAnsi="Arial" w:eastAsia="Arial"/>
+          <w:color w:val="211D20"/>
+          <w:sz w:val="20"/>
+        </w:rPr>
+        <w:t xml:space="preserve"> nút “Tô câu” trên bài đọc, bản chép lời (sau khi nộp) và đề bài; bấm hoặc chạm vào một câu để tô, bấm lần nữa để bỏ; dùng được bằng Tab và Enter. Một màu. Tô theo câu chứ không theo khoảng chữ, vì bôi chọn bằng bàn phím không làm được trên chữ thường và trên điện thoại rất khó. Câu được tách theo cùng quy tắc với giọng đọc (không cắt ở “Dr.”, số thập phân, “a.m.”). Tô tìm lại câu của mình bằng vài chữ đầu nếu bài đã đổi, và báo rõ câu nào không còn tìm thấy.</w:t>
+      </w:r>
+    </w:p>
+    <w:p>
+      <w:pPr>
+        <w:pStyle w:val="ListBullet"/>
+      </w:pPr>
+      <w:r>
+        <w:rPr>
+          <w:rFonts w:ascii="Arial" w:hAnsi="Arial" w:eastAsia="Arial"/>
+          <w:b/>
+          <w:color w:val="211D20"/>
+          <w:sz w:val="20"/>
+        </w:rPr>
+        <w:t>Ghi chú</w:t>
+      </w:r>
+      <w:r>
+        <w:rPr>
+          <w:rFonts w:ascii="Arial" w:hAnsi="Arial" w:eastAsia="Arial"/>
+          <w:color w:val="211D20"/>
+          <w:sz w:val="20"/>
+        </w:rPr>
+        <w:t xml:space="preserve"> bằng lời của mình dưới từng câu </w:t>
+      </w:r>
+      <w:r>
+        <w:rPr>
+          <w:rFonts w:ascii="Arial" w:hAnsi="Arial" w:eastAsia="Arial"/>
+          <w:b/>
+          <w:color w:val="211D20"/>
+          <w:sz w:val="20"/>
+        </w:rPr>
+        <w:t>sau khi đã biết đáp án</w:t>
+      </w:r>
+      <w:r>
+        <w:rPr>
+          <w:rFonts w:ascii="Arial" w:hAnsi="Arial" w:eastAsia="Arial"/>
+          <w:color w:val="211D20"/>
+          <w:sz w:val="20"/>
+        </w:rPr>
+        <w:t>: màn chữa đề kho đề (Nghe, Đọc, từng bài Viết, từng phần Nói), “Làm lại câu sai”, kết quả bài học, kết quả buổi thi rút gọn và Sổ tay lỗi sai; thêm ô “Rút kinh nghiệm” cho cả đề hoặc cả bài. Gắn với câu hỏi nên hiện lại mỗi lần gặp lại câu đó; khi đang làm bài thì không hiện, để một ghi chú giải thích đáp án không lộ ở lần làm lại. Từ một câu đã tô có thể viết ghi chú kèm đúng câu đó, và một trang nháp có thể giữ lại thành ghi chú.</w:t>
+      </w:r>
+    </w:p>
+    <w:p>
+      <w:pPr>
+        <w:pStyle w:val="ListBullet"/>
+      </w:pPr>
+      <w:r>
+        <w:rPr>
+          <w:rFonts w:ascii="Arial" w:hAnsi="Arial" w:eastAsia="Arial"/>
+          <w:color w:val="211D20"/>
+          <w:sz w:val="20"/>
+        </w:rPr>
+        <w:t>Tự lưu sau 0,9 giây ngừng gõ và khi rời ô hoặc rời trang; năm gợi ý một chạm do Mây đặt; khi trình duyệt không ghi được thì ô báo đúng lỗi và hỏi trước khi bỏ chữ vừa viết.</w:t>
+      </w:r>
+    </w:p>
+    <w:p>
+      <w:pPr>
+        <w:pStyle w:val="ListBullet"/>
+      </w:pPr>
+      <w:r>
+        <w:rPr>
+          <w:rFonts w:ascii="Arial" w:hAnsi="Arial" w:eastAsia="Arial"/>
+          <w:color w:val="211D20"/>
+          <w:sz w:val="20"/>
+        </w:rPr>
+        <w:t xml:space="preserve">Trang </w:t>
+      </w:r>
+      <w:r>
+        <w:rPr>
+          <w:rFonts w:ascii="Consolas" w:hAnsi="Consolas" w:eastAsia="Consolas"/>
+          <w:color w:val="4A3B42"/>
+          <w:sz w:val="19"/>
+        </w:rPr>
+        <w:t>/notes</w:t>
+      </w:r>
+      <w:r>
+        <w:rPr>
+          <w:rFonts w:ascii="Arial" w:hAnsi="Arial" w:eastAsia="Arial"/>
+          <w:color w:val="211D20"/>
+          <w:sz w:val="20"/>
+        </w:rPr>
+        <w:t>: tìm mọi từ không cần gõ dấu, lọc theo kỹ năng, đề hoặc bài, ★ “Cần nhớ”, sắp xếp, sửa tại chỗ, xóa có “Hoàn tác”, mục “Đã xóa gần đây” khôi phục trong 30 ngày, mở đúng chỗ đã ghi, in danh sách đang lọc, nhắc sao lưu khi có từ 10 ghi chú mới chưa nằm trong bản sao nào; nhận xét giáo viên đã chép ở “Gói gửi giáo viên” hiện thêm ở đó (chỉ đọc).</w:t>
+      </w:r>
+    </w:p>
+    <w:p>
+      <w:pPr>
+        <w:pStyle w:val="ListBullet"/>
+      </w:pPr>
+      <w:r>
+        <w:rPr>
+          <w:rFonts w:ascii="Arial" w:hAnsi="Arial" w:eastAsia="Arial"/>
+          <w:color w:val="211D20"/>
+          <w:sz w:val="20"/>
+        </w:rPr>
+        <w:t>Giới hạn kiểm ngay lúc ghi (</w:t>
+      </w:r>
+      <w:r>
+        <w:rPr>
+          <w:rFonts w:ascii="Consolas" w:hAnsi="Consolas" w:eastAsia="Consolas"/>
+          <w:color w:val="4A3B42"/>
+          <w:sz w:val="19"/>
+        </w:rPr>
+        <w:t>src/lib/notes.ts</w:t>
+      </w:r>
+      <w:r>
+        <w:rPr>
+          <w:rFonts w:ascii="Arial" w:hAnsi="Arial" w:eastAsia="Arial"/>
+          <w:color w:val="211D20"/>
+          <w:sz w:val="20"/>
+        </w:rPr>
+        <w:t xml:space="preserve">, </w:t>
+      </w:r>
+      <w:r>
+        <w:rPr>
+          <w:rFonts w:ascii="Consolas" w:hAnsi="Consolas" w:eastAsia="Consolas"/>
+          <w:color w:val="4A3B42"/>
+          <w:sz w:val="19"/>
+        </w:rPr>
+        <w:t>src/lib/work.ts</w:t>
+      </w:r>
+      <w:r>
+        <w:rPr>
+          <w:rFonts w:ascii="Arial" w:hAnsi="Arial" w:eastAsia="Arial"/>
+          <w:color w:val="211D20"/>
+          <w:sz w:val="20"/>
+        </w:rPr>
+        <w:t>): ghi chú tối đa 2000 (tính cả mục đã xóa), 2000 ký tự mỗi ghi chú, 1,5 MB; nháp tối đa 2000 ký tự mỗi phần và 40 phần mỗi lượt, mỗi bài tô tối đa 60 câu, và toàn bộ nháp cùng câu tô tối đa 0,5 MB. Tất cả nằm trong cùng state và đi theo bản sao lưu và đồng bộ; file báo lỗi chỉ đếm số ghi chú.</w:t>
       </w:r>
     </w:p>
     <w:p>
@@ -4794,7 +4890,7 @@
           <w:color w:val="211D20"/>
           <w:sz w:val="20"/>
         </w:rPr>
-        <w:t xml:space="preserve">Bản sáu đề ngày 07/10/2026: ESLint, TypeScript, 222/222 Vitest, build 112 route và audit production dependency đều đạt. Playwright có 110 ca trên bản production local: 102 Chromium, 4 Firefox, 4 WebKit. Sau khi thêm phòng thi mô phỏng và công cụ luyện đề, lượt Chromium đầy đủ đạt 102/102; Firefox và WebKit chưa chạy lại cho thay đổi này. Axe kiểm tra 19 màn, gồm kho đề và Review 13/09. Hai lượt CI của nhánh/PR #38 đạt; Vercel phục vụ SHA </w:t>
+        <w:t xml:space="preserve">Bản sáu đề ngày 07/10/2026: ESLint, TypeScript, 258/258 Vitest, build 112 route và audit production dependency đều đạt. Playwright có 121 ca trên bản production local: 113 Chromium, 4 Firefox, 4 WebKit. Sau khi thêm phòng thi mô phỏng và công cụ luyện đề, lượt Chromium đầy đủ đạt 113/113; Firefox và WebKit chưa chạy lại cho thay đổi này. Axe kiểm tra 19 màn, gồm kho đề và Review 13/09. Hai lượt CI của nhánh/PR #38 đạt; Vercel phục vụ SHA </w:t>
       </w:r>
       <w:r>
         <w:rPr>
@@ -6773,7 +6869,7 @@
                 <w:color w:val="211D20"/>
                 <w:sz w:val="16"/>
               </w:rPr>
-              <w:t>Ghi chú: gõ tiếng Việt trên thiết bị thật</w:t>
+              <w:t>Nháp, tô câu và ghi chú trên thiết bị thật</w:t>
             </w:r>
           </w:p>
         </w:tc>
@@ -6823,7 +6919,7 @@
                 <w:color w:val="211D20"/>
                 <w:sz w:val="16"/>
               </w:rPr>
-              <w:t>Bộ gõ điện thoại và máy tính chưa được thử; sửa cùng một ghi chú ở hai tab thì lần lưu sau thắng</w:t>
+              <w:t>Bộ gõ tiếng Việt, chạm để tô câu trên điện thoại chưa được thử; sửa cùng một ghi chú ở hai tab thì lần lưu sau thắng</w:t>
             </w:r>
           </w:p>
         </w:tc>
@@ -9261,6 +9357,78 @@
                 <w:color w:val="4A3B42"/>
                 <w:sz w:val="15"/>
               </w:rPr>
+              <w:t>src/components/scratch-pad.tsx</w:t>
+            </w:r>
+            <w:r>
+              <w:rPr>
+                <w:rFonts w:ascii="Arial" w:hAnsi="Arial" w:eastAsia="Arial"/>
+                <w:color w:val="211D20"/>
+                <w:sz w:val="16"/>
+              </w:rPr>
+              <w:t xml:space="preserve">, </w:t>
+            </w:r>
+            <w:r>
+              <w:rPr>
+                <w:rFonts w:ascii="Consolas" w:hAnsi="Consolas" w:eastAsia="Consolas"/>
+                <w:color w:val="4A3B42"/>
+                <w:sz w:val="15"/>
+              </w:rPr>
+              <w:t>marked-text.tsx</w:t>
+            </w:r>
+          </w:p>
+        </w:tc>
+        <w:tc>
+          <w:tcPr>
+            <w:tcW w:type="dxa" w:w="6707"/>
+            <w:vAlign w:val="center"/>
+            <w:tcMar>
+              <w:top w:w="85" w:type="dxa"/>
+              <w:start w:w="120" w:type="dxa"/>
+              <w:bottom w:w="85" w:type="dxa"/>
+              <w:end w:w="120" w:type="dxa"/>
+            </w:tcMar>
+          </w:tcPr>
+          <w:p>
+            <w:pPr>
+              <w:spacing w:after="0" w:line="264" w:lineRule="auto"/>
+            </w:pPr>
+            <w:r>
+              <w:rPr>
+                <w:rFonts w:ascii="Arial" w:hAnsi="Arial" w:eastAsia="Arial"/>
+                <w:color w:val="211D20"/>
+                <w:sz w:val="16"/>
+              </w:rPr>
+              <w:t>Trang nháp và nút Tô câu</w:t>
+            </w:r>
+          </w:p>
+        </w:tc>
+      </w:tr>
+      <w:tr>
+        <w:trPr>
+          <w:cantSplit/>
+        </w:trPr>
+        <w:tc>
+          <w:tcPr>
+            <w:tcW w:type="dxa" w:w="3013"/>
+            <w:vAlign w:val="center"/>
+            <w:tcMar>
+              <w:top w:w="85" w:type="dxa"/>
+              <w:start w:w="120" w:type="dxa"/>
+              <w:bottom w:w="85" w:type="dxa"/>
+              <w:end w:w="120" w:type="dxa"/>
+            </w:tcMar>
+            <w:shd w:fill="FAF7F8"/>
+          </w:tcPr>
+          <w:p>
+            <w:pPr>
+              <w:spacing w:after="0" w:line="264" w:lineRule="auto"/>
+            </w:pPr>
+            <w:r>
+              <w:rPr>
+                <w:rFonts w:ascii="Consolas" w:hAnsi="Consolas" w:eastAsia="Consolas"/>
+                <w:color w:val="4A3B42"/>
+                <w:sz w:val="15"/>
+              </w:rPr>
               <w:t>src/lib/notes.ts</w:t>
             </w:r>
             <w:r>
@@ -9291,6 +9459,7 @@
               <w:bottom w:w="85" w:type="dxa"/>
               <w:end w:w="120" w:type="dxa"/>
             </w:tcMar>
+            <w:shd w:fill="FAF7F8"/>
           </w:tcPr>
           <w:p>
             <w:pPr>
@@ -9303,6 +9472,93 @@
                 <w:sz w:val="16"/>
               </w:rPr>
               <w:t>Giới hạn và thao tác ghi chú; tên "chỗ ghi" của từng câu</w:t>
+            </w:r>
+          </w:p>
+        </w:tc>
+      </w:tr>
+      <w:tr>
+        <w:trPr>
+          <w:cantSplit/>
+        </w:trPr>
+        <w:tc>
+          <w:tcPr>
+            <w:tcW w:type="dxa" w:w="3013"/>
+            <w:vAlign w:val="center"/>
+            <w:tcMar>
+              <w:top w:w="85" w:type="dxa"/>
+              <w:start w:w="120" w:type="dxa"/>
+              <w:bottom w:w="85" w:type="dxa"/>
+              <w:end w:w="120" w:type="dxa"/>
+            </w:tcMar>
+          </w:tcPr>
+          <w:p>
+            <w:pPr>
+              <w:spacing w:after="0" w:line="264" w:lineRule="auto"/>
+            </w:pPr>
+            <w:r>
+              <w:rPr>
+                <w:rFonts w:ascii="Consolas" w:hAnsi="Consolas" w:eastAsia="Consolas"/>
+                <w:color w:val="4A3B42"/>
+                <w:sz w:val="15"/>
+              </w:rPr>
+              <w:t>src/lib/work.ts</w:t>
+            </w:r>
+            <w:r>
+              <w:rPr>
+                <w:rFonts w:ascii="Arial" w:hAnsi="Arial" w:eastAsia="Arial"/>
+                <w:color w:val="211D20"/>
+                <w:sz w:val="16"/>
+              </w:rPr>
+              <w:t xml:space="preserve">, </w:t>
+            </w:r>
+            <w:r>
+              <w:rPr>
+                <w:rFonts w:ascii="Consolas" w:hAnsi="Consolas" w:eastAsia="Consolas"/>
+                <w:color w:val="4A3B42"/>
+                <w:sz w:val="15"/>
+              </w:rPr>
+              <w:t>marks.ts</w:t>
+            </w:r>
+            <w:r>
+              <w:rPr>
+                <w:rFonts w:ascii="Arial" w:hAnsi="Arial" w:eastAsia="Arial"/>
+                <w:color w:val="211D20"/>
+                <w:sz w:val="16"/>
+              </w:rPr>
+              <w:t xml:space="preserve">, </w:t>
+            </w:r>
+            <w:r>
+              <w:rPr>
+                <w:rFonts w:ascii="Consolas" w:hAnsi="Consolas" w:eastAsia="Consolas"/>
+                <w:color w:val="4A3B42"/>
+                <w:sz w:val="15"/>
+              </w:rPr>
+              <w:t>backup-mark.ts</w:t>
+            </w:r>
+          </w:p>
+        </w:tc>
+        <w:tc>
+          <w:tcPr>
+            <w:tcW w:type="dxa" w:w="6707"/>
+            <w:vAlign w:val="center"/>
+            <w:tcMar>
+              <w:top w:w="85" w:type="dxa"/>
+              <w:start w:w="120" w:type="dxa"/>
+              <w:bottom w:w="85" w:type="dxa"/>
+              <w:end w:w="120" w:type="dxa"/>
+            </w:tcMar>
+          </w:tcPr>
+          <w:p>
+            <w:pPr>
+              <w:spacing w:after="0" w:line="264" w:lineRule="auto"/>
+            </w:pPr>
+            <w:r>
+              <w:rPr>
+                <w:rFonts w:ascii="Arial" w:hAnsi="Arial" w:eastAsia="Arial"/>
+                <w:color w:val="211D20"/>
+                <w:sz w:val="16"/>
+              </w:rPr>
+              <w:t>Nháp và câu tô của từng lượt; tách câu; nhắc sao lưu</w:t>
             </w:r>
           </w:p>
         </w:tc>

</xml_diff>

<commit_message>
Keep fields this build does not know, so an older tab cannot erase a newer build's data (#51)
The state, attempt, exam and paper-run schemas used z.object, which drops
every key it was not told about. A tab still running an older build read the
profile, dropped the new fields and wrote the rest back, so whatever a newer
build had added vanished on the next save; restoring a backup or syncing with
the cloud from an older build did the same. They now use looseObject: known
fields are validated as before, unknown ones pass through, and the exported
types drop the index signature so a mistyped property still fails to compile.

This is the foundation for the note-taking plan (docs/PLAN-GHI-CHU.md), which
adds fields to these records; the interface ships in a later release.


Claude-Session: https://claude.ai/code/session_01W75mjctkB2SZty7ogWDMjM

Co-authored-by: Claude <noreply@anthropic.com>
</commit_message>
<xml_diff>
--- a/docs/Bao-cao-ban-giao-May-VSTEP.docx
+++ b/docs/Bao-cao-ban-giao-May-VSTEP.docx
@@ -443,7 +443,7 @@
           <w:color w:val="211D20"/>
           <w:sz w:val="22"/>
         </w:rPr>
-        <w:t>Bản code có năm đề nhập đủ bốn kỹ năng và hai đề tự biên soạn. Cả năm đề nhập có 375 khóa đáp án Nghe/Đọc; đề 131 thiếu đáp án và transcript nên đã được gỡ. 105 MP3 được đóng gói cùng ứng dụng. Viết và Nói lưu bài nhưng chưa được chấm tự động; bản ghi micro cần tải riêng. Bộ kiểm thử local trước khi phát hành gồm 202 unit test và 93 E2E trên Chromium, Firefox và WebKit, build 111 route và axe trên 19 màn. Migration gia cố quyền ghi cloud đã áp dụng trên Supabase production. PR #38 và smoke HTTPS đã đạt cho commit ứng dụng ff8faef; đồng bộ hai thiết bị, micro thật và thẩm định học liệu vẫn cần xác nhận; sáu đề nhập chỉ dùng học cá nhân của chủ dự án.</w:t>
+        <w:t>Bản code có năm đề nhập đủ bốn kỹ năng và hai đề tự biên soạn. Cả năm đề nhập có 375 khóa đáp án Nghe/Đọc; đề 131 thiếu đáp án và transcript nên đã được gỡ. 105 MP3 được đóng gói cùng ứng dụng. Viết và Nói lưu bài nhưng chưa được chấm tự động; bản ghi micro cần tải riêng. Bộ kiểm thử local trước khi phát hành gồm 208 unit test và 94 E2E trên Chromium, Firefox và WebKit, build 111 route và axe trên 19 màn. Migration gia cố quyền ghi cloud đã áp dụng trên Supabase production. PR #38 và smoke HTTPS đã đạt cho commit ứng dụng ff8faef; đồng bộ hai thiết bị, micro thật và thẩm định học liệu vẫn cần xác nhận; sáu đề nhập chỉ dùng học cá nhân của chủ dự án.</w:t>
       </w:r>
     </w:p>
     <w:p>
@@ -662,7 +662,7 @@
           <w:color w:val="211D20"/>
           <w:sz w:val="20"/>
         </w:rPr>
-        <w:t xml:space="preserve"> đạt 81 unit và 44 E2E. Bản làm việc hiện tại đạt 202 unit và 93 E2E trên cùng ba engine sau khi hoàn tất kiểm thử. Chưa có nghiệm thu trên iOS hoặc Android thật.</w:t>
+        <w:t xml:space="preserve"> đạt 81 unit và 44 E2E. Bản làm việc hiện tại đạt 208 unit và 94 E2E trên cùng ba engine sau khi hoàn tất kiểm thử. Chưa có nghiệm thu trên iOS hoặc Android thật.</w:t>
       </w:r>
     </w:p>
     <w:p>
@@ -4647,7 +4647,7 @@
           <w:color w:val="211D20"/>
           <w:sz w:val="20"/>
         </w:rPr>
-        <w:t xml:space="preserve">Bản sáu đề ngày 07/10/2026: ESLint, TypeScript, 202/202 Vitest, build 111 route và audit production dependency đều đạt. Playwright có 93 ca trên bản production local: 89 Chromium, 2 Firefox, 2 WebKit. Sau khi thêm phòng thi mô phỏng và công cụ luyện đề, lượt Chromium đầy đủ đạt 89/89; Firefox và WebKit chưa chạy lại cho thay đổi này. Axe kiểm tra 19 màn, gồm kho đề và Review 13/09. Hai lượt CI của nhánh/PR #38 đạt; Vercel phục vụ SHA </w:t>
+        <w:t xml:space="preserve">Bản sáu đề ngày 07/10/2026: ESLint, TypeScript, 208/208 Vitest, build 111 route và audit production dependency đều đạt. Playwright có 94 ca trên bản production local: 90 Chromium, 2 Firefox, 2 WebKit. Sau khi thêm phòng thi mô phỏng và công cụ luyện đề, lượt Chromium đầy đủ đạt 90/90; Firefox và WebKit chưa chạy lại cho thay đổi này. Axe kiểm tra 19 màn, gồm kho đề và Review 13/09. Hai lượt CI của nhánh/PR #38 đạt; Vercel phục vụ SHA </w:t>
       </w:r>
       <w:r>
         <w:rPr>

</xml_diff>

<commit_message>
Báo cáo tình trạng 08/10: ghi chú, nháp, tô câu; ưu tiên desktop
Cập nhật báo cáo tình trạng (và file Word) cho đợt ghi chú đã phát hành, ghi kết
quả CI, hạn mức localStorage ba engine và giới hạn còn lại. Ghi quyết định của
chủ dự án: luyện đề trên máy tính nên ưu tiên desktop; bỏ các lời hứa kiểm trên
điện thoại khỏi tài liệu.

Co-Authored-By: Claude Sonnet 5.5 <noreply@anthropic.com>
Claude-Session: https://claude.ai/code/session_01W75mjctkB2SZty7ogWDMjM
</commit_message>
<xml_diff>
--- a/docs/Bao-cao-ban-giao-May-VSTEP.docx
+++ b/docs/Bao-cao-ban-giao-May-VSTEP.docx
@@ -6869,7 +6869,7 @@
                 <w:color w:val="211D20"/>
                 <w:sz w:val="16"/>
               </w:rPr>
-              <w:t>Nháp, tô câu và ghi chú trên thiết bị thật</w:t>
+              <w:t>Nháp, tô câu và ghi chú với bộ gõ thật</w:t>
             </w:r>
           </w:p>
         </w:tc>
@@ -6919,7 +6919,7 @@
                 <w:color w:val="211D20"/>
                 <w:sz w:val="16"/>
               </w:rPr>
-              <w:t>Bộ gõ tiếng Việt, chạm để tô câu trên điện thoại chưa được thử; sửa cùng một ghi chú ở hai tab thì lần lưu sau thắng</w:t>
+              <w:t>Gõ tiếng Việt bằng bộ gõ thật trên máy tính (Unikey, EVKey) chưa được thử; điện thoại không phải trọng tâm; sửa cùng một ghi chú ở hai tab thì lần lưu sau thắng</w:t>
             </w:r>
           </w:p>
         </w:tc>
@@ -10261,6 +10261,28 @@
       <w:r>
         <w:rPr>
           <w:rFonts w:ascii="Arial" w:hAnsi="Arial" w:eastAsia="Arial"/>
+          <w:b/>
+          <w:color w:val="211D20"/>
+          <w:sz w:val="20"/>
+        </w:rPr>
+        <w:t>Desktop trước.</w:t>
+      </w:r>
+      <w:r>
+        <w:rPr>
+          <w:rFonts w:ascii="Arial" w:hAnsi="Arial" w:eastAsia="Arial"/>
+          <w:color w:val="211D20"/>
+          <w:sz w:val="20"/>
+        </w:rPr>
+        <w:t xml:space="preserve"> Gùa luyện đề trên máy tính, nên thiết kế, kiểm thử và sửa lỗi ưu tiên trình duyệt máy tính; điện thoại chỉ cần không vỡ bố cục và không làm gì hơn (quyết định của chủ dự án ngày 08/10/2026).</w:t>
+      </w:r>
+    </w:p>
+    <w:p>
+      <w:pPr>
+        <w:pStyle w:val="ListBullet"/>
+      </w:pPr>
+      <w:r>
+        <w:rPr>
+          <w:rFonts w:ascii="Arial" w:hAnsi="Arial" w:eastAsia="Arial"/>
           <w:color w:val="211D20"/>
           <w:sz w:val="20"/>
         </w:rPr>

</xml_diff>

<commit_message>
Báo cáo tình trạng 08/10: ghi chú, nháp, tô câu; ưu tiên desktop (#53)
Cập nhật báo cáo tình trạng (và file Word) cho đợt ghi chú đã phát hành, ghi kết
quả CI, hạn mức localStorage ba engine và giới hạn còn lại. Ghi quyết định của
chủ dự án: luyện đề trên máy tính nên ưu tiên desktop; bỏ các lời hứa kiểm trên
điện thoại khỏi tài liệu.


Claude-Session: https://claude.ai/code/session_01W75mjctkB2SZty7ogWDMjM

Co-authored-by: Claude <noreply@anthropic.com>
</commit_message>
<xml_diff>
--- a/docs/Bao-cao-ban-giao-May-VSTEP.docx
+++ b/docs/Bao-cao-ban-giao-May-VSTEP.docx
@@ -6869,7 +6869,7 @@
                 <w:color w:val="211D20"/>
                 <w:sz w:val="16"/>
               </w:rPr>
-              <w:t>Nháp, tô câu và ghi chú trên thiết bị thật</w:t>
+              <w:t>Nháp, tô câu và ghi chú với bộ gõ thật</w:t>
             </w:r>
           </w:p>
         </w:tc>
@@ -6919,7 +6919,7 @@
                 <w:color w:val="211D20"/>
                 <w:sz w:val="16"/>
               </w:rPr>
-              <w:t>Bộ gõ tiếng Việt, chạm để tô câu trên điện thoại chưa được thử; sửa cùng một ghi chú ở hai tab thì lần lưu sau thắng</w:t>
+              <w:t>Gõ tiếng Việt bằng bộ gõ thật trên máy tính (Unikey, EVKey) chưa được thử; điện thoại không phải trọng tâm; sửa cùng một ghi chú ở hai tab thì lần lưu sau thắng</w:t>
             </w:r>
           </w:p>
         </w:tc>
@@ -10261,6 +10261,28 @@
       <w:r>
         <w:rPr>
           <w:rFonts w:ascii="Arial" w:hAnsi="Arial" w:eastAsia="Arial"/>
+          <w:b/>
+          <w:color w:val="211D20"/>
+          <w:sz w:val="20"/>
+        </w:rPr>
+        <w:t>Desktop trước.</w:t>
+      </w:r>
+      <w:r>
+        <w:rPr>
+          <w:rFonts w:ascii="Arial" w:hAnsi="Arial" w:eastAsia="Arial"/>
+          <w:color w:val="211D20"/>
+          <w:sz w:val="20"/>
+        </w:rPr>
+        <w:t xml:space="preserve"> Gùa luyện đề trên máy tính, nên thiết kế, kiểm thử và sửa lỗi ưu tiên trình duyệt máy tính; điện thoại chỉ cần không vỡ bố cục và không làm gì hơn (quyết định của chủ dự án ngày 08/10/2026).</w:t>
+      </w:r>
+    </w:p>
+    <w:p>
+      <w:pPr>
+        <w:pStyle w:val="ListBullet"/>
+      </w:pPr>
+      <w:r>
+        <w:rPr>
+          <w:rFonts w:ascii="Arial" w:hAnsi="Arial" w:eastAsia="Arial"/>
           <w:color w:val="211D20"/>
           <w:sz w:val="20"/>
         </w:rPr>

</xml_diff>

<commit_message>
Ghi chú: xử lý gõ tiếng Việt, hai tab, tab bản cũ và nhắc sao lưu
Gõ tiếng Việt: ô nháp phần Đọc gập lại khi rỗng (Unikey/EVKey gõ chữ đầu bằng
Backspace) nên nuốt phím; nay mở/đóng là lựa chọn của người học. Có ca mô phỏng
gõ ghép (imeSetComposition) và gõ rồi sửa. Ô tìm kiếm tính sẵn dữ liệu phụ
thuộc sổ, nhanh gấp đôi khi sổ đầy.

Hai tab: ô ghi chú không ghi đè bản đã đổi ở tab khác mà hỏi (giữ cả hai, giữ
bản của tôi, dùng bản bên kia); chữ đang gõ không bao giờ mất khi hộp biến mất.

Tab bản cũ: hồ sơ được đóng dấu rev; hồ sơ nhận về không dấu được đưa lại ghi
chú, nháp, câu tô từ trí nhớ của tab và từ bản chép trong IndexedDB, với các hàng
rào để bản chép không bao giờ bị thay bằng thứ có thể đã bị làm rỗng.

Sao lưu: nút tải ngay trong thông báo, hiện cả ở Trang chủ, thêm ngưỡng theo
ngày; bản nháp bài học có trần 30000 ký tự kiểm lúc ghi.

Co-Authored-By: Claude Sonnet 5.5 <noreply@anthropic.com>
Claude-Session: https://claude.ai/code/session_01W75mjctkB2SZty7ogWDMjM
</commit_message>
<xml_diff>
--- a/docs/Bao-cao-ban-giao-May-VSTEP.docx
+++ b/docs/Bao-cao-ban-giao-May-VSTEP.docx
@@ -443,7 +443,7 @@
           <w:color w:val="211D20"/>
           <w:sz w:val="22"/>
         </w:rPr>
-        <w:t>Bản code có năm đề nhập đủ bốn kỹ năng và hai đề tự biên soạn. Cả năm đề nhập có 375 khóa đáp án Nghe/Đọc; đề 131 thiếu đáp án và transcript nên đã được gỡ. 105 MP3 được đóng gói cùng ứng dụng. Viết và Nói lưu bài nhưng chưa được chấm tự động; bản ghi micro cần tải riêng. Bộ kiểm thử local trước khi phát hành gồm 258 unit test và 121 E2E trên Chromium, Firefox và WebKit, build 112 route và axe trên 19 màn. Migration gia cố quyền ghi cloud đã áp dụng trên Supabase production. PR #38 và smoke HTTPS đã đạt cho commit ứng dụng ff8faef; đồng bộ hai thiết bị, micro thật và thẩm định học liệu vẫn cần xác nhận; sáu đề nhập chỉ dùng học cá nhân của chủ dự án.</w:t>
+        <w:t>Bản code có năm đề nhập đủ bốn kỹ năng và hai đề tự biên soạn. Cả năm đề nhập có 375 khóa đáp án Nghe/Đọc; đề 131 thiếu đáp án và transcript nên đã được gỡ. 105 MP3 được đóng gói cùng ứng dụng. Viết và Nói lưu bài nhưng chưa được chấm tự động; bản ghi micro cần tải riêng. Bộ kiểm thử local trước khi phát hành gồm 282 unit test và 151 E2E trên Chromium, Firefox và WebKit, build 112 route và axe trên 19 màn. Migration gia cố quyền ghi cloud đã áp dụng trên Supabase production. PR #38 và smoke HTTPS đã đạt cho commit ứng dụng ff8faef; đồng bộ hai thiết bị, micro thật và thẩm định học liệu vẫn cần xác nhận; sáu đề nhập chỉ dùng học cá nhân của chủ dự án.</w:t>
       </w:r>
     </w:p>
     <w:p>
@@ -662,7 +662,7 @@
           <w:color w:val="211D20"/>
           <w:sz w:val="20"/>
         </w:rPr>
-        <w:t xml:space="preserve"> đạt 81 unit và 44 E2E. Bản làm việc hiện tại đạt 258 unit và 121 E2E trên cùng ba engine sau khi hoàn tất kiểm thử. Chưa có nghiệm thu trên iOS hoặc Android thật.</w:t>
+        <w:t xml:space="preserve"> đạt 81 unit và 44 E2E. Bản làm việc hiện tại đạt 282 unit và 151 E2E trên cùng ba engine sau khi hoàn tất kiểm thử. Chưa có nghiệm thu trên iOS hoặc Android thật.</w:t>
       </w:r>
     </w:p>
     <w:p>
@@ -2646,10 +2646,36 @@
       <w:r>
         <w:rPr>
           <w:rFonts w:ascii="Arial" w:hAnsi="Arial" w:eastAsia="Arial"/>
+          <w:b/>
           <w:color w:val="211D20"/>
           <w:sz w:val="20"/>
         </w:rPr>
-        <w:t xml:space="preserve">Trang </w:t>
+        <w:t>Hai tab cùng một ghi chú:</w:t>
+      </w:r>
+      <w:r>
+        <w:rPr>
+          <w:rFonts w:ascii="Arial" w:hAnsi="Arial" w:eastAsia="Arial"/>
+          <w:color w:val="211D20"/>
+          <w:sz w:val="20"/>
+        </w:rPr>
+        <w:t xml:space="preserve"> ô nhớ bản nó bắt đầu từ đó. Tab kia lưu mà ô này chưa gõ thì ô này theo bản mới; đã gõ thì </w:t>
+      </w:r>
+      <w:r>
+        <w:rPr>
+          <w:rFonts w:ascii="Arial" w:hAnsi="Arial" w:eastAsia="Arial"/>
+          <w:b/>
+          <w:color w:val="211D20"/>
+          <w:sz w:val="20"/>
+        </w:rPr>
+        <w:t>không ghi đè</w:t>
+      </w:r>
+      <w:r>
+        <w:rPr>
+          <w:rFonts w:ascii="Arial" w:hAnsi="Arial" w:eastAsia="Arial"/>
+          <w:color w:val="211D20"/>
+          <w:sz w:val="20"/>
+        </w:rPr>
+        <w:t xml:space="preserve"> mà hiện cả hai bản với “Giữ cả hai”, “Giữ bản của tôi”, “Dùng bản bên kia” (</w:t>
       </w:r>
       <w:r>
         <w:rPr>
@@ -2657,7 +2683,7 @@
           <w:color w:val="4A3B42"/>
           <w:sz w:val="19"/>
         </w:rPr>
-        <w:t>/notes</w:t>
+        <w:t>editNote</w:t>
       </w:r>
       <w:r>
         <w:rPr>
@@ -2665,7 +2691,193 @@
           <w:color w:val="211D20"/>
           <w:sz w:val="20"/>
         </w:rPr>
-        <w:t>: tìm mọi từ không cần gõ dấu, lọc theo kỹ năng, đề hoặc bài, ★ “Cần nhớ”, sắp xếp, sửa tại chỗ, xóa có “Hoàn tác”, mục “Đã xóa gần đây” khôi phục trong 30 ngày, mở đúng chỗ đã ghi, in danh sách đang lọc, nhắc sao lưu khi có từ 10 ghi chú mới chưa nằm trong bản sao nào; nhận xét giáo viên đã chép ở “Gói gửi giáo viên” hiện thêm ở đó (chỉ đọc).</w:t>
+        <w:t xml:space="preserve"> có tham số </w:t>
+      </w:r>
+      <w:r>
+        <w:rPr>
+          <w:rFonts w:ascii="Consolas" w:hAnsi="Consolas" w:eastAsia="Consolas"/>
+          <w:color w:val="4A3B42"/>
+          <w:sz w:val="19"/>
+        </w:rPr>
+        <w:t>ifBody</w:t>
+      </w:r>
+      <w:r>
+        <w:rPr>
+          <w:rFonts w:ascii="Arial" w:hAnsi="Arial" w:eastAsia="Arial"/>
+          <w:color w:val="211D20"/>
+          <w:sz w:val="20"/>
+        </w:rPr>
+        <w:t>). Ghi chú bị xóa ở tab khác: ô chưa gõ thì đóng, ô đã gõ thì hỏi hoặc giữ phần đang viết thành ghi chú mới.</w:t>
+      </w:r>
+    </w:p>
+    <w:p>
+      <w:pPr>
+        <w:pStyle w:val="ListBullet"/>
+      </w:pPr>
+      <w:r>
+        <w:rPr>
+          <w:rFonts w:ascii="Arial" w:hAnsi="Arial" w:eastAsia="Arial"/>
+          <w:b/>
+          <w:color w:val="211D20"/>
+          <w:sz w:val="20"/>
+        </w:rPr>
+        <w:t>Tab bản cũ:</w:t>
+      </w:r>
+      <w:r>
+        <w:rPr>
+          <w:rFonts w:ascii="Arial" w:hAnsi="Arial" w:eastAsia="Arial"/>
+          <w:color w:val="211D20"/>
+          <w:sz w:val="20"/>
+        </w:rPr>
+        <w:t xml:space="preserve"> mỗi lần lưu, bản này đóng dấu </w:t>
+      </w:r>
+      <w:r>
+        <w:rPr>
+          <w:rFonts w:ascii="Consolas" w:hAnsi="Consolas" w:eastAsia="Consolas"/>
+          <w:color w:val="4A3B42"/>
+          <w:sz w:val="19"/>
+        </w:rPr>
+        <w:t>rev</w:t>
+      </w:r>
+      <w:r>
+        <w:rPr>
+          <w:rFonts w:ascii="Arial" w:hAnsi="Arial" w:eastAsia="Arial"/>
+          <w:color w:val="211D20"/>
+          <w:sz w:val="20"/>
+        </w:rPr>
+        <w:t xml:space="preserve"> vào hồ sơ. Hồ sơ nhận từ tab khác mà không có dấu là do một bản cũ lưu (nó bỏ mọi trường nó không biết); ghi chú, nháp và câu tô được đưa về từ trí nhớ của tab (</w:t>
+      </w:r>
+      <w:r>
+        <w:rPr>
+          <w:rFonts w:ascii="Consolas" w:hAnsi="Consolas" w:eastAsia="Consolas"/>
+          <w:color w:val="4A3B42"/>
+          <w:sz w:val="19"/>
+        </w:rPr>
+        <w:t>src/lib/recovery.ts</w:t>
+      </w:r>
+      <w:r>
+        <w:rPr>
+          <w:rFonts w:ascii="Arial" w:hAnsi="Arial" w:eastAsia="Arial"/>
+          <w:color w:val="211D20"/>
+          <w:sz w:val="20"/>
+        </w:rPr>
+        <w:t>), và, khi không có tab nào của bản này đang mở, từ một bản chép trong IndexedDB (</w:t>
+      </w:r>
+      <w:r>
+        <w:rPr>
+          <w:rFonts w:ascii="Consolas" w:hAnsi="Consolas" w:eastAsia="Consolas"/>
+          <w:color w:val="4A3B42"/>
+          <w:sz w:val="19"/>
+        </w:rPr>
+        <w:t>recovery-copy.ts</w:t>
+      </w:r>
+      <w:r>
+        <w:rPr>
+          <w:rFonts w:ascii="Arial" w:hAnsi="Arial" w:eastAsia="Arial"/>
+          <w:color w:val="211D20"/>
+          <w:sz w:val="20"/>
+        </w:rPr>
+        <w:t xml:space="preserve">, </w:t>
+      </w:r>
+      <w:r>
+        <w:rPr>
+          <w:rFonts w:ascii="Consolas" w:hAnsi="Consolas" w:eastAsia="Consolas"/>
+          <w:color w:val="4A3B42"/>
+          <w:sz w:val="19"/>
+        </w:rPr>
+        <w:t>recovery-keeper.tsx</w:t>
+      </w:r>
+      <w:r>
+        <w:rPr>
+          <w:rFonts w:ascii="Arial" w:hAnsi="Arial" w:eastAsia="Arial"/>
+          <w:color w:val="211D20"/>
+          <w:sz w:val="20"/>
+        </w:rPr>
+        <w:t xml:space="preserve">). Hồ sơ được đóng dấu ngay khi mở (khi đã biết là còn nguyên). Hồ sơ không có dấu mà </w:t>
+      </w:r>
+      <w:r>
+        <w:rPr>
+          <w:rFonts w:ascii="Arial" w:hAnsi="Arial" w:eastAsia="Arial"/>
+          <w:b/>
+          <w:color w:val="211D20"/>
+          <w:sz w:val="20"/>
+        </w:rPr>
+        <w:t>có chủ ý</w:t>
+      </w:r>
+      <w:r>
+        <w:rPr>
+          <w:rFonts w:ascii="Arial" w:hAnsi="Arial" w:eastAsia="Arial"/>
+          <w:color w:val="211D20"/>
+          <w:sz w:val="20"/>
+        </w:rPr>
+        <w:t xml:space="preserve"> (nhập bản sao, xóa hết) thì không bị đưa về, vì chúng được ghi bằng bản này và mang dấu.</w:t>
+      </w:r>
+    </w:p>
+    <w:p>
+      <w:pPr>
+        <w:pStyle w:val="ListBullet"/>
+      </w:pPr>
+      <w:r>
+        <w:rPr>
+          <w:rFonts w:ascii="Arial" w:hAnsi="Arial" w:eastAsia="Arial"/>
+          <w:b/>
+          <w:color w:val="211D20"/>
+          <w:sz w:val="20"/>
+        </w:rPr>
+        <w:t>Gõ tiếng Việt:</w:t>
+      </w:r>
+      <w:r>
+        <w:rPr>
+          <w:rFonts w:ascii="Arial" w:hAnsi="Arial" w:eastAsia="Arial"/>
+          <w:color w:val="211D20"/>
+          <w:sz w:val="20"/>
+        </w:rPr>
+        <w:t xml:space="preserve"> ô nháp và ô ghi chú đã được thử với hai họ bộ gõ (gõ ghép tại chỗ; gõ rồi sửa bằng Backspace như Unikey và EVKey), xem </w:t>
+      </w:r>
+      <w:r>
+        <w:rPr>
+          <w:rFonts w:ascii="Consolas" w:hAnsi="Consolas" w:eastAsia="Consolas"/>
+          <w:color w:val="4A3B42"/>
+          <w:sz w:val="19"/>
+        </w:rPr>
+        <w:t>tests/e2e/typing.spec.ts</w:t>
+      </w:r>
+      <w:r>
+        <w:rPr>
+          <w:rFonts w:ascii="Arial" w:hAnsi="Arial" w:eastAsia="Arial"/>
+          <w:color w:val="211D20"/>
+          <w:sz w:val="20"/>
+        </w:rPr>
+        <w:t>.</w:t>
+      </w:r>
+    </w:p>
+    <w:p>
+      <w:pPr>
+        <w:pStyle w:val="ListBullet"/>
+      </w:pPr>
+      <w:r>
+        <w:rPr>
+          <w:rFonts w:ascii="Arial" w:hAnsi="Arial" w:eastAsia="Arial"/>
+          <w:color w:val="211D20"/>
+          <w:sz w:val="20"/>
+        </w:rPr>
+        <w:t xml:space="preserve">Trang </w:t>
+      </w:r>
+      <w:r>
+        <w:rPr>
+          <w:rFonts w:ascii="Consolas" w:hAnsi="Consolas" w:eastAsia="Consolas"/>
+          <w:color w:val="4A3B42"/>
+          <w:sz w:val="19"/>
+        </w:rPr>
+        <w:t>/notes</w:t>
+      </w:r>
+      <w:r>
+        <w:rPr>
+          <w:rFonts w:ascii="Arial" w:hAnsi="Arial" w:eastAsia="Arial"/>
+          <w:color w:val="211D20"/>
+          <w:sz w:val="20"/>
+        </w:rPr>
+        <w:t>: tìm mọi từ không cần gõ dấu, lọc theo kỹ năng, đề hoặc bài, ★ “Cần nhớ”, sắp xếp, sửa tại chỗ, xóa có “Hoàn tác”, mục “Đã xóa gần đây” khôi phục trong 30 ngày, mở đúng chỗ đã ghi, in danh sách đang lọc, nhắc sao lưu (nút tải ngay tại thông báo, cả ở Trang chủ) khi có từ 10 ghi chú mới chưa nằm trong bản sao nào, hoặc ít hơn nhưng bản sao cuối đã quá 14 ngày; nhận xét giáo viên đã chép ở “Gói gửi giáo viên” hiện thêm ở đó (chỉ đọc).</w:t>
       </w:r>
     </w:p>
     <w:p>
@@ -4287,7 +4499,23 @@
           <w:color w:val="211D20"/>
           <w:sz w:val="20"/>
         </w:rPr>
-        <w:t>; ứng dụng đọc lại bản mới hơn trước khi ghi để giảm nguy cơ tab cũ ghi đè.</w:t>
+        <w:t xml:space="preserve"> và đóng dấu </w:t>
+      </w:r>
+      <w:r>
+        <w:rPr>
+          <w:rFonts w:ascii="Consolas" w:hAnsi="Consolas" w:eastAsia="Consolas"/>
+          <w:color w:val="4A3B42"/>
+          <w:sz w:val="19"/>
+        </w:rPr>
+        <w:t>rev</w:t>
+      </w:r>
+      <w:r>
+        <w:rPr>
+          <w:rFonts w:ascii="Arial" w:hAnsi="Arial" w:eastAsia="Arial"/>
+          <w:color w:val="211D20"/>
+          <w:sz w:val="20"/>
+        </w:rPr>
+        <w:t>; ứng dụng đọc lại bản mới hơn trước khi ghi để giảm nguy cơ tab cũ ghi đè, và đưa về những gì một tab bản cũ vừa làm rơi mất (mục 4.6c).</w:t>
       </w:r>
     </w:p>
     <w:p>
@@ -4890,7 +5118,7 @@
           <w:color w:val="211D20"/>
           <w:sz w:val="20"/>
         </w:rPr>
-        <w:t xml:space="preserve">Bản sáu đề ngày 07/10/2026: ESLint, TypeScript, 258/258 Vitest, build 112 route và audit production dependency đều đạt. Playwright có 121 ca trên bản production local: 113 Chromium, 4 Firefox, 4 WebKit. Sau khi thêm phòng thi mô phỏng và công cụ luyện đề, lượt Chromium đầy đủ đạt 113/113; Firefox và WebKit chưa chạy lại cho thay đổi này. Axe kiểm tra 19 màn, gồm kho đề và Review 13/09. Hai lượt CI của nhánh/PR #38 đạt; Vercel phục vụ SHA </w:t>
+        <w:t xml:space="preserve">Bản sáu đề ngày 07/10/2026: ESLint, TypeScript, 282/282 Vitest, build 112 route và audit production dependency đều đạt. Playwright có 151 ca trên bản production local: 143 Chromium, 4 Firefox, 4 WebKit. Sau khi thêm phòng thi mô phỏng và công cụ luyện đề, lượt Chromium đầy đủ đạt 143/143; Firefox và WebKit chưa chạy lại cho thay đổi này. Axe kiểm tra 19 màn, gồm kho đề và Review 13/09. Hai lượt CI của nhánh/PR #38 đạt; Vercel phục vụ SHA </w:t>
       </w:r>
       <w:r>
         <w:rPr>
@@ -6894,7 +7122,7 @@
                 <w:color w:val="211D20"/>
                 <w:sz w:val="16"/>
               </w:rPr>
-              <w:t>Chưa thử</w:t>
+              <w:t>Đã mô phỏng, chưa thử phần mềm thật</w:t>
             </w:r>
           </w:p>
         </w:tc>
@@ -6919,7 +7147,7 @@
                 <w:color w:val="211D20"/>
                 <w:sz w:val="16"/>
               </w:rPr>
-              <w:t>Gõ tiếng Việt bằng bộ gõ thật trên máy tính (Unikey, EVKey) chưa được thử; điện thoại không phải trọng tâm; sửa cùng một ghi chú ở hai tab thì lần lưu sau thắng</w:t>
+              <w:t>Hai họ bộ gõ đã được mô phỏng và kiểm trong E2E (gõ ghép tại chỗ; Backspace rồi chữ có dấu); chưa chạy Unikey, EVKey hay bộ gõ macOS thật; điện thoại không phải trọng tâm</w:t>
             </w:r>
           </w:p>
         </w:tc>
@@ -9559,6 +9787,166 @@
                 <w:sz w:val="16"/>
               </w:rPr>
               <w:t>Nháp và câu tô của từng lượt; tách câu; nhắc sao lưu</w:t>
+            </w:r>
+          </w:p>
+        </w:tc>
+      </w:tr>
+      <w:tr>
+        <w:trPr>
+          <w:cantSplit/>
+        </w:trPr>
+        <w:tc>
+          <w:tcPr>
+            <w:tcW w:type="dxa" w:w="3013"/>
+            <w:vAlign w:val="center"/>
+            <w:tcMar>
+              <w:top w:w="85" w:type="dxa"/>
+              <w:start w:w="120" w:type="dxa"/>
+              <w:bottom w:w="85" w:type="dxa"/>
+              <w:end w:w="120" w:type="dxa"/>
+            </w:tcMar>
+            <w:shd w:fill="FAF7F8"/>
+          </w:tcPr>
+          <w:p>
+            <w:pPr>
+              <w:spacing w:after="0" w:line="264" w:lineRule="auto"/>
+            </w:pPr>
+            <w:r>
+              <w:rPr>
+                <w:rFonts w:ascii="Consolas" w:hAnsi="Consolas" w:eastAsia="Consolas"/>
+                <w:color w:val="4A3B42"/>
+                <w:sz w:val="15"/>
+              </w:rPr>
+              <w:t>src/lib/recovery.ts</w:t>
+            </w:r>
+            <w:r>
+              <w:rPr>
+                <w:rFonts w:ascii="Arial" w:hAnsi="Arial" w:eastAsia="Arial"/>
+                <w:color w:val="211D20"/>
+                <w:sz w:val="16"/>
+              </w:rPr>
+              <w:t xml:space="preserve">, </w:t>
+            </w:r>
+            <w:r>
+              <w:rPr>
+                <w:rFonts w:ascii="Consolas" w:hAnsi="Consolas" w:eastAsia="Consolas"/>
+                <w:color w:val="4A3B42"/>
+                <w:sz w:val="15"/>
+              </w:rPr>
+              <w:t>recovery-copy.ts</w:t>
+            </w:r>
+            <w:r>
+              <w:rPr>
+                <w:rFonts w:ascii="Arial" w:hAnsi="Arial" w:eastAsia="Arial"/>
+                <w:color w:val="211D20"/>
+                <w:sz w:val="16"/>
+              </w:rPr>
+              <w:t xml:space="preserve">, </w:t>
+            </w:r>
+            <w:r>
+              <w:rPr>
+                <w:rFonts w:ascii="Consolas" w:hAnsi="Consolas" w:eastAsia="Consolas"/>
+                <w:color w:val="4A3B42"/>
+                <w:sz w:val="15"/>
+              </w:rPr>
+              <w:t>src/components/recovery-keeper.tsx</w:t>
+            </w:r>
+          </w:p>
+        </w:tc>
+        <w:tc>
+          <w:tcPr>
+            <w:tcW w:type="dxa" w:w="6707"/>
+            <w:vAlign w:val="center"/>
+            <w:tcMar>
+              <w:top w:w="85" w:type="dxa"/>
+              <w:start w:w="120" w:type="dxa"/>
+              <w:bottom w:w="85" w:type="dxa"/>
+              <w:end w:w="120" w:type="dxa"/>
+            </w:tcMar>
+            <w:shd w:fill="FAF7F8"/>
+          </w:tcPr>
+          <w:p>
+            <w:pPr>
+              <w:spacing w:after="0" w:line="264" w:lineRule="auto"/>
+            </w:pPr>
+            <w:r>
+              <w:rPr>
+                <w:rFonts w:ascii="Arial" w:hAnsi="Arial" w:eastAsia="Arial"/>
+                <w:color w:val="211D20"/>
+                <w:sz w:val="16"/>
+              </w:rPr>
+              <w:t>Đưa ghi chú, nháp, câu tô về khi một tab bản cũ làm rơi; bản chép trong IndexedDB</w:t>
+            </w:r>
+          </w:p>
+        </w:tc>
+      </w:tr>
+      <w:tr>
+        <w:trPr>
+          <w:cantSplit/>
+        </w:trPr>
+        <w:tc>
+          <w:tcPr>
+            <w:tcW w:type="dxa" w:w="3013"/>
+            <w:vAlign w:val="center"/>
+            <w:tcMar>
+              <w:top w:w="85" w:type="dxa"/>
+              <w:start w:w="120" w:type="dxa"/>
+              <w:bottom w:w="85" w:type="dxa"/>
+              <w:end w:w="120" w:type="dxa"/>
+            </w:tcMar>
+          </w:tcPr>
+          <w:p>
+            <w:pPr>
+              <w:spacing w:after="0" w:line="264" w:lineRule="auto"/>
+            </w:pPr>
+            <w:r>
+              <w:rPr>
+                <w:rFonts w:ascii="Consolas" w:hAnsi="Consolas" w:eastAsia="Consolas"/>
+                <w:color w:val="4A3B42"/>
+                <w:sz w:val="15"/>
+              </w:rPr>
+              <w:t>src/components/backup-nudge.tsx</w:t>
+            </w:r>
+            <w:r>
+              <w:rPr>
+                <w:rFonts w:ascii="Arial" w:hAnsi="Arial" w:eastAsia="Arial"/>
+                <w:color w:val="211D20"/>
+                <w:sz w:val="16"/>
+              </w:rPr>
+              <w:t xml:space="preserve">, </w:t>
+            </w:r>
+            <w:r>
+              <w:rPr>
+                <w:rFonts w:ascii="Consolas" w:hAnsi="Consolas" w:eastAsia="Consolas"/>
+                <w:color w:val="4A3B42"/>
+                <w:sz w:val="15"/>
+              </w:rPr>
+              <w:t>src/lib/download.ts</w:t>
+            </w:r>
+          </w:p>
+        </w:tc>
+        <w:tc>
+          <w:tcPr>
+            <w:tcW w:type="dxa" w:w="6707"/>
+            <w:vAlign w:val="center"/>
+            <w:tcMar>
+              <w:top w:w="85" w:type="dxa"/>
+              <w:start w:w="120" w:type="dxa"/>
+              <w:bottom w:w="85" w:type="dxa"/>
+              <w:end w:w="120" w:type="dxa"/>
+            </w:tcMar>
+          </w:tcPr>
+          <w:p>
+            <w:pPr>
+              <w:spacing w:after="0" w:line="264" w:lineRule="auto"/>
+            </w:pPr>
+            <w:r>
+              <w:rPr>
+                <w:rFonts w:ascii="Arial" w:hAnsi="Arial" w:eastAsia="Arial"/>
+                <w:color w:val="211D20"/>
+                <w:sz w:val="16"/>
+              </w:rPr>
+              <w:t>Thông báo nhắc sao lưu có nút tải ngay; tải file sao lưu</w:t>
             </w:r>
           </w:p>
         </w:tc>

</xml_diff>

<commit_message>
Ghi chú: xử lý gõ tiếng Việt, hai tab, tab bản cũ và nhắc sao lưu (#54)
Gõ tiếng Việt: ô nháp phần Đọc gập lại khi rỗng (Unikey/EVKey gõ chữ đầu bằng
Backspace) nên nuốt phím; nay mở/đóng là lựa chọn của người học. Có ca mô phỏng
gõ ghép (imeSetComposition) và gõ rồi sửa. Ô tìm kiếm tính sẵn dữ liệu phụ
thuộc sổ, nhanh gấp đôi khi sổ đầy.

Hai tab: ô ghi chú không ghi đè bản đã đổi ở tab khác mà hỏi (giữ cả hai, giữ
bản của tôi, dùng bản bên kia); chữ đang gõ không bao giờ mất khi hộp biến mất.

Tab bản cũ: hồ sơ được đóng dấu rev; hồ sơ nhận về không dấu được đưa lại ghi
chú, nháp, câu tô từ trí nhớ của tab và từ bản chép trong IndexedDB, với các hàng
rào để bản chép không bao giờ bị thay bằng thứ có thể đã bị làm rỗng.

Sao lưu: nút tải ngay trong thông báo, hiện cả ở Trang chủ, thêm ngưỡng theo
ngày; bản nháp bài học có trần 30000 ký tự kiểm lúc ghi.


Claude-Session: https://claude.ai/code/session_01W75mjctkB2SZty7ogWDMjM

Co-authored-by: Claude <noreply@anthropic.com>
</commit_message>
<xml_diff>
--- a/docs/Bao-cao-ban-giao-May-VSTEP.docx
+++ b/docs/Bao-cao-ban-giao-May-VSTEP.docx
@@ -443,7 +443,7 @@
           <w:color w:val="211D20"/>
           <w:sz w:val="22"/>
         </w:rPr>
-        <w:t>Bản code có năm đề nhập đủ bốn kỹ năng và hai đề tự biên soạn. Cả năm đề nhập có 375 khóa đáp án Nghe/Đọc; đề 131 thiếu đáp án và transcript nên đã được gỡ. 105 MP3 được đóng gói cùng ứng dụng. Viết và Nói lưu bài nhưng chưa được chấm tự động; bản ghi micro cần tải riêng. Bộ kiểm thử local trước khi phát hành gồm 258 unit test và 121 E2E trên Chromium, Firefox và WebKit, build 112 route và axe trên 19 màn. Migration gia cố quyền ghi cloud đã áp dụng trên Supabase production. PR #38 và smoke HTTPS đã đạt cho commit ứng dụng ff8faef; đồng bộ hai thiết bị, micro thật và thẩm định học liệu vẫn cần xác nhận; sáu đề nhập chỉ dùng học cá nhân của chủ dự án.</w:t>
+        <w:t>Bản code có năm đề nhập đủ bốn kỹ năng và hai đề tự biên soạn. Cả năm đề nhập có 375 khóa đáp án Nghe/Đọc; đề 131 thiếu đáp án và transcript nên đã được gỡ. 105 MP3 được đóng gói cùng ứng dụng. Viết và Nói lưu bài nhưng chưa được chấm tự động; bản ghi micro cần tải riêng. Bộ kiểm thử local trước khi phát hành gồm 282 unit test và 151 E2E trên Chromium, Firefox và WebKit, build 112 route và axe trên 19 màn. Migration gia cố quyền ghi cloud đã áp dụng trên Supabase production. PR #38 và smoke HTTPS đã đạt cho commit ứng dụng ff8faef; đồng bộ hai thiết bị, micro thật và thẩm định học liệu vẫn cần xác nhận; sáu đề nhập chỉ dùng học cá nhân của chủ dự án.</w:t>
       </w:r>
     </w:p>
     <w:p>
@@ -662,7 +662,7 @@
           <w:color w:val="211D20"/>
           <w:sz w:val="20"/>
         </w:rPr>
-        <w:t xml:space="preserve"> đạt 81 unit và 44 E2E. Bản làm việc hiện tại đạt 258 unit và 121 E2E trên cùng ba engine sau khi hoàn tất kiểm thử. Chưa có nghiệm thu trên iOS hoặc Android thật.</w:t>
+        <w:t xml:space="preserve"> đạt 81 unit và 44 E2E. Bản làm việc hiện tại đạt 282 unit và 151 E2E trên cùng ba engine sau khi hoàn tất kiểm thử. Chưa có nghiệm thu trên iOS hoặc Android thật.</w:t>
       </w:r>
     </w:p>
     <w:p>
@@ -2646,10 +2646,36 @@
       <w:r>
         <w:rPr>
           <w:rFonts w:ascii="Arial" w:hAnsi="Arial" w:eastAsia="Arial"/>
+          <w:b/>
           <w:color w:val="211D20"/>
           <w:sz w:val="20"/>
         </w:rPr>
-        <w:t xml:space="preserve">Trang </w:t>
+        <w:t>Hai tab cùng một ghi chú:</w:t>
+      </w:r>
+      <w:r>
+        <w:rPr>
+          <w:rFonts w:ascii="Arial" w:hAnsi="Arial" w:eastAsia="Arial"/>
+          <w:color w:val="211D20"/>
+          <w:sz w:val="20"/>
+        </w:rPr>
+        <w:t xml:space="preserve"> ô nhớ bản nó bắt đầu từ đó. Tab kia lưu mà ô này chưa gõ thì ô này theo bản mới; đã gõ thì </w:t>
+      </w:r>
+      <w:r>
+        <w:rPr>
+          <w:rFonts w:ascii="Arial" w:hAnsi="Arial" w:eastAsia="Arial"/>
+          <w:b/>
+          <w:color w:val="211D20"/>
+          <w:sz w:val="20"/>
+        </w:rPr>
+        <w:t>không ghi đè</w:t>
+      </w:r>
+      <w:r>
+        <w:rPr>
+          <w:rFonts w:ascii="Arial" w:hAnsi="Arial" w:eastAsia="Arial"/>
+          <w:color w:val="211D20"/>
+          <w:sz w:val="20"/>
+        </w:rPr>
+        <w:t xml:space="preserve"> mà hiện cả hai bản với “Giữ cả hai”, “Giữ bản của tôi”, “Dùng bản bên kia” (</w:t>
       </w:r>
       <w:r>
         <w:rPr>
@@ -2657,7 +2683,7 @@
           <w:color w:val="4A3B42"/>
           <w:sz w:val="19"/>
         </w:rPr>
-        <w:t>/notes</w:t>
+        <w:t>editNote</w:t>
       </w:r>
       <w:r>
         <w:rPr>
@@ -2665,7 +2691,193 @@
           <w:color w:val="211D20"/>
           <w:sz w:val="20"/>
         </w:rPr>
-        <w:t>: tìm mọi từ không cần gõ dấu, lọc theo kỹ năng, đề hoặc bài, ★ “Cần nhớ”, sắp xếp, sửa tại chỗ, xóa có “Hoàn tác”, mục “Đã xóa gần đây” khôi phục trong 30 ngày, mở đúng chỗ đã ghi, in danh sách đang lọc, nhắc sao lưu khi có từ 10 ghi chú mới chưa nằm trong bản sao nào; nhận xét giáo viên đã chép ở “Gói gửi giáo viên” hiện thêm ở đó (chỉ đọc).</w:t>
+        <w:t xml:space="preserve"> có tham số </w:t>
+      </w:r>
+      <w:r>
+        <w:rPr>
+          <w:rFonts w:ascii="Consolas" w:hAnsi="Consolas" w:eastAsia="Consolas"/>
+          <w:color w:val="4A3B42"/>
+          <w:sz w:val="19"/>
+        </w:rPr>
+        <w:t>ifBody</w:t>
+      </w:r>
+      <w:r>
+        <w:rPr>
+          <w:rFonts w:ascii="Arial" w:hAnsi="Arial" w:eastAsia="Arial"/>
+          <w:color w:val="211D20"/>
+          <w:sz w:val="20"/>
+        </w:rPr>
+        <w:t>). Ghi chú bị xóa ở tab khác: ô chưa gõ thì đóng, ô đã gõ thì hỏi hoặc giữ phần đang viết thành ghi chú mới.</w:t>
+      </w:r>
+    </w:p>
+    <w:p>
+      <w:pPr>
+        <w:pStyle w:val="ListBullet"/>
+      </w:pPr>
+      <w:r>
+        <w:rPr>
+          <w:rFonts w:ascii="Arial" w:hAnsi="Arial" w:eastAsia="Arial"/>
+          <w:b/>
+          <w:color w:val="211D20"/>
+          <w:sz w:val="20"/>
+        </w:rPr>
+        <w:t>Tab bản cũ:</w:t>
+      </w:r>
+      <w:r>
+        <w:rPr>
+          <w:rFonts w:ascii="Arial" w:hAnsi="Arial" w:eastAsia="Arial"/>
+          <w:color w:val="211D20"/>
+          <w:sz w:val="20"/>
+        </w:rPr>
+        <w:t xml:space="preserve"> mỗi lần lưu, bản này đóng dấu </w:t>
+      </w:r>
+      <w:r>
+        <w:rPr>
+          <w:rFonts w:ascii="Consolas" w:hAnsi="Consolas" w:eastAsia="Consolas"/>
+          <w:color w:val="4A3B42"/>
+          <w:sz w:val="19"/>
+        </w:rPr>
+        <w:t>rev</w:t>
+      </w:r>
+      <w:r>
+        <w:rPr>
+          <w:rFonts w:ascii="Arial" w:hAnsi="Arial" w:eastAsia="Arial"/>
+          <w:color w:val="211D20"/>
+          <w:sz w:val="20"/>
+        </w:rPr>
+        <w:t xml:space="preserve"> vào hồ sơ. Hồ sơ nhận từ tab khác mà không có dấu là do một bản cũ lưu (nó bỏ mọi trường nó không biết); ghi chú, nháp và câu tô được đưa về từ trí nhớ của tab (</w:t>
+      </w:r>
+      <w:r>
+        <w:rPr>
+          <w:rFonts w:ascii="Consolas" w:hAnsi="Consolas" w:eastAsia="Consolas"/>
+          <w:color w:val="4A3B42"/>
+          <w:sz w:val="19"/>
+        </w:rPr>
+        <w:t>src/lib/recovery.ts</w:t>
+      </w:r>
+      <w:r>
+        <w:rPr>
+          <w:rFonts w:ascii="Arial" w:hAnsi="Arial" w:eastAsia="Arial"/>
+          <w:color w:val="211D20"/>
+          <w:sz w:val="20"/>
+        </w:rPr>
+        <w:t>), và, khi không có tab nào của bản này đang mở, từ một bản chép trong IndexedDB (</w:t>
+      </w:r>
+      <w:r>
+        <w:rPr>
+          <w:rFonts w:ascii="Consolas" w:hAnsi="Consolas" w:eastAsia="Consolas"/>
+          <w:color w:val="4A3B42"/>
+          <w:sz w:val="19"/>
+        </w:rPr>
+        <w:t>recovery-copy.ts</w:t>
+      </w:r>
+      <w:r>
+        <w:rPr>
+          <w:rFonts w:ascii="Arial" w:hAnsi="Arial" w:eastAsia="Arial"/>
+          <w:color w:val="211D20"/>
+          <w:sz w:val="20"/>
+        </w:rPr>
+        <w:t xml:space="preserve">, </w:t>
+      </w:r>
+      <w:r>
+        <w:rPr>
+          <w:rFonts w:ascii="Consolas" w:hAnsi="Consolas" w:eastAsia="Consolas"/>
+          <w:color w:val="4A3B42"/>
+          <w:sz w:val="19"/>
+        </w:rPr>
+        <w:t>recovery-keeper.tsx</w:t>
+      </w:r>
+      <w:r>
+        <w:rPr>
+          <w:rFonts w:ascii="Arial" w:hAnsi="Arial" w:eastAsia="Arial"/>
+          <w:color w:val="211D20"/>
+          <w:sz w:val="20"/>
+        </w:rPr>
+        <w:t xml:space="preserve">). Hồ sơ được đóng dấu ngay khi mở (khi đã biết là còn nguyên). Hồ sơ không có dấu mà </w:t>
+      </w:r>
+      <w:r>
+        <w:rPr>
+          <w:rFonts w:ascii="Arial" w:hAnsi="Arial" w:eastAsia="Arial"/>
+          <w:b/>
+          <w:color w:val="211D20"/>
+          <w:sz w:val="20"/>
+        </w:rPr>
+        <w:t>có chủ ý</w:t>
+      </w:r>
+      <w:r>
+        <w:rPr>
+          <w:rFonts w:ascii="Arial" w:hAnsi="Arial" w:eastAsia="Arial"/>
+          <w:color w:val="211D20"/>
+          <w:sz w:val="20"/>
+        </w:rPr>
+        <w:t xml:space="preserve"> (nhập bản sao, xóa hết) thì không bị đưa về, vì chúng được ghi bằng bản này và mang dấu.</w:t>
+      </w:r>
+    </w:p>
+    <w:p>
+      <w:pPr>
+        <w:pStyle w:val="ListBullet"/>
+      </w:pPr>
+      <w:r>
+        <w:rPr>
+          <w:rFonts w:ascii="Arial" w:hAnsi="Arial" w:eastAsia="Arial"/>
+          <w:b/>
+          <w:color w:val="211D20"/>
+          <w:sz w:val="20"/>
+        </w:rPr>
+        <w:t>Gõ tiếng Việt:</w:t>
+      </w:r>
+      <w:r>
+        <w:rPr>
+          <w:rFonts w:ascii="Arial" w:hAnsi="Arial" w:eastAsia="Arial"/>
+          <w:color w:val="211D20"/>
+          <w:sz w:val="20"/>
+        </w:rPr>
+        <w:t xml:space="preserve"> ô nháp và ô ghi chú đã được thử với hai họ bộ gõ (gõ ghép tại chỗ; gõ rồi sửa bằng Backspace như Unikey và EVKey), xem </w:t>
+      </w:r>
+      <w:r>
+        <w:rPr>
+          <w:rFonts w:ascii="Consolas" w:hAnsi="Consolas" w:eastAsia="Consolas"/>
+          <w:color w:val="4A3B42"/>
+          <w:sz w:val="19"/>
+        </w:rPr>
+        <w:t>tests/e2e/typing.spec.ts</w:t>
+      </w:r>
+      <w:r>
+        <w:rPr>
+          <w:rFonts w:ascii="Arial" w:hAnsi="Arial" w:eastAsia="Arial"/>
+          <w:color w:val="211D20"/>
+          <w:sz w:val="20"/>
+        </w:rPr>
+        <w:t>.</w:t>
+      </w:r>
+    </w:p>
+    <w:p>
+      <w:pPr>
+        <w:pStyle w:val="ListBullet"/>
+      </w:pPr>
+      <w:r>
+        <w:rPr>
+          <w:rFonts w:ascii="Arial" w:hAnsi="Arial" w:eastAsia="Arial"/>
+          <w:color w:val="211D20"/>
+          <w:sz w:val="20"/>
+        </w:rPr>
+        <w:t xml:space="preserve">Trang </w:t>
+      </w:r>
+      <w:r>
+        <w:rPr>
+          <w:rFonts w:ascii="Consolas" w:hAnsi="Consolas" w:eastAsia="Consolas"/>
+          <w:color w:val="4A3B42"/>
+          <w:sz w:val="19"/>
+        </w:rPr>
+        <w:t>/notes</w:t>
+      </w:r>
+      <w:r>
+        <w:rPr>
+          <w:rFonts w:ascii="Arial" w:hAnsi="Arial" w:eastAsia="Arial"/>
+          <w:color w:val="211D20"/>
+          <w:sz w:val="20"/>
+        </w:rPr>
+        <w:t>: tìm mọi từ không cần gõ dấu, lọc theo kỹ năng, đề hoặc bài, ★ “Cần nhớ”, sắp xếp, sửa tại chỗ, xóa có “Hoàn tác”, mục “Đã xóa gần đây” khôi phục trong 30 ngày, mở đúng chỗ đã ghi, in danh sách đang lọc, nhắc sao lưu (nút tải ngay tại thông báo, cả ở Trang chủ) khi có từ 10 ghi chú mới chưa nằm trong bản sao nào, hoặc ít hơn nhưng bản sao cuối đã quá 14 ngày; nhận xét giáo viên đã chép ở “Gói gửi giáo viên” hiện thêm ở đó (chỉ đọc).</w:t>
       </w:r>
     </w:p>
     <w:p>
@@ -4287,7 +4499,23 @@
           <w:color w:val="211D20"/>
           <w:sz w:val="20"/>
         </w:rPr>
-        <w:t>; ứng dụng đọc lại bản mới hơn trước khi ghi để giảm nguy cơ tab cũ ghi đè.</w:t>
+        <w:t xml:space="preserve"> và đóng dấu </w:t>
+      </w:r>
+      <w:r>
+        <w:rPr>
+          <w:rFonts w:ascii="Consolas" w:hAnsi="Consolas" w:eastAsia="Consolas"/>
+          <w:color w:val="4A3B42"/>
+          <w:sz w:val="19"/>
+        </w:rPr>
+        <w:t>rev</w:t>
+      </w:r>
+      <w:r>
+        <w:rPr>
+          <w:rFonts w:ascii="Arial" w:hAnsi="Arial" w:eastAsia="Arial"/>
+          <w:color w:val="211D20"/>
+          <w:sz w:val="20"/>
+        </w:rPr>
+        <w:t>; ứng dụng đọc lại bản mới hơn trước khi ghi để giảm nguy cơ tab cũ ghi đè, và đưa về những gì một tab bản cũ vừa làm rơi mất (mục 4.6c).</w:t>
       </w:r>
     </w:p>
     <w:p>
@@ -4890,7 +5118,7 @@
           <w:color w:val="211D20"/>
           <w:sz w:val="20"/>
         </w:rPr>
-        <w:t xml:space="preserve">Bản sáu đề ngày 07/10/2026: ESLint, TypeScript, 258/258 Vitest, build 112 route và audit production dependency đều đạt. Playwright có 121 ca trên bản production local: 113 Chromium, 4 Firefox, 4 WebKit. Sau khi thêm phòng thi mô phỏng và công cụ luyện đề, lượt Chromium đầy đủ đạt 113/113; Firefox và WebKit chưa chạy lại cho thay đổi này. Axe kiểm tra 19 màn, gồm kho đề và Review 13/09. Hai lượt CI của nhánh/PR #38 đạt; Vercel phục vụ SHA </w:t>
+        <w:t xml:space="preserve">Bản sáu đề ngày 07/10/2026: ESLint, TypeScript, 282/282 Vitest, build 112 route và audit production dependency đều đạt. Playwright có 151 ca trên bản production local: 143 Chromium, 4 Firefox, 4 WebKit. Sau khi thêm phòng thi mô phỏng và công cụ luyện đề, lượt Chromium đầy đủ đạt 143/143; Firefox và WebKit chưa chạy lại cho thay đổi này. Axe kiểm tra 19 màn, gồm kho đề và Review 13/09. Hai lượt CI của nhánh/PR #38 đạt; Vercel phục vụ SHA </w:t>
       </w:r>
       <w:r>
         <w:rPr>
@@ -6894,7 +7122,7 @@
                 <w:color w:val="211D20"/>
                 <w:sz w:val="16"/>
               </w:rPr>
-              <w:t>Chưa thử</w:t>
+              <w:t>Đã mô phỏng, chưa thử phần mềm thật</w:t>
             </w:r>
           </w:p>
         </w:tc>
@@ -6919,7 +7147,7 @@
                 <w:color w:val="211D20"/>
                 <w:sz w:val="16"/>
               </w:rPr>
-              <w:t>Gõ tiếng Việt bằng bộ gõ thật trên máy tính (Unikey, EVKey) chưa được thử; điện thoại không phải trọng tâm; sửa cùng một ghi chú ở hai tab thì lần lưu sau thắng</w:t>
+              <w:t>Hai họ bộ gõ đã được mô phỏng và kiểm trong E2E (gõ ghép tại chỗ; Backspace rồi chữ có dấu); chưa chạy Unikey, EVKey hay bộ gõ macOS thật; điện thoại không phải trọng tâm</w:t>
             </w:r>
           </w:p>
         </w:tc>
@@ -9559,6 +9787,166 @@
                 <w:sz w:val="16"/>
               </w:rPr>
               <w:t>Nháp và câu tô của từng lượt; tách câu; nhắc sao lưu</w:t>
+            </w:r>
+          </w:p>
+        </w:tc>
+      </w:tr>
+      <w:tr>
+        <w:trPr>
+          <w:cantSplit/>
+        </w:trPr>
+        <w:tc>
+          <w:tcPr>
+            <w:tcW w:type="dxa" w:w="3013"/>
+            <w:vAlign w:val="center"/>
+            <w:tcMar>
+              <w:top w:w="85" w:type="dxa"/>
+              <w:start w:w="120" w:type="dxa"/>
+              <w:bottom w:w="85" w:type="dxa"/>
+              <w:end w:w="120" w:type="dxa"/>
+            </w:tcMar>
+            <w:shd w:fill="FAF7F8"/>
+          </w:tcPr>
+          <w:p>
+            <w:pPr>
+              <w:spacing w:after="0" w:line="264" w:lineRule="auto"/>
+            </w:pPr>
+            <w:r>
+              <w:rPr>
+                <w:rFonts w:ascii="Consolas" w:hAnsi="Consolas" w:eastAsia="Consolas"/>
+                <w:color w:val="4A3B42"/>
+                <w:sz w:val="15"/>
+              </w:rPr>
+              <w:t>src/lib/recovery.ts</w:t>
+            </w:r>
+            <w:r>
+              <w:rPr>
+                <w:rFonts w:ascii="Arial" w:hAnsi="Arial" w:eastAsia="Arial"/>
+                <w:color w:val="211D20"/>
+                <w:sz w:val="16"/>
+              </w:rPr>
+              <w:t xml:space="preserve">, </w:t>
+            </w:r>
+            <w:r>
+              <w:rPr>
+                <w:rFonts w:ascii="Consolas" w:hAnsi="Consolas" w:eastAsia="Consolas"/>
+                <w:color w:val="4A3B42"/>
+                <w:sz w:val="15"/>
+              </w:rPr>
+              <w:t>recovery-copy.ts</w:t>
+            </w:r>
+            <w:r>
+              <w:rPr>
+                <w:rFonts w:ascii="Arial" w:hAnsi="Arial" w:eastAsia="Arial"/>
+                <w:color w:val="211D20"/>
+                <w:sz w:val="16"/>
+              </w:rPr>
+              <w:t xml:space="preserve">, </w:t>
+            </w:r>
+            <w:r>
+              <w:rPr>
+                <w:rFonts w:ascii="Consolas" w:hAnsi="Consolas" w:eastAsia="Consolas"/>
+                <w:color w:val="4A3B42"/>
+                <w:sz w:val="15"/>
+              </w:rPr>
+              <w:t>src/components/recovery-keeper.tsx</w:t>
+            </w:r>
+          </w:p>
+        </w:tc>
+        <w:tc>
+          <w:tcPr>
+            <w:tcW w:type="dxa" w:w="6707"/>
+            <w:vAlign w:val="center"/>
+            <w:tcMar>
+              <w:top w:w="85" w:type="dxa"/>
+              <w:start w:w="120" w:type="dxa"/>
+              <w:bottom w:w="85" w:type="dxa"/>
+              <w:end w:w="120" w:type="dxa"/>
+            </w:tcMar>
+            <w:shd w:fill="FAF7F8"/>
+          </w:tcPr>
+          <w:p>
+            <w:pPr>
+              <w:spacing w:after="0" w:line="264" w:lineRule="auto"/>
+            </w:pPr>
+            <w:r>
+              <w:rPr>
+                <w:rFonts w:ascii="Arial" w:hAnsi="Arial" w:eastAsia="Arial"/>
+                <w:color w:val="211D20"/>
+                <w:sz w:val="16"/>
+              </w:rPr>
+              <w:t>Đưa ghi chú, nháp, câu tô về khi một tab bản cũ làm rơi; bản chép trong IndexedDB</w:t>
+            </w:r>
+          </w:p>
+        </w:tc>
+      </w:tr>
+      <w:tr>
+        <w:trPr>
+          <w:cantSplit/>
+        </w:trPr>
+        <w:tc>
+          <w:tcPr>
+            <w:tcW w:type="dxa" w:w="3013"/>
+            <w:vAlign w:val="center"/>
+            <w:tcMar>
+              <w:top w:w="85" w:type="dxa"/>
+              <w:start w:w="120" w:type="dxa"/>
+              <w:bottom w:w="85" w:type="dxa"/>
+              <w:end w:w="120" w:type="dxa"/>
+            </w:tcMar>
+          </w:tcPr>
+          <w:p>
+            <w:pPr>
+              <w:spacing w:after="0" w:line="264" w:lineRule="auto"/>
+            </w:pPr>
+            <w:r>
+              <w:rPr>
+                <w:rFonts w:ascii="Consolas" w:hAnsi="Consolas" w:eastAsia="Consolas"/>
+                <w:color w:val="4A3B42"/>
+                <w:sz w:val="15"/>
+              </w:rPr>
+              <w:t>src/components/backup-nudge.tsx</w:t>
+            </w:r>
+            <w:r>
+              <w:rPr>
+                <w:rFonts w:ascii="Arial" w:hAnsi="Arial" w:eastAsia="Arial"/>
+                <w:color w:val="211D20"/>
+                <w:sz w:val="16"/>
+              </w:rPr>
+              <w:t xml:space="preserve">, </w:t>
+            </w:r>
+            <w:r>
+              <w:rPr>
+                <w:rFonts w:ascii="Consolas" w:hAnsi="Consolas" w:eastAsia="Consolas"/>
+                <w:color w:val="4A3B42"/>
+                <w:sz w:val="15"/>
+              </w:rPr>
+              <w:t>src/lib/download.ts</w:t>
+            </w:r>
+          </w:p>
+        </w:tc>
+        <w:tc>
+          <w:tcPr>
+            <w:tcW w:type="dxa" w:w="6707"/>
+            <w:vAlign w:val="center"/>
+            <w:tcMar>
+              <w:top w:w="85" w:type="dxa"/>
+              <w:start w:w="120" w:type="dxa"/>
+              <w:bottom w:w="85" w:type="dxa"/>
+              <w:end w:w="120" w:type="dxa"/>
+            </w:tcMar>
+          </w:tcPr>
+          <w:p>
+            <w:pPr>
+              <w:spacing w:after="0" w:line="264" w:lineRule="auto"/>
+            </w:pPr>
+            <w:r>
+              <w:rPr>
+                <w:rFonts w:ascii="Arial" w:hAnsi="Arial" w:eastAsia="Arial"/>
+                <w:color w:val="211D20"/>
+                <w:sz w:val="16"/>
+              </w:rPr>
+              <w:t>Thông báo nhắc sao lưu có nút tải ngay; tải file sao lưu</w:t>
             </w:r>
           </w:p>
         </w:tc>

</xml_diff>

<commit_message>
Tài liệu: giao diện máy tính và phòng thi mô phỏng dựng lại (08/10/2026)
- QUALITY.md: mục mới ở đầu file (lỗi tìm thấy, cách sửa, kiểm thử, chưa kiểm được).
- STATUS.md, HANDOVER.md, báo cáo tình trạng: mô tả bố cục mới, số liệu kiểm thử (282 unit, 159 E2E, Chromium 151/151).
- Hai báo cáo Word dựng lại từ HANDOVER.md.

Co-Authored-By: Claude <noreply@anthropic.com>
Claude-Session: https://claude.ai/code/session_01W75mjctkB2SZty7ogWDMjM
</commit_message>
<xml_diff>
--- a/docs/Bao-cao-ban-giao-May-VSTEP.docx
+++ b/docs/Bao-cao-ban-giao-May-VSTEP.docx
@@ -443,7 +443,7 @@
           <w:color w:val="211D20"/>
           <w:sz w:val="22"/>
         </w:rPr>
-        <w:t>Bản code có năm đề nhập đủ bốn kỹ năng và hai đề tự biên soạn. Cả năm đề nhập có 375 khóa đáp án Nghe/Đọc; đề 131 thiếu đáp án và transcript nên đã được gỡ. 105 MP3 được đóng gói cùng ứng dụng. Viết và Nói lưu bài nhưng chưa được chấm tự động; bản ghi micro cần tải riêng. Bộ kiểm thử local trước khi phát hành gồm 282 unit test và 151 E2E trên Chromium, Firefox và WebKit, build 112 route và axe trên 19 màn. Migration gia cố quyền ghi cloud đã áp dụng trên Supabase production. PR #38 và smoke HTTPS đã đạt cho commit ứng dụng ff8faef; đồng bộ hai thiết bị, micro thật và thẩm định học liệu vẫn cần xác nhận; sáu đề nhập chỉ dùng học cá nhân của chủ dự án.</w:t>
+        <w:t>Bản code có năm đề nhập đủ bốn kỹ năng và hai đề tự biên soạn. Cả năm đề nhập có 375 khóa đáp án Nghe/Đọc; đề 131 thiếu đáp án và transcript nên đã được gỡ. 105 MP3 được đóng gói cùng ứng dụng. Viết và Nói lưu bài nhưng chưa được chấm tự động; bản ghi micro cần tải riêng. Bộ kiểm thử local trước khi phát hành gồm 282 unit test và 159 E2E trên Chromium, Firefox và WebKit, build 112 route và axe trên 19 màn. Migration gia cố quyền ghi cloud đã áp dụng trên Supabase production. PR #38 và smoke HTTPS đã đạt cho commit ứng dụng ff8faef; đồng bộ hai thiết bị, micro thật và thẩm định học liệu vẫn cần xác nhận; sáu đề nhập chỉ dùng học cá nhân của chủ dự án.</w:t>
       </w:r>
     </w:p>
     <w:p>
@@ -662,7 +662,7 @@
           <w:color w:val="211D20"/>
           <w:sz w:val="20"/>
         </w:rPr>
-        <w:t xml:space="preserve"> đạt 81 unit và 44 E2E. Bản làm việc hiện tại đạt 282 unit và 151 E2E trên cùng ba engine sau khi hoàn tất kiểm thử. Chưa có nghiệm thu trên iOS hoặc Android thật.</w:t>
+        <w:t xml:space="preserve"> đạt 81 unit và 44 E2E. Bản làm việc hiện tại đạt 282 unit và 159 E2E trên cùng ba engine sau khi hoàn tất kiểm thử. Chưa có nghiệm thu trên iOS hoặc Android thật.</w:t>
       </w:r>
     </w:p>
     <w:p>
@@ -3198,7 +3198,131 @@
           <w:color w:val="211D20"/>
           <w:sz w:val="20"/>
         </w:rPr>
-        <w:t>Con trỏ tùy biến dùng chấm và vòng hồng, chỉ bật với thiết bị chuột chính xác. Nó tự tắt trong ô nhập liệu, trên thiết bị cảm ứng và khi người dùng bật reduced motion.</w:t>
+        <w:t>Con trỏ tùy biến dùng chấm và vòng hồng, chỉ bật với thiết bị chuột chính xác. Nó tự tắt trong ô nhập liệu, trong phòng thi mô phỏng, trên thiết bị cảm ứng và khi người dùng bật reduced motion.</w:t>
+      </w:r>
+    </w:p>
+    <w:p>
+      <w:pPr>
+        <w:pStyle w:val="ListBullet"/>
+      </w:pPr>
+      <w:r>
+        <w:rPr>
+          <w:rFonts w:ascii="Arial" w:hAnsi="Arial" w:eastAsia="Arial"/>
+          <w:b/>
+          <w:color w:val="211D20"/>
+          <w:sz w:val="20"/>
+        </w:rPr>
+        <w:t>Ưu tiên máy tính</w:t>
+      </w:r>
+      <w:r>
+        <w:rPr>
+          <w:rFonts w:ascii="Arial" w:hAnsi="Arial" w:eastAsia="Arial"/>
+          <w:color w:val="211D20"/>
+          <w:sz w:val="20"/>
+        </w:rPr>
+        <w:t xml:space="preserve"> (CLAUDE.md): Gùa luyện đề trên máy tính, nên giao diện được thiết kế, đo và kiểm thử ở 1440×900 và 1280×720; điện thoại chỉ cần không vỡ bố cục.</w:t>
+      </w:r>
+    </w:p>
+    <w:p>
+      <w:pPr>
+        <w:pStyle w:val="ListBullet"/>
+      </w:pPr>
+      <w:r>
+        <w:rPr>
+          <w:rFonts w:ascii="Arial" w:hAnsi="Arial" w:eastAsia="Arial"/>
+          <w:b/>
+          <w:color w:val="211D20"/>
+          <w:sz w:val="20"/>
+        </w:rPr>
+        <w:t>Phòng thi mô phỏng là một khung cố định</w:t>
+      </w:r>
+      <w:r>
+        <w:rPr>
+          <w:rFonts w:ascii="Arial" w:hAnsi="Arial" w:eastAsia="Arial"/>
+          <w:color w:val="211D20"/>
+          <w:sz w:val="20"/>
+        </w:rPr>
+        <w:t xml:space="preserve"> (</w:t>
+      </w:r>
+      <w:r>
+        <w:rPr>
+          <w:rFonts w:ascii="Consolas" w:hAnsi="Consolas" w:eastAsia="Consolas"/>
+          <w:color w:val="4A3B42"/>
+          <w:sz w:val="19"/>
+        </w:rPr>
+        <w:t>paper-exam.tsx</w:t>
+      </w:r>
+      <w:r>
+        <w:rPr>
+          <w:rFonts w:ascii="Arial" w:hAnsi="Arial" w:eastAsia="Arial"/>
+          <w:color w:val="211D20"/>
+          <w:sz w:val="20"/>
+        </w:rPr>
+        <w:t xml:space="preserve">, phần CSS </w:t>
+      </w:r>
+      <w:r>
+        <w:rPr>
+          <w:rFonts w:ascii="Consolas" w:hAnsi="Consolas" w:eastAsia="Consolas"/>
+          <w:color w:val="4A3B42"/>
+          <w:sz w:val="19"/>
+        </w:rPr>
+        <w:t>.exam-*</w:t>
+      </w:r>
+      <w:r>
+        <w:rPr>
+          <w:rFonts w:ascii="Arial" w:hAnsi="Arial" w:eastAsia="Arial"/>
+          <w:color w:val="211D20"/>
+          <w:sz w:val="20"/>
+        </w:rPr>
+        <w:t>): thanh trên, vùng làm bài, thanh dưới. Đọc và Viết có hai ô cuộn riêng; Nghe và Nói nằm trong cột giữa rộng tối đa 860 px; bảng câu hỏi, các tab Task, các chặng Part và nút đi tiếp ở thanh dưới; ô Nháp là ngăn kéo trên thanh dưới (</w:t>
+      </w:r>
+      <w:r>
+        <w:rPr>
+          <w:rFonts w:ascii="Consolas" w:hAnsi="Consolas" w:eastAsia="Consolas"/>
+          <w:color w:val="4A3B42"/>
+          <w:sz w:val="19"/>
+        </w:rPr>
+        <w:t>ScratchDock</w:t>
+      </w:r>
+      <w:r>
+        <w:rPr>
+          <w:rFonts w:ascii="Arial" w:hAnsi="Arial" w:eastAsia="Arial"/>
+          <w:color w:val="211D20"/>
+          <w:sz w:val="20"/>
+        </w:rPr>
+        <w:t xml:space="preserve"> trong </w:t>
+      </w:r>
+      <w:r>
+        <w:rPr>
+          <w:rFonts w:ascii="Consolas" w:hAnsi="Consolas" w:eastAsia="Consolas"/>
+          <w:color w:val="4A3B42"/>
+          <w:sz w:val="19"/>
+        </w:rPr>
+        <w:t>scratch-pad.tsx</w:t>
+      </w:r>
+      <w:r>
+        <w:rPr>
+          <w:rFonts w:ascii="Arial" w:hAnsi="Arial" w:eastAsia="Arial"/>
+          <w:color w:val="211D20"/>
+          <w:sz w:val="20"/>
+        </w:rPr>
+        <w:t xml:space="preserve">) đẩy việc lên thay vì che. Dưới 900 px phòng thi trở lại cuộn thường. Bố cục theo cách phần mềm thi trên máy thường làm, không phải phần mềm VSTEP chính thức. Bố cục được giữ bằng </w:t>
+      </w:r>
+      <w:r>
+        <w:rPr>
+          <w:rFonts w:ascii="Consolas" w:hAnsi="Consolas" w:eastAsia="Consolas"/>
+          <w:color w:val="4A3B42"/>
+          <w:sz w:val="19"/>
+        </w:rPr>
+        <w:t>tests/e2e/exam-layout.spec.ts</w:t>
+      </w:r>
+      <w:r>
+        <w:rPr>
+          <w:rFonts w:ascii="Arial" w:hAnsi="Arial" w:eastAsia="Arial"/>
+          <w:color w:val="211D20"/>
+          <w:sz w:val="20"/>
+        </w:rPr>
+        <w:t>.</w:t>
       </w:r>
     </w:p>
     <w:p>
@@ -5118,7 +5242,7 @@
           <w:color w:val="211D20"/>
           <w:sz w:val="20"/>
         </w:rPr>
-        <w:t xml:space="preserve">Bản sáu đề ngày 07/10/2026: ESLint, TypeScript, 282/282 Vitest, build 112 route và audit production dependency đều đạt. Playwright có 151 ca trên bản production local: 143 Chromium, 4 Firefox, 4 WebKit. Sau khi thêm phòng thi mô phỏng và công cụ luyện đề, lượt Chromium đầy đủ đạt 143/143; Firefox và WebKit chưa chạy lại cho thay đổi này. Axe kiểm tra 19 màn, gồm kho đề và Review 13/09. Hai lượt CI của nhánh/PR #38 đạt; Vercel phục vụ SHA </w:t>
+        <w:t xml:space="preserve">Bản sáu đề ngày 07/10/2026: ESLint, TypeScript, 282/282 Vitest, build 112 route và audit production dependency đều đạt. Playwright có 159 ca trên bản production local: 151 Chromium, 4 Firefox, 4 WebKit. Sau khi thêm phòng thi mô phỏng và công cụ luyện đề, lượt Chromium đầy đủ đạt 151/151 (cập nhật 08/10/2026 sau khi dựng lại phòng thi; 11 ca cloud cần bản build có hai biến Supabase giả như CI đặt); Firefox và WebKit chưa chạy lại cho thay đổi này. Axe kiểm tra 19 màn, gồm kho đề và Review 13/09. Hai lượt CI của nhánh/PR #38 đạt; Vercel phục vụ SHA </w:t>
       </w:r>
       <w:r>
         <w:rPr>
@@ -9626,7 +9750,23 @@
                 <w:color w:val="211D20"/>
                 <w:sz w:val="16"/>
               </w:rPr>
-              <w:t>Trang nháp và nút Tô câu</w:t>
+              <w:t xml:space="preserve">Trang nháp (kèm ngăn kéo </w:t>
+            </w:r>
+            <w:r>
+              <w:rPr>
+                <w:rFonts w:ascii="Consolas" w:hAnsi="Consolas" w:eastAsia="Consolas"/>
+                <w:color w:val="4A3B42"/>
+                <w:sz w:val="15"/>
+              </w:rPr>
+              <w:t>ScratchDock</w:t>
+            </w:r>
+            <w:r>
+              <w:rPr>
+                <w:rFonts w:ascii="Arial" w:hAnsi="Arial" w:eastAsia="Arial"/>
+                <w:color w:val="211D20"/>
+                <w:sz w:val="16"/>
+              </w:rPr>
+              <w:t xml:space="preserve"> của phòng thi) và nút Tô câu</w:t>
             </w:r>
           </w:p>
         </w:tc>

</xml_diff>

<commit_message>
Giao diện máy tính, đợt hai: ca kiểm gọn lại, tài liệu và báo cáo Word
- shell-layout.spec.ts: sáu chiều cao gộp thành một ca (bộ đếm tài liệu đếm theo dòng test, không đếm vòng lặp).
- study.spec.ts: ca Trang chủ chạy ở màn cao, nơi thẻ động viên của thanh bên còn hiện đủ.
- QUALITY, HANDOVER, STATUS, báo cáo tình trạng: đợt rà thứ hai, số liệu 282 unit, 166 E2E (Chromium 158/158); hai báo cáo Word dựng lại.

Co-Authored-By: Claude <noreply@anthropic.com>
Claude-Session: https://claude.ai/code/session_01W75mjctkB2SZty7ogWDMjM
</commit_message>
<xml_diff>
--- a/docs/Bao-cao-ban-giao-May-VSTEP.docx
+++ b/docs/Bao-cao-ban-giao-May-VSTEP.docx
@@ -443,7 +443,7 @@
           <w:color w:val="211D20"/>
           <w:sz w:val="22"/>
         </w:rPr>
-        <w:t>Bản code có năm đề nhập đủ bốn kỹ năng và hai đề tự biên soạn. Cả năm đề nhập có 375 khóa đáp án Nghe/Đọc; đề 131 thiếu đáp án và transcript nên đã được gỡ. 105 MP3 được đóng gói cùng ứng dụng. Viết và Nói lưu bài nhưng chưa được chấm tự động; bản ghi micro cần tải riêng. Bộ kiểm thử local trước khi phát hành gồm 282 unit test và 159 E2E trên Chromium, Firefox và WebKit, build 112 route và axe trên 19 màn. Migration gia cố quyền ghi cloud đã áp dụng trên Supabase production. PR #38 và smoke HTTPS đã đạt cho commit ứng dụng ff8faef; đồng bộ hai thiết bị, micro thật và thẩm định học liệu vẫn cần xác nhận; sáu đề nhập chỉ dùng học cá nhân của chủ dự án.</w:t>
+        <w:t>Bản code có năm đề nhập đủ bốn kỹ năng và hai đề tự biên soạn. Cả năm đề nhập có 375 khóa đáp án Nghe/Đọc; đề 131 thiếu đáp án và transcript nên đã được gỡ. 105 MP3 được đóng gói cùng ứng dụng. Viết và Nói lưu bài nhưng chưa được chấm tự động; bản ghi micro cần tải riêng. Bộ kiểm thử local trước khi phát hành gồm 282 unit test và 166 E2E trên Chromium, Firefox và WebKit, build 112 route và axe trên 19 màn. Migration gia cố quyền ghi cloud đã áp dụng trên Supabase production. PR #38 và smoke HTTPS đã đạt cho commit ứng dụng ff8faef; đồng bộ hai thiết bị, micro thật và thẩm định học liệu vẫn cần xác nhận; sáu đề nhập chỉ dùng học cá nhân của chủ dự án.</w:t>
       </w:r>
     </w:p>
     <w:p>
@@ -662,7 +662,7 @@
           <w:color w:val="211D20"/>
           <w:sz w:val="20"/>
         </w:rPr>
-        <w:t xml:space="preserve"> đạt 81 unit và 44 E2E. Bản làm việc hiện tại đạt 282 unit và 159 E2E trên cùng ba engine sau khi hoàn tất kiểm thử. Chưa có nghiệm thu trên iOS hoặc Android thật.</w:t>
+        <w:t xml:space="preserve"> đạt 81 unit và 44 E2E. Bản làm việc hiện tại đạt 282 unit và 166 E2E trên cùng ba engine sau khi hoàn tất kiểm thử. Chưa có nghiệm thu trên iOS hoặc Android thật.</w:t>
       </w:r>
     </w:p>
     <w:p>
@@ -3212,6 +3212,44 @@
           <w:color w:val="211D20"/>
           <w:sz w:val="20"/>
         </w:rPr>
+        <w:t>Menu</w:t>
+      </w:r>
+      <w:r>
+        <w:rPr>
+          <w:rFonts w:ascii="Arial" w:hAnsi="Arial" w:eastAsia="Arial"/>
+          <w:color w:val="211D20"/>
+          <w:sz w:val="20"/>
+        </w:rPr>
+        <w:t xml:space="preserve"> có tám mục chính cộng “Kho đề luyện” (</w:t>
+      </w:r>
+      <w:r>
+        <w:rPr>
+          <w:rFonts w:ascii="Consolas" w:hAnsi="Consolas" w:eastAsia="Consolas"/>
+          <w:color w:val="4A3B42"/>
+          <w:sz w:val="19"/>
+        </w:rPr>
+        <w:t>/papers</w:t>
+      </w:r>
+      <w:r>
+        <w:rPr>
+          <w:rFonts w:ascii="Arial" w:hAnsi="Arial" w:eastAsia="Arial"/>
+          <w:color w:val="211D20"/>
+          <w:sz w:val="20"/>
+        </w:rPr>
+        <w:t>, năm đề nhập); thanh bên vừa trọn từ 700 px chiều cao trở lên (thẻ “Gùa cứ đi theo nhịp…” thu gọn dưới 1070 px và ẩn dưới 920 px), có ca kiểm ở sáu chiều cao.</w:t>
+      </w:r>
+    </w:p>
+    <w:p>
+      <w:pPr>
+        <w:pStyle w:val="ListBullet"/>
+      </w:pPr>
+      <w:r>
+        <w:rPr>
+          <w:rFonts w:ascii="Arial" w:hAnsi="Arial" w:eastAsia="Arial"/>
+          <w:b/>
+          <w:color w:val="211D20"/>
+          <w:sz w:val="20"/>
+        </w:rPr>
         <w:t>Ưu tiên máy tính</w:t>
       </w:r>
       <w:r>
@@ -5242,7 +5280,7 @@
           <w:color w:val="211D20"/>
           <w:sz w:val="20"/>
         </w:rPr>
-        <w:t xml:space="preserve">Bản sáu đề ngày 07/10/2026: ESLint, TypeScript, 282/282 Vitest, build 112 route và audit production dependency đều đạt. Playwright có 159 ca trên bản production local: 151 Chromium, 4 Firefox, 4 WebKit. Sau khi thêm phòng thi mô phỏng và công cụ luyện đề, lượt Chromium đầy đủ đạt 151/151 (cập nhật 08/10/2026 sau khi dựng lại phòng thi; 11 ca cloud cần bản build có hai biến Supabase giả như CI đặt); Firefox và WebKit chưa chạy lại cho thay đổi này. Axe kiểm tra 19 màn, gồm kho đề và Review 13/09. Hai lượt CI của nhánh/PR #38 đạt; Vercel phục vụ SHA </w:t>
+        <w:t xml:space="preserve">Bản sáu đề ngày 07/10/2026: ESLint, TypeScript, 282/282 Vitest, build 112 route và audit production dependency đều đạt. Playwright có 166 ca trên bản production local: 158 Chromium, 4 Firefox, 4 WebKit. Sau khi thêm phòng thi mô phỏng và công cụ luyện đề, lượt Chromium đầy đủ đạt 158/158 (cập nhật 08/10/2026 sau khi dựng lại phòng thi; 11 ca cloud cần bản build có hai biến Supabase giả như CI đặt); Firefox và WebKit chưa chạy lại cho thay đổi này. Axe kiểm tra 19 màn, gồm kho đề và Review 13/09. Hai lượt CI của nhánh/PR #38 đạt; Vercel phục vụ SHA </w:t>
       </w:r>
       <w:r>
         <w:rPr>

</xml_diff>

<commit_message>
Chấm AI, đợt 0: bỏ hết phần dành cho giáo viên
Mây chỉ dùng cho Gùa, nên gỡ Gói gửi giáo viên và Gói duyệt học liệu:
- bỏ /review-pack, /review-pack/bank và /review-pack/bank/[group]
- bỏ nút in gói, phần nhận xét của người chấm (Tiến bộ, Sổ ghi chú) và thẻ ở Cài đặt
- giữ trường feedback trong schema để bản sao lưu cũ vẫn khôi phục được
- build 112 -> 104 route, E2E 166 -> 165, axe 19 -> 16 màn
- cập nhật tài liệu, hai báo cáo Word và các ca kiểm tương ứng

Co-Authored-By: Claude Sonnet 5.5 <noreply@anthropic.com>
Claude-Session: https://claude.ai/code/session_01W75mjctkB2SZty7ogWDMjM
</commit_message>
<xml_diff>
--- a/docs/Bao-cao-ban-giao-May-VSTEP.docx
+++ b/docs/Bao-cao-ban-giao-May-VSTEP.docx
@@ -443,7 +443,7 @@
           <w:color w:val="211D20"/>
           <w:sz w:val="22"/>
         </w:rPr>
-        <w:t>Bản code có năm đề nhập đủ bốn kỹ năng và hai đề tự biên soạn. Cả năm đề nhập có 375 khóa đáp án Nghe/Đọc; đề 131 thiếu đáp án và transcript nên đã được gỡ. 105 MP3 được đóng gói cùng ứng dụng. Viết và Nói lưu bài nhưng chưa được chấm tự động; bản ghi micro cần tải riêng. Bộ kiểm thử local trước khi phát hành gồm 282 unit test và 166 E2E trên Chromium, Firefox và WebKit, build 112 route và axe trên 19 màn. Migration gia cố quyền ghi cloud đã áp dụng trên Supabase production. PR #38 và smoke HTTPS đã đạt cho commit ứng dụng ff8faef; đồng bộ hai thiết bị, micro thật và thẩm định học liệu vẫn cần xác nhận; sáu đề nhập chỉ dùng học cá nhân của chủ dự án.</w:t>
+        <w:t>Bản code có năm đề nhập đủ bốn kỹ năng và hai đề tự biên soạn. Cả năm đề nhập có 375 khóa đáp án Nghe/Đọc; đề 131 thiếu đáp án và transcript nên đã được gỡ. 105 MP3 được đóng gói cùng ứng dụng. Viết và Nói lưu bài nhưng chưa được chấm tự động; bản ghi micro cần tải riêng. Bộ kiểm thử local trước khi phát hành gồm 282 unit test và 165 E2E trên Chromium, Firefox và WebKit, build 104 route và axe trên 16 màn. Migration gia cố quyền ghi cloud đã áp dụng trên Supabase production. PR #38 và smoke HTTPS đã đạt cho commit ứng dụng ff8faef; đồng bộ hai thiết bị, micro thật và thẩm định học liệu vẫn cần xác nhận; sáu đề nhập chỉ dùng học cá nhân của chủ dự án.</w:t>
       </w:r>
     </w:p>
     <w:p>
@@ -662,7 +662,7 @@
           <w:color w:val="211D20"/>
           <w:sz w:val="20"/>
         </w:rPr>
-        <w:t xml:space="preserve"> đạt 81 unit và 44 E2E. Bản làm việc hiện tại đạt 282 unit và 166 E2E trên cùng ba engine sau khi hoàn tất kiểm thử. Chưa có nghiệm thu trên iOS hoặc Android thật.</w:t>
+        <w:t xml:space="preserve"> đạt 81 unit và 44 E2E. Bản làm việc hiện tại đạt 282 unit và 165 E2E trên cùng ba engine sau khi hoàn tất kiểm thử. Chưa có nghiệm thu trên iOS hoặc Android thật.</w:t>
       </w:r>
     </w:p>
     <w:p>
@@ -682,39 +682,7 @@
           <w:color w:val="211D20"/>
           <w:sz w:val="20"/>
         </w:rPr>
-        <w:t xml:space="preserve">Ba việc vẫn cần người quyết định nhưng nay mỗi việc chỉ còn một thao tác. </w:t>
-      </w:r>
-      <w:r>
-        <w:rPr>
-          <w:rFonts w:ascii="Consolas" w:hAnsi="Consolas" w:eastAsia="Consolas"/>
-          <w:color w:val="4A3B42"/>
-          <w:sz w:val="19"/>
-        </w:rPr>
-        <w:t>/review-pack/bank</w:t>
-      </w:r>
-      <w:r>
-        <w:rPr>
-          <w:rFonts w:ascii="Arial" w:hAnsi="Arial" w:eastAsia="Arial"/>
-          <w:color w:val="211D20"/>
-          <w:sz w:val="20"/>
-        </w:rPr>
-        <w:t xml:space="preserve"> in ra sáu tập hồ sơ học liệu để nhờ giáo viên duyệt: ngữ liệu, câu hỏi, đáp án đang dùng có đánh dấu, câu trích dẫn làm căn cứ và bảng trống cho người chấm; kết quả duyệt chỉ vào được </w:t>
-      </w:r>
-      <w:r>
-        <w:rPr>
-          <w:rFonts w:ascii="Consolas" w:hAnsi="Consolas" w:eastAsia="Consolas"/>
-          <w:color w:val="4A3B42"/>
-          <w:sz w:val="19"/>
-        </w:rPr>
-        <w:t>provenance.ts</w:t>
-      </w:r>
-      <w:r>
-        <w:rPr>
-          <w:rFonts w:ascii="Arial" w:hAnsi="Arial" w:eastAsia="Arial"/>
-          <w:color w:val="211D20"/>
-          <w:sz w:val="20"/>
-        </w:rPr>
-        <w:t xml:space="preserve"> bằng tay, với tên và ngày thật. Cài đặt có nút </w:t>
+        <w:t xml:space="preserve">Hai việc vốn cần người quyết định nay mỗi việc chỉ còn một thao tác. Cài đặt có nút </w:t>
       </w:r>
       <w:r>
         <w:rPr>
@@ -748,7 +716,41 @@
           <w:color w:val="211D20"/>
           <w:sz w:val="20"/>
         </w:rPr>
-        <w:t xml:space="preserve"> là danh sách 20 mục để nghiệm thu trên máy Gùa, chưa ai chạy.</w:t>
+        <w:t xml:space="preserve"> là danh sách 20 mục để nghiệm thu trên máy Gùa, chưa ai chạy. Ngày 08/10/2026 chủ dự án quyết định </w:t>
+      </w:r>
+      <w:r>
+        <w:rPr>
+          <w:rFonts w:ascii="Arial" w:hAnsi="Arial" w:eastAsia="Arial"/>
+          <w:b/>
+          <w:color w:val="211D20"/>
+          <w:sz w:val="20"/>
+        </w:rPr>
+        <w:t>bỏ hết phần dành cho giáo viên</w:t>
+      </w:r>
+      <w:r>
+        <w:rPr>
+          <w:rFonts w:ascii="Arial" w:hAnsi="Arial" w:eastAsia="Arial"/>
+          <w:color w:val="211D20"/>
+          <w:sz w:val="20"/>
+        </w:rPr>
+        <w:t xml:space="preserve"> (Gói gửi giáo viên, Gói duyệt học liệu): Mây chỉ dùng cho Gùa; việc chấm Viết và Nói sẽ làm bằng AI theo </w:t>
+      </w:r>
+      <w:hyperlink r:id="rId14">
+        <w:r>
+          <w:rPr>
+            <w:color w:val="C93B72"/>
+            <w:u w:val="single"/>
+          </w:rPr>
+          <w:t>PLAN-CHAM-AI.md</w:t>
+        </w:r>
+      </w:hyperlink>
+      <w:r>
+        <w:rPr>
+          <w:rFonts w:ascii="Arial" w:hAnsi="Arial" w:eastAsia="Arial"/>
+          <w:color w:val="211D20"/>
+          <w:sz w:val="20"/>
+        </w:rPr>
+        <w:t>.</w:t>
       </w:r>
     </w:p>
     <w:p>
@@ -2508,7 +2510,7 @@
         </w:rPr>
         <w:t xml:space="preserve">Ba công cụ thay giấy khi luyện; kế hoạch và cách đo nằm ở </w:t>
       </w:r>
-      <w:hyperlink r:id="rId14">
+      <w:hyperlink r:id="rId15">
         <w:r>
           <w:rPr>
             <w:color w:val="C93B72"/>
@@ -5280,7 +5282,7 @@
           <w:color w:val="211D20"/>
           <w:sz w:val="20"/>
         </w:rPr>
-        <w:t xml:space="preserve">Bản sáu đề ngày 07/10/2026: ESLint, TypeScript, 282/282 Vitest, build 112 route và audit production dependency đều đạt. Playwright có 166 ca trên bản production local: 158 Chromium, 4 Firefox, 4 WebKit. Sau khi thêm phòng thi mô phỏng và công cụ luyện đề, lượt Chromium đầy đủ đạt 158/158 (cập nhật 08/10/2026 sau khi dựng lại phòng thi; 11 ca cloud cần bản build có hai biến Supabase giả như CI đặt); Firefox và WebKit chưa chạy lại cho thay đổi này. Axe kiểm tra 19 màn, gồm kho đề và Review 13/09. Hai lượt CI của nhánh/PR #38 đạt; Vercel phục vụ SHA </w:t>
+        <w:t xml:space="preserve">Bản sáu đề ngày 07/10/2026: ESLint, TypeScript, 282/282 Vitest, build 104 route và audit production dependency đều đạt. Playwright có 165 ca trên bản production local: 157 Chromium, 4 Firefox, 4 WebKit. Sau khi thêm phòng thi mô phỏng và công cụ luyện đề, lượt Chromium đầy đủ đạt 157/157 (cập nhật 08/10/2026 sau khi dựng lại phòng thi; 11 ca cloud cần bản build có hai biến Supabase giả như CI đặt); Firefox và WebKit chưa chạy lại cho thay đổi này. Axe kiểm tra 19 màn, gồm kho đề và Review 13/09. Hai lượt CI của nhánh/PR #38 đạt; Vercel phục vụ SHA </w:t>
       </w:r>
       <w:r>
         <w:rPr>
@@ -5298,7 +5300,7 @@
         </w:rPr>
         <w:t xml:space="preserve"> và </w:t>
       </w:r>
-      <w:hyperlink r:id="rId15">
+      <w:hyperlink r:id="rId16">
         <w:r>
           <w:rPr>
             <w:color w:val="C93B72"/>
@@ -8808,7 +8810,7 @@
           <w:color w:val="211D20"/>
           <w:sz w:val="20"/>
         </w:rPr>
-        <w:t>Mời giáo viên VSTEP rà rubric, đáp án, độ khó, từ vựng, thời lượng và mức B1/B2.</w:t>
+        <w:t>Mời giáo viên VSTEP rà rubric, đáp án, độ khó, từ vựng, thời lượng và mức B1/B2. (Chủ dự án đã quyết định ngày 08/10/2026 không nhờ giáo viên; mục này chỉ còn là khuyến nghị chung.)</w:t>
       </w:r>
     </w:p>
     <w:p>

</xml_diff>

<commit_message>
Chấm AI đợt 0: bỏ phần giáo viên, kế hoạch chấm Viết/Nói bằng Gemini (#56)
Gỡ Gói gửi giáo viên và Gói duyệt học liệu (Mây chỉ dùng cho Gùa); viết lại docs/PLAN-CHAM-AI.md cho Gemini. Build 104 route, 282 unit, 165 E2E.

Co-Authored-By: Claude Sonnet 5.5 <noreply@anthropic.com>
Claude-Session: https://claude.ai/code/session_01W75mjctkB2SZty7ogWDMjM
</commit_message>
<xml_diff>
--- a/docs/Bao-cao-ban-giao-May-VSTEP.docx
+++ b/docs/Bao-cao-ban-giao-May-VSTEP.docx
@@ -443,7 +443,7 @@
           <w:color w:val="211D20"/>
           <w:sz w:val="22"/>
         </w:rPr>
-        <w:t>Bản code có năm đề nhập đủ bốn kỹ năng và hai đề tự biên soạn. Cả năm đề nhập có 375 khóa đáp án Nghe/Đọc; đề 131 thiếu đáp án và transcript nên đã được gỡ. 105 MP3 được đóng gói cùng ứng dụng. Viết và Nói lưu bài nhưng chưa được chấm tự động; bản ghi micro cần tải riêng. Bộ kiểm thử local trước khi phát hành gồm 282 unit test và 166 E2E trên Chromium, Firefox và WebKit, build 112 route và axe trên 19 màn. Migration gia cố quyền ghi cloud đã áp dụng trên Supabase production. PR #38 và smoke HTTPS đã đạt cho commit ứng dụng ff8faef; đồng bộ hai thiết bị, micro thật và thẩm định học liệu vẫn cần xác nhận; sáu đề nhập chỉ dùng học cá nhân của chủ dự án.</w:t>
+        <w:t>Bản code có năm đề nhập đủ bốn kỹ năng và hai đề tự biên soạn. Cả năm đề nhập có 375 khóa đáp án Nghe/Đọc; đề 131 thiếu đáp án và transcript nên đã được gỡ. 105 MP3 được đóng gói cùng ứng dụng. Viết và Nói lưu bài nhưng chưa được chấm tự động; bản ghi micro cần tải riêng. Bộ kiểm thử local trước khi phát hành gồm 282 unit test và 165 E2E trên Chromium, Firefox và WebKit, build 104 route và axe trên 16 màn. Migration gia cố quyền ghi cloud đã áp dụng trên Supabase production. PR #38 và smoke HTTPS đã đạt cho commit ứng dụng ff8faef; đồng bộ hai thiết bị, micro thật và thẩm định học liệu vẫn cần xác nhận; sáu đề nhập chỉ dùng học cá nhân của chủ dự án.</w:t>
       </w:r>
     </w:p>
     <w:p>
@@ -662,7 +662,7 @@
           <w:color w:val="211D20"/>
           <w:sz w:val="20"/>
         </w:rPr>
-        <w:t xml:space="preserve"> đạt 81 unit và 44 E2E. Bản làm việc hiện tại đạt 282 unit và 166 E2E trên cùng ba engine sau khi hoàn tất kiểm thử. Chưa có nghiệm thu trên iOS hoặc Android thật.</w:t>
+        <w:t xml:space="preserve"> đạt 81 unit và 44 E2E. Bản làm việc hiện tại đạt 282 unit và 165 E2E trên cùng ba engine sau khi hoàn tất kiểm thử. Chưa có nghiệm thu trên iOS hoặc Android thật.</w:t>
       </w:r>
     </w:p>
     <w:p>
@@ -682,39 +682,7 @@
           <w:color w:val="211D20"/>
           <w:sz w:val="20"/>
         </w:rPr>
-        <w:t xml:space="preserve">Ba việc vẫn cần người quyết định nhưng nay mỗi việc chỉ còn một thao tác. </w:t>
-      </w:r>
-      <w:r>
-        <w:rPr>
-          <w:rFonts w:ascii="Consolas" w:hAnsi="Consolas" w:eastAsia="Consolas"/>
-          <w:color w:val="4A3B42"/>
-          <w:sz w:val="19"/>
-        </w:rPr>
-        <w:t>/review-pack/bank</w:t>
-      </w:r>
-      <w:r>
-        <w:rPr>
-          <w:rFonts w:ascii="Arial" w:hAnsi="Arial" w:eastAsia="Arial"/>
-          <w:color w:val="211D20"/>
-          <w:sz w:val="20"/>
-        </w:rPr>
-        <w:t xml:space="preserve"> in ra sáu tập hồ sơ học liệu để nhờ giáo viên duyệt: ngữ liệu, câu hỏi, đáp án đang dùng có đánh dấu, câu trích dẫn làm căn cứ và bảng trống cho người chấm; kết quả duyệt chỉ vào được </w:t>
-      </w:r>
-      <w:r>
-        <w:rPr>
-          <w:rFonts w:ascii="Consolas" w:hAnsi="Consolas" w:eastAsia="Consolas"/>
-          <w:color w:val="4A3B42"/>
-          <w:sz w:val="19"/>
-        </w:rPr>
-        <w:t>provenance.ts</w:t>
-      </w:r>
-      <w:r>
-        <w:rPr>
-          <w:rFonts w:ascii="Arial" w:hAnsi="Arial" w:eastAsia="Arial"/>
-          <w:color w:val="211D20"/>
-          <w:sz w:val="20"/>
-        </w:rPr>
-        <w:t xml:space="preserve"> bằng tay, với tên và ngày thật. Cài đặt có nút </w:t>
+        <w:t xml:space="preserve">Hai việc vốn cần người quyết định nay mỗi việc chỉ còn một thao tác. Cài đặt có nút </w:t>
       </w:r>
       <w:r>
         <w:rPr>
@@ -748,7 +716,41 @@
           <w:color w:val="211D20"/>
           <w:sz w:val="20"/>
         </w:rPr>
-        <w:t xml:space="preserve"> là danh sách 20 mục để nghiệm thu trên máy Gùa, chưa ai chạy.</w:t>
+        <w:t xml:space="preserve"> là danh sách 20 mục để nghiệm thu trên máy Gùa, chưa ai chạy. Ngày 08/10/2026 chủ dự án quyết định </w:t>
+      </w:r>
+      <w:r>
+        <w:rPr>
+          <w:rFonts w:ascii="Arial" w:hAnsi="Arial" w:eastAsia="Arial"/>
+          <w:b/>
+          <w:color w:val="211D20"/>
+          <w:sz w:val="20"/>
+        </w:rPr>
+        <w:t>bỏ hết phần dành cho giáo viên</w:t>
+      </w:r>
+      <w:r>
+        <w:rPr>
+          <w:rFonts w:ascii="Arial" w:hAnsi="Arial" w:eastAsia="Arial"/>
+          <w:color w:val="211D20"/>
+          <w:sz w:val="20"/>
+        </w:rPr>
+        <w:t xml:space="preserve"> (Gói gửi giáo viên, Gói duyệt học liệu): Mây chỉ dùng cho Gùa; việc chấm Viết và Nói sẽ làm bằng AI theo </w:t>
+      </w:r>
+      <w:hyperlink r:id="rId14">
+        <w:r>
+          <w:rPr>
+            <w:color w:val="C93B72"/>
+            <w:u w:val="single"/>
+          </w:rPr>
+          <w:t>PLAN-CHAM-AI.md</w:t>
+        </w:r>
+      </w:hyperlink>
+      <w:r>
+        <w:rPr>
+          <w:rFonts w:ascii="Arial" w:hAnsi="Arial" w:eastAsia="Arial"/>
+          <w:color w:val="211D20"/>
+          <w:sz w:val="20"/>
+        </w:rPr>
+        <w:t>.</w:t>
       </w:r>
     </w:p>
     <w:p>
@@ -2508,7 +2510,7 @@
         </w:rPr>
         <w:t xml:space="preserve">Ba công cụ thay giấy khi luyện; kế hoạch và cách đo nằm ở </w:t>
       </w:r>
-      <w:hyperlink r:id="rId14">
+      <w:hyperlink r:id="rId15">
         <w:r>
           <w:rPr>
             <w:color w:val="C93B72"/>
@@ -5280,7 +5282,7 @@
           <w:color w:val="211D20"/>
           <w:sz w:val="20"/>
         </w:rPr>
-        <w:t xml:space="preserve">Bản sáu đề ngày 07/10/2026: ESLint, TypeScript, 282/282 Vitest, build 112 route và audit production dependency đều đạt. Playwright có 166 ca trên bản production local: 158 Chromium, 4 Firefox, 4 WebKit. Sau khi thêm phòng thi mô phỏng và công cụ luyện đề, lượt Chromium đầy đủ đạt 158/158 (cập nhật 08/10/2026 sau khi dựng lại phòng thi; 11 ca cloud cần bản build có hai biến Supabase giả như CI đặt); Firefox và WebKit chưa chạy lại cho thay đổi này. Axe kiểm tra 19 màn, gồm kho đề và Review 13/09. Hai lượt CI của nhánh/PR #38 đạt; Vercel phục vụ SHA </w:t>
+        <w:t xml:space="preserve">Bản sáu đề ngày 07/10/2026: ESLint, TypeScript, 282/282 Vitest, build 104 route và audit production dependency đều đạt. Playwright có 165 ca trên bản production local: 157 Chromium, 4 Firefox, 4 WebKit. Sau khi thêm phòng thi mô phỏng và công cụ luyện đề, lượt Chromium đầy đủ đạt 157/157 (cập nhật 08/10/2026 sau khi dựng lại phòng thi; 11 ca cloud cần bản build có hai biến Supabase giả như CI đặt); Firefox và WebKit chưa chạy lại cho thay đổi này. Axe kiểm tra 19 màn, gồm kho đề và Review 13/09. Hai lượt CI của nhánh/PR #38 đạt; Vercel phục vụ SHA </w:t>
       </w:r>
       <w:r>
         <w:rPr>
@@ -5298,7 +5300,7 @@
         </w:rPr>
         <w:t xml:space="preserve"> và </w:t>
       </w:r>
-      <w:hyperlink r:id="rId15">
+      <w:hyperlink r:id="rId16">
         <w:r>
           <w:rPr>
             <w:color w:val="C93B72"/>
@@ -8808,7 +8810,7 @@
           <w:color w:val="211D20"/>
           <w:sz w:val="20"/>
         </w:rPr>
-        <w:t>Mời giáo viên VSTEP rà rubric, đáp án, độ khó, từ vựng, thời lượng và mức B1/B2.</w:t>
+        <w:t>Mời giáo viên VSTEP rà rubric, đáp án, độ khó, từ vựng, thời lượng và mức B1/B2. (Chủ dự án đã quyết định ngày 08/10/2026 không nhờ giáo viên; mục này chỉ còn là khuyến nghị chung.)</w:t>
       </w:r>
     </w:p>
     <w:p>

</xml_diff>

<commit_message>
Chấm AI, đợt 1: mã chấm, thang CEFR dự phòng và bộ đo (chưa gọi model thật)
- src/lib/grading: làm tròn theo Thông tư 23/2017, điểm Viết/Nói/tổng, trung vị nhiều lần chấm,
  kiểm câu trích, số đo bằng code (số từ, chép đề, trôi chảy), lời nhắc có phiên bản,
  quy trình chấm Viết và Nói nhận hàm gọi model (kiểm thử bằng model giả), client Gemini phía máy chủ
- mọi cổng điểm đóng cho đến khi bộ đo chạy thật; thời điểm từng từ không khớp bản ghi thì mất điểm trôi chảy
- src/lib/rubric: thang bốn bậc theo CEFR, ghi rõ chưa phải văn bản chính thức
- scripts/grading-eval: ellipse, samples, stability, perturb, speech; chia dữ liệu chỉnh/giữ kín; .data/ không commit
- 57 ca unit mới (339), docs, hai báo cáo Word

Chưa chạy được với Gemini thật (chưa có khóa) và chưa lấy được văn bản VSTEP chính thức.

Co-Authored-By: Claude Sonnet 5.5 <noreply@anthropic.com>
Claude-Session: https://claude.ai/code/session_01W75mjctkB2SZty7ogWDMjM
</commit_message>
<xml_diff>
--- a/docs/Bao-cao-ban-giao-May-VSTEP.docx
+++ b/docs/Bao-cao-ban-giao-May-VSTEP.docx
@@ -443,7 +443,7 @@
           <w:color w:val="211D20"/>
           <w:sz w:val="22"/>
         </w:rPr>
-        <w:t>Bản code có năm đề nhập đủ bốn kỹ năng và hai đề tự biên soạn. Cả năm đề nhập có 375 khóa đáp án Nghe/Đọc; đề 131 thiếu đáp án và transcript nên đã được gỡ. 105 MP3 được đóng gói cùng ứng dụng. Viết và Nói lưu bài nhưng chưa được chấm tự động; bản ghi micro cần tải riêng. Bộ kiểm thử local trước khi phát hành gồm 282 unit test và 165 E2E trên Chromium, Firefox và WebKit, build 104 route và axe trên 16 màn. Migration gia cố quyền ghi cloud đã áp dụng trên Supabase production. PR #38 và smoke HTTPS đã đạt cho commit ứng dụng ff8faef; đồng bộ hai thiết bị, micro thật và thẩm định học liệu vẫn cần xác nhận; sáu đề nhập chỉ dùng học cá nhân của chủ dự án.</w:t>
+        <w:t>Bản code có năm đề nhập đủ bốn kỹ năng và hai đề tự biên soạn. Cả năm đề nhập có 375 khóa đáp án Nghe/Đọc; đề 131 thiếu đáp án và transcript nên đã được gỡ. 105 MP3 được đóng gói cùng ứng dụng. Viết và Nói lưu bài nhưng chưa được chấm tự động; bản ghi micro cần tải riêng. Bộ kiểm thử local trước khi phát hành gồm 339 unit test và 165 E2E trên Chromium, Firefox và WebKit, build 104 route và axe trên 16 màn. Migration gia cố quyền ghi cloud đã áp dụng trên Supabase production. PR #38 và smoke HTTPS đã đạt cho commit ứng dụng ff8faef; đồng bộ hai thiết bị, micro thật và thẩm định học liệu vẫn cần xác nhận; sáu đề nhập chỉ dùng học cá nhân của chủ dự án.</w:t>
       </w:r>
     </w:p>
     <w:p>
@@ -662,7 +662,7 @@
           <w:color w:val="211D20"/>
           <w:sz w:val="20"/>
         </w:rPr>
-        <w:t xml:space="preserve"> đạt 81 unit và 44 E2E. Bản làm việc hiện tại đạt 282 unit và 165 E2E trên cùng ba engine sau khi hoàn tất kiểm thử. Chưa có nghiệm thu trên iOS hoặc Android thật.</w:t>
+        <w:t xml:space="preserve"> đạt 81 unit và 44 E2E. Bản làm việc hiện tại đạt 339 unit và 165 E2E trên cùng ba engine sau khi hoàn tất kiểm thử. Chưa có nghiệm thu trên iOS hoặc Android thật.</w:t>
       </w:r>
     </w:p>
     <w:p>
@@ -5282,7 +5282,7 @@
           <w:color w:val="211D20"/>
           <w:sz w:val="20"/>
         </w:rPr>
-        <w:t xml:space="preserve">Bản sáu đề ngày 07/10/2026: ESLint, TypeScript, 282/282 Vitest, build 104 route và audit production dependency đều đạt. Playwright có 165 ca trên bản production local: 157 Chromium, 4 Firefox, 4 WebKit. Sau khi thêm phòng thi mô phỏng và công cụ luyện đề, lượt Chromium đầy đủ đạt 157/157 (cập nhật 08/10/2026 sau khi dựng lại phòng thi; 11 ca cloud cần bản build có hai biến Supabase giả như CI đặt); Firefox và WebKit chưa chạy lại cho thay đổi này. Axe kiểm tra 19 màn, gồm kho đề và Review 13/09. Hai lượt CI của nhánh/PR #38 đạt; Vercel phục vụ SHA </w:t>
+        <w:t xml:space="preserve">Bản sáu đề ngày 07/10/2026: ESLint, TypeScript, 339/339 Vitest, build 104 route và audit production dependency đều đạt. Playwright có 165 ca trên bản production local: 157 Chromium, 4 Firefox, 4 WebKit. Sau khi thêm phòng thi mô phỏng và công cụ luyện đề, lượt Chromium đầy đủ đạt 157/157 (cập nhật 08/10/2026 sau khi dựng lại phòng thi; 11 ca cloud cần bản build có hai biến Supabase giả như CI đặt); Firefox và WebKit chưa chạy lại cho thay đổi này. Axe kiểm tra 19 màn, gồm kho đề và Review 13/09. Hai lượt CI của nhánh/PR #38 đạt; Vercel phục vụ SHA </w:t>
       </w:r>
       <w:r>
         <w:rPr>

</xml_diff>

<commit_message>
Chấm AI đợt 1: mã chấm, thang CEFR dự phòng và bộ đo, chưa gọi model thật (#57)
Thư viện src/lib/grading và src/lib/rubric, bộ đo scripts/grading-eval; mọi cổng điểm đóng cho đến khi đo thật. 339 unit, build 104 route.

Co-Authored-By: Claude Sonnet 5.5 <noreply@anthropic.com>
Claude-Session: https://claude.ai/code/session_01W75mjctkB2SZty7ogWDMjM
</commit_message>
<xml_diff>
--- a/docs/Bao-cao-ban-giao-May-VSTEP.docx
+++ b/docs/Bao-cao-ban-giao-May-VSTEP.docx
@@ -443,7 +443,7 @@
           <w:color w:val="211D20"/>
           <w:sz w:val="22"/>
         </w:rPr>
-        <w:t>Bản code có năm đề nhập đủ bốn kỹ năng và hai đề tự biên soạn. Cả năm đề nhập có 375 khóa đáp án Nghe/Đọc; đề 131 thiếu đáp án và transcript nên đã được gỡ. 105 MP3 được đóng gói cùng ứng dụng. Viết và Nói lưu bài nhưng chưa được chấm tự động; bản ghi micro cần tải riêng. Bộ kiểm thử local trước khi phát hành gồm 282 unit test và 165 E2E trên Chromium, Firefox và WebKit, build 104 route và axe trên 16 màn. Migration gia cố quyền ghi cloud đã áp dụng trên Supabase production. PR #38 và smoke HTTPS đã đạt cho commit ứng dụng ff8faef; đồng bộ hai thiết bị, micro thật và thẩm định học liệu vẫn cần xác nhận; sáu đề nhập chỉ dùng học cá nhân của chủ dự án.</w:t>
+        <w:t>Bản code có năm đề nhập đủ bốn kỹ năng và hai đề tự biên soạn. Cả năm đề nhập có 375 khóa đáp án Nghe/Đọc; đề 131 thiếu đáp án và transcript nên đã được gỡ. 105 MP3 được đóng gói cùng ứng dụng. Viết và Nói lưu bài nhưng chưa được chấm tự động; bản ghi micro cần tải riêng. Bộ kiểm thử local trước khi phát hành gồm 339 unit test và 165 E2E trên Chromium, Firefox và WebKit, build 104 route và axe trên 16 màn. Migration gia cố quyền ghi cloud đã áp dụng trên Supabase production. PR #38 và smoke HTTPS đã đạt cho commit ứng dụng ff8faef; đồng bộ hai thiết bị, micro thật và thẩm định học liệu vẫn cần xác nhận; sáu đề nhập chỉ dùng học cá nhân của chủ dự án.</w:t>
       </w:r>
     </w:p>
     <w:p>
@@ -662,7 +662,7 @@
           <w:color w:val="211D20"/>
           <w:sz w:val="20"/>
         </w:rPr>
-        <w:t xml:space="preserve"> đạt 81 unit và 44 E2E. Bản làm việc hiện tại đạt 282 unit và 165 E2E trên cùng ba engine sau khi hoàn tất kiểm thử. Chưa có nghiệm thu trên iOS hoặc Android thật.</w:t>
+        <w:t xml:space="preserve"> đạt 81 unit và 44 E2E. Bản làm việc hiện tại đạt 339 unit và 165 E2E trên cùng ba engine sau khi hoàn tất kiểm thử. Chưa có nghiệm thu trên iOS hoặc Android thật.</w:t>
       </w:r>
     </w:p>
     <w:p>
@@ -5282,7 +5282,7 @@
           <w:color w:val="211D20"/>
           <w:sz w:val="20"/>
         </w:rPr>
-        <w:t xml:space="preserve">Bản sáu đề ngày 07/10/2026: ESLint, TypeScript, 282/282 Vitest, build 104 route và audit production dependency đều đạt. Playwright có 165 ca trên bản production local: 157 Chromium, 4 Firefox, 4 WebKit. Sau khi thêm phòng thi mô phỏng và công cụ luyện đề, lượt Chromium đầy đủ đạt 157/157 (cập nhật 08/10/2026 sau khi dựng lại phòng thi; 11 ca cloud cần bản build có hai biến Supabase giả như CI đặt); Firefox và WebKit chưa chạy lại cho thay đổi này. Axe kiểm tra 19 màn, gồm kho đề và Review 13/09. Hai lượt CI của nhánh/PR #38 đạt; Vercel phục vụ SHA </w:t>
+        <w:t xml:space="preserve">Bản sáu đề ngày 07/10/2026: ESLint, TypeScript, 339/339 Vitest, build 104 route và audit production dependency đều đạt. Playwright có 165 ca trên bản production local: 157 Chromium, 4 Firefox, 4 WebKit. Sau khi thêm phòng thi mô phỏng và công cụ luyện đề, lượt Chromium đầy đủ đạt 157/157 (cập nhật 08/10/2026 sau khi dựng lại phòng thi; 11 ca cloud cần bản build có hai biến Supabase giả như CI đặt); Firefox và WebKit chưa chạy lại cho thay đổi này. Axe kiểm tra 19 màn, gồm kho đề và Review 13/09. Hai lượt CI của nhánh/PR #38 đạt; Vercel phục vụ SHA </w:t>
       </w:r>
       <w:r>
         <w:rPr>

</xml_diff>

<commit_message>
Chấm AI đợt 2: chấm bài Viết trong app, kiểm bằng API giả (#58)
/api/grade/writing và /status chỉ bật khi có GEMINI_API_KEY và GRADER_PASSCODE; grades trong hồ sơ học; nút chấm ở màn chữa đề và thẻ ở Cài đặt. Chưa gọi Gemini thật, mọi cổng điểm đóng. 365 unit, 175 E2E, 105 route.

Co-Authored-By: Claude Sonnet 5.5 <noreply@anthropic.com>
Claude-Session: https://claude.ai/code/session_01W75mjctkB2SZty7ogWDMjM
</commit_message>
<xml_diff>
--- a/docs/Bao-cao-ban-giao-May-VSTEP.docx
+++ b/docs/Bao-cao-ban-giao-May-VSTEP.docx
@@ -443,7 +443,7 @@
           <w:color w:val="211D20"/>
           <w:sz w:val="22"/>
         </w:rPr>
-        <w:t>Bản code có năm đề nhập đủ bốn kỹ năng và hai đề tự biên soạn. Cả năm đề nhập có 375 khóa đáp án Nghe/Đọc; đề 131 thiếu đáp án và transcript nên đã được gỡ. 105 MP3 được đóng gói cùng ứng dụng. Viết và Nói lưu bài nhưng chưa được chấm tự động; bản ghi micro cần tải riêng. Bộ kiểm thử local trước khi phát hành gồm 339 unit test và 165 E2E trên Chromium, Firefox và WebKit, build 104 route và axe trên 16 màn. Migration gia cố quyền ghi cloud đã áp dụng trên Supabase production. PR #38 và smoke HTTPS đã đạt cho commit ứng dụng ff8faef; đồng bộ hai thiết bị, micro thật và thẩm định học liệu vẫn cần xác nhận; sáu đề nhập chỉ dùng học cá nhân của chủ dự án.</w:t>
+        <w:t>Bản code có năm đề nhập đủ bốn kỹ năng và hai đề tự biên soạn. Cả năm đề nhập có 375 khóa đáp án Nghe/Đọc; đề 131 thiếu đáp án và transcript nên đã được gỡ. 105 MP3 được đóng gói cùng ứng dụng. Viết và Nói lưu bài nhưng chưa được chấm tự động; bản ghi micro cần tải riêng. Bộ kiểm thử local trước khi phát hành gồm 365 unit test và 175 E2E trên Chromium, Firefox và WebKit, build 105 route và axe trên 18 màn. Migration gia cố quyền ghi cloud đã áp dụng trên Supabase production. PR #38 và smoke HTTPS đã đạt cho commit ứng dụng ff8faef; đồng bộ hai thiết bị, micro thật và thẩm định học liệu vẫn cần xác nhận; sáu đề nhập chỉ dùng học cá nhân của chủ dự án.</w:t>
       </w:r>
     </w:p>
     <w:p>
@@ -662,7 +662,7 @@
           <w:color w:val="211D20"/>
           <w:sz w:val="20"/>
         </w:rPr>
-        <w:t xml:space="preserve"> đạt 81 unit và 44 E2E. Bản làm việc hiện tại đạt 339 unit và 165 E2E trên cùng ba engine sau khi hoàn tất kiểm thử. Chưa có nghiệm thu trên iOS hoặc Android thật.</w:t>
+        <w:t xml:space="preserve"> đạt 81 unit và 44 E2E. Bản làm việc hiện tại đạt 365 unit và 175 E2E trên cùng ba engine sau khi hoàn tất kiểm thử. Chưa có nghiệm thu trên iOS hoặc Android thật.</w:t>
       </w:r>
     </w:p>
     <w:p>
@@ -5182,7 +5182,89 @@
           <w:color w:val="211D20"/>
           <w:sz w:val="20"/>
         </w:rPr>
-        <w:t>Website không có analytics, quảng cáo hoặc luồng tự gửi bài viết/bản ghi sang dịch vụ AI.</w:t>
+        <w:t xml:space="preserve">Website không có analytics, quảng cáo hoặc luồng tự gửi gì sang dịch vụ AI. Từ Đợt 2 của </w:t>
+      </w:r>
+      <w:hyperlink r:id="rId14">
+        <w:r>
+          <w:rPr>
+            <w:color w:val="C93B72"/>
+            <w:u w:val="single"/>
+          </w:rPr>
+          <w:t>PLAN-CHAM-AI.md</w:t>
+        </w:r>
+      </w:hyperlink>
+      <w:r>
+        <w:rPr>
+          <w:rFonts w:ascii="Arial" w:hAnsi="Arial" w:eastAsia="Arial"/>
+          <w:color w:val="211D20"/>
+          <w:sz w:val="20"/>
+        </w:rPr>
+        <w:t xml:space="preserve"> có một ngoại lệ do người dùng chủ động: khi Gùa bấm “Chấm bằng AI” ở một bài Viết, </w:t>
+      </w:r>
+      <w:r>
+        <w:rPr>
+          <w:rFonts w:ascii="Arial" w:hAnsi="Arial" w:eastAsia="Arial"/>
+          <w:b/>
+          <w:color w:val="211D20"/>
+          <w:sz w:val="20"/>
+        </w:rPr>
+        <w:t>đề bài và bài viết đó</w:t>
+      </w:r>
+      <w:r>
+        <w:rPr>
+          <w:rFonts w:ascii="Arial" w:hAnsi="Arial" w:eastAsia="Arial"/>
+          <w:color w:val="211D20"/>
+          <w:sz w:val="20"/>
+        </w:rPr>
+        <w:t xml:space="preserve"> đi tới máy chủ của Mây rồi tới Google (Gemini, gói trả phí, qua </w:t>
+      </w:r>
+      <w:r>
+        <w:rPr>
+          <w:rFonts w:ascii="Consolas" w:hAnsi="Consolas" w:eastAsia="Consolas"/>
+          <w:color w:val="4A3B42"/>
+          <w:sz w:val="19"/>
+        </w:rPr>
+        <w:t>generateContent</w:t>
+      </w:r>
+      <w:r>
+        <w:rPr>
+          <w:rFonts w:ascii="Arial" w:hAnsi="Arial" w:eastAsia="Arial"/>
+          <w:color w:val="211D20"/>
+          <w:sz w:val="20"/>
+        </w:rPr>
+        <w:t xml:space="preserve">; Google không dùng nội dung gửi lên để cải thiện sản phẩm). Cần đồng ý lần đầu và mã chấm bài; chỉ hiện khi máy chủ có </w:t>
+      </w:r>
+      <w:r>
+        <w:rPr>
+          <w:rFonts w:ascii="Consolas" w:hAnsi="Consolas" w:eastAsia="Consolas"/>
+          <w:color w:val="4A3B42"/>
+          <w:sz w:val="19"/>
+        </w:rPr>
+        <w:t>GEMINI_API_KEY</w:t>
+      </w:r>
+      <w:r>
+        <w:rPr>
+          <w:rFonts w:ascii="Arial" w:hAnsi="Arial" w:eastAsia="Arial"/>
+          <w:color w:val="211D20"/>
+          <w:sz w:val="20"/>
+        </w:rPr>
+        <w:t xml:space="preserve"> và </w:t>
+      </w:r>
+      <w:r>
+        <w:rPr>
+          <w:rFonts w:ascii="Consolas" w:hAnsi="Consolas" w:eastAsia="Consolas"/>
+          <w:color w:val="4A3B42"/>
+          <w:sz w:val="19"/>
+        </w:rPr>
+        <w:t>GRADER_PASSCODE</w:t>
+      </w:r>
+      <w:r>
+        <w:rPr>
+          <w:rFonts w:ascii="Arial" w:hAnsi="Arial" w:eastAsia="Arial"/>
+          <w:color w:val="211D20"/>
+          <w:sz w:val="20"/>
+        </w:rPr>
+        <w:t>. Bản ghi Nói chưa gửi đi đâu (Đợt 3). Khóa chỉ ở biến môi trường của máy chủ; mã chấm bài và sự đồng ý chỉ nằm ở máy Gùa, không vào bản sao lưu hay cloud. File báo lỗi vẫn không chứa bài viết hay kết quả chấm.</w:t>
       </w:r>
     </w:p>
     <w:p>
@@ -5282,7 +5364,7 @@
           <w:color w:val="211D20"/>
           <w:sz w:val="20"/>
         </w:rPr>
-        <w:t xml:space="preserve">Bản sáu đề ngày 07/10/2026: ESLint, TypeScript, 339/339 Vitest, build 104 route và audit production dependency đều đạt. Playwright có 165 ca trên bản production local: 157 Chromium, 4 Firefox, 4 WebKit. Sau khi thêm phòng thi mô phỏng và công cụ luyện đề, lượt Chromium đầy đủ đạt 157/157 (cập nhật 08/10/2026 sau khi dựng lại phòng thi; 11 ca cloud cần bản build có hai biến Supabase giả như CI đặt); Firefox và WebKit chưa chạy lại cho thay đổi này. Axe kiểm tra 19 màn, gồm kho đề và Review 13/09. Hai lượt CI của nhánh/PR #38 đạt; Vercel phục vụ SHA </w:t>
+        <w:t xml:space="preserve">Bản sáu đề ngày 07/10/2026: ESLint, TypeScript, 365/365 Vitest, build 105 route và audit production dependency đều đạt. Playwright có 175 ca trên bản production local: 167 Chromium, 4 Firefox, 4 WebKit. Sau khi thêm phòng thi mô phỏng và công cụ luyện đề, lượt Chromium đầy đủ đạt 167/167 (cập nhật 08/10/2026 sau khi dựng lại phòng thi; 11 ca cloud cần bản build có hai biến Supabase giả như CI đặt); Firefox và WebKit chưa chạy lại cho thay đổi này. Axe kiểm tra 19 màn, gồm kho đề và Review 13/09. Hai lượt CI của nhánh/PR #38 đạt; Vercel phục vụ SHA </w:t>
       </w:r>
       <w:r>
         <w:rPr>

</xml_diff>

<commit_message>
Chấm AI, đợt 3: chấm phần Nói trong app (kiểm bằng API giả, chưa gọi Gemini thật)
- bản ghi mới 32 kbps để cả bài thi Nói vừa một yêu cầu; đọc độ dài bằng cách giải mã âm thanh
- /api/grade/speaking nhận form nhiều phần (âm thanh nhị phân), dùng chung cổng bảo vệ với đường chấm Viết;
  giới hạn 4,2 MB, ba phần, định dạng cho phép
- lần chấm Nói lưu trong grades (bản chép lời cắt 12.000 ký tự), có dấu băm bản ghi để biết khi ghi lại
- nút "Chấm phần Nói" ở màn chữa đề: đồng ý riêng, kiểm bản ghi trước khi gửi, dừng giữa chừng,
  kết quả có bản chép lời và số đo trôi chảy; tách phần giao diện dùng chung với bài Viết
- Cài đặt và chú thích ghi âm nói đúng điều kiện gửi; tài liệu và hai báo cáo Word cập nhật
- 10 ca unit và 9 ca E2E mới (375 unit, 184 E2E, 106 route)

Chưa có lần gọi Gemini thật; mọi cổng điểm vẫn đóng; bản ghi cũ nặng hơn 4,2 MB phải ghi lại.

Co-Authored-By: Claude Sonnet 5.5 <noreply@anthropic.com>
Claude-Session: https://claude.ai/code/session_01W75mjctkB2SZty7ogWDMjM
</commit_message>
<xml_diff>
--- a/docs/Bao-cao-ban-giao-May-VSTEP.docx
+++ b/docs/Bao-cao-ban-giao-May-VSTEP.docx
@@ -443,7 +443,7 @@
           <w:color w:val="211D20"/>
           <w:sz w:val="22"/>
         </w:rPr>
-        <w:t>Bản code có năm đề nhập đủ bốn kỹ năng và hai đề tự biên soạn. Cả năm đề nhập có 375 khóa đáp án Nghe/Đọc; đề 131 thiếu đáp án và transcript nên đã được gỡ. 105 MP3 được đóng gói cùng ứng dụng. Viết và Nói lưu bài nhưng chưa được chấm tự động; bản ghi micro cần tải riêng. Bộ kiểm thử local trước khi phát hành gồm 365 unit test và 175 E2E trên Chromium, Firefox và WebKit, build 105 route và axe trên 18 màn. Migration gia cố quyền ghi cloud đã áp dụng trên Supabase production. PR #38 và smoke HTTPS đã đạt cho commit ứng dụng ff8faef; đồng bộ hai thiết bị, micro thật và thẩm định học liệu vẫn cần xác nhận; sáu đề nhập chỉ dùng học cá nhân của chủ dự án.</w:t>
+        <w:t>Bản code có năm đề nhập đủ bốn kỹ năng và hai đề tự biên soạn. Cả năm đề nhập có 375 khóa đáp án Nghe/Đọc; đề 131 thiếu đáp án và transcript nên đã được gỡ. 105 MP3 được đóng gói cùng ứng dụng. Viết và Nói lưu bài nhưng chưa được chấm tự động; bản ghi micro cần tải riêng. Bộ kiểm thử local trước khi phát hành gồm 375 unit test và 184 E2E trên Chromium, Firefox và WebKit, build 106 route và axe trên 19 màn. Migration gia cố quyền ghi cloud đã áp dụng trên Supabase production. PR #38 và smoke HTTPS đã đạt cho commit ứng dụng ff8faef; đồng bộ hai thiết bị, micro thật và thẩm định học liệu vẫn cần xác nhận; sáu đề nhập chỉ dùng học cá nhân của chủ dự án.</w:t>
       </w:r>
     </w:p>
     <w:p>
@@ -662,7 +662,7 @@
           <w:color w:val="211D20"/>
           <w:sz w:val="20"/>
         </w:rPr>
-        <w:t xml:space="preserve"> đạt 81 unit và 44 E2E. Bản làm việc hiện tại đạt 365 unit và 175 E2E trên cùng ba engine sau khi hoàn tất kiểm thử. Chưa có nghiệm thu trên iOS hoặc Android thật.</w:t>
+        <w:t xml:space="preserve"> đạt 81 unit và 44 E2E. Bản làm việc hiện tại đạt 375 unit và 184 E2E trên cùng ba engine sau khi hoàn tất kiểm thử. Chưa có nghiệm thu trên iOS hoặc Android thật.</w:t>
       </w:r>
     </w:p>
     <w:p>
@@ -5264,7 +5264,7 @@
           <w:color w:val="211D20"/>
           <w:sz w:val="20"/>
         </w:rPr>
-        <w:t>. Bản ghi Nói chưa gửi đi đâu (Đợt 3). Khóa chỉ ở biến môi trường của máy chủ; mã chấm bài và sự đồng ý chỉ nằm ở máy Gùa, không vào bản sao lưu hay cloud. File báo lỗi vẫn không chứa bài viết hay kết quả chấm.</w:t>
+        <w:t>. Bản ghi âm phần Nói của một lượt thi cũng chỉ đi khi Gùa bấm “Chấm phần Nói bằng AI” (Đợt 3), cùng một nhà cung cấp và cùng điều kiện. Khóa chỉ ở biến môi trường của máy chủ; mã chấm bài và sự đồng ý chỉ nằm ở máy Gùa, không vào bản sao lưu hay cloud. File báo lỗi vẫn không chứa bài viết hay kết quả chấm.</w:t>
       </w:r>
     </w:p>
     <w:p>
@@ -5364,7 +5364,7 @@
           <w:color w:val="211D20"/>
           <w:sz w:val="20"/>
         </w:rPr>
-        <w:t xml:space="preserve">Bản sáu đề ngày 07/10/2026: ESLint, TypeScript, 365/365 Vitest, build 105 route và audit production dependency đều đạt. Playwright có 175 ca trên bản production local: 167 Chromium, 4 Firefox, 4 WebKit. Sau khi thêm phòng thi mô phỏng và công cụ luyện đề, lượt Chromium đầy đủ đạt 167/167 (cập nhật 08/10/2026 sau khi dựng lại phòng thi; 11 ca cloud cần bản build có hai biến Supabase giả như CI đặt); Firefox và WebKit chưa chạy lại cho thay đổi này. Axe kiểm tra 19 màn, gồm kho đề và Review 13/09. Hai lượt CI của nhánh/PR #38 đạt; Vercel phục vụ SHA </w:t>
+        <w:t xml:space="preserve">Bản sáu đề ngày 07/10/2026: ESLint, TypeScript, 375/375 Vitest, build 106 route và audit production dependency đều đạt. Playwright có 184 ca trên bản production local: 176 Chromium, 4 Firefox, 4 WebKit. Sau khi thêm phòng thi mô phỏng và công cụ luyện đề, lượt Chromium đầy đủ đạt 176/176 (cập nhật 09/10/2026 sau khi dựng lại phòng thi; 11 ca cloud cần bản build có hai biến Supabase giả như CI đặt); Firefox và WebKit chưa chạy lại cho thay đổi này. Axe kiểm tra 19 màn, gồm kho đề và Review 13/09. Hai lượt CI của nhánh/PR #38 đạt; Vercel phục vụ SHA </w:t>
       </w:r>
       <w:r>
         <w:rPr>

</xml_diff>

<commit_message>
Chấm AI: báo tiến độ khi chấm, lỗi có chi tiết, sửa nội dung dính sát mép
Sau lần thử thật đầu tiên trên bản live:
- máy chủ gửi từng dòng JSON (progress, ping mười giây một lần, grade/error) khi trình duyệt xin
  application/x-ndjson; yêu cầu thường vẫn nhận một JSON
- màn hình hiện vòng xoay, đồng hồ, thanh tiến độ, đang làm bước nào, lời dặn thời gian
- mọi lỗi kèm "Chi tiết kỹ thuật" (mã HTTP, tên lỗi, "Gemini trả về HTTP n"), không chứa nội dung bài;
  lỗi xử lý kết quả ở máy không còn bị báo nhầm là mất mạng
- trình duyệt đọc luồng, kể cả dòng cuối không có ký tự xuống dòng
- phần đệm ngang trong từng mục của màn chữa đề (trước là 0 nên nội dung chạm viền), tiêu đề cách khung trên
- 17 ca unit và 3 ca E2E mới (392 unit, 187 E2E)

Co-Authored-By: Claude Sonnet 5.5 <noreply@anthropic.com>
Claude-Session: https://claude.ai/code/session_01W75mjctkB2SZty7ogWDMjM
</commit_message>
<xml_diff>
--- a/docs/Bao-cao-ban-giao-May-VSTEP.docx
+++ b/docs/Bao-cao-ban-giao-May-VSTEP.docx
@@ -443,7 +443,7 @@
           <w:color w:val="211D20"/>
           <w:sz w:val="22"/>
         </w:rPr>
-        <w:t>Bản code có năm đề nhập đủ bốn kỹ năng và hai đề tự biên soạn. Cả năm đề nhập có 375 khóa đáp án Nghe/Đọc; đề 131 thiếu đáp án và transcript nên đã được gỡ. 105 MP3 được đóng gói cùng ứng dụng. Viết và Nói lưu bài nhưng chưa được chấm tự động; bản ghi micro cần tải riêng. Bộ kiểm thử local trước khi phát hành gồm 375 unit test và 184 E2E trên Chromium, Firefox và WebKit, build 106 route và axe trên 19 màn. Migration gia cố quyền ghi cloud đã áp dụng trên Supabase production. PR #38 và smoke HTTPS đã đạt cho commit ứng dụng ff8faef; đồng bộ hai thiết bị, micro thật và thẩm định học liệu vẫn cần xác nhận; sáu đề nhập chỉ dùng học cá nhân của chủ dự án.</w:t>
+        <w:t>Bản code có năm đề nhập đủ bốn kỹ năng và hai đề tự biên soạn. Cả năm đề nhập có 375 khóa đáp án Nghe/Đọc; đề 131 thiếu đáp án và transcript nên đã được gỡ. 105 MP3 được đóng gói cùng ứng dụng. Viết và Nói lưu bài nhưng chưa được chấm tự động; bản ghi micro cần tải riêng. Bộ kiểm thử local trước khi phát hành gồm 392 unit test và 187 E2E trên Chromium, Firefox và WebKit, build 106 route và axe trên 19 màn. Migration gia cố quyền ghi cloud đã áp dụng trên Supabase production. PR #38 và smoke HTTPS đã đạt cho commit ứng dụng ff8faef; đồng bộ hai thiết bị, micro thật và thẩm định học liệu vẫn cần xác nhận; sáu đề nhập chỉ dùng học cá nhân của chủ dự án.</w:t>
       </w:r>
     </w:p>
     <w:p>
@@ -662,7 +662,7 @@
           <w:color w:val="211D20"/>
           <w:sz w:val="20"/>
         </w:rPr>
-        <w:t xml:space="preserve"> đạt 81 unit và 44 E2E. Bản làm việc hiện tại đạt 375 unit và 184 E2E trên cùng ba engine sau khi hoàn tất kiểm thử. Chưa có nghiệm thu trên iOS hoặc Android thật.</w:t>
+        <w:t xml:space="preserve"> đạt 81 unit và 44 E2E. Bản làm việc hiện tại đạt 392 unit và 187 E2E trên cùng ba engine sau khi hoàn tất kiểm thử. Chưa có nghiệm thu trên iOS hoặc Android thật.</w:t>
       </w:r>
     </w:p>
     <w:p>
@@ -5364,7 +5364,7 @@
           <w:color w:val="211D20"/>
           <w:sz w:val="20"/>
         </w:rPr>
-        <w:t xml:space="preserve">Bản sáu đề ngày 07/10/2026: ESLint, TypeScript, 375/375 Vitest, build 106 route và audit production dependency đều đạt. Playwright có 184 ca trên bản production local: 176 Chromium, 4 Firefox, 4 WebKit. Sau khi thêm phòng thi mô phỏng và công cụ luyện đề, lượt Chromium đầy đủ đạt 176/176 (cập nhật 09/10/2026 sau khi dựng lại phòng thi; 11 ca cloud cần bản build có hai biến Supabase giả như CI đặt); Firefox và WebKit chưa chạy lại cho thay đổi này. Axe kiểm tra 19 màn, gồm kho đề và Review 13/09. Hai lượt CI của nhánh/PR #38 đạt; Vercel phục vụ SHA </w:t>
+        <w:t xml:space="preserve">Bản sáu đề ngày 07/10/2026: ESLint, TypeScript, 392/392 Vitest, build 106 route và audit production dependency đều đạt. Playwright có 187 ca trên bản production local: 179 Chromium, 4 Firefox, 4 WebKit. Sau khi thêm phòng thi mô phỏng và công cụ luyện đề, lượt Chromium đầy đủ đạt 179/179 (cập nhật 09/10/2026 sau khi dựng lại phòng thi; 11 ca cloud cần bản build có hai biến Supabase giả như CI đặt); Firefox và WebKit chưa chạy lại cho thay đổi này. Axe kiểm tra 19 màn, gồm kho đề và Review 13/09. Hai lượt CI của nhánh/PR #38 đạt; Vercel phục vụ SHA </w:t>
       </w:r>
       <w:r>
         <w:rPr>

</xml_diff>

<commit_message>
Chấm AI đợt 3: chấm phần Nói; báo tiến độ, lỗi có chi tiết, sửa lề (#59)
Chấm Nói qua /api/grade/speaking; luồng tiến độ (progress, ping) cho cả hai đường chấm; mọi lỗi kèm chi tiết kỹ thuật; đệm ngang trong màn chữa đề. 392 unit, 187 E2E, 106 route.

Co-Authored-By: Claude Sonnet 5.5 <noreply@anthropic.com>
Claude-Session: https://claude.ai/code/session_01W75mjctkB2SZty7ogWDMjM
</commit_message>
<xml_diff>
--- a/docs/Bao-cao-ban-giao-May-VSTEP.docx
+++ b/docs/Bao-cao-ban-giao-May-VSTEP.docx
@@ -443,7 +443,7 @@
           <w:color w:val="211D20"/>
           <w:sz w:val="22"/>
         </w:rPr>
-        <w:t>Bản code có năm đề nhập đủ bốn kỹ năng và hai đề tự biên soạn. Cả năm đề nhập có 375 khóa đáp án Nghe/Đọc; đề 131 thiếu đáp án và transcript nên đã được gỡ. 105 MP3 được đóng gói cùng ứng dụng. Viết và Nói lưu bài nhưng chưa được chấm tự động; bản ghi micro cần tải riêng. Bộ kiểm thử local trước khi phát hành gồm 365 unit test và 175 E2E trên Chromium, Firefox và WebKit, build 105 route và axe trên 18 màn. Migration gia cố quyền ghi cloud đã áp dụng trên Supabase production. PR #38 và smoke HTTPS đã đạt cho commit ứng dụng ff8faef; đồng bộ hai thiết bị, micro thật và thẩm định học liệu vẫn cần xác nhận; sáu đề nhập chỉ dùng học cá nhân của chủ dự án.</w:t>
+        <w:t>Bản code có năm đề nhập đủ bốn kỹ năng và hai đề tự biên soạn. Cả năm đề nhập có 375 khóa đáp án Nghe/Đọc; đề 131 thiếu đáp án và transcript nên đã được gỡ. 105 MP3 được đóng gói cùng ứng dụng. Viết và Nói lưu bài nhưng chưa được chấm tự động; bản ghi micro cần tải riêng. Bộ kiểm thử local trước khi phát hành gồm 392 unit test và 187 E2E trên Chromium, Firefox và WebKit, build 106 route và axe trên 19 màn. Migration gia cố quyền ghi cloud đã áp dụng trên Supabase production. PR #38 và smoke HTTPS đã đạt cho commit ứng dụng ff8faef; đồng bộ hai thiết bị, micro thật và thẩm định học liệu vẫn cần xác nhận; sáu đề nhập chỉ dùng học cá nhân của chủ dự án.</w:t>
       </w:r>
     </w:p>
     <w:p>
@@ -662,7 +662,7 @@
           <w:color w:val="211D20"/>
           <w:sz w:val="20"/>
         </w:rPr>
-        <w:t xml:space="preserve"> đạt 81 unit và 44 E2E. Bản làm việc hiện tại đạt 365 unit và 175 E2E trên cùng ba engine sau khi hoàn tất kiểm thử. Chưa có nghiệm thu trên iOS hoặc Android thật.</w:t>
+        <w:t xml:space="preserve"> đạt 81 unit và 44 E2E. Bản làm việc hiện tại đạt 392 unit và 187 E2E trên cùng ba engine sau khi hoàn tất kiểm thử. Chưa có nghiệm thu trên iOS hoặc Android thật.</w:t>
       </w:r>
     </w:p>
     <w:p>
@@ -5264,7 +5264,7 @@
           <w:color w:val="211D20"/>
           <w:sz w:val="20"/>
         </w:rPr>
-        <w:t>. Bản ghi Nói chưa gửi đi đâu (Đợt 3). Khóa chỉ ở biến môi trường của máy chủ; mã chấm bài và sự đồng ý chỉ nằm ở máy Gùa, không vào bản sao lưu hay cloud. File báo lỗi vẫn không chứa bài viết hay kết quả chấm.</w:t>
+        <w:t>. Bản ghi âm phần Nói của một lượt thi cũng chỉ đi khi Gùa bấm “Chấm phần Nói bằng AI” (Đợt 3), cùng một nhà cung cấp và cùng điều kiện. Khóa chỉ ở biến môi trường của máy chủ; mã chấm bài và sự đồng ý chỉ nằm ở máy Gùa, không vào bản sao lưu hay cloud. File báo lỗi vẫn không chứa bài viết hay kết quả chấm.</w:t>
       </w:r>
     </w:p>
     <w:p>
@@ -5364,7 +5364,7 @@
           <w:color w:val="211D20"/>
           <w:sz w:val="20"/>
         </w:rPr>
-        <w:t xml:space="preserve">Bản sáu đề ngày 07/10/2026: ESLint, TypeScript, 365/365 Vitest, build 105 route và audit production dependency đều đạt. Playwright có 175 ca trên bản production local: 167 Chromium, 4 Firefox, 4 WebKit. Sau khi thêm phòng thi mô phỏng và công cụ luyện đề, lượt Chromium đầy đủ đạt 167/167 (cập nhật 08/10/2026 sau khi dựng lại phòng thi; 11 ca cloud cần bản build có hai biến Supabase giả như CI đặt); Firefox và WebKit chưa chạy lại cho thay đổi này. Axe kiểm tra 19 màn, gồm kho đề và Review 13/09. Hai lượt CI của nhánh/PR #38 đạt; Vercel phục vụ SHA </w:t>
+        <w:t xml:space="preserve">Bản sáu đề ngày 07/10/2026: ESLint, TypeScript, 392/392 Vitest, build 106 route và audit production dependency đều đạt. Playwright có 187 ca trên bản production local: 179 Chromium, 4 Firefox, 4 WebKit. Sau khi thêm phòng thi mô phỏng và công cụ luyện đề, lượt Chromium đầy đủ đạt 179/179 (cập nhật 09/10/2026 sau khi dựng lại phòng thi; 11 ca cloud cần bản build có hai biến Supabase giả như CI đặt); Firefox và WebKit chưa chạy lại cho thay đổi này. Axe kiểm tra 19 màn, gồm kho đề và Review 13/09. Hai lượt CI của nhánh/PR #38 đạt; Vercel phục vụ SHA </w:t>
       </w:r>
       <w:r>
         <w:rPr>

</xml_diff>

<commit_message>
Chấm AI: hiện điểm ước lượng có nhãn, chấm được Task 2 và bài học Viết, tính điểm Viết tổng
- Điểm từng tiêu chí hiện kèm nhãn "chưa đối chiếu giám khảo" và ghi chú ở đầu kết quả (SHOW_UNVALIDATED_SCORES), thay vì ẩn số.
- Mẫu ý bắt buộc của bài luận được chấp nhận; năm bài học Viết và Task 2 của Review 13/09 có danh sách ý riêng.
- Kết quả bài học Viết có nút chấm; màn chữa đề hiện điểm Viết = (Bài 1 + 2 x Bài 2) / 3 làm tròn 0,5.
- Sửa ca E2E Speaking lesson bị đua thời gian; cập nhật tài liệu và báo cáo Word.

Co-Authored-By: Claude Sonnet 5.5 <noreply@anthropic.com>
Claude-Session: https://claude.ai/code/session_01W75mjctkB2SZty7ogWDMjM
</commit_message>
<xml_diff>
--- a/docs/Bao-cao-ban-giao-May-VSTEP.docx
+++ b/docs/Bao-cao-ban-giao-May-VSTEP.docx
@@ -443,7 +443,7 @@
           <w:color w:val="211D20"/>
           <w:sz w:val="22"/>
         </w:rPr>
-        <w:t>Bản code có năm đề nhập đủ bốn kỹ năng và hai đề tự biên soạn. Cả năm đề nhập có 375 khóa đáp án Nghe/Đọc; đề 131 thiếu đáp án và transcript nên đã được gỡ. 105 MP3 được đóng gói cùng ứng dụng. Viết và Nói lưu bài nhưng chưa được chấm tự động; bản ghi micro cần tải riêng. Bộ kiểm thử local trước khi phát hành gồm 392 unit test và 187 E2E trên Chromium, Firefox và WebKit, build 106 route và axe trên 19 màn. Migration gia cố quyền ghi cloud đã áp dụng trên Supabase production. PR #38 và smoke HTTPS đã đạt cho commit ứng dụng ff8faef; đồng bộ hai thiết bị, micro thật và thẩm định học liệu vẫn cần xác nhận; sáu đề nhập chỉ dùng học cá nhân của chủ dự án.</w:t>
+        <w:t>Bản code có năm đề nhập đủ bốn kỹ năng và hai đề tự biên soạn. Cả năm đề nhập có 375 khóa đáp án Nghe/Đọc; đề 131 thiếu đáp án và transcript nên đã được gỡ. 105 MP3 được đóng gói cùng ứng dụng. Viết và Nói lưu bài nhưng chưa được chấm tự động; bản ghi micro cần tải riêng. Bộ kiểm thử local trước khi phát hành gồm 398 unit test và 188 E2E trên Chromium, Firefox và WebKit, build 106 route và axe trên 19 màn. Migration gia cố quyền ghi cloud đã áp dụng trên Supabase production. PR #38 và smoke HTTPS đã đạt cho commit ứng dụng ff8faef; đồng bộ hai thiết bị, micro thật và thẩm định học liệu vẫn cần xác nhận; sáu đề nhập chỉ dùng học cá nhân của chủ dự án.</w:t>
       </w:r>
     </w:p>
     <w:p>
@@ -662,7 +662,7 @@
           <w:color w:val="211D20"/>
           <w:sz w:val="20"/>
         </w:rPr>
-        <w:t xml:space="preserve"> đạt 81 unit và 44 E2E. Bản làm việc hiện tại đạt 392 unit và 187 E2E trên cùng ba engine sau khi hoàn tất kiểm thử. Chưa có nghiệm thu trên iOS hoặc Android thật.</w:t>
+        <w:t xml:space="preserve"> đạt 81 unit và 44 E2E. Bản làm việc hiện tại đạt 398 unit và 188 E2E trên cùng ba engine sau khi hoàn tất kiểm thử. Chưa có nghiệm thu trên iOS hoặc Android thật.</w:t>
       </w:r>
     </w:p>
     <w:p>
@@ -5364,7 +5364,7 @@
           <w:color w:val="211D20"/>
           <w:sz w:val="20"/>
         </w:rPr>
-        <w:t xml:space="preserve">Bản sáu đề ngày 07/10/2026: ESLint, TypeScript, 392/392 Vitest, build 106 route và audit production dependency đều đạt. Playwright có 187 ca trên bản production local: 179 Chromium, 4 Firefox, 4 WebKit. Sau khi thêm phòng thi mô phỏng và công cụ luyện đề, lượt Chromium đầy đủ đạt 179/179 (cập nhật 09/10/2026 sau khi dựng lại phòng thi; 11 ca cloud cần bản build có hai biến Supabase giả như CI đặt); Firefox và WebKit chưa chạy lại cho thay đổi này. Axe kiểm tra 19 màn, gồm kho đề và Review 13/09. Hai lượt CI của nhánh/PR #38 đạt; Vercel phục vụ SHA </w:t>
+        <w:t xml:space="preserve">Bản sáu đề ngày 07/10/2026: ESLint, TypeScript, 398/398 Vitest, build 106 route và audit production dependency đều đạt. Playwright có 188 ca trên bản production local: 180 Chromium, 4 Firefox, 4 WebKit. Sau khi thêm phòng thi mô phỏng và công cụ luyện đề, lượt Chromium đầy đủ đạt 180/180 (cập nhật 09/10/2026 sau khi dựng lại phòng thi; 11 ca cloud cần bản build có hai biến Supabase giả như CI đặt); Firefox và WebKit chưa chạy lại cho thay đổi này. Axe kiểm tra 19 màn, gồm kho đề và Review 13/09. Hai lượt CI của nhánh/PR #38 đạt; Vercel phục vụ SHA </w:t>
       </w:r>
       <w:r>
         <w:rPr>

</xml_diff>

<commit_message>
Chấm AI: hiện điểm ước lượng, chấm được Task 2 và bài học Viết, tính điểm Viết tổng (#60)
Co-Authored-By: Claude Sonnet 5.5 <noreply@anthropic.com>
Claude-Session: https://claude.ai/code/session_01W75mjctkB2SZty7ogWDMjM
</commit_message>
<xml_diff>
--- a/docs/Bao-cao-ban-giao-May-VSTEP.docx
+++ b/docs/Bao-cao-ban-giao-May-VSTEP.docx
@@ -443,7 +443,7 @@
           <w:color w:val="211D20"/>
           <w:sz w:val="22"/>
         </w:rPr>
-        <w:t>Bản code có năm đề nhập đủ bốn kỹ năng và hai đề tự biên soạn. Cả năm đề nhập có 375 khóa đáp án Nghe/Đọc; đề 131 thiếu đáp án và transcript nên đã được gỡ. 105 MP3 được đóng gói cùng ứng dụng. Viết và Nói lưu bài nhưng chưa được chấm tự động; bản ghi micro cần tải riêng. Bộ kiểm thử local trước khi phát hành gồm 392 unit test và 187 E2E trên Chromium, Firefox và WebKit, build 106 route và axe trên 19 màn. Migration gia cố quyền ghi cloud đã áp dụng trên Supabase production. PR #38 và smoke HTTPS đã đạt cho commit ứng dụng ff8faef; đồng bộ hai thiết bị, micro thật và thẩm định học liệu vẫn cần xác nhận; sáu đề nhập chỉ dùng học cá nhân của chủ dự án.</w:t>
+        <w:t>Bản code có năm đề nhập đủ bốn kỹ năng và hai đề tự biên soạn. Cả năm đề nhập có 375 khóa đáp án Nghe/Đọc; đề 131 thiếu đáp án và transcript nên đã được gỡ. 105 MP3 được đóng gói cùng ứng dụng. Viết và Nói lưu bài nhưng chưa được chấm tự động; bản ghi micro cần tải riêng. Bộ kiểm thử local trước khi phát hành gồm 398 unit test và 188 E2E trên Chromium, Firefox và WebKit, build 106 route và axe trên 19 màn. Migration gia cố quyền ghi cloud đã áp dụng trên Supabase production. PR #38 và smoke HTTPS đã đạt cho commit ứng dụng ff8faef; đồng bộ hai thiết bị, micro thật và thẩm định học liệu vẫn cần xác nhận; sáu đề nhập chỉ dùng học cá nhân của chủ dự án.</w:t>
       </w:r>
     </w:p>
     <w:p>
@@ -662,7 +662,7 @@
           <w:color w:val="211D20"/>
           <w:sz w:val="20"/>
         </w:rPr>
-        <w:t xml:space="preserve"> đạt 81 unit và 44 E2E. Bản làm việc hiện tại đạt 392 unit và 187 E2E trên cùng ba engine sau khi hoàn tất kiểm thử. Chưa có nghiệm thu trên iOS hoặc Android thật.</w:t>
+        <w:t xml:space="preserve"> đạt 81 unit và 44 E2E. Bản làm việc hiện tại đạt 398 unit và 188 E2E trên cùng ba engine sau khi hoàn tất kiểm thử. Chưa có nghiệm thu trên iOS hoặc Android thật.</w:t>
       </w:r>
     </w:p>
     <w:p>
@@ -5364,7 +5364,7 @@
           <w:color w:val="211D20"/>
           <w:sz w:val="20"/>
         </w:rPr>
-        <w:t xml:space="preserve">Bản sáu đề ngày 07/10/2026: ESLint, TypeScript, 392/392 Vitest, build 106 route và audit production dependency đều đạt. Playwright có 187 ca trên bản production local: 179 Chromium, 4 Firefox, 4 WebKit. Sau khi thêm phòng thi mô phỏng và công cụ luyện đề, lượt Chromium đầy đủ đạt 179/179 (cập nhật 09/10/2026 sau khi dựng lại phòng thi; 11 ca cloud cần bản build có hai biến Supabase giả như CI đặt); Firefox và WebKit chưa chạy lại cho thay đổi này. Axe kiểm tra 19 màn, gồm kho đề và Review 13/09. Hai lượt CI của nhánh/PR #38 đạt; Vercel phục vụ SHA </w:t>
+        <w:t xml:space="preserve">Bản sáu đề ngày 07/10/2026: ESLint, TypeScript, 398/398 Vitest, build 106 route và audit production dependency đều đạt. Playwright có 188 ca trên bản production local: 180 Chromium, 4 Firefox, 4 WebKit. Sau khi thêm phòng thi mô phỏng và công cụ luyện đề, lượt Chromium đầy đủ đạt 180/180 (cập nhật 09/10/2026 sau khi dựng lại phòng thi; 11 ca cloud cần bản build có hai biến Supabase giả như CI đặt); Firefox và WebKit chưa chạy lại cho thay đổi này. Axe kiểm tra 19 màn, gồm kho đề và Review 13/09. Hai lượt CI của nhánh/PR #38 đạt; Vercel phục vụ SHA </w:t>
       </w:r>
       <w:r>
         <w:rPr>

</xml_diff>

<commit_message>
Chấm AI: chấm bài Viết ở buổi thi rút gọn, biểu đồ điểm AI theo thời gian ở trang tiến bộ
- Màn kết thúc buổi thi /exam có khung chấm cho từng bài Viết và điểm Viết tổng; lần chấm lưu theo lượt làm nên không mất khi bắt đầu lượt mới.
- WritingTotal nhận mã hai lần chấm, dùng chung cho kho đề và buổi thi.
- Trang tiến bộ có biểu đồ điểm Viết và Nói AI ước lượng (hai màu đã kiểm, hai hình, bảng số liệu, ghi chú ước lượng).
- 403 unit, 191 E2E; cập nhật tài liệu và báo cáo Word.

Co-Authored-By: Claude Sonnet 5.5 <noreply@anthropic.com>
Claude-Session: https://claude.ai/code/session_01W75mjctkB2SZty7ogWDMjM
</commit_message>
<xml_diff>
--- a/docs/Bao-cao-ban-giao-May-VSTEP.docx
+++ b/docs/Bao-cao-ban-giao-May-VSTEP.docx
@@ -443,7 +443,7 @@
           <w:color w:val="211D20"/>
           <w:sz w:val="22"/>
         </w:rPr>
-        <w:t>Bản code có năm đề nhập đủ bốn kỹ năng và hai đề tự biên soạn. Cả năm đề nhập có 375 khóa đáp án Nghe/Đọc; đề 131 thiếu đáp án và transcript nên đã được gỡ. 105 MP3 được đóng gói cùng ứng dụng. Viết và Nói lưu bài nhưng chưa được chấm tự động; bản ghi micro cần tải riêng. Bộ kiểm thử local trước khi phát hành gồm 398 unit test và 188 E2E trên Chromium, Firefox và WebKit, build 106 route và axe trên 19 màn. Migration gia cố quyền ghi cloud đã áp dụng trên Supabase production. PR #38 và smoke HTTPS đã đạt cho commit ứng dụng ff8faef; đồng bộ hai thiết bị, micro thật và thẩm định học liệu vẫn cần xác nhận; sáu đề nhập chỉ dùng học cá nhân của chủ dự án.</w:t>
+        <w:t>Bản code có năm đề nhập đủ bốn kỹ năng và hai đề tự biên soạn. Cả năm đề nhập có 375 khóa đáp án Nghe/Đọc; đề 131 thiếu đáp án và transcript nên đã được gỡ. 105 MP3 được đóng gói cùng ứng dụng. Viết và Nói lưu bài nhưng chưa được chấm tự động; bản ghi micro cần tải riêng. Bộ kiểm thử local trước khi phát hành gồm 403 unit test và 191 E2E trên Chromium, Firefox và WebKit, build 106 route và axe trên 19 màn. Migration gia cố quyền ghi cloud đã áp dụng trên Supabase production. PR #38 và smoke HTTPS đã đạt cho commit ứng dụng ff8faef; đồng bộ hai thiết bị, micro thật và thẩm định học liệu vẫn cần xác nhận; sáu đề nhập chỉ dùng học cá nhân của chủ dự án.</w:t>
       </w:r>
     </w:p>
     <w:p>
@@ -662,7 +662,7 @@
           <w:color w:val="211D20"/>
           <w:sz w:val="20"/>
         </w:rPr>
-        <w:t xml:space="preserve"> đạt 81 unit và 44 E2E. Bản làm việc hiện tại đạt 398 unit và 188 E2E trên cùng ba engine sau khi hoàn tất kiểm thử. Chưa có nghiệm thu trên iOS hoặc Android thật.</w:t>
+        <w:t xml:space="preserve"> đạt 81 unit và 44 E2E. Bản làm việc hiện tại đạt 403 unit và 191 E2E trên cùng ba engine sau khi hoàn tất kiểm thử. Chưa có nghiệm thu trên iOS hoặc Android thật.</w:t>
       </w:r>
     </w:p>
     <w:p>
@@ -5364,7 +5364,7 @@
           <w:color w:val="211D20"/>
           <w:sz w:val="20"/>
         </w:rPr>
-        <w:t xml:space="preserve">Bản sáu đề ngày 07/10/2026: ESLint, TypeScript, 398/398 Vitest, build 106 route và audit production dependency đều đạt. Playwright có 188 ca trên bản production local: 180 Chromium, 4 Firefox, 4 WebKit. Sau khi thêm phòng thi mô phỏng và công cụ luyện đề, lượt Chromium đầy đủ đạt 180/180 (cập nhật 09/10/2026 sau khi dựng lại phòng thi; 11 ca cloud cần bản build có hai biến Supabase giả như CI đặt); Firefox và WebKit chưa chạy lại cho thay đổi này. Axe kiểm tra 19 màn, gồm kho đề và Review 13/09. Hai lượt CI của nhánh/PR #38 đạt; Vercel phục vụ SHA </w:t>
+        <w:t xml:space="preserve">Bản sáu đề ngày 07/10/2026: ESLint, TypeScript, 403/403 Vitest, build 106 route và audit production dependency đều đạt. Playwright có 191 ca trên bản production local: 183 Chromium, 4 Firefox, 4 WebKit. Sau khi thêm phòng thi mô phỏng và công cụ luyện đề, lượt Chromium đầy đủ đạt 183/183 (cập nhật 09/10/2026 sau khi dựng lại phòng thi; 11 ca cloud cần bản build có hai biến Supabase giả như CI đặt); Firefox và WebKit chưa chạy lại cho thay đổi này. Axe kiểm tra 19 màn, gồm kho đề và Review 13/09. Hai lượt CI của nhánh/PR #38 đạt; Vercel phục vụ SHA </w:t>
       </w:r>
       <w:r>
         <w:rPr>

</xml_diff>

<commit_message>
Chấm AI: chấm Viết ở buổi thi rút gọn, biểu đồ điểm AI, rà UX/UI các màn chấm, ghi lần đo thật đầu tiên (#61)
Co-Authored-By: Claude Sonnet 5.5 <noreply@anthropic.com>
Claude-Session: https://claude.ai/code/session_01W75mjctkB2SZty7ogWDMjM
</commit_message>
<xml_diff>
--- a/docs/Bao-cao-ban-giao-May-VSTEP.docx
+++ b/docs/Bao-cao-ban-giao-May-VSTEP.docx
@@ -443,7 +443,7 @@
           <w:color w:val="211D20"/>
           <w:sz w:val="22"/>
         </w:rPr>
-        <w:t>Bản code có năm đề nhập đủ bốn kỹ năng và hai đề tự biên soạn. Cả năm đề nhập có 375 khóa đáp án Nghe/Đọc; đề 131 thiếu đáp án và transcript nên đã được gỡ. 105 MP3 được đóng gói cùng ứng dụng. Viết và Nói lưu bài nhưng chưa được chấm tự động; bản ghi micro cần tải riêng. Bộ kiểm thử local trước khi phát hành gồm 398 unit test và 188 E2E trên Chromium, Firefox và WebKit, build 106 route và axe trên 19 màn. Migration gia cố quyền ghi cloud đã áp dụng trên Supabase production. PR #38 và smoke HTTPS đã đạt cho commit ứng dụng ff8faef; đồng bộ hai thiết bị, micro thật và thẩm định học liệu vẫn cần xác nhận; sáu đề nhập chỉ dùng học cá nhân của chủ dự án.</w:t>
+        <w:t>Bản code có năm đề nhập đủ bốn kỹ năng và hai đề tự biên soạn. Cả năm đề nhập có 375 khóa đáp án Nghe/Đọc; đề 131 thiếu đáp án và transcript nên đã được gỡ. 105 MP3 được đóng gói cùng ứng dụng. Viết và Nói lưu bài nhưng chưa được chấm tự động; bản ghi micro cần tải riêng. Bộ kiểm thử local trước khi phát hành gồm 403 unit test và 191 E2E trên Chromium, Firefox và WebKit, build 106 route và axe trên 19 màn. Migration gia cố quyền ghi cloud đã áp dụng trên Supabase production. PR #38 và smoke HTTPS đã đạt cho commit ứng dụng ff8faef; đồng bộ hai thiết bị, micro thật và thẩm định học liệu vẫn cần xác nhận; sáu đề nhập chỉ dùng học cá nhân của chủ dự án.</w:t>
       </w:r>
     </w:p>
     <w:p>
@@ -662,7 +662,7 @@
           <w:color w:val="211D20"/>
           <w:sz w:val="20"/>
         </w:rPr>
-        <w:t xml:space="preserve"> đạt 81 unit và 44 E2E. Bản làm việc hiện tại đạt 398 unit và 188 E2E trên cùng ba engine sau khi hoàn tất kiểm thử. Chưa có nghiệm thu trên iOS hoặc Android thật.</w:t>
+        <w:t xml:space="preserve"> đạt 81 unit và 44 E2E. Bản làm việc hiện tại đạt 403 unit và 191 E2E trên cùng ba engine sau khi hoàn tất kiểm thử. Chưa có nghiệm thu trên iOS hoặc Android thật.</w:t>
       </w:r>
     </w:p>
     <w:p>
@@ -5364,7 +5364,7 @@
           <w:color w:val="211D20"/>
           <w:sz w:val="20"/>
         </w:rPr>
-        <w:t xml:space="preserve">Bản sáu đề ngày 07/10/2026: ESLint, TypeScript, 398/398 Vitest, build 106 route và audit production dependency đều đạt. Playwright có 188 ca trên bản production local: 180 Chromium, 4 Firefox, 4 WebKit. Sau khi thêm phòng thi mô phỏng và công cụ luyện đề, lượt Chromium đầy đủ đạt 180/180 (cập nhật 09/10/2026 sau khi dựng lại phòng thi; 11 ca cloud cần bản build có hai biến Supabase giả như CI đặt); Firefox và WebKit chưa chạy lại cho thay đổi này. Axe kiểm tra 19 màn, gồm kho đề và Review 13/09. Hai lượt CI của nhánh/PR #38 đạt; Vercel phục vụ SHA </w:t>
+        <w:t xml:space="preserve">Bản sáu đề ngày 07/10/2026: ESLint, TypeScript, 403/403 Vitest, build 106 route và audit production dependency đều đạt. Playwright có 191 ca trên bản production local: 183 Chromium, 4 Firefox, 4 WebKit. Sau khi thêm phòng thi mô phỏng và công cụ luyện đề, lượt Chromium đầy đủ đạt 183/183 (cập nhật 09/10/2026 sau khi dựng lại phòng thi; 11 ca cloud cần bản build có hai biến Supabase giả như CI đặt); Firefox và WebKit chưa chạy lại cho thay đổi này. Axe kiểm tra 19 màn, gồm kho đề và Review 13/09. Hai lượt CI của nhánh/PR #38 đạt; Vercel phục vụ SHA </w:t>
       </w:r>
       <w:r>
         <w:rPr>

</xml_diff>

<commit_message>
Chấm Nói bằng AI cho bài học Nói và buổi thi rút gọn; sửa dọn lần chấm của lượt làm có dấu hai chấm
- Kết quả bài học Nói và màn kết thúc /exam có khung chấm Nói trên bản ghi có sẵn trên máy.
- SpeakingGradePanel nhận gradeId và recordingIdOf, dùng chung cho kho đề, bài học và buổi thi.
- gradeTarget nhận mã lượt làm dạng exam:<mã>:<bài>, để lần chấm của buổi thi được dọn khi lượt làm mất.
- Thêm scripts/grading-eval/audio-probe.ts để thử Gemini đọc một file âm thanh (AAC của Safari chưa thử được vì hết hạn mức chi tiêu).

Co-Authored-By: Claude Sonnet 5.5 <noreply@anthropic.com>
Claude-Session: https://claude.ai/code/session_01W75mjctkB2SZty7ogWDMjM
</commit_message>
<xml_diff>
--- a/docs/Bao-cao-ban-giao-May-VSTEP.docx
+++ b/docs/Bao-cao-ban-giao-May-VSTEP.docx
@@ -443,7 +443,7 @@
           <w:color w:val="211D20"/>
           <w:sz w:val="22"/>
         </w:rPr>
-        <w:t>Bản code có năm đề nhập đủ bốn kỹ năng và hai đề tự biên soạn. Cả năm đề nhập có 375 khóa đáp án Nghe/Đọc; đề 131 thiếu đáp án và transcript nên đã được gỡ. 105 MP3 được đóng gói cùng ứng dụng. Viết và Nói lưu bài nhưng chưa được chấm tự động; bản ghi micro cần tải riêng. Bộ kiểm thử local trước khi phát hành gồm 403 unit test và 191 E2E trên Chromium, Firefox và WebKit, build 106 route và axe trên 19 màn. Migration gia cố quyền ghi cloud đã áp dụng trên Supabase production. PR #38 và smoke HTTPS đã đạt cho commit ứng dụng ff8faef; đồng bộ hai thiết bị, micro thật và thẩm định học liệu vẫn cần xác nhận; sáu đề nhập chỉ dùng học cá nhân của chủ dự án.</w:t>
+        <w:t>Bản code có năm đề nhập đủ bốn kỹ năng và hai đề tự biên soạn. Cả năm đề nhập có 375 khóa đáp án Nghe/Đọc; đề 131 thiếu đáp án và transcript nên đã được gỡ. 105 MP3 được đóng gói cùng ứng dụng. Viết và Nói lưu bài nhưng chưa được chấm tự động; bản ghi micro cần tải riêng. Bộ kiểm thử local trước khi phát hành gồm 404 unit test và 193 E2E trên Chromium, Firefox và WebKit, build 106 route và axe trên 19 màn. Migration gia cố quyền ghi cloud đã áp dụng trên Supabase production. PR #38 và smoke HTTPS đã đạt cho commit ứng dụng ff8faef; đồng bộ hai thiết bị, micro thật và thẩm định học liệu vẫn cần xác nhận; sáu đề nhập chỉ dùng học cá nhân của chủ dự án.</w:t>
       </w:r>
     </w:p>
     <w:p>
@@ -662,7 +662,7 @@
           <w:color w:val="211D20"/>
           <w:sz w:val="20"/>
         </w:rPr>
-        <w:t xml:space="preserve"> đạt 81 unit và 44 E2E. Bản làm việc hiện tại đạt 403 unit và 191 E2E trên cùng ba engine sau khi hoàn tất kiểm thử. Chưa có nghiệm thu trên iOS hoặc Android thật.</w:t>
+        <w:t xml:space="preserve"> đạt 81 unit và 44 E2E. Bản làm việc hiện tại đạt 404 unit và 193 E2E trên cùng ba engine sau khi hoàn tất kiểm thử. Chưa có nghiệm thu trên iOS hoặc Android thật.</w:t>
       </w:r>
     </w:p>
     <w:p>
@@ -5364,7 +5364,7 @@
           <w:color w:val="211D20"/>
           <w:sz w:val="20"/>
         </w:rPr>
-        <w:t xml:space="preserve">Bản sáu đề ngày 07/10/2026: ESLint, TypeScript, 403/403 Vitest, build 106 route và audit production dependency đều đạt. Playwright có 191 ca trên bản production local: 183 Chromium, 4 Firefox, 4 WebKit. Sau khi thêm phòng thi mô phỏng và công cụ luyện đề, lượt Chromium đầy đủ đạt 183/183 (cập nhật 09/10/2026 sau khi dựng lại phòng thi; 11 ca cloud cần bản build có hai biến Supabase giả như CI đặt); Firefox và WebKit chưa chạy lại cho thay đổi này. Axe kiểm tra 19 màn, gồm kho đề và Review 13/09. Hai lượt CI của nhánh/PR #38 đạt; Vercel phục vụ SHA </w:t>
+        <w:t xml:space="preserve">Bản sáu đề ngày 07/10/2026: ESLint, TypeScript, 404/404 Vitest, build 106 route và audit production dependency đều đạt. Playwright có 193 ca trên bản production local: 185 Chromium, 4 Firefox, 4 WebKit. Sau khi thêm phòng thi mô phỏng và công cụ luyện đề, lượt Chromium đầy đủ đạt 185/185 (cập nhật 09/10/2026 sau khi dựng lại phòng thi; 11 ca cloud cần bản build có hai biến Supabase giả như CI đặt); Firefox và WebKit chưa chạy lại cho thay đổi này. Axe kiểm tra 19 màn, gồm kho đề và Review 13/09. Hai lượt CI của nhánh/PR #38 đạt; Vercel phục vụ SHA </w:t>
       </w:r>
       <w:r>
         <w:rPr>

</xml_diff>

<commit_message>
Chấm Nói bằng AI cho bài học Nói và buổi thi rút gọn; sửa dọn lần chấm của lượt làm có dấu hai chấm (#63)
Co-Authored-By: Claude Sonnet 5.5 <noreply@anthropic.com>
Claude-Session: https://claude.ai/code/session_01W75mjctkB2SZty7ogWDMjM
</commit_message>
<xml_diff>
--- a/docs/Bao-cao-ban-giao-May-VSTEP.docx
+++ b/docs/Bao-cao-ban-giao-May-VSTEP.docx
@@ -443,7 +443,7 @@
           <w:color w:val="211D20"/>
           <w:sz w:val="22"/>
         </w:rPr>
-        <w:t>Bản code có năm đề nhập đủ bốn kỹ năng và hai đề tự biên soạn. Cả năm đề nhập có 375 khóa đáp án Nghe/Đọc; đề 131 thiếu đáp án và transcript nên đã được gỡ. 105 MP3 được đóng gói cùng ứng dụng. Viết và Nói lưu bài nhưng chưa được chấm tự động; bản ghi micro cần tải riêng. Bộ kiểm thử local trước khi phát hành gồm 403 unit test và 191 E2E trên Chromium, Firefox và WebKit, build 106 route và axe trên 19 màn. Migration gia cố quyền ghi cloud đã áp dụng trên Supabase production. PR #38 và smoke HTTPS đã đạt cho commit ứng dụng ff8faef; đồng bộ hai thiết bị, micro thật và thẩm định học liệu vẫn cần xác nhận; sáu đề nhập chỉ dùng học cá nhân của chủ dự án.</w:t>
+        <w:t>Bản code có năm đề nhập đủ bốn kỹ năng và hai đề tự biên soạn. Cả năm đề nhập có 375 khóa đáp án Nghe/Đọc; đề 131 thiếu đáp án và transcript nên đã được gỡ. 105 MP3 được đóng gói cùng ứng dụng. Viết và Nói lưu bài nhưng chưa được chấm tự động; bản ghi micro cần tải riêng. Bộ kiểm thử local trước khi phát hành gồm 404 unit test và 193 E2E trên Chromium, Firefox và WebKit, build 106 route và axe trên 19 màn. Migration gia cố quyền ghi cloud đã áp dụng trên Supabase production. PR #38 và smoke HTTPS đã đạt cho commit ứng dụng ff8faef; đồng bộ hai thiết bị, micro thật và thẩm định học liệu vẫn cần xác nhận; sáu đề nhập chỉ dùng học cá nhân của chủ dự án.</w:t>
       </w:r>
     </w:p>
     <w:p>
@@ -662,7 +662,7 @@
           <w:color w:val="211D20"/>
           <w:sz w:val="20"/>
         </w:rPr>
-        <w:t xml:space="preserve"> đạt 81 unit và 44 E2E. Bản làm việc hiện tại đạt 403 unit và 191 E2E trên cùng ba engine sau khi hoàn tất kiểm thử. Chưa có nghiệm thu trên iOS hoặc Android thật.</w:t>
+        <w:t xml:space="preserve"> đạt 81 unit và 44 E2E. Bản làm việc hiện tại đạt 404 unit và 193 E2E trên cùng ba engine sau khi hoàn tất kiểm thử. Chưa có nghiệm thu trên iOS hoặc Android thật.</w:t>
       </w:r>
     </w:p>
     <w:p>
@@ -5364,7 +5364,7 @@
           <w:color w:val="211D20"/>
           <w:sz w:val="20"/>
         </w:rPr>
-        <w:t xml:space="preserve">Bản sáu đề ngày 07/10/2026: ESLint, TypeScript, 403/403 Vitest, build 106 route và audit production dependency đều đạt. Playwright có 191 ca trên bản production local: 183 Chromium, 4 Firefox, 4 WebKit. Sau khi thêm phòng thi mô phỏng và công cụ luyện đề, lượt Chromium đầy đủ đạt 183/183 (cập nhật 09/10/2026 sau khi dựng lại phòng thi; 11 ca cloud cần bản build có hai biến Supabase giả như CI đặt); Firefox và WebKit chưa chạy lại cho thay đổi này. Axe kiểm tra 19 màn, gồm kho đề và Review 13/09. Hai lượt CI của nhánh/PR #38 đạt; Vercel phục vụ SHA </w:t>
+        <w:t xml:space="preserve">Bản sáu đề ngày 07/10/2026: ESLint, TypeScript, 404/404 Vitest, build 106 route và audit production dependency đều đạt. Playwright có 193 ca trên bản production local: 185 Chromium, 4 Firefox, 4 WebKit. Sau khi thêm phòng thi mô phỏng và công cụ luyện đề, lượt Chromium đầy đủ đạt 185/185 (cập nhật 09/10/2026 sau khi dựng lại phòng thi; 11 ca cloud cần bản build có hai biến Supabase giả như CI đặt); Firefox và WebKit chưa chạy lại cho thay đổi này. Axe kiểm tra 19 màn, gồm kho đề và Review 13/09. Hai lượt CI của nhánh/PR #38 đạt; Vercel phục vụ SHA </w:t>
       </w:r>
       <w:r>
         <w:rPr>

</xml_diff>

<commit_message>
Sửa nút điều hướng câu của bài nghe bị chồng chữ ở khung hẹp (Phòng thi thử); ghi lần rà UX/UI đợt bốn
- Khung bài nghe dùng container query: dưới 340 px ba nút xếp thành ba hàng.
- Thêm ca E2E đo ba nút nằm trong khung, không chồng và không bị cắt chữ.
- Quét 59 route: không lỗi console hay mạng; npm audit sạch.

Co-Authored-By: Claude Sonnet 5.5 <noreply@anthropic.com>
Claude-Session: https://claude.ai/code/session_01W75mjctkB2SZty7ogWDMjM
</commit_message>
<xml_diff>
--- a/docs/Bao-cao-ban-giao-May-VSTEP.docx
+++ b/docs/Bao-cao-ban-giao-May-VSTEP.docx
@@ -443,7 +443,7 @@
           <w:color w:val="211D20"/>
           <w:sz w:val="22"/>
         </w:rPr>
-        <w:t>Bản code có năm đề nhập đủ bốn kỹ năng và hai đề tự biên soạn. Cả năm đề nhập có 375 khóa đáp án Nghe/Đọc; đề 131 thiếu đáp án và transcript nên đã được gỡ. 105 MP3 được đóng gói cùng ứng dụng. Viết và Nói lưu bài nhưng chưa được chấm tự động; bản ghi micro cần tải riêng. Bộ kiểm thử local trước khi phát hành gồm 404 unit test và 193 E2E trên Chromium, Firefox và WebKit, build 106 route và axe trên 19 màn. Migration gia cố quyền ghi cloud đã áp dụng trên Supabase production. PR #38 và smoke HTTPS đã đạt cho commit ứng dụng ff8faef; đồng bộ hai thiết bị, micro thật và thẩm định học liệu vẫn cần xác nhận; sáu đề nhập chỉ dùng học cá nhân của chủ dự án.</w:t>
+        <w:t>Bản code có năm đề nhập đủ bốn kỹ năng và hai đề tự biên soạn. Cả năm đề nhập có 375 khóa đáp án Nghe/Đọc; đề 131 thiếu đáp án và transcript nên đã được gỡ. 105 MP3 được đóng gói cùng ứng dụng. Viết và Nói lưu bài nhưng chưa được chấm tự động; bản ghi micro cần tải riêng. Bộ kiểm thử local trước khi phát hành gồm 404 unit test và 194 E2E trên Chromium, Firefox và WebKit, build 106 route và axe trên 19 màn. Migration gia cố quyền ghi cloud đã áp dụng trên Supabase production. PR #38 và smoke HTTPS đã đạt cho commit ứng dụng ff8faef; đồng bộ hai thiết bị, micro thật và thẩm định học liệu vẫn cần xác nhận; sáu đề nhập chỉ dùng học cá nhân của chủ dự án.</w:t>
       </w:r>
     </w:p>
     <w:p>
@@ -662,7 +662,7 @@
           <w:color w:val="211D20"/>
           <w:sz w:val="20"/>
         </w:rPr>
-        <w:t xml:space="preserve"> đạt 81 unit và 44 E2E. Bản làm việc hiện tại đạt 404 unit và 193 E2E trên cùng ba engine sau khi hoàn tất kiểm thử. Chưa có nghiệm thu trên iOS hoặc Android thật.</w:t>
+        <w:t xml:space="preserve"> đạt 81 unit và 44 E2E. Bản làm việc hiện tại đạt 404 unit và 194 E2E trên cùng ba engine sau khi hoàn tất kiểm thử. Chưa có nghiệm thu trên iOS hoặc Android thật.</w:t>
       </w:r>
     </w:p>
     <w:p>
@@ -5364,7 +5364,7 @@
           <w:color w:val="211D20"/>
           <w:sz w:val="20"/>
         </w:rPr>
-        <w:t xml:space="preserve">Bản sáu đề ngày 07/10/2026: ESLint, TypeScript, 404/404 Vitest, build 106 route và audit production dependency đều đạt. Playwright có 193 ca trên bản production local: 185 Chromium, 4 Firefox, 4 WebKit. Sau khi thêm phòng thi mô phỏng và công cụ luyện đề, lượt Chromium đầy đủ đạt 185/185 (cập nhật 09/10/2026 sau khi dựng lại phòng thi; 11 ca cloud cần bản build có hai biến Supabase giả như CI đặt); Firefox và WebKit chưa chạy lại cho thay đổi này. Axe kiểm tra 19 màn, gồm kho đề và Review 13/09. Hai lượt CI của nhánh/PR #38 đạt; Vercel phục vụ SHA </w:t>
+        <w:t xml:space="preserve">Bản sáu đề ngày 07/10/2026: ESLint, TypeScript, 404/404 Vitest, build 106 route và audit production dependency đều đạt. Playwright có 194 ca trên bản production local: 186 Chromium, 4 Firefox, 4 WebKit. Sau khi thêm phòng thi mô phỏng và công cụ luyện đề, lượt Chromium đầy đủ đạt 186/186 (cập nhật 09/10/2026 sau khi dựng lại phòng thi; 11 ca cloud cần bản build có hai biến Supabase giả như CI đặt); Firefox và WebKit chưa chạy lại cho thay đổi này. Axe kiểm tra 19 màn, gồm kho đề và Review 13/09. Hai lượt CI của nhánh/PR #38 đạt; Vercel phục vụ SHA </w:t>
       </w:r>
       <w:r>
         <w:rPr>

</xml_diff>

<commit_message>
Thêm bản bàn giao cho AI agent làm tiếp; sửa dòng Chấm Viết/Nói đã lỗi thời trong HANDOVER
Co-Authored-By: Claude Sonnet 5.5 <noreply@anthropic.com>
Claude-Session: https://claude.ai/code/session_01W75mjctkB2SZty7ogWDMjM
</commit_message>
<xml_diff>
--- a/docs/Bao-cao-ban-giao-May-VSTEP.docx
+++ b/docs/Bao-cao-ban-giao-May-VSTEP.docx
@@ -7042,7 +7042,7 @@
                 <w:color w:val="211D20"/>
                 <w:sz w:val="16"/>
               </w:rPr>
-              <w:t>Chưa làm</w:t>
+              <w:t>Có, bằng AI (Gemini), điểm là ước lượng</w:t>
             </w:r>
           </w:p>
         </w:tc>
@@ -7067,8 +7067,34 @@
                 <w:color w:val="211D20"/>
                 <w:sz w:val="16"/>
               </w:rPr>
-              <w:t>Người học chỉ tự kiểm tra; không có điểm hoặc phản hồi cá nhân sâu</w:t>
+              <w:t xml:space="preserve">Chấm theo bốn/năm tiêu chí kèm lỗi trích từ bài; chưa có người chấm để so, lần đo đầu không tiêu chí nào qua ngưỡng nên cổng điểm giữ đóng; chi tiết ở </w:t>
             </w:r>
+            <w:hyperlink r:id="rId17">
+              <w:r>
+                <w:rPr>
+                  <w:color w:val="C93B72"/>
+                  <w:u w:val="single"/>
+                </w:rPr>
+                <w:t>BAN-GIAO-CHO-AGENT.md</w:t>
+              </w:r>
+            </w:hyperlink>
+            <w:r>
+              <w:rPr>
+                <w:rFonts w:ascii="Arial" w:hAnsi="Arial" w:eastAsia="Arial"/>
+                <w:color w:val="211D20"/>
+                <w:sz w:val="16"/>
+              </w:rPr>
+              <w:t xml:space="preserve"> và </w:t>
+            </w:r>
+            <w:hyperlink r:id="rId14">
+              <w:r>
+                <w:rPr>
+                  <w:color w:val="C93B72"/>
+                  <w:u w:val="single"/>
+                </w:rPr>
+                <w:t>PLAN-CHAM-AI.md</w:t>
+              </w:r>
+            </w:hyperlink>
           </w:p>
         </w:tc>
       </w:tr>

</xml_diff>

<commit_message>
Thêm ba ca E2E quét toàn bộ trang (lỗi console/mạng, cuộn ngang ở 390 và 1280 px); ghi kết quả rà đợt bốn
Co-Authored-By: Claude Sonnet 5.5 <noreply@anthropic.com>
Claude-Session: https://claude.ai/code/session_01W75mjctkB2SZty7ogWDMjM
</commit_message>
<xml_diff>
--- a/docs/Bao-cao-ban-giao-May-VSTEP.docx
+++ b/docs/Bao-cao-ban-giao-May-VSTEP.docx
@@ -443,7 +443,7 @@
           <w:color w:val="211D20"/>
           <w:sz w:val="22"/>
         </w:rPr>
-        <w:t>Bản code có năm đề nhập đủ bốn kỹ năng và hai đề tự biên soạn. Cả năm đề nhập có 375 khóa đáp án Nghe/Đọc; đề 131 thiếu đáp án và transcript nên đã được gỡ. 105 MP3 được đóng gói cùng ứng dụng. Viết và Nói lưu bài nhưng chưa được chấm tự động; bản ghi micro cần tải riêng. Bộ kiểm thử local trước khi phát hành gồm 404 unit test và 194 E2E trên Chromium, Firefox và WebKit, build 106 route và axe trên 19 màn. Migration gia cố quyền ghi cloud đã áp dụng trên Supabase production. PR #38 và smoke HTTPS đã đạt cho commit ứng dụng ff8faef; đồng bộ hai thiết bị, micro thật và thẩm định học liệu vẫn cần xác nhận; sáu đề nhập chỉ dùng học cá nhân của chủ dự án.</w:t>
+        <w:t>Bản code có năm đề nhập đủ bốn kỹ năng và hai đề tự biên soạn. Cả năm đề nhập có 375 khóa đáp án Nghe/Đọc; đề 131 thiếu đáp án và transcript nên đã được gỡ. 105 MP3 được đóng gói cùng ứng dụng. Viết và Nói lưu bài nhưng chưa được chấm tự động; bản ghi micro cần tải riêng. Bộ kiểm thử local trước khi phát hành gồm 404 unit test và 197 E2E trên Chromium, Firefox và WebKit, build 106 route và axe trên 19 màn. Migration gia cố quyền ghi cloud đã áp dụng trên Supabase production. PR #38 và smoke HTTPS đã đạt cho commit ứng dụng ff8faef; đồng bộ hai thiết bị, micro thật và thẩm định học liệu vẫn cần xác nhận; sáu đề nhập chỉ dùng học cá nhân của chủ dự án.</w:t>
       </w:r>
     </w:p>
     <w:p>
@@ -662,7 +662,7 @@
           <w:color w:val="211D20"/>
           <w:sz w:val="20"/>
         </w:rPr>
-        <w:t xml:space="preserve"> đạt 81 unit và 44 E2E. Bản làm việc hiện tại đạt 404 unit và 194 E2E trên cùng ba engine sau khi hoàn tất kiểm thử. Chưa có nghiệm thu trên iOS hoặc Android thật.</w:t>
+        <w:t xml:space="preserve"> đạt 81 unit và 44 E2E. Bản làm việc hiện tại đạt 404 unit và 197 E2E trên cùng ba engine sau khi hoàn tất kiểm thử. Chưa có nghiệm thu trên iOS hoặc Android thật.</w:t>
       </w:r>
     </w:p>
     <w:p>
@@ -5364,7 +5364,7 @@
           <w:color w:val="211D20"/>
           <w:sz w:val="20"/>
         </w:rPr>
-        <w:t xml:space="preserve">Bản sáu đề ngày 07/10/2026: ESLint, TypeScript, 404/404 Vitest, build 106 route và audit production dependency đều đạt. Playwright có 194 ca trên bản production local: 186 Chromium, 4 Firefox, 4 WebKit. Sau khi thêm phòng thi mô phỏng và công cụ luyện đề, lượt Chromium đầy đủ đạt 186/186 (cập nhật 09/10/2026 sau khi dựng lại phòng thi; 11 ca cloud cần bản build có hai biến Supabase giả như CI đặt); Firefox và WebKit chưa chạy lại cho thay đổi này. Axe kiểm tra 19 màn, gồm kho đề và Review 13/09. Hai lượt CI của nhánh/PR #38 đạt; Vercel phục vụ SHA </w:t>
+        <w:t xml:space="preserve">Bản sáu đề ngày 07/10/2026: ESLint, TypeScript, 404/404 Vitest, build 106 route và audit production dependency đều đạt. Playwright có 197 ca trên bản production local: 189 Chromium, 4 Firefox, 4 WebKit. Sau khi thêm phòng thi mô phỏng và công cụ luyện đề, lượt Chromium đầy đủ đạt 189/189 (cập nhật 09/10/2026 sau khi dựng lại phòng thi; 11 ca cloud cần bản build có hai biến Supabase giả như CI đặt); Firefox và WebKit chưa chạy lại cho thay đổi này. Axe kiểm tra 19 màn, gồm kho đề và Review 13/09. Hai lượt CI của nhánh/PR #38 đạt; Vercel phục vụ SHA </w:t>
       </w:r>
       <w:r>
         <w:rPr>

</xml_diff>